<commit_message>
Use US names, LLC companies and US details in use-case stories
Co-Authored-By: Claude Opus 5.5 <noreply@anthropic.com>
Claude-Session: https://claude.ai/code/session_01Xs6uEGTRa4UggVmKjUH61X
</commit_message>
<xml_diff>
--- a/content/use-cases/story-drafts/Lynkk-Use-Case-Stories.docx
+++ b/content/use-cases/story-drafts/Lynkk-Use-Case-Stories.docx
@@ -1112,7 +1112,7 @@
         <w:pStyle w:val="Heading3"/>
       </w:pPr>
       <w:r>
-        <w:t xml:space="preserve">Meet Maya</w:t>
+        <w:t xml:space="preserve">Meet Jessica</w:t>
       </w:r>
     </w:p>
     <w:p>
@@ -1124,23 +1124,23 @@
           <w:i/>
           <w:iCs/>
         </w:rPr>
-        <w:t xml:space="preserve">Maya is an example. But you may know someone just like her.</w:t>
-      </w:r>
-    </w:p>
-    <w:p>
-      <w:pPr>
-        <w:spacing w:after="140"/>
-      </w:pPr>
-      <w:r>
-        <w:t xml:space="preserve">Maya sells software. She has many sales calls every day.</w:t>
-      </w:r>
-    </w:p>
-    <w:p>
-      <w:pPr>
-        <w:spacing w:after="140"/>
-      </w:pPr>
-      <w:r>
-        <w:t xml:space="preserve">Today she is talking to Dana from Bluestone Logistics Ltd. Dana is interested. She asks about the price. She wants to try it with two teams first. And she is not sure who will sign the order.</w:t>
+        <w:t xml:space="preserve">Jessica is an example. But you may know someone just like her.</w:t>
+      </w:r>
+    </w:p>
+    <w:p>
+      <w:pPr>
+        <w:spacing w:after="140"/>
+      </w:pPr>
+      <w:r>
+        <w:t xml:space="preserve">Jessica sells software. She has many sales calls every day.</w:t>
+      </w:r>
+    </w:p>
+    <w:p>
+      <w:pPr>
+        <w:spacing w:after="140"/>
+      </w:pPr>
+      <w:r>
+        <w:t xml:space="preserve">Today she is talking to Dana from Bluestone Logistics LLC Dana is interested. She asks about the price. She wants to try it with two teams first. And she is not sure who will sign the order.</w:t>
       </w:r>
     </w:p>
     <w:p>
@@ -1148,15 +1148,15 @@
         <w:pStyle w:val="Heading3"/>
       </w:pPr>
       <w:r>
-        <w:t xml:space="preserve">Maya's problem</w:t>
-      </w:r>
-    </w:p>
-    <w:p>
-      <w:pPr>
-        <w:spacing w:after="140"/>
-      </w:pPr>
-      <w:r>
-        <w:t xml:space="preserve">Maya is doing three things at once. She is talking. She is listening. And she is typing notes.</w:t>
+        <w:t xml:space="preserve">Jessica's problem</w:t>
+      </w:r>
+    </w:p>
+    <w:p>
+      <w:pPr>
+        <w:spacing w:after="140"/>
+      </w:pPr>
+      <w:r>
+        <w:t xml:space="preserve">Jessica is doing three things at once. She is talking. She is listening. And she is typing notes.</w:t>
       </w:r>
     </w:p>
     <w:p>
@@ -1180,45 +1180,45 @@
         <w:pStyle w:val="Heading3"/>
       </w:pPr>
       <w:r>
-        <w:t xml:space="preserve">How Lynkk helps Maya on her next sales call</w:t>
-      </w:r>
-    </w:p>
-    <w:p>
-      <w:pPr>
-        <w:spacing w:after="140"/>
-      </w:pPr>
-      <w:r>
-        <w:t xml:space="preserve">Maya starts using Lynkk, an AI sales assistant. Here is what changes.</w:t>
-      </w:r>
-    </w:p>
-    <w:p>
-      <w:pPr>
-        <w:spacing w:after="140"/>
-      </w:pPr>
-      <w:r>
-        <w:rPr>
-          <w:b/>
-          <w:bCs/>
-        </w:rPr>
-        <w:t xml:space="preserve">Before the call, Maya asks Lynkk one question.</w:t>
-      </w:r>
-      <w:r>
-        <w:t xml:space="preserve"> "What is still open with Bluestone?" Lynkk replies: "Dana has not said who will sign the order." Now Maya knows what to ask first.</w:t>
-      </w:r>
-    </w:p>
-    <w:p>
-      <w:pPr>
-        <w:spacing w:after="140"/>
-      </w:pPr>
-      <w:r>
-        <w:rPr>
-          <w:b/>
-          <w:bCs/>
-        </w:rPr>
-        <w:t xml:space="preserve">During the call, Maya just talks.</w:t>
-      </w:r>
-      <w:r>
-        <w:t xml:space="preserve"> Lynkk records the call from her computer. No extra bot joins the call. When Dana asks, "What did we agree last time?", Lynkk shows Maya the answer right away.</w:t>
+        <w:t xml:space="preserve">How Lynkk helps Jessica on her next sales call</w:t>
+      </w:r>
+    </w:p>
+    <w:p>
+      <w:pPr>
+        <w:spacing w:after="140"/>
+      </w:pPr>
+      <w:r>
+        <w:t xml:space="preserve">Jessica starts using Lynkk, an AI sales assistant. Here is what changes.</w:t>
+      </w:r>
+    </w:p>
+    <w:p>
+      <w:pPr>
+        <w:spacing w:after="140"/>
+      </w:pPr>
+      <w:r>
+        <w:rPr>
+          <w:b/>
+          <w:bCs/>
+        </w:rPr>
+        <w:t xml:space="preserve">Before the call, Jessica asks Lynkk one question.</w:t>
+      </w:r>
+      <w:r>
+        <w:t xml:space="preserve"> "What is still open with Bluestone?" Lynkk replies: "Dana has not said who will sign the order." Now Jessica knows what to ask first.</w:t>
+      </w:r>
+    </w:p>
+    <w:p>
+      <w:pPr>
+        <w:spacing w:after="140"/>
+      </w:pPr>
+      <w:r>
+        <w:rPr>
+          <w:b/>
+          <w:bCs/>
+        </w:rPr>
+        <w:t xml:space="preserve">During the call, Jessica just talks.</w:t>
+      </w:r>
+      <w:r>
+        <w:t xml:space="preserve"> Lynkk records the call from her computer. No extra bot joins the call. When Dana asks, "What did we agree last time?", Lynkk shows Jessica the answer right away.</w:t>
       </w:r>
     </w:p>
     <w:p>
@@ -1233,31 +1233,31 @@
         <w:t xml:space="preserve">After the call, the notes are already done.</w:t>
       </w:r>
       <w:r>
-        <w:t xml:space="preserve"> Maya does not type anything. Lynkk writes the next steps, who will do them, and by when.</w:t>
-      </w:r>
-    </w:p>
-    <w:p>
-      <w:pPr>
-        <w:spacing w:after="140"/>
-      </w:pPr>
-      <w:r>
-        <w:rPr>
-          <w:b/>
-          <w:bCs/>
-        </w:rPr>
-        <w:t xml:space="preserve">Here is the note Lynkk wrote for Maya (example)</w:t>
-      </w:r>
-    </w:p>
-    <w:p>
-      <w:pPr>
-        <w:spacing w:after="140"/>
-      </w:pPr>
-      <w:r>
-        <w:rPr>
-          <w:b/>
-          <w:bCs/>
-        </w:rPr>
-        <w:t xml:space="preserve">Call with Bluestone Logistics Ltd. · Zoom · 32 min</w:t>
+        <w:t xml:space="preserve"> Jessica does not type anything. Lynkk writes the next steps, who will do them, and by when.</w:t>
+      </w:r>
+    </w:p>
+    <w:p>
+      <w:pPr>
+        <w:spacing w:after="140"/>
+      </w:pPr>
+      <w:r>
+        <w:rPr>
+          <w:b/>
+          <w:bCs/>
+        </w:rPr>
+        <w:t xml:space="preserve">Here is the note Lynkk wrote for Jessica (example)</w:t>
+      </w:r>
+    </w:p>
+    <w:p>
+      <w:pPr>
+        <w:spacing w:after="140"/>
+      </w:pPr>
+      <w:r>
+        <w:rPr>
+          <w:b/>
+          <w:bCs/>
+        </w:rPr>
+        <w:t xml:space="preserve">Call with Bluestone Logistics LLC · Zoom · 32 min</w:t>
       </w:r>
     </w:p>
     <w:p>
@@ -1281,7 +1281,7 @@
         </w:numPr>
       </w:pPr>
       <w:r>
-        <w:t xml:space="preserve">Send the new price quote to Dana. Who: Maya. When: Friday.</w:t>
+        <w:t xml:space="preserve">Send the new price quote to Dana. Who: Jessica. When: Friday.</w:t>
       </w:r>
     </w:p>
     <w:p>
@@ -1293,7 +1293,7 @@
         </w:numPr>
       </w:pPr>
       <w:r>
-        <w:t xml:space="preserve">Book a security check. Who: Dev. When: Tuesday.</w:t>
+        <w:t xml:space="preserve">Book a security check. Who: Mike. When: Tuesday.</w:t>
       </w:r>
     </w:p>
     <w:p>
@@ -1331,7 +1331,7 @@
         <w:spacing w:after="140"/>
       </w:pPr>
       <w:r>
-        <w:t xml:space="preserve">Maya can click any line to hear that part of the call again.</w:t>
+        <w:t xml:space="preserve">Jessica can click any line to hear that part of the call again.</w:t>
       </w:r>
     </w:p>
     <w:p>
@@ -1832,7 +1832,7 @@
       <w:r>
         <w:t xml:space="preserve">Your notes are private unless you share them. Your data is encrypted and stays in the region you choose. Lynkk never uses your calls to train AI. </w:t>
       </w:r>
-      <w:hyperlink w:history="1" r:id="rId166imgdyfzc-nwynpixov">
+      <w:hyperlink w:history="1" r:id="rIdzys9tb4axi_faxolf4vmr">
         <w:r>
           <w:rPr>
             <w:rStyle w:val="Hyperlink"/>
@@ -2054,7 +2054,7 @@
       <w:pPr>
         <w:spacing w:after="140"/>
       </w:pPr>
-      <w:hyperlink w:history="1" r:id="rIdpjpnwbqwha-ulovjgw3wy">
+      <w:hyperlink w:history="1" r:id="rIdawazr-eyovua9wcenmiar">
         <w:r>
           <w:rPr>
             <w:rStyle w:val="Hyperlink"/>
@@ -2176,7 +2176,7 @@
         <w:pStyle w:val="Heading3"/>
       </w:pPr>
       <w:r>
-        <w:t xml:space="preserve">Be like Maya. Never forget a next step again.</w:t>
+        <w:t xml:space="preserve">Be like Jessica. Never forget a next step again.</w:t>
       </w:r>
     </w:p>
     <w:p>
@@ -3086,7 +3086,7 @@
         <w:pStyle w:val="Heading3"/>
       </w:pPr>
       <w:r>
-        <w:t xml:space="preserve">Meet Priya</w:t>
+        <w:t xml:space="preserve">Meet Rachel</w:t>
       </w:r>
     </w:p>
     <w:p>
@@ -3098,15 +3098,15 @@
           <w:i/>
           <w:iCs/>
         </w:rPr>
-        <w:t xml:space="preserve">Priya is an example. But you may know someone just like her.</w:t>
-      </w:r>
-    </w:p>
-    <w:p>
-      <w:pPr>
-        <w:spacing w:after="140"/>
-      </w:pPr>
-      <w:r>
-        <w:t xml:space="preserve">Priya designs apps at Greenway Foods Ltd. This week she has eight customer interviews. She wants to know why new users stop using the app.</w:t>
+        <w:t xml:space="preserve">Rachel is an example. But you may know someone just like her.</w:t>
+      </w:r>
+    </w:p>
+    <w:p>
+      <w:pPr>
+        <w:spacing w:after="140"/>
+      </w:pPr>
+      <w:r>
+        <w:t xml:space="preserve">Rachel designs apps at Greenway Foods LLC This week she has eight customer interviews. She wants to know why new users stop using the app.</w:t>
       </w:r>
     </w:p>
     <w:p>
@@ -3114,15 +3114,15 @@
         <w:pStyle w:val="Heading3"/>
       </w:pPr>
       <w:r>
-        <w:t xml:space="preserve">Priya's problem</w:t>
-      </w:r>
-    </w:p>
-    <w:p>
-      <w:pPr>
-        <w:spacing w:after="140"/>
-      </w:pPr>
-      <w:r>
-        <w:t xml:space="preserve">In each interview, Priya tries to listen and write at the same time. She looks at her notebook more than at the person.</w:t>
+        <w:t xml:space="preserve">Rachel's problem</w:t>
+      </w:r>
+    </w:p>
+    <w:p>
+      <w:pPr>
+        <w:spacing w:after="140"/>
+      </w:pPr>
+      <w:r>
+        <w:t xml:space="preserve">In each interview, Rachel tries to listen and write at the same time. She looks at her notebook more than at the person.</w:t>
       </w:r>
     </w:p>
     <w:p>
@@ -3138,27 +3138,27 @@
         <w:pStyle w:val="Heading3"/>
       </w:pPr>
       <w:r>
-        <w:t xml:space="preserve">How Lynkk helps Priya transcribe interviews</w:t>
-      </w:r>
-    </w:p>
-    <w:p>
-      <w:pPr>
-        <w:spacing w:after="140"/>
-      </w:pPr>
-      <w:r>
-        <w:t xml:space="preserve">Priya starts using Lynkk. Here is what changes.</w:t>
-      </w:r>
-    </w:p>
-    <w:p>
-      <w:pPr>
-        <w:spacing w:after="140"/>
-      </w:pPr>
-      <w:r>
-        <w:rPr>
-          <w:b/>
-          <w:bCs/>
-        </w:rPr>
-        <w:t xml:space="preserve">Before the interview, Priya presses record.</w:t>
+        <w:t xml:space="preserve">How Lynkk helps Rachel transcribe interviews</w:t>
+      </w:r>
+    </w:p>
+    <w:p>
+      <w:pPr>
+        <w:spacing w:after="140"/>
+      </w:pPr>
+      <w:r>
+        <w:t xml:space="preserve">Rachel starts using Lynkk. Here is what changes.</w:t>
+      </w:r>
+    </w:p>
+    <w:p>
+      <w:pPr>
+        <w:spacing w:after="140"/>
+      </w:pPr>
+      <w:r>
+        <w:rPr>
+          <w:b/>
+          <w:bCs/>
+        </w:rPr>
+        <w:t xml:space="preserve">Before the interview, Rachel presses record.</w:t>
       </w:r>
       <w:r>
         <w:t xml:space="preserve"> She records from her computer, or in the room when she meets someone in person. No bot joins the call.</w:t>
@@ -3173,7 +3173,7 @@
           <w:b/>
           <w:bCs/>
         </w:rPr>
-        <w:t xml:space="preserve">During the interview, Priya just listens.</w:t>
+        <w:t xml:space="preserve">During the interview, Rachel just listens.</w:t>
       </w:r>
       <w:r>
         <w:t xml:space="preserve"> She looks at the person, not her notebook. She asks better follow-up questions.</w:t>
@@ -3203,7 +3203,7 @@
           <w:b/>
           <w:bCs/>
         </w:rPr>
-        <w:t xml:space="preserve">Here is the note Lynkk wrote for Priya (example)</w:t>
+        <w:t xml:space="preserve">Here is the note Lynkk wrote for Rachel (example)</w:t>
       </w:r>
     </w:p>
     <w:p>
@@ -3234,7 +3234,7 @@
           <w:b/>
           <w:bCs/>
         </w:rPr>
-        <w:t xml:space="preserve">Priya:</w:t>
+        <w:t xml:space="preserve">Rachel:</w:t>
       </w:r>
       <w:r>
         <w:t xml:space="preserve"> What made you look for something new?</w:t>
@@ -3278,7 +3278,7 @@
           <w:b/>
           <w:bCs/>
         </w:rPr>
-        <w:t xml:space="preserve">Priya:</w:t>
+        <w:t xml:space="preserve">Rachel:</w:t>
       </w:r>
       <w:r>
         <w:t xml:space="preserve"> Where did they give up?</w:t>
@@ -3319,7 +3319,7 @@
         <w:spacing w:after="140"/>
       </w:pPr>
       <w:r>
-        <w:t xml:space="preserve">Priya can click any line to hear that moment again.</w:t>
+        <w:t xml:space="preserve">Rachel can click any line to hear that moment again.</w:t>
       </w:r>
     </w:p>
     <w:p>
@@ -3820,7 +3820,7 @@
       <w:r>
         <w:t xml:space="preserve">Your notes are private unless you share them. Your data is encrypted and stays in the region you choose. Lynkk never uses your recordings to train AI. </w:t>
       </w:r>
-      <w:hyperlink w:history="1" r:id="rIdgpeg1z7ixnfjkyzqnpfj4">
+      <w:hyperlink w:history="1" r:id="rIdvh_zfoljlwpxagthvo2ib">
         <w:r>
           <w:rPr>
             <w:rStyle w:val="Hyperlink"/>
@@ -4042,7 +4042,7 @@
       <w:pPr>
         <w:spacing w:after="140"/>
       </w:pPr>
-      <w:hyperlink w:history="1" r:id="rIdhtijcpnqfl-ljjvewja50">
+      <w:hyperlink w:history="1" r:id="rIdrtu-zv3neqqqd1cc70yiq">
         <w:r>
           <w:rPr>
             <w:rStyle w:val="Hyperlink"/>
@@ -4164,7 +4164,7 @@
         <w:pStyle w:val="Heading3"/>
       </w:pPr>
       <w:r>
-        <w:t xml:space="preserve">Be like Priya. Look at the person, not your notebook.</w:t>
+        <w:t xml:space="preserve">Be like Rachel. Look at the person, not your notebook.</w:t>
       </w:r>
     </w:p>
     <w:p>
@@ -4991,7 +4991,7 @@
         <w:pStyle w:val="Heading3"/>
       </w:pPr>
       <w:r>
-        <w:t xml:space="preserve">Meet Arjun</w:t>
+        <w:t xml:space="preserve">Meet Jake</w:t>
       </w:r>
     </w:p>
     <w:p>
@@ -5003,15 +5003,15 @@
           <w:i/>
           <w:iCs/>
         </w:rPr>
-        <w:t xml:space="preserve">Arjun is an example. But you may know someone just like him.</w:t>
-      </w:r>
-    </w:p>
-    <w:p>
-      <w:pPr>
-        <w:spacing w:after="140"/>
-      </w:pPr>
-      <w:r>
-        <w:t xml:space="preserve">Arjun is a project manager at Riverstone Apps Ltd. Every morning at 10, his team has a 15-minute standup meeting. Each person says what they did yesterday, what they will do today, and what is blocking them.</w:t>
+        <w:t xml:space="preserve">Jake is an example. But you may know someone just like him.</w:t>
+      </w:r>
+    </w:p>
+    <w:p>
+      <w:pPr>
+        <w:spacing w:after="140"/>
+      </w:pPr>
+      <w:r>
+        <w:t xml:space="preserve">Jake is a project manager at Riverstone Apps LLC Every morning at 10, his team has a 15-minute standup meeting. Each person says what they did yesterday, what they will do today, and what is blocking them.</w:t>
       </w:r>
     </w:p>
     <w:p>
@@ -5019,7 +5019,7 @@
         <w:pStyle w:val="Heading3"/>
       </w:pPr>
       <w:r>
-        <w:t xml:space="preserve">Arjun's problem</w:t>
+        <w:t xml:space="preserve">Jake's problem</w:t>
       </w:r>
     </w:p>
     <w:p>
@@ -5035,7 +5035,7 @@
         <w:spacing w:after="140"/>
       </w:pPr>
       <w:r>
-        <w:t xml:space="preserve">On Monday, Sana says she is blocked, waiting for a design review. By Thursday, everyone has forgotten. Sana is still waiting. And Leo, who missed Tuesday's standup, has to message three people to catch up.</w:t>
+        <w:t xml:space="preserve">On Monday, Megan says she is blocked, waiting for a design review. By Thursday, everyone has forgotten. Megan is still waiting. And Leo, who missed Tuesday's standup, has to message three people to catch up.</w:t>
       </w:r>
     </w:p>
     <w:p>
@@ -5043,27 +5043,27 @@
         <w:pStyle w:val="Heading3"/>
       </w:pPr>
       <w:r>
-        <w:t xml:space="preserve">How Lynkk helps Arjun with the daily standup meeting</w:t>
-      </w:r>
-    </w:p>
-    <w:p>
-      <w:pPr>
-        <w:spacing w:after="140"/>
-      </w:pPr>
-      <w:r>
-        <w:t xml:space="preserve">Arjun starts using Lynkk. Here is what changes.</w:t>
-      </w:r>
-    </w:p>
-    <w:p>
-      <w:pPr>
-        <w:spacing w:after="140"/>
-      </w:pPr>
-      <w:r>
-        <w:rPr>
-          <w:b/>
-          <w:bCs/>
-        </w:rPr>
-        <w:t xml:space="preserve">Before the standup, Arjun does nothing.</w:t>
+        <w:t xml:space="preserve">How Lynkk helps Jake with the daily standup meeting</w:t>
+      </w:r>
+    </w:p>
+    <w:p>
+      <w:pPr>
+        <w:spacing w:after="140"/>
+      </w:pPr>
+      <w:r>
+        <w:t xml:space="preserve">Jake starts using Lynkk. Here is what changes.</w:t>
+      </w:r>
+    </w:p>
+    <w:p>
+      <w:pPr>
+        <w:spacing w:after="140"/>
+      </w:pPr>
+      <w:r>
+        <w:rPr>
+          <w:b/>
+          <w:bCs/>
+        </w:rPr>
+        <w:t xml:space="preserve">Before the standup, Jake does nothing.</w:t>
       </w:r>
       <w:r>
         <w:t xml:space="preserve"> Lynkk is connected to his calendar. Every morning, the Lynkk meeting bot joins the standup on its own.</w:t>
@@ -5108,7 +5108,7 @@
           <w:b/>
           <w:bCs/>
         </w:rPr>
-        <w:t xml:space="preserve">Here is the note Lynkk wrote for Arjun (example)</w:t>
+        <w:t xml:space="preserve">Here is the note Lynkk wrote for Jake (example)</w:t>
       </w:r>
     </w:p>
     <w:p>
@@ -5165,7 +5165,7 @@
         <w:t xml:space="preserve">Blocked:</w:t>
       </w:r>
       <w:r>
-        <w:t xml:space="preserve"> Sana is waiting on the design review. Raised at 07:48.</w:t>
+        <w:t xml:space="preserve"> Megan is waiting on the design review. Raised at 07:48.</w:t>
       </w:r>
     </w:p>
     <w:p>
@@ -5198,7 +5198,7 @@
       <w:r>
         <w:t xml:space="preserve">New to standups? Read our guide to the </w:t>
       </w:r>
-      <w:hyperlink w:history="1" r:id="rIdfevjf_f-iiwhq75sdfxbg">
+      <w:hyperlink w:history="1" r:id="rIdxfuqnsy-qnl7ovwdeirlz">
         <w:r>
           <w:rPr>
             <w:rStyle w:val="Hyperlink"/>
@@ -5708,7 +5708,7 @@
       <w:r>
         <w:t xml:space="preserve">Notes are private unless you share them. Your data is encrypted and stays in the region you choose. Lynkk never uses your meetings to train AI. </w:t>
       </w:r>
-      <w:hyperlink w:history="1" r:id="rIdqsuuyratexpmjssbob2ni">
+      <w:hyperlink w:history="1" r:id="rIdqqe_2aokh3xxecl7eugh1">
         <w:r>
           <w:rPr>
             <w:rStyle w:val="Hyperlink"/>
@@ -5930,7 +5930,7 @@
       <w:pPr>
         <w:spacing w:after="140"/>
       </w:pPr>
-      <w:hyperlink w:history="1" r:id="rIddpb3x3xjsbx03-oumfqkr">
+      <w:hyperlink w:history="1" r:id="rIdi03r1ddg361xwq9uli9ec">
         <w:r>
           <w:rPr>
             <w:rStyle w:val="Hyperlink"/>
@@ -6052,7 +6052,7 @@
         <w:pStyle w:val="Heading3"/>
       </w:pPr>
       <w:r>
-        <w:t xml:space="preserve">Be like Arjun. Never lose a blocker again.</w:t>
+        <w:t xml:space="preserve">Be like Jake. Never lose a blocker again.</w:t>
       </w:r>
     </w:p>
     <w:p>
@@ -6962,7 +6962,7 @@
         <w:pStyle w:val="Heading3"/>
       </w:pPr>
       <w:r>
-        <w:t xml:space="preserve">Meet Neha</w:t>
+        <w:t xml:space="preserve">Meet Emily</w:t>
       </w:r>
     </w:p>
     <w:p>
@@ -6974,15 +6974,15 @@
           <w:i/>
           <w:iCs/>
         </w:rPr>
-        <w:t xml:space="preserve">Neha is an example. But you may know someone just like her.</w:t>
-      </w:r>
-    </w:p>
-    <w:p>
-      <w:pPr>
-        <w:spacing w:after="140"/>
-      </w:pPr>
-      <w:r>
-        <w:t xml:space="preserve">Neha works at Green Fields Research Ltd. This month she is doing field research near Nashik. She visits farms and talks to farmers about water and crops.</w:t>
+        <w:t xml:space="preserve">Emily is an example. But you may know someone just like her.</w:t>
+      </w:r>
+    </w:p>
+    <w:p>
+      <w:pPr>
+        <w:spacing w:after="140"/>
+      </w:pPr>
+      <w:r>
+        <w:t xml:space="preserve">Emily works at Green Fields Research LLC This month she is doing field research near Nashik, India. She visits farms and talks to farmers about water and crops.</w:t>
       </w:r>
     </w:p>
     <w:p>
@@ -6990,7 +6990,7 @@
         <w:pStyle w:val="Heading3"/>
       </w:pPr>
       <w:r>
-        <w:t xml:space="preserve">Neha's problem</w:t>
+        <w:t xml:space="preserve">Emily's problem</w:t>
       </w:r>
     </w:p>
     <w:p>
@@ -7006,7 +7006,7 @@
         <w:spacing w:after="140"/>
       </w:pPr>
       <w:r>
-        <w:t xml:space="preserve">Neha comes back with hours of audio. She has no time to listen to it again. And typing it out by hand would take days.</w:t>
+        <w:t xml:space="preserve">Emily comes back with hours of audio. She has no time to listen to it again. And typing it out by hand would take days.</w:t>
       </w:r>
     </w:p>
     <w:p>
@@ -7014,27 +7014,27 @@
         <w:pStyle w:val="Heading3"/>
       </w:pPr>
       <w:r>
-        <w:t xml:space="preserve">How Lynkk helps Neha with field interviews</w:t>
-      </w:r>
-    </w:p>
-    <w:p>
-      <w:pPr>
-        <w:spacing w:after="140"/>
-      </w:pPr>
-      <w:r>
-        <w:t xml:space="preserve">Neha starts using Lynkk on her Mac. Here is what changes.</w:t>
-      </w:r>
-    </w:p>
-    <w:p>
-      <w:pPr>
-        <w:spacing w:after="140"/>
-      </w:pPr>
-      <w:r>
-        <w:rPr>
-          <w:b/>
-          <w:bCs/>
-        </w:rPr>
-        <w:t xml:space="preserve">During the visit, Neha just records.</w:t>
+        <w:t xml:space="preserve">How Lynkk helps Emily with field interviews</w:t>
+      </w:r>
+    </w:p>
+    <w:p>
+      <w:pPr>
+        <w:spacing w:after="140"/>
+      </w:pPr>
+      <w:r>
+        <w:t xml:space="preserve">Emily starts using Lynkk on her Mac. Here is what changes.</w:t>
+      </w:r>
+    </w:p>
+    <w:p>
+      <w:pPr>
+        <w:spacing w:after="140"/>
+      </w:pPr>
+      <w:r>
+        <w:rPr>
+          <w:b/>
+          <w:bCs/>
+        </w:rPr>
+        <w:t xml:space="preserve">During the visit, Emily just records.</w:t>
       </w:r>
       <w:r>
         <w:t xml:space="preserve"> She opens the Lynkk Mac app and records the conversation. No internet needed. The recording is saved on her Mac.</w:t>
@@ -7079,7 +7079,7 @@
           <w:b/>
           <w:bCs/>
         </w:rPr>
-        <w:t xml:space="preserve">Here is the note Lynkk wrote for Neha (example)</w:t>
+        <w:t xml:space="preserve">Here is the note Lynkk wrote for Emily (example)</w:t>
       </w:r>
     </w:p>
     <w:p>
@@ -7132,7 +7132,7 @@
           <w:b/>
           <w:bCs/>
         </w:rPr>
-        <w:t xml:space="preserve">Neha:</w:t>
+        <w:t xml:space="preserve">Emily:</w:t>
       </w:r>
       <w:r>
         <w:t xml:space="preserve"> Aur usse kharcha kitna badha?</w:t>
@@ -7173,7 +7173,7 @@
         <w:spacing w:after="140"/>
       </w:pPr>
       <w:r>
-        <w:t xml:space="preserve">Neha can click any line to hear that part again.</w:t>
+        <w:t xml:space="preserve">Emily can click any line to hear that part again.</w:t>
       </w:r>
     </w:p>
     <w:p>
@@ -7674,7 +7674,7 @@
       <w:r>
         <w:t xml:space="preserve">Your notes are private unless you share them. Your data is encrypted and stays in the region you choose. Lynkk never uses your recordings to train AI. </w:t>
       </w:r>
-      <w:hyperlink w:history="1" r:id="rIdxt2t0420zym8vbipiztwa">
+      <w:hyperlink w:history="1" r:id="rIdvzkhy4qrbw8opjec36oov">
         <w:r>
           <w:rPr>
             <w:rStyle w:val="Hyperlink"/>
@@ -7896,7 +7896,7 @@
       <w:pPr>
         <w:spacing w:after="140"/>
       </w:pPr>
-      <w:hyperlink w:history="1" r:id="rIdjiwfcflzgji-fdica4p9k">
+      <w:hyperlink w:history="1" r:id="rIdwhx3uom3acnjslr1iejyk">
         <w:r>
           <w:rPr>
             <w:rStyle w:val="Hyperlink"/>
@@ -8018,7 +8018,7 @@
         <w:pStyle w:val="Heading3"/>
       </w:pPr>
       <w:r>
-        <w:t xml:space="preserve">Be like Neha. Record anywhere, read it later.</w:t>
+        <w:t xml:space="preserve">Be like Emily. Record anywhere, read it later.</w:t>
       </w:r>
     </w:p>
     <w:p>
@@ -8845,7 +8845,7 @@
         <w:pStyle w:val="Heading3"/>
       </w:pPr>
       <w:r>
-        <w:t xml:space="preserve">Meet Rohan</w:t>
+        <w:t xml:space="preserve">Meet Ethan</w:t>
       </w:r>
     </w:p>
     <w:p>
@@ -8857,15 +8857,15 @@
           <w:i/>
           <w:iCs/>
         </w:rPr>
-        <w:t xml:space="preserve">Rohan is an example. But you may know someone just like him.</w:t>
-      </w:r>
-    </w:p>
-    <w:p>
-      <w:pPr>
-        <w:spacing w:after="140"/>
-      </w:pPr>
-      <w:r>
-        <w:t xml:space="preserve">Rohan is in his second year of college. He has a 90-minute economics class every Monday. The teacher talks fast and explains a lot with examples.</w:t>
+        <w:t xml:space="preserve">Ethan is an example. But you may know someone just like him.</w:t>
+      </w:r>
+    </w:p>
+    <w:p>
+      <w:pPr>
+        <w:spacing w:after="140"/>
+      </w:pPr>
+      <w:r>
+        <w:t xml:space="preserve">Ethan is in his second year of college. He has a 90-minute economics class every Monday. The teacher talks fast and explains a lot with examples.</w:t>
       </w:r>
     </w:p>
     <w:p>
@@ -8873,15 +8873,15 @@
         <w:pStyle w:val="Heading3"/>
       </w:pPr>
       <w:r>
-        <w:t xml:space="preserve">Rohan's problem</w:t>
-      </w:r>
-    </w:p>
-    <w:p>
-      <w:pPr>
-        <w:spacing w:after="140"/>
-      </w:pPr>
-      <w:r>
-        <w:t xml:space="preserve">Rohan can either write or listen. He can't do both.</w:t>
+        <w:t xml:space="preserve">Ethan's problem</w:t>
+      </w:r>
+    </w:p>
+    <w:p>
+      <w:pPr>
+        <w:spacing w:after="140"/>
+      </w:pPr>
+      <w:r>
+        <w:t xml:space="preserve">Ethan can either write or listen. He can't do both.</w:t>
       </w:r>
     </w:p>
     <w:p>
@@ -8897,27 +8897,27 @@
         <w:pStyle w:val="Heading3"/>
       </w:pPr>
       <w:r>
-        <w:t xml:space="preserve">How Lynkk helps Rohan record lectures</w:t>
-      </w:r>
-    </w:p>
-    <w:p>
-      <w:pPr>
-        <w:spacing w:after="140"/>
-      </w:pPr>
-      <w:r>
-        <w:t xml:space="preserve">Rohan asks his teacher if he can record, and the teacher says yes. Then he starts using Lynkk.</w:t>
-      </w:r>
-    </w:p>
-    <w:p>
-      <w:pPr>
-        <w:spacing w:after="140"/>
-      </w:pPr>
-      <w:r>
-        <w:rPr>
-          <w:b/>
-          <w:bCs/>
-        </w:rPr>
-        <w:t xml:space="preserve">In class, Rohan presses record.</w:t>
+        <w:t xml:space="preserve">How Lynkk helps Ethan record lectures</w:t>
+      </w:r>
+    </w:p>
+    <w:p>
+      <w:pPr>
+        <w:spacing w:after="140"/>
+      </w:pPr>
+      <w:r>
+        <w:t xml:space="preserve">Ethan asks his teacher if he can record, and the teacher says yes. Then he starts using Lynkk.</w:t>
+      </w:r>
+    </w:p>
+    <w:p>
+      <w:pPr>
+        <w:spacing w:after="140"/>
+      </w:pPr>
+      <w:r>
+        <w:rPr>
+          <w:b/>
+          <w:bCs/>
+        </w:rPr>
+        <w:t xml:space="preserve">In class, Ethan presses record.</w:t>
       </w:r>
       <w:r>
         <w:t xml:space="preserve"> He uses the Lynkk Mac app on his laptop. If the campus Wi-Fi is weak, that's fine. It uploads later.</w:t>
@@ -8932,7 +8932,7 @@
           <w:b/>
           <w:bCs/>
         </w:rPr>
-        <w:t xml:space="preserve">During class, Rohan just listens.</w:t>
+        <w:t xml:space="preserve">During class, Ethan just listens.</w:t>
       </w:r>
       <w:r>
         <w:t xml:space="preserve"> He follows the explanation and asks questions. He doesn't try to write everything down.</w:t>
@@ -8962,7 +8962,7 @@
           <w:b/>
           <w:bCs/>
         </w:rPr>
-        <w:t xml:space="preserve">Here is the note Lynkk wrote for Rohan (example)</w:t>
+        <w:t xml:space="preserve">Here is the note Lynkk wrote for Ethan (example)</w:t>
       </w:r>
     </w:p>
     <w:p>
@@ -9060,7 +9060,7 @@
         <w:spacing w:after="140"/>
       </w:pPr>
       <w:r>
-        <w:t xml:space="preserve">Before the exam, Rohan clicks "38:05" and hears the example again.</w:t>
+        <w:t xml:space="preserve">Before the exam, Ethan clicks "38:05" and hears the example again.</w:t>
       </w:r>
     </w:p>
     <w:p>
@@ -9543,7 +9543,7 @@
         <w:t xml:space="preserve">Many languages.</w:t>
       </w:r>
       <w:r>
-        <w:t xml:space="preserve"> English, Hindi, Hinglish and more.</w:t>
+        <w:t xml:space="preserve"> English, Spanish, Hindi and more.</w:t>
       </w:r>
     </w:p>
     <w:p>
@@ -9775,7 +9775,7 @@
       <w:pPr>
         <w:spacing w:after="140"/>
       </w:pPr>
-      <w:hyperlink w:history="1" r:id="rId5zmpzdvfszysxdgpu6tfk">
+      <w:hyperlink w:history="1" r:id="rIdk-bb3fmoeuiiri8t87fsk">
         <w:r>
           <w:rPr>
             <w:rStyle w:val="Hyperlink"/>
@@ -9897,7 +9897,7 @@
         <w:pStyle w:val="Heading3"/>
       </w:pPr>
       <w:r>
-        <w:t xml:space="preserve">Be like Rohan. Listen in class, and let Lynkk write.</w:t>
+        <w:t xml:space="preserve">Be like Ethan. Listen in class, and let Lynkk write.</w:t>
       </w:r>
     </w:p>
     <w:p>
@@ -10558,7 +10558,7 @@
         <w:pStyle w:val="Heading3"/>
       </w:pPr>
       <w:r>
-        <w:t xml:space="preserve">Meet Sara</w:t>
+        <w:t xml:space="preserve">Meet Sarah</w:t>
       </w:r>
     </w:p>
     <w:p>
@@ -10570,15 +10570,15 @@
           <w:i/>
           <w:iCs/>
         </w:rPr>
-        <w:t xml:space="preserve">Sara is an example. But you may know someone just like her.</w:t>
-      </w:r>
-    </w:p>
-    <w:p>
-      <w:pPr>
-        <w:spacing w:after="140"/>
-      </w:pPr>
-      <w:r>
-        <w:t xml:space="preserve">Sara is the marketing manager at Brightpath Software Ltd. She is rewriting the company website. She wants it to sound like the customers, not like the company.</w:t>
+        <w:t xml:space="preserve">Sarah is an example. But you may know someone just like her.</w:t>
+      </w:r>
+    </w:p>
+    <w:p>
+      <w:pPr>
+        <w:spacing w:after="140"/>
+      </w:pPr>
+      <w:r>
+        <w:t xml:space="preserve">Sarah is the marketing manager at Brightpath Software LLC She is rewriting the company website. She wants it to sound like the customers, not like the company.</w:t>
       </w:r>
     </w:p>
     <w:p>
@@ -10586,7 +10586,7 @@
         <w:pStyle w:val="Heading3"/>
       </w:pPr>
       <w:r>
-        <w:t xml:space="preserve">Sara's problem</w:t>
+        <w:t xml:space="preserve">Sarah's problem</w:t>
       </w:r>
     </w:p>
     <w:p>
@@ -10602,7 +10602,7 @@
         <w:spacing w:after="140"/>
       </w:pPr>
       <w:r>
-        <w:t xml:space="preserve">So Sara guesses. She writes "fast and easy to use" because it sounds good. She doesn't know what customers really say.</w:t>
+        <w:t xml:space="preserve">So Sarah guesses. She writes "fast and easy to use" because it sounds good. She doesn't know what customers really say.</w:t>
       </w:r>
     </w:p>
     <w:p>
@@ -10610,15 +10610,15 @@
         <w:pStyle w:val="Heading3"/>
       </w:pPr>
       <w:r>
-        <w:t xml:space="preserve">How Lynkk helps Sara find the voice of customer</w:t>
-      </w:r>
-    </w:p>
-    <w:p>
-      <w:pPr>
-        <w:spacing w:after="140"/>
-      </w:pPr>
-      <w:r>
-        <w:t xml:space="preserve">Sara's team starts recording customer calls with Lynkk. Here is what changes.</w:t>
+        <w:t xml:space="preserve">How Lynkk helps Sarah find the voice of customer</w:t>
+      </w:r>
+    </w:p>
+    <w:p>
+      <w:pPr>
+        <w:spacing w:after="140"/>
+      </w:pPr>
+      <w:r>
+        <w:t xml:space="preserve">Sarah's team starts recording customer calls with Lynkk. Here is what changes.</w:t>
       </w:r>
     </w:p>
     <w:p>
@@ -10645,7 +10645,7 @@
           <w:b/>
           <w:bCs/>
         </w:rPr>
-        <w:t xml:space="preserve">Then, Sara asks Lynkk one question.</w:t>
+        <w:t xml:space="preserve">Then, Sarah asks Lynkk one question.</w:t>
       </w:r>
       <w:r>
         <w:t xml:space="preserve"> "What stops customers from switching to us?"</w:t>
@@ -10663,19 +10663,19 @@
         <w:t xml:space="preserve">Lynkk answers from all the calls, with sources.</w:t>
       </w:r>
       <w:r>
-        <w:t xml:space="preserve"> Sara sees the answer, and exactly which calls it came from. She clicks to hear the customer say it.</w:t>
-      </w:r>
-    </w:p>
-    <w:p>
-      <w:pPr>
-        <w:spacing w:after="140"/>
-      </w:pPr>
-      <w:r>
-        <w:rPr>
-          <w:b/>
-          <w:bCs/>
-        </w:rPr>
-        <w:t xml:space="preserve">Here is the answer Lynkk gave Sara (example)</w:t>
+        <w:t xml:space="preserve"> Sarah sees the answer, and exactly which calls it came from. She clicks to hear the customer say it.</w:t>
+      </w:r>
+    </w:p>
+    <w:p>
+      <w:pPr>
+        <w:spacing w:after="140"/>
+      </w:pPr>
+      <w:r>
+        <w:rPr>
+          <w:b/>
+          <w:bCs/>
+        </w:rPr>
+        <w:t xml:space="preserve">Here is the answer Lynkk gave Sarah (example)</w:t>
       </w:r>
     </w:p>
     <w:p>
@@ -10720,15 +10720,15 @@
         <w:t xml:space="preserve">Where it came from:</w:t>
       </w:r>
       <w:r>
-        <w:t xml:space="preserve"> Call with a customer, 14:05 · Focus group, Pune, 22:40 · Customer interview, 09:12</w:t>
-      </w:r>
-    </w:p>
-    <w:p>
-      <w:pPr>
-        <w:spacing w:after="140"/>
-      </w:pPr>
-      <w:r>
-        <w:t xml:space="preserve">Sara now writes "We move your data for you" on the website, because that's what customers worry about.</w:t>
+        <w:t xml:space="preserve"> Call with a customer, 14:05 · Focus group, Austin, 22:40 · Customer interview, 09:12</w:t>
+      </w:r>
+    </w:p>
+    <w:p>
+      <w:pPr>
+        <w:spacing w:after="140"/>
+      </w:pPr>
+      <w:r>
+        <w:t xml:space="preserve">Sarah now writes "We move your data for you" on the website, because that's what customers worry about.</w:t>
       </w:r>
     </w:p>
     <w:p>
@@ -11189,7 +11189,7 @@
         <w:t xml:space="preserve">Many languages.</w:t>
       </w:r>
       <w:r>
-        <w:t xml:space="preserve"> English, Hindi, Hinglish and more.</w:t>
+        <w:t xml:space="preserve"> English, Spanish, Hindi and more.</w:t>
       </w:r>
     </w:p>
     <w:p>
@@ -11226,7 +11226,7 @@
       <w:r>
         <w:t xml:space="preserve">Notes are private unless you share them. Your data is encrypted and stays in the region you choose. Lynkk never uses your calls to train AI. </w:t>
       </w:r>
-      <w:hyperlink w:history="1" r:id="rIdc4-kzrsmfyxmlspv_fqtp">
+      <w:hyperlink w:history="1" r:id="rIdwcbzr0mnukxzrkws3ltjf">
         <w:r>
           <w:rPr>
             <w:rStyle w:val="Hyperlink"/>
@@ -11448,7 +11448,7 @@
       <w:pPr>
         <w:spacing w:after="140"/>
       </w:pPr>
-      <w:hyperlink w:history="1" r:id="rId3pj4a1qqdvpvh98zcofks">
+      <w:hyperlink w:history="1" r:id="rId7rwmo0ollmljmsgj_p3lz">
         <w:r>
           <w:rPr>
             <w:rStyle w:val="Hyperlink"/>
@@ -11570,7 +11570,7 @@
         <w:pStyle w:val="Heading3"/>
       </w:pPr>
       <w:r>
-        <w:t xml:space="preserve">Be like Sara. Write in your customers' own words.</w:t>
+        <w:t xml:space="preserve">Be like Sarah. Write in your customers' own words.</w:t>
       </w:r>
     </w:p>
     <w:p>
@@ -12231,7 +12231,7 @@
         <w:pStyle w:val="Heading3"/>
       </w:pPr>
       <w:r>
-        <w:t xml:space="preserve">Meet Anita</w:t>
+        <w:t xml:space="preserve">Meet Laura</w:t>
       </w:r>
     </w:p>
     <w:p>
@@ -12243,15 +12243,15 @@
           <w:i/>
           <w:iCs/>
         </w:rPr>
-        <w:t xml:space="preserve">Anita is an example. But you may know someone just like her.</w:t>
-      </w:r>
-    </w:p>
-    <w:p>
-      <w:pPr>
-        <w:spacing w:after="140"/>
-      </w:pPr>
-      <w:r>
-        <w:t xml:space="preserve">Anita is a lawyer at Clearwater Legal LLP. Today a new client comes to her office. The client's landlord wants them to leave, and the client is worried.</w:t>
+        <w:t xml:space="preserve">Laura is an example. But you may know someone just like her.</w:t>
+      </w:r>
+    </w:p>
+    <w:p>
+      <w:pPr>
+        <w:spacing w:after="140"/>
+      </w:pPr>
+      <w:r>
+        <w:t xml:space="preserve">Laura is a lawyer at Clearwater Legal LLP. Today a new client comes to her office. The client's landlord wants them to leave, and the client is worried.</w:t>
       </w:r>
     </w:p>
     <w:p>
@@ -12259,15 +12259,15 @@
         <w:pStyle w:val="Heading3"/>
       </w:pPr>
       <w:r>
-        <w:t xml:space="preserve">Anita's problem</w:t>
-      </w:r>
-    </w:p>
-    <w:p>
-      <w:pPr>
-        <w:spacing w:after="140"/>
-      </w:pPr>
-      <w:r>
-        <w:t xml:space="preserve">The client talks fast and shares many details: dates, emails, payments. Anita needs every fact.</w:t>
+        <w:t xml:space="preserve">Laura's problem</w:t>
+      </w:r>
+    </w:p>
+    <w:p>
+      <w:pPr>
+        <w:spacing w:after="140"/>
+      </w:pPr>
+      <w:r>
+        <w:t xml:space="preserve">The client talks fast and shares many details: dates, emails, payments. Laura needs every fact.</w:t>
       </w:r>
     </w:p>
     <w:p>
@@ -12283,42 +12283,42 @@
         <w:pStyle w:val="Heading3"/>
       </w:pPr>
       <w:r>
-        <w:t xml:space="preserve">How Lynkk helps Anita in client meetings</w:t>
-      </w:r>
-    </w:p>
-    <w:p>
-      <w:pPr>
-        <w:spacing w:after="140"/>
-      </w:pPr>
-      <w:r>
-        <w:t xml:space="preserve">Anita starts using Lynkk. Here is what changes.</w:t>
-      </w:r>
-    </w:p>
-    <w:p>
-      <w:pPr>
-        <w:spacing w:after="140"/>
-      </w:pPr>
-      <w:r>
-        <w:rPr>
-          <w:b/>
-          <w:bCs/>
-        </w:rPr>
-        <w:t xml:space="preserve">Before the meeting, Anita asks the client.</w:t>
-      </w:r>
-      <w:r>
-        <w:t xml:space="preserve"> "May I record this, so I don't miss anything?" The client agrees. Anita records with the Lynkk Mac app on her desk.</w:t>
-      </w:r>
-    </w:p>
-    <w:p>
-      <w:pPr>
-        <w:spacing w:after="140"/>
-      </w:pPr>
-      <w:r>
-        <w:rPr>
-          <w:b/>
-          <w:bCs/>
-        </w:rPr>
-        <w:t xml:space="preserve">During the meeting, Anita just listens.</w:t>
+        <w:t xml:space="preserve">How Lynkk helps Laura in client meetings</w:t>
+      </w:r>
+    </w:p>
+    <w:p>
+      <w:pPr>
+        <w:spacing w:after="140"/>
+      </w:pPr>
+      <w:r>
+        <w:t xml:space="preserve">Laura starts using Lynkk. Here is what changes.</w:t>
+      </w:r>
+    </w:p>
+    <w:p>
+      <w:pPr>
+        <w:spacing w:after="140"/>
+      </w:pPr>
+      <w:r>
+        <w:rPr>
+          <w:b/>
+          <w:bCs/>
+        </w:rPr>
+        <w:t xml:space="preserve">Before the meeting, Laura asks the client.</w:t>
+      </w:r>
+      <w:r>
+        <w:t xml:space="preserve"> "May I record this, so I don't miss anything?" The client agrees. Laura records with the Lynkk Mac app on her desk.</w:t>
+      </w:r>
+    </w:p>
+    <w:p>
+      <w:pPr>
+        <w:spacing w:after="140"/>
+      </w:pPr>
+      <w:r>
+        <w:rPr>
+          <w:b/>
+          <w:bCs/>
+        </w:rPr>
+        <w:t xml:space="preserve">During the meeting, Laura just listens.</w:t>
       </w:r>
       <w:r>
         <w:t xml:space="preserve"> She looks at her client. She asks better questions. She notices what the client is worried about.</w:t>
@@ -12348,7 +12348,7 @@
           <w:b/>
           <w:bCs/>
         </w:rPr>
-        <w:t xml:space="preserve">Here is the note Lynkk wrote for Anita (example)</w:t>
+        <w:t xml:space="preserve">Here is the note Lynkk wrote for Laura (example)</w:t>
       </w:r>
     </w:p>
     <w:p>
@@ -12405,15 +12405,15 @@
         <w:t xml:space="preserve">Next step:</w:t>
       </w:r>
       <w:r>
-        <w:t xml:space="preserve"> Send the engagement letter. Who: Anita. When: Friday.</w:t>
-      </w:r>
-    </w:p>
-    <w:p>
-      <w:pPr>
-        <w:spacing w:after="140"/>
-      </w:pPr>
-      <w:r>
-        <w:t xml:space="preserve">Anita can click any line to hear exactly what the client said.</w:t>
+        <w:t xml:space="preserve"> Send the engagement letter. Who: Laura. When: Friday.</w:t>
+      </w:r>
+    </w:p>
+    <w:p>
+      <w:pPr>
+        <w:spacing w:after="140"/>
+      </w:pPr>
+      <w:r>
+        <w:t xml:space="preserve">Laura can click any line to hear exactly what the client said.</w:t>
       </w:r>
     </w:p>
     <w:p>
@@ -12914,7 +12914,7 @@
       <w:r>
         <w:t xml:space="preserve">Notes are private unless you share them. Your data is encrypted. Lynkk never uses your meetings to train AI. </w:t>
       </w:r>
-      <w:hyperlink w:history="1" r:id="rIdhdh9s9jyvoyfewoshj5gu">
+      <w:hyperlink w:history="1" r:id="rIdkvh-gmlwbv0hbrsgsfr4a">
         <w:r>
           <w:rPr>
             <w:rStyle w:val="Hyperlink"/>
@@ -13136,7 +13136,7 @@
       <w:pPr>
         <w:spacing w:after="140"/>
       </w:pPr>
-      <w:hyperlink w:history="1" r:id="rIddfvqtryflr9knuxuppj2c">
+      <w:hyperlink w:history="1" r:id="rIdh9peiz9jjrrxeb2egci36">
         <w:r>
           <w:rPr>
             <w:rStyle w:val="Hyperlink"/>
@@ -13172,7 +13172,7 @@
       <w:r>
         <w:t xml:space="preserve">No. Lynkk writes notes and text for your own work. It isn't a certified court transcript. See our guide to </w:t>
       </w:r>
-      <w:hyperlink w:history="1" r:id="rIdskk4ga5wvczmemm9bfdqz">
+      <w:hyperlink w:history="1" r:id="rIdion1jqpdrcsfp5o5xlpff">
         <w:r>
           <w:rPr>
             <w:rStyle w:val="Hyperlink"/>
@@ -13269,7 +13269,7 @@
         <w:pStyle w:val="Heading3"/>
       </w:pPr>
       <w:r>
-        <w:t xml:space="preserve">Be like Anita. Look at your client, not your notepad.</w:t>
+        <w:t xml:space="preserve">Be like Laura. Look at your client, not your notepad.</w:t>
       </w:r>
     </w:p>
     <w:p>
@@ -13950,7 +13950,7 @@
         <w:spacing w:after="140"/>
       </w:pPr>
       <w:r>
-        <w:t xml:space="preserve">Sam is a team manager at Bluebird Apps Ltd. He has eight people on his team. Every week he has a 1 on 1 meeting with each of them. That's eight conversations about work, problems and goals.</w:t>
+        <w:t xml:space="preserve">Sam is a team manager at Bluebird Apps LLC He has eight people on his team. Every week he has a 1 on 1 meeting with each of them. That's eight conversations about work, problems and goals.</w:t>
       </w:r>
     </w:p>
     <w:p>
@@ -13966,15 +13966,15 @@
         <w:spacing w:after="140"/>
       </w:pPr>
       <w:r>
-        <w:t xml:space="preserve">Last month, Sam promised Leena he would book a design review for her. Then he forgot.</w:t>
-      </w:r>
-    </w:p>
-    <w:p>
-      <w:pPr>
-        <w:spacing w:after="140"/>
-      </w:pPr>
-      <w:r>
-        <w:t xml:space="preserve">In this week's 1 on 1, Leena asks about it. Sam doesn't remember promising. Leena feels unheard. Sam feels bad. With eight people, small promises are easy to lose.</w:t>
+        <w:t xml:space="preserve">Last month, Sam promised Olivia he would book a design review for her. Then he forgot.</w:t>
+      </w:r>
+    </w:p>
+    <w:p>
+      <w:pPr>
+        <w:spacing w:after="140"/>
+      </w:pPr>
+      <w:r>
+        <w:t xml:space="preserve">In this week's 1 on 1, Olivia asks about it. Sam doesn't remember promising. Olivia feels unheard. Sam feels bad. With eight people, small promises are easy to lose.</w:t>
       </w:r>
     </w:p>
     <w:p>
@@ -14005,7 +14005,7 @@
         <w:t xml:space="preserve">Before the 1:1, Sam asks Lynkk.</w:t>
       </w:r>
       <w:r>
-        <w:t xml:space="preserve"> "What did Leena and I agree last month?" Lynkk shows the answer, with a link to the moment it was said.</w:t>
+        <w:t xml:space="preserve"> "What did Olivia and I agree last month?" Lynkk shows the answer, with a link to the moment it was said.</w:t>
       </w:r>
     </w:p>
     <w:p>
@@ -14020,7 +14020,7 @@
         <w:t xml:space="preserve">During the 1:1, Sam just listens.</w:t>
       </w:r>
       <w:r>
-        <w:t xml:space="preserve"> He doesn't type. He pays attention to how Leena feels, not just what she says.</w:t>
+        <w:t xml:space="preserve"> He doesn't type. He pays attention to how Olivia feels, not just what she says.</w:t>
       </w:r>
     </w:p>
     <w:p>
@@ -14059,7 +14059,7 @@
           <w:b/>
           <w:bCs/>
         </w:rPr>
-        <w:t xml:space="preserve">Weekly 1:1 with Leena · Google Meet · 28 min</w:t>
+        <w:t xml:space="preserve">Weekly 1:1 with Olivia · Google Meet · 28 min</w:t>
       </w:r>
     </w:p>
     <w:p>
@@ -14104,7 +14104,7 @@
         <w:t xml:space="preserve">Tasks:</w:t>
       </w:r>
       <w:r>
-        <w:t xml:space="preserve"> Book a design review. Who: Sam. When: Wednesday. · Write the goals for next quarter. Who: Leena. When: Friday.</w:t>
+        <w:t xml:space="preserve"> Book a design review. Who: Sam. When: Wednesday. · Write the goals for next quarter. Who: Olivia. When: Friday.</w:t>
       </w:r>
     </w:p>
     <w:p>
@@ -14119,7 +14119,7 @@
         <w:t xml:space="preserve">Still open:</w:t>
       </w:r>
       <w:r>
-        <w:t xml:space="preserve"> Is Leena ready to lead the next release?</w:t>
+        <w:t xml:space="preserve"> Is Olivia ready to lead the next release?</w:t>
       </w:r>
     </w:p>
     <w:p>
@@ -14129,7 +14129,7 @@
       <w:r>
         <w:t xml:space="preserve">New to 1:1s? Read our guide to the </w:t>
       </w:r>
-      <w:hyperlink w:history="1" r:id="rIda7_g-vdjwodnduqkhebw-">
+      <w:hyperlink w:history="1" r:id="rIdvlntdyj3vd1qtwscc2t5j">
         <w:r>
           <w:rPr>
             <w:rStyle w:val="Hyperlink"/>
@@ -14639,7 +14639,7 @@
       <w:r>
         <w:t xml:space="preserve">1:1 notes are private unless you share them. Your data is encrypted and stays in the region you choose. Lynkk never uses your meetings to train AI. </w:t>
       </w:r>
-      <w:hyperlink w:history="1" r:id="rIdseodgjvx1fplrg3hm3fne">
+      <w:hyperlink w:history="1" r:id="rIdm4earmwjcofszoexkjmno">
         <w:r>
           <w:rPr>
             <w:rStyle w:val="Hyperlink"/>
@@ -14861,7 +14861,7 @@
       <w:pPr>
         <w:spacing w:after="140"/>
       </w:pPr>
-      <w:hyperlink w:history="1" r:id="rIdqr__z5vh0xz85yogajc0q">
+      <w:hyperlink w:history="1" r:id="rIdodk5dyyslhtk9kfcucebp">
         <w:r>
           <w:rPr>
             <w:rStyle w:val="Hyperlink"/>
@@ -15644,7 +15644,7 @@
         <w:pStyle w:val="Heading3"/>
       </w:pPr>
       <w:r>
-        <w:t xml:space="preserve">Meet Ravi</w:t>
+        <w:t xml:space="preserve">Meet Chris</w:t>
       </w:r>
     </w:p>
     <w:p>
@@ -15656,15 +15656,15 @@
           <w:i/>
           <w:iCs/>
         </w:rPr>
-        <w:t xml:space="preserve">Ravi is an example. But you may know someone just like him.</w:t>
-      </w:r>
-    </w:p>
-    <w:p>
-      <w:pPr>
-        <w:spacing w:after="140"/>
-      </w:pPr>
-      <w:r>
-        <w:t xml:space="preserve">Ravi is a real estate agent at Skyline Homes Ltd. This month he is helping ten families find a new home. Each family has a budget, a wish list and lots of questions.</w:t>
+        <w:t xml:space="preserve">Chris is an example. But you may know someone just like him.</w:t>
+      </w:r>
+    </w:p>
+    <w:p>
+      <w:pPr>
+        <w:spacing w:after="140"/>
+      </w:pPr>
+      <w:r>
+        <w:t xml:space="preserve">Chris is a real estate agent at Skyline Homes Realty LLC This month he is helping ten families find a new home. Each family has a budget, a wish list and lots of questions.</w:t>
       </w:r>
     </w:p>
     <w:p>
@@ -15672,23 +15672,23 @@
         <w:pStyle w:val="Heading3"/>
       </w:pPr>
       <w:r>
-        <w:t xml:space="preserve">Ravi's problem</w:t>
-      </w:r>
-    </w:p>
-    <w:p>
-      <w:pPr>
-        <w:spacing w:after="140"/>
-      </w:pPr>
-      <w:r>
-        <w:t xml:space="preserve">The Kapoor family told Ravi they need a school nearby. Another family wants a big garden. Another needs two parking spots.</w:t>
-      </w:r>
-    </w:p>
-    <w:p>
-      <w:pPr>
-        <w:spacing w:after="140"/>
-      </w:pPr>
-      <w:r>
-        <w:t xml:space="preserve">After many calls, Ravi mixes them up. He sends the Kapoors a house with a garden but no school nearby. They are disappointed. Ravi looks like he wasn't listening, but he just couldn't remember everything.</w:t>
+        <w:t xml:space="preserve">Chris's problem</w:t>
+      </w:r>
+    </w:p>
+    <w:p>
+      <w:pPr>
+        <w:spacing w:after="140"/>
+      </w:pPr>
+      <w:r>
+        <w:t xml:space="preserve">The Johnson family told Chris they need a school nearby. Another family wants a big garden. Another needs two parking spots.</w:t>
+      </w:r>
+    </w:p>
+    <w:p>
+      <w:pPr>
+        <w:spacing w:after="140"/>
+      </w:pPr>
+      <w:r>
+        <w:t xml:space="preserve">After many calls, Chris mixes them up. He sends the Johnsons a house with a garden but no school nearby. They are disappointed. Chris looks like he wasn't listening, but he just couldn't remember everything.</w:t>
       </w:r>
     </w:p>
     <w:p>
@@ -15696,42 +15696,42 @@
         <w:pStyle w:val="Heading3"/>
       </w:pPr>
       <w:r>
-        <w:t xml:space="preserve">How Lynkk helps Ravi remember every client</w:t>
-      </w:r>
-    </w:p>
-    <w:p>
-      <w:pPr>
-        <w:spacing w:after="140"/>
-      </w:pPr>
-      <w:r>
-        <w:t xml:space="preserve">Ravi starts using Lynkk. Here is what changes.</w:t>
-      </w:r>
-    </w:p>
-    <w:p>
-      <w:pPr>
-        <w:spacing w:after="140"/>
-      </w:pPr>
-      <w:r>
-        <w:rPr>
-          <w:b/>
-          <w:bCs/>
-        </w:rPr>
-        <w:t xml:space="preserve">Before the meeting, Ravi asks the client.</w:t>
-      </w:r>
-      <w:r>
-        <w:t xml:space="preserve"> "May I record this, so I get every detail right?" The Kapoors agree.</w:t>
-      </w:r>
-    </w:p>
-    <w:p>
-      <w:pPr>
-        <w:spacing w:after="140"/>
-      </w:pPr>
-      <w:r>
-        <w:rPr>
-          <w:b/>
-          <w:bCs/>
-        </w:rPr>
-        <w:t xml:space="preserve">During the meeting, Ravi just listens.</w:t>
+        <w:t xml:space="preserve">How Lynkk helps Chris remember every client</w:t>
+      </w:r>
+    </w:p>
+    <w:p>
+      <w:pPr>
+        <w:spacing w:after="140"/>
+      </w:pPr>
+      <w:r>
+        <w:t xml:space="preserve">Chris starts using Lynkk. Here is what changes.</w:t>
+      </w:r>
+    </w:p>
+    <w:p>
+      <w:pPr>
+        <w:spacing w:after="140"/>
+      </w:pPr>
+      <w:r>
+        <w:rPr>
+          <w:b/>
+          <w:bCs/>
+        </w:rPr>
+        <w:t xml:space="preserve">Before the meeting, Chris asks the client.</w:t>
+      </w:r>
+      <w:r>
+        <w:t xml:space="preserve"> "May I record this, so I get every detail right?" The Johnsons agree.</w:t>
+      </w:r>
+    </w:p>
+    <w:p>
+      <w:pPr>
+        <w:spacing w:after="140"/>
+      </w:pPr>
+      <w:r>
+        <w:rPr>
+          <w:b/>
+          <w:bCs/>
+        </w:rPr>
+        <w:t xml:space="preserve">During the meeting, Chris just listens.</w:t>
       </w:r>
       <w:r>
         <w:t xml:space="preserve"> He records with the Lynkk Mac app in his office, or on a video call. He doesn't write anything down.</w:t>
@@ -15749,31 +15749,31 @@
         <w:t xml:space="preserve">After the meeting, the note is ready.</w:t>
       </w:r>
       <w:r>
-        <w:t xml:space="preserve"> Lynkk writes the budget, the must-haves, and Ravi's next steps with dates.</w:t>
-      </w:r>
-    </w:p>
-    <w:p>
-      <w:pPr>
-        <w:spacing w:after="140"/>
-      </w:pPr>
-      <w:r>
-        <w:rPr>
-          <w:b/>
-          <w:bCs/>
-        </w:rPr>
-        <w:t xml:space="preserve">Here is the note Lynkk wrote for Ravi (example)</w:t>
-      </w:r>
-    </w:p>
-    <w:p>
-      <w:pPr>
-        <w:spacing w:after="140"/>
-      </w:pPr>
-      <w:r>
-        <w:rPr>
-          <w:b/>
-          <w:bCs/>
-        </w:rPr>
-        <w:t xml:space="preserve">Meeting with the Kapoors · In the office · 34 min</w:t>
+        <w:t xml:space="preserve"> Lynkk writes the budget, the must-haves, and Chris's next steps with dates.</w:t>
+      </w:r>
+    </w:p>
+    <w:p>
+      <w:pPr>
+        <w:spacing w:after="140"/>
+      </w:pPr>
+      <w:r>
+        <w:rPr>
+          <w:b/>
+          <w:bCs/>
+        </w:rPr>
+        <w:t xml:space="preserve">Here is the note Lynkk wrote for Chris (example)</w:t>
+      </w:r>
+    </w:p>
+    <w:p>
+      <w:pPr>
+        <w:spacing w:after="140"/>
+      </w:pPr>
+      <w:r>
+        <w:rPr>
+          <w:b/>
+          <w:bCs/>
+        </w:rPr>
+        <w:t xml:space="preserve">Meeting with the Johnsons · In the office · 34 min</w:t>
       </w:r>
     </w:p>
     <w:p>
@@ -15788,7 +15788,7 @@
         <w:t xml:space="preserve">Budget and area:</w:t>
       </w:r>
       <w:r>
-        <w:t xml:space="preserve"> Up to 1.2 crore. Close to the metro line.</w:t>
+        <w:t xml:space="preserve"> Up to $650,000. Close to the train station.</w:t>
       </w:r>
     </w:p>
     <w:p>
@@ -15803,7 +15803,7 @@
         <w:t xml:space="preserve">Must-haves:</w:t>
       </w:r>
       <w:r>
-        <w:t xml:space="preserve"> 3 bedrooms. A school within 2 km. Parking for two cars.</w:t>
+        <w:t xml:space="preserve"> 3 bedrooms. A school within 1 mile. Parking for two cars.</w:t>
       </w:r>
     </w:p>
     <w:p>
@@ -15818,15 +15818,15 @@
         <w:t xml:space="preserve">Next steps:</w:t>
       </w:r>
       <w:r>
-        <w:t xml:space="preserve"> Send 5 listings. Who: Ravi. When: Thursday. · Book Saturday viewings. Who: Ravi. When: Friday.</w:t>
-      </w:r>
-    </w:p>
-    <w:p>
-      <w:pPr>
-        <w:spacing w:after="140"/>
-      </w:pPr>
-      <w:r>
-        <w:t xml:space="preserve">Next week, Ravi asks Lynkk, "What did the Kapoors say about schools?" and gets the answer in seconds.</w:t>
+        <w:t xml:space="preserve"> Send 5 listings. Who: Chris. When: Thursday. · Book Saturday viewings. Who: Chris. When: Friday.</w:t>
+      </w:r>
+    </w:p>
+    <w:p>
+      <w:pPr>
+        <w:spacing w:after="140"/>
+      </w:pPr>
+      <w:r>
+        <w:t xml:space="preserve">Next week, Chris asks Lynkk, "What did the Johnsons say about schools?" and gets the answer in seconds.</w:t>
       </w:r>
     </w:p>
     <w:p>
@@ -16260,7 +16260,7 @@
         <w:t xml:space="preserve">Talk in any language.</w:t>
       </w:r>
       <w:r>
-        <w:t xml:space="preserve"> Hindi, Hinglish, English and more.</w:t>
+        <w:t xml:space="preserve"> English, Spanish, Hindi and more.</w:t>
       </w:r>
     </w:p>
     <w:p>
@@ -16335,7 +16335,7 @@
       <w:r>
         <w:t xml:space="preserve">Notes are private unless you share them. Your data is encrypted and stays in the region you choose. Lynkk never uses your calls to train AI. </w:t>
       </w:r>
-      <w:hyperlink w:history="1" r:id="rIdg2beesaouwt7z6bmewaco">
+      <w:hyperlink w:history="1" r:id="rIdvoaobxkkkwoegkuxjxcxz">
         <w:r>
           <w:rPr>
             <w:rStyle w:val="Hyperlink"/>
@@ -16557,7 +16557,7 @@
       <w:pPr>
         <w:spacing w:after="140"/>
       </w:pPr>
-      <w:hyperlink w:history="1" r:id="rIdqdzxog_g4f-vc1j7dtqnm">
+      <w:hyperlink w:history="1" r:id="rIdgtsczofrygg9qzya5dzjr">
         <w:r>
           <w:rPr>
             <w:rStyle w:val="Hyperlink"/>
@@ -16679,7 +16679,7 @@
         <w:pStyle w:val="Heading3"/>
       </w:pPr>
       <w:r>
-        <w:t xml:space="preserve">Be like Ravi. Never forget a client's must-have again.</w:t>
+        <w:t xml:space="preserve">Be like Chris. Never forget a client's must-have again.</w:t>
       </w:r>
     </w:p>
     <w:p>
@@ -17423,7 +17423,7 @@
         <w:pStyle w:val="Heading3"/>
       </w:pPr>
       <w:r>
-        <w:t xml:space="preserve">Meet Karan</w:t>
+        <w:t xml:space="preserve">Meet David</w:t>
       </w:r>
     </w:p>
     <w:p>
@@ -17435,15 +17435,15 @@
           <w:i/>
           <w:iCs/>
         </w:rPr>
-        <w:t xml:space="preserve">Karan is an example. But you may know someone just like him.</w:t>
-      </w:r>
-    </w:p>
-    <w:p>
-      <w:pPr>
-        <w:spacing w:after="140"/>
-      </w:pPr>
-      <w:r>
-        <w:t xml:space="preserve">Karan is a financial advisor at Northstar Wealth Ltd. Once a year, he sits down with each family to review their money and their plans.</w:t>
+        <w:t xml:space="preserve">David is an example. But you may know someone just like him.</w:t>
+      </w:r>
+    </w:p>
+    <w:p>
+      <w:pPr>
+        <w:spacing w:after="140"/>
+      </w:pPr>
+      <w:r>
+        <w:t xml:space="preserve">David is a financial advisor at Northstar Wealth LLC Once a year, he sits down with each family to review their money and their plans.</w:t>
       </w:r>
     </w:p>
     <w:p>
@@ -17451,23 +17451,23 @@
         <w:pStyle w:val="Heading3"/>
       </w:pPr>
       <w:r>
-        <w:t xml:space="preserve">Karan's problem</w:t>
-      </w:r>
-    </w:p>
-    <w:p>
-      <w:pPr>
-        <w:spacing w:after="140"/>
-      </w:pPr>
-      <w:r>
-        <w:t xml:space="preserve">Today he meets the Shah family. They talk about retiring early, saving for their daughter's university, and Meera's new job.</w:t>
-      </w:r>
-    </w:p>
-    <w:p>
-      <w:pPr>
-        <w:spacing w:after="140"/>
-      </w:pPr>
-      <w:r>
-        <w:t xml:space="preserve">There are many numbers and many changes. Karan writes notes while they talk. Next year, before the review, he digs through old notes and can't find what they said about retirement.</w:t>
+        <w:t xml:space="preserve">David's problem</w:t>
+      </w:r>
+    </w:p>
+    <w:p>
+      <w:pPr>
+        <w:spacing w:after="140"/>
+      </w:pPr>
+      <w:r>
+        <w:t xml:space="preserve">Today he meets the Miller family. They talk about retiring early, saving for their daughter's college, and Jennifer's new job.</w:t>
+      </w:r>
+    </w:p>
+    <w:p>
+      <w:pPr>
+        <w:spacing w:after="140"/>
+      </w:pPr>
+      <w:r>
+        <w:t xml:space="preserve">There are many numbers and many changes. David writes notes while they talk. Next year, before the review, he digs through old notes and can't find what they said about retirement.</w:t>
       </w:r>
     </w:p>
     <w:p>
@@ -17475,42 +17475,42 @@
         <w:pStyle w:val="Heading3"/>
       </w:pPr>
       <w:r>
-        <w:t xml:space="preserve">How Lynkk helps Karan with client reviews</w:t>
-      </w:r>
-    </w:p>
-    <w:p>
-      <w:pPr>
-        <w:spacing w:after="140"/>
-      </w:pPr>
-      <w:r>
-        <w:t xml:space="preserve">Karan starts using Lynkk. Here is what changes.</w:t>
-      </w:r>
-    </w:p>
-    <w:p>
-      <w:pPr>
-        <w:spacing w:after="140"/>
-      </w:pPr>
-      <w:r>
-        <w:rPr>
-          <w:b/>
-          <w:bCs/>
-        </w:rPr>
-        <w:t xml:space="preserve">Before the meeting, Karan asks the family.</w:t>
-      </w:r>
-      <w:r>
-        <w:t xml:space="preserve"> "May I record this, so I don't miss any details?" The Shahs agree.</w:t>
-      </w:r>
-    </w:p>
-    <w:p>
-      <w:pPr>
-        <w:spacing w:after="140"/>
-      </w:pPr>
-      <w:r>
-        <w:rPr>
-          <w:b/>
-          <w:bCs/>
-        </w:rPr>
-        <w:t xml:space="preserve">During the meeting, Karan just listens.</w:t>
+        <w:t xml:space="preserve">How Lynkk helps David with client reviews</w:t>
+      </w:r>
+    </w:p>
+    <w:p>
+      <w:pPr>
+        <w:spacing w:after="140"/>
+      </w:pPr>
+      <w:r>
+        <w:t xml:space="preserve">David starts using Lynkk. Here is what changes.</w:t>
+      </w:r>
+    </w:p>
+    <w:p>
+      <w:pPr>
+        <w:spacing w:after="140"/>
+      </w:pPr>
+      <w:r>
+        <w:rPr>
+          <w:b/>
+          <w:bCs/>
+        </w:rPr>
+        <w:t xml:space="preserve">Before the meeting, David asks the family.</w:t>
+      </w:r>
+      <w:r>
+        <w:t xml:space="preserve"> "May I record this, so I don't miss any details?" The Millers agree.</w:t>
+      </w:r>
+    </w:p>
+    <w:p>
+      <w:pPr>
+        <w:spacing w:after="140"/>
+      </w:pPr>
+      <w:r>
+        <w:rPr>
+          <w:b/>
+          <w:bCs/>
+        </w:rPr>
+        <w:t xml:space="preserve">During the meeting, David just listens.</w:t>
       </w:r>
       <w:r>
         <w:t xml:space="preserve"> He records on Zoom or in his office. He looks at the family, not his notebook.</w:t>
@@ -17540,19 +17540,19 @@
           <w:b/>
           <w:bCs/>
         </w:rPr>
-        <w:t xml:space="preserve">Here is the note Lynkk wrote for Karan (example)</w:t>
-      </w:r>
-    </w:p>
-    <w:p>
-      <w:pPr>
-        <w:spacing w:after="140"/>
-      </w:pPr>
-      <w:r>
-        <w:rPr>
-          <w:b/>
-          <w:bCs/>
-        </w:rPr>
-        <w:t xml:space="preserve">Annual review, the Shahs · Zoom · 46 min</w:t>
+        <w:t xml:space="preserve">Here is the note Lynkk wrote for David (example)</w:t>
+      </w:r>
+    </w:p>
+    <w:p>
+      <w:pPr>
+        <w:spacing w:after="140"/>
+      </w:pPr>
+      <w:r>
+        <w:rPr>
+          <w:b/>
+          <w:bCs/>
+        </w:rPr>
+        <w:t xml:space="preserve">Annual review, the Millers · Zoom · 46 min</w:t>
       </w:r>
     </w:p>
     <w:p>
@@ -17567,7 +17567,7 @@
         <w:t xml:space="preserve">Goals:</w:t>
       </w:r>
       <w:r>
-        <w:t xml:space="preserve"> Retire at 58. Pay for their daughter's university in 2029.</w:t>
+        <w:t xml:space="preserve"> Retire at 58. Pay for their daughter's college in 2029.</w:t>
       </w:r>
     </w:p>
     <w:p>
@@ -17582,7 +17582,7 @@
         <w:t xml:space="preserve">What changed:</w:t>
       </w:r>
       <w:r>
-        <w:t xml:space="preserve"> Meera has a new job, with a higher income from April.</w:t>
+        <w:t xml:space="preserve"> Jennifer has a new job, with a higher income from April.</w:t>
       </w:r>
     </w:p>
     <w:p>
@@ -17597,15 +17597,15 @@
         <w:t xml:space="preserve">Tasks:</w:t>
       </w:r>
       <w:r>
-        <w:t xml:space="preserve"> Update the risk profile. Who: Karan. When: Monday. · Send the new plan. Who: Karan. When: Friday.</w:t>
-      </w:r>
-    </w:p>
-    <w:p>
-      <w:pPr>
-        <w:spacing w:after="140"/>
-      </w:pPr>
-      <w:r>
-        <w:t xml:space="preserve">Next year, before the review, Karan asks Lynkk, "What did the Shahs say about retirement?" and gets the answer right away.</w:t>
+        <w:t xml:space="preserve"> Update the risk profile. Who: David. When: Monday. · Send the new plan. Who: David. When: Friday.</w:t>
+      </w:r>
+    </w:p>
+    <w:p>
+      <w:pPr>
+        <w:spacing w:after="140"/>
+      </w:pPr>
+      <w:r>
+        <w:t xml:space="preserve">Next year, before the review, David asks Lynkk, "What did the Millers say about retirement?" and gets the answer right away.</w:t>
       </w:r>
     </w:p>
     <w:p>
@@ -18114,7 +18114,7 @@
       <w:r>
         <w:t xml:space="preserve">Notes are private unless you share them. Your data is encrypted. Lynkk never uses your meetings to train AI. </w:t>
       </w:r>
-      <w:hyperlink w:history="1" r:id="rId22mykepxnkhjt3zw1byo9">
+      <w:hyperlink w:history="1" r:id="rIdhk0xrelmuuoq-eecpiv4n">
         <w:r>
           <w:rPr>
             <w:rStyle w:val="Hyperlink"/>
@@ -18336,7 +18336,7 @@
       <w:pPr>
         <w:spacing w:after="140"/>
       </w:pPr>
-      <w:hyperlink w:history="1" r:id="rId8ky-qafqauvffdwq91oqx">
+      <w:hyperlink w:history="1" r:id="rIdphunpb8mniohogwjugzgd">
         <w:r>
           <w:rPr>
             <w:rStyle w:val="Hyperlink"/>
@@ -18458,7 +18458,7 @@
         <w:pStyle w:val="Heading3"/>
       </w:pPr>
       <w:r>
-        <w:t xml:space="preserve">Be like Karan. Start every review where the last one ended.</w:t>
+        <w:t xml:space="preserve">Be like David. Start every review where the last one ended.</w:t>
       </w:r>
     </w:p>
     <w:p>
@@ -18525,7 +18525,7 @@
         <w:t xml:space="preserve">Sales Calls:</w:t>
       </w:r>
       <w:r>
-        <w:t xml:space="preserve"> How Cue shows answers during a call ("Lynkk shows Maya the answer right away")</w:t>
+        <w:t xml:space="preserve"> How Cue shows answers during a call ("Lynkk shows Jessica the answer right away")</w:t>
       </w:r>
     </w:p>
     <w:p>
@@ -18693,48 +18693,10 @@
           <w:b/>
           <w:bCs/>
         </w:rPr>
-        <w:t xml:space="preserve">Real Estate Agents:</w:t>
-      </w:r>
-      <w:r>
-        <w:t xml:space="preserve"> The sample uses rupees (crore); switch to dollars for a US version</w:t>
-      </w:r>
-    </w:p>
-    <w:p>
-      <w:pPr>
-        <w:pStyle w:val="ListParagraph"/>
-        <w:numPr>
-          <w:ilvl w:val="0"/>
-          <w:numId w:val="2"/>
-        </w:numPr>
-      </w:pPr>
-      <w:r>
-        <w:rPr>
-          <w:b/>
-          <w:bCs/>
-        </w:rPr>
         <w:t xml:space="preserve">Financial Advisors:</w:t>
       </w:r>
       <w:r>
         <w:t xml:space="preserve"> Compliance review of all wording (no record-keeping or regulatory claims)</w:t>
-      </w:r>
-    </w:p>
-    <w:p>
-      <w:pPr>
-        <w:pStyle w:val="ListParagraph"/>
-        <w:numPr>
-          <w:ilvl w:val="0"/>
-          <w:numId w:val="2"/>
-        </w:numPr>
-      </w:pPr>
-      <w:r>
-        <w:rPr>
-          <w:b/>
-          <w:bCs/>
-        </w:rPr>
-        <w:t xml:space="preserve">Financial Advisors:</w:t>
-      </w:r>
-      <w:r>
-        <w:t xml:space="preserve"> The sample uses Indian names; use a US sample for a US version if needed</w:t>
       </w:r>
     </w:p>
     <w:sectPr>

</xml_diff>

<commit_message>
Remove example disclaimers from stories and fix LLC punctuation
Co-Authored-By: Claude Opus 5.5 <noreply@anthropic.com>
Claude-Session: https://claude.ai/code/session_01Xs6uEGTRa4UggVmKjUH61X
</commit_message>
<xml_diff>
--- a/content/use-cases/story-drafts/Lynkk-Use-Case-Stories.docx
+++ b/content/use-cases/story-drafts/Lynkk-Use-Case-Stories.docx
@@ -1120,18 +1120,6 @@
         <w:spacing w:after="140"/>
       </w:pPr>
       <w:r>
-        <w:rPr>
-          <w:i/>
-          <w:iCs/>
-        </w:rPr>
-        <w:t xml:space="preserve">Jessica is an example. But you may know someone just like her.</w:t>
-      </w:r>
-    </w:p>
-    <w:p>
-      <w:pPr>
-        <w:spacing w:after="140"/>
-      </w:pPr>
-      <w:r>
         <w:t xml:space="preserve">Jessica sells software. She has many sales calls every day.</w:t>
       </w:r>
     </w:p>
@@ -1140,7 +1128,7 @@
         <w:spacing w:after="140"/>
       </w:pPr>
       <w:r>
-        <w:t xml:space="preserve">Today she is talking to Dana from Bluestone Logistics LLC Dana is interested. She asks about the price. She wants to try it with two teams first. And she is not sure who will sign the order.</w:t>
+        <w:t xml:space="preserve">Today she is talking to Dana from Bluestone Logistics LLC. Dana is interested. She asks about the price. She wants to try it with two teams first. And she is not sure who will sign the order.</w:t>
       </w:r>
     </w:p>
     <w:p>
@@ -1832,7 +1820,7 @@
       <w:r>
         <w:t xml:space="preserve">Your notes are private unless you share them. Your data is encrypted and stays in the region you choose. Lynkk never uses your calls to train AI. </w:t>
       </w:r>
-      <w:hyperlink w:history="1" r:id="rIdzys9tb4axi_faxolf4vmr">
+      <w:hyperlink w:history="1" r:id="rId0xc1iwydrx8shgvm6lwpb">
         <w:r>
           <w:rPr>
             <w:rStyle w:val="Hyperlink"/>
@@ -2054,7 +2042,7 @@
       <w:pPr>
         <w:spacing w:after="140"/>
       </w:pPr>
-      <w:hyperlink w:history="1" r:id="rIdawazr-eyovua9wcenmiar">
+      <w:hyperlink w:history="1" r:id="rIduf04lanvj6s7ig42dnff8">
         <w:r>
           <w:rPr>
             <w:rStyle w:val="Hyperlink"/>
@@ -3094,19 +3082,7 @@
         <w:spacing w:after="140"/>
       </w:pPr>
       <w:r>
-        <w:rPr>
-          <w:i/>
-          <w:iCs/>
-        </w:rPr>
-        <w:t xml:space="preserve">Rachel is an example. But you may know someone just like her.</w:t>
-      </w:r>
-    </w:p>
-    <w:p>
-      <w:pPr>
-        <w:spacing w:after="140"/>
-      </w:pPr>
-      <w:r>
-        <w:t xml:space="preserve">Rachel designs apps at Greenway Foods LLC This week she has eight customer interviews. She wants to know why new users stop using the app.</w:t>
+        <w:t xml:space="preserve">Rachel designs apps at Greenway Foods LLC. This week she has eight customer interviews. She wants to know why new users stop using the app.</w:t>
       </w:r>
     </w:p>
     <w:p>
@@ -3820,7 +3796,7 @@
       <w:r>
         <w:t xml:space="preserve">Your notes are private unless you share them. Your data is encrypted and stays in the region you choose. Lynkk never uses your recordings to train AI. </w:t>
       </w:r>
-      <w:hyperlink w:history="1" r:id="rIdvh_zfoljlwpxagthvo2ib">
+      <w:hyperlink w:history="1" r:id="rIdcwpjb6wchfrlhyvt9cmcs">
         <w:r>
           <w:rPr>
             <w:rStyle w:val="Hyperlink"/>
@@ -4042,7 +4018,7 @@
       <w:pPr>
         <w:spacing w:after="140"/>
       </w:pPr>
-      <w:hyperlink w:history="1" r:id="rIdrtu-zv3neqqqd1cc70yiq">
+      <w:hyperlink w:history="1" r:id="rIdljw72ihnfo-9sk-98uvhs">
         <w:r>
           <w:rPr>
             <w:rStyle w:val="Hyperlink"/>
@@ -4999,19 +4975,7 @@
         <w:spacing w:after="140"/>
       </w:pPr>
       <w:r>
-        <w:rPr>
-          <w:i/>
-          <w:iCs/>
-        </w:rPr>
-        <w:t xml:space="preserve">Jake is an example. But you may know someone just like him.</w:t>
-      </w:r>
-    </w:p>
-    <w:p>
-      <w:pPr>
-        <w:spacing w:after="140"/>
-      </w:pPr>
-      <w:r>
-        <w:t xml:space="preserve">Jake is a project manager at Riverstone Apps LLC Every morning at 10, his team has a 15-minute standup meeting. Each person says what they did yesterday, what they will do today, and what is blocking them.</w:t>
+        <w:t xml:space="preserve">Jake is a project manager at Riverstone Apps LLC. Every morning at 10, his team has a 15-minute standup meeting. Each person says what they did yesterday, what they will do today, and what is blocking them.</w:t>
       </w:r>
     </w:p>
     <w:p>
@@ -5198,7 +5162,7 @@
       <w:r>
         <w:t xml:space="preserve">New to standups? Read our guide to the </w:t>
       </w:r>
-      <w:hyperlink w:history="1" r:id="rIdxfuqnsy-qnl7ovwdeirlz">
+      <w:hyperlink w:history="1" r:id="rIdu1df3tehzplfmiupeurd7">
         <w:r>
           <w:rPr>
             <w:rStyle w:val="Hyperlink"/>
@@ -5708,7 +5672,7 @@
       <w:r>
         <w:t xml:space="preserve">Notes are private unless you share them. Your data is encrypted and stays in the region you choose. Lynkk never uses your meetings to train AI. </w:t>
       </w:r>
-      <w:hyperlink w:history="1" r:id="rIdqqe_2aokh3xxecl7eugh1">
+      <w:hyperlink w:history="1" r:id="rIdnj_aqopto_b5vxoixe-mr">
         <w:r>
           <w:rPr>
             <w:rStyle w:val="Hyperlink"/>
@@ -5930,7 +5894,7 @@
       <w:pPr>
         <w:spacing w:after="140"/>
       </w:pPr>
-      <w:hyperlink w:history="1" r:id="rIdi03r1ddg361xwq9uli9ec">
+      <w:hyperlink w:history="1" r:id="rIdqog8dgalyru-rcgatngoi">
         <w:r>
           <w:rPr>
             <w:rStyle w:val="Hyperlink"/>
@@ -6970,19 +6934,7 @@
         <w:spacing w:after="140"/>
       </w:pPr>
       <w:r>
-        <w:rPr>
-          <w:i/>
-          <w:iCs/>
-        </w:rPr>
-        <w:t xml:space="preserve">Emily is an example. But you may know someone just like her.</w:t>
-      </w:r>
-    </w:p>
-    <w:p>
-      <w:pPr>
-        <w:spacing w:after="140"/>
-      </w:pPr>
-      <w:r>
-        <w:t xml:space="preserve">Emily works at Green Fields Research LLC This month she is doing field research near Nashik, India. She visits farms and talks to farmers about water and crops.</w:t>
+        <w:t xml:space="preserve">Emily works at Green Fields Research LLC. This month she is doing field research near Nashik, India. She visits farms and talks to farmers about water and crops.</w:t>
       </w:r>
     </w:p>
     <w:p>
@@ -7674,7 +7626,7 @@
       <w:r>
         <w:t xml:space="preserve">Your notes are private unless you share them. Your data is encrypted and stays in the region you choose. Lynkk never uses your recordings to train AI. </w:t>
       </w:r>
-      <w:hyperlink w:history="1" r:id="rIdvzkhy4qrbw8opjec36oov">
+      <w:hyperlink w:history="1" r:id="rIdu7o6uvyzkbr1wc9fvs3ae">
         <w:r>
           <w:rPr>
             <w:rStyle w:val="Hyperlink"/>
@@ -7896,7 +7848,7 @@
       <w:pPr>
         <w:spacing w:after="140"/>
       </w:pPr>
-      <w:hyperlink w:history="1" r:id="rIdwhx3uom3acnjslr1iejyk">
+      <w:hyperlink w:history="1" r:id="rIdstalqkddykazdpf3lwplw">
         <w:r>
           <w:rPr>
             <w:rStyle w:val="Hyperlink"/>
@@ -8853,18 +8805,6 @@
         <w:spacing w:after="140"/>
       </w:pPr>
       <w:r>
-        <w:rPr>
-          <w:i/>
-          <w:iCs/>
-        </w:rPr>
-        <w:t xml:space="preserve">Ethan is an example. But you may know someone just like him.</w:t>
-      </w:r>
-    </w:p>
-    <w:p>
-      <w:pPr>
-        <w:spacing w:after="140"/>
-      </w:pPr>
-      <w:r>
         <w:t xml:space="preserve">Ethan is in his second year of college. He has a 90-minute economics class every Monday. The teacher talks fast and explains a lot with examples.</w:t>
       </w:r>
     </w:p>
@@ -9775,7 +9715,7 @@
       <w:pPr>
         <w:spacing w:after="140"/>
       </w:pPr>
-      <w:hyperlink w:history="1" r:id="rIdk-bb3fmoeuiiri8t87fsk">
+      <w:hyperlink w:history="1" r:id="rId5hcxdhbqeh_bqsqk-wocw">
         <w:r>
           <w:rPr>
             <w:rStyle w:val="Hyperlink"/>
@@ -10566,19 +10506,7 @@
         <w:spacing w:after="140"/>
       </w:pPr>
       <w:r>
-        <w:rPr>
-          <w:i/>
-          <w:iCs/>
-        </w:rPr>
-        <w:t xml:space="preserve">Sarah is an example. But you may know someone just like her.</w:t>
-      </w:r>
-    </w:p>
-    <w:p>
-      <w:pPr>
-        <w:spacing w:after="140"/>
-      </w:pPr>
-      <w:r>
-        <w:t xml:space="preserve">Sarah is the marketing manager at Brightpath Software LLC She is rewriting the company website. She wants it to sound like the customers, not like the company.</w:t>
+        <w:t xml:space="preserve">Sarah is the marketing manager at Brightpath Software LLC. She is rewriting the company website. She wants it to sound like the customers, not like the company.</w:t>
       </w:r>
     </w:p>
     <w:p>
@@ -11226,7 +11154,7 @@
       <w:r>
         <w:t xml:space="preserve">Notes are private unless you share them. Your data is encrypted and stays in the region you choose. Lynkk never uses your calls to train AI. </w:t>
       </w:r>
-      <w:hyperlink w:history="1" r:id="rIdwcbzr0mnukxzrkws3ltjf">
+      <w:hyperlink w:history="1" r:id="rIddyv-bhyvhxkz6qx4a9-or">
         <w:r>
           <w:rPr>
             <w:rStyle w:val="Hyperlink"/>
@@ -11448,7 +11376,7 @@
       <w:pPr>
         <w:spacing w:after="140"/>
       </w:pPr>
-      <w:hyperlink w:history="1" r:id="rId7rwmo0ollmljmsgj_p3lz">
+      <w:hyperlink w:history="1" r:id="rIdmbupxyenwcrvujl-qtfta">
         <w:r>
           <w:rPr>
             <w:rStyle w:val="Hyperlink"/>
@@ -12239,18 +12167,6 @@
         <w:spacing w:after="140"/>
       </w:pPr>
       <w:r>
-        <w:rPr>
-          <w:i/>
-          <w:iCs/>
-        </w:rPr>
-        <w:t xml:space="preserve">Laura is an example. But you may know someone just like her.</w:t>
-      </w:r>
-    </w:p>
-    <w:p>
-      <w:pPr>
-        <w:spacing w:after="140"/>
-      </w:pPr>
-      <w:r>
         <w:t xml:space="preserve">Laura is a lawyer at Clearwater Legal LLP. Today a new client comes to her office. The client's landlord wants them to leave, and the client is worried.</w:t>
       </w:r>
     </w:p>
@@ -12914,7 +12830,7 @@
       <w:r>
         <w:t xml:space="preserve">Notes are private unless you share them. Your data is encrypted. Lynkk never uses your meetings to train AI. </w:t>
       </w:r>
-      <w:hyperlink w:history="1" r:id="rIdkvh-gmlwbv0hbrsgsfr4a">
+      <w:hyperlink w:history="1" r:id="rIddev5gvhcxy_wfe5yhs4et">
         <w:r>
           <w:rPr>
             <w:rStyle w:val="Hyperlink"/>
@@ -13136,7 +13052,7 @@
       <w:pPr>
         <w:spacing w:after="140"/>
       </w:pPr>
-      <w:hyperlink w:history="1" r:id="rIdh9peiz9jjrrxeb2egci36">
+      <w:hyperlink w:history="1" r:id="rId7o37p3htstny6ywc9eqyu">
         <w:r>
           <w:rPr>
             <w:rStyle w:val="Hyperlink"/>
@@ -13172,7 +13088,7 @@
       <w:r>
         <w:t xml:space="preserve">No. Lynkk writes notes and text for your own work. It isn't a certified court transcript. See our guide to </w:t>
       </w:r>
-      <w:hyperlink w:history="1" r:id="rIdion1jqpdrcsfp5o5xlpff">
+      <w:hyperlink w:history="1" r:id="rIdqzy6pvyhdrlokxbiczfad">
         <w:r>
           <w:rPr>
             <w:rStyle w:val="Hyperlink"/>
@@ -13938,19 +13854,7 @@
         <w:spacing w:after="140"/>
       </w:pPr>
       <w:r>
-        <w:rPr>
-          <w:i/>
-          <w:iCs/>
-        </w:rPr>
-        <w:t xml:space="preserve">Sam is an example. But you may know someone just like him.</w:t>
-      </w:r>
-    </w:p>
-    <w:p>
-      <w:pPr>
-        <w:spacing w:after="140"/>
-      </w:pPr>
-      <w:r>
-        <w:t xml:space="preserve">Sam is a team manager at Bluebird Apps LLC He has eight people on his team. Every week he has a 1 on 1 meeting with each of them. That's eight conversations about work, problems and goals.</w:t>
+        <w:t xml:space="preserve">Sam is a team manager at Bluebird Apps LLC. He has eight people on his team. Every week he has a 1 on 1 meeting with each of them. That's eight conversations about work, problems and goals.</w:t>
       </w:r>
     </w:p>
     <w:p>
@@ -14129,7 +14033,7 @@
       <w:r>
         <w:t xml:space="preserve">New to 1:1s? Read our guide to the </w:t>
       </w:r>
-      <w:hyperlink w:history="1" r:id="rIdvlntdyj3vd1qtwscc2t5j">
+      <w:hyperlink w:history="1" r:id="rIdx4bg5ditgrb4g_pnirfkl">
         <w:r>
           <w:rPr>
             <w:rStyle w:val="Hyperlink"/>
@@ -14639,7 +14543,7 @@
       <w:r>
         <w:t xml:space="preserve">1:1 notes are private unless you share them. Your data is encrypted and stays in the region you choose. Lynkk never uses your meetings to train AI. </w:t>
       </w:r>
-      <w:hyperlink w:history="1" r:id="rIdm4earmwjcofszoexkjmno">
+      <w:hyperlink w:history="1" r:id="rId7vrmvrqg947ppqwrxacpp">
         <w:r>
           <w:rPr>
             <w:rStyle w:val="Hyperlink"/>
@@ -14861,7 +14765,7 @@
       <w:pPr>
         <w:spacing w:after="140"/>
       </w:pPr>
-      <w:hyperlink w:history="1" r:id="rIdodk5dyyslhtk9kfcucebp">
+      <w:hyperlink w:history="1" r:id="rIdpm48weisv_nifxx-y9oqr">
         <w:r>
           <w:rPr>
             <w:rStyle w:val="Hyperlink"/>
@@ -15652,19 +15556,7 @@
         <w:spacing w:after="140"/>
       </w:pPr>
       <w:r>
-        <w:rPr>
-          <w:i/>
-          <w:iCs/>
-        </w:rPr>
-        <w:t xml:space="preserve">Chris is an example. But you may know someone just like him.</w:t>
-      </w:r>
-    </w:p>
-    <w:p>
-      <w:pPr>
-        <w:spacing w:after="140"/>
-      </w:pPr>
-      <w:r>
-        <w:t xml:space="preserve">Chris is a real estate agent at Skyline Homes Realty LLC This month he is helping ten families find a new home. Each family has a budget, a wish list and lots of questions.</w:t>
+        <w:t xml:space="preserve">Chris is a real estate agent at Skyline Homes Realty LLC. This month he is helping ten families find a new home. Each family has a budget, a wish list and lots of questions.</w:t>
       </w:r>
     </w:p>
     <w:p>
@@ -16335,7 +16227,7 @@
       <w:r>
         <w:t xml:space="preserve">Notes are private unless you share them. Your data is encrypted and stays in the region you choose. Lynkk never uses your calls to train AI. </w:t>
       </w:r>
-      <w:hyperlink w:history="1" r:id="rIdvoaobxkkkwoegkuxjxcxz">
+      <w:hyperlink w:history="1" r:id="rIdhnfa_cctldmvily4ox3z5">
         <w:r>
           <w:rPr>
             <w:rStyle w:val="Hyperlink"/>
@@ -16557,7 +16449,7 @@
       <w:pPr>
         <w:spacing w:after="140"/>
       </w:pPr>
-      <w:hyperlink w:history="1" r:id="rIdgtsczofrygg9qzya5dzjr">
+      <w:hyperlink w:history="1" r:id="rIdnbqfl28e7dikdwpgynp2j">
         <w:r>
           <w:rPr>
             <w:rStyle w:val="Hyperlink"/>
@@ -17431,19 +17323,7 @@
         <w:spacing w:after="140"/>
       </w:pPr>
       <w:r>
-        <w:rPr>
-          <w:i/>
-          <w:iCs/>
-        </w:rPr>
-        <w:t xml:space="preserve">David is an example. But you may know someone just like him.</w:t>
-      </w:r>
-    </w:p>
-    <w:p>
-      <w:pPr>
-        <w:spacing w:after="140"/>
-      </w:pPr>
-      <w:r>
-        <w:t xml:space="preserve">David is a financial advisor at Northstar Wealth LLC Once a year, he sits down with each family to review their money and their plans.</w:t>
+        <w:t xml:space="preserve">David is a financial advisor at Northstar Wealth LLC. Once a year, he sits down with each family to review their money and their plans.</w:t>
       </w:r>
     </w:p>
     <w:p>
@@ -18114,7 +17994,7 @@
       <w:r>
         <w:t xml:space="preserve">Notes are private unless you share them. Your data is encrypted. Lynkk never uses your meetings to train AI. </w:t>
       </w:r>
-      <w:hyperlink w:history="1" r:id="rIdhk0xrelmuuoq-eecpiv4n">
+      <w:hyperlink w:history="1" r:id="rId6s1agxa5u3fvdrqx9hhem">
         <w:r>
           <w:rPr>
             <w:rStyle w:val="Hyperlink"/>
@@ -18336,7 +18216,7 @@
       <w:pPr>
         <w:spacing w:after="140"/>
       </w:pPr>
-      <w:hyperlink w:history="1" r:id="rIdphunpb8mniohogwjugzgd">
+      <w:hyperlink w:history="1" r:id="rIdikjhlmucpvuzv9qogvef4">
         <w:r>
           <w:rPr>
             <w:rStyle w:val="Hyperlink"/>

</xml_diff>

<commit_message>
Add keyword stuffing check and accurate keyword tables to story drafts
Count each keyword's real uses and placement, add three missing exact-match
keywords once each, trim one repeat on the 1:1 page, and add a report.

Co-Authored-By: Claude Opus 5.5 <noreply@anthropic.com>
Claude-Session: https://claude.ai/code/session_01Xs6uEGTRa4UggVmKjUH61X
</commit_message>
<xml_diff>
--- a/content/use-cases/story-drafts/Lynkk-Use-Case-Stories.docx
+++ b/content/use-cases/story-drafts/Lynkk-Use-Case-Stories.docx
@@ -184,9 +184,10 @@
         </w:tblBorders>
       </w:tblPr>
       <w:tblGrid>
-        <w:gridCol w:w="3360"/>
-        <w:gridCol w:w="3360"/>
-        <w:gridCol w:w="3360"/>
+        <w:gridCol w:w="2520"/>
+        <w:gridCol w:w="2520"/>
+        <w:gridCol w:w="2520"/>
+        <w:gridCol w:w="2520"/>
       </w:tblGrid>
       <w:tr>
         <w:trPr>
@@ -194,7 +195,7 @@
         </w:trPr>
         <w:tc>
           <w:tcPr>
-            <w:tcW w:type="dxa" w:w="3360"/>
+            <w:tcW w:type="dxa" w:w="2520"/>
             <w:tcBorders>
               <w:top w:val="single" w:color="C9D3DF" w:sz="4"/>
               <w:left w:val="single" w:color="C9D3DF" w:sz="4"/>
@@ -224,7 +225,7 @@
         </w:tc>
         <w:tc>
           <w:tcPr>
-            <w:tcW w:type="dxa" w:w="3360"/>
+            <w:tcW w:type="dxa" w:w="2520"/>
             <w:tcBorders>
               <w:top w:val="single" w:color="C9D3DF" w:sz="4"/>
               <w:left w:val="single" w:color="C9D3DF" w:sz="4"/>
@@ -254,7 +255,37 @@
         </w:tc>
         <w:tc>
           <w:tcPr>
-            <w:tcW w:type="dxa" w:w="3360"/>
+            <w:tcW w:type="dxa" w:w="2520"/>
+            <w:tcBorders>
+              <w:top w:val="single" w:color="C9D3DF" w:sz="4"/>
+              <w:left w:val="single" w:color="C9D3DF" w:sz="4"/>
+              <w:bottom w:val="single" w:color="C9D3DF" w:sz="4"/>
+              <w:right w:val="single" w:color="C9D3DF" w:sz="4"/>
+            </w:tcBorders>
+            <w:shd w:fill="1F3A5F" w:color="auto" w:val="clear"/>
+            <w:tcMar>
+              <w:top w:type="dxa" w:w="60"/>
+              <w:left w:type="dxa" w:w="100"/>
+              <w:bottom w:type="dxa" w:w="60"/>
+              <w:right w:type="dxa" w:w="100"/>
+            </w:tcMar>
+          </w:tcPr>
+          <w:p>
+            <w:r>
+              <w:rPr>
+                <w:b/>
+                <w:bCs/>
+                <w:color w:val="FFFFFF"/>
+                <w:sz w:val="19"/>
+                <w:szCs w:val="19"/>
+              </w:rPr>
+              <w:t xml:space="preserve">Uses on page</w:t>
+            </w:r>
+          </w:p>
+        </w:tc>
+        <w:tc>
+          <w:tcPr>
+            <w:tcW w:type="dxa" w:w="2520"/>
             <w:tcBorders>
               <w:top w:val="single" w:color="C9D3DF" w:sz="4"/>
               <w:left w:val="single" w:color="C9D3DF" w:sz="4"/>
@@ -289,7 +320,7 @@
         </w:trPr>
         <w:tc>
           <w:tcPr>
-            <w:tcW w:type="dxa" w:w="3360"/>
+            <w:tcW w:type="dxa" w:w="2520"/>
             <w:tcBorders>
               <w:top w:val="single" w:color="C9D3DF" w:sz="4"/>
               <w:left w:val="single" w:color="C9D3DF" w:sz="4"/>
@@ -315,7 +346,7 @@
         </w:tc>
         <w:tc>
           <w:tcPr>
-            <w:tcW w:type="dxa" w:w="3360"/>
+            <w:tcW w:type="dxa" w:w="2520"/>
             <w:tcBorders>
               <w:top w:val="single" w:color="C9D3DF" w:sz="4"/>
               <w:left w:val="single" w:color="C9D3DF" w:sz="4"/>
@@ -341,27 +372,53 @@
         </w:tc>
         <w:tc>
           <w:tcPr>
-            <w:tcW w:type="dxa" w:w="3360"/>
-            <w:tcBorders>
-              <w:top w:val="single" w:color="C9D3DF" w:sz="4"/>
-              <w:left w:val="single" w:color="C9D3DF" w:sz="4"/>
-              <w:bottom w:val="single" w:color="C9D3DF" w:sz="4"/>
-              <w:right w:val="single" w:color="C9D3DF" w:sz="4"/>
-            </w:tcBorders>
-            <w:tcMar>
-              <w:top w:type="dxa" w:w="60"/>
-              <w:left w:type="dxa" w:w="100"/>
-              <w:bottom w:type="dxa" w:w="60"/>
-              <w:right w:type="dxa" w:w="100"/>
-            </w:tcMar>
-          </w:tcPr>
-          <w:p>
-            <w:r>
-              <w:rPr>
-                <w:sz w:val="19"/>
-                <w:szCs w:val="19"/>
-              </w:rPr>
-              <w:t xml:space="preserve">Title, H1, intro</w:t>
+            <w:tcW w:type="dxa" w:w="2520"/>
+            <w:tcBorders>
+              <w:top w:val="single" w:color="C9D3DF" w:sz="4"/>
+              <w:left w:val="single" w:color="C9D3DF" w:sz="4"/>
+              <w:bottom w:val="single" w:color="C9D3DF" w:sz="4"/>
+              <w:right w:val="single" w:color="C9D3DF" w:sz="4"/>
+            </w:tcBorders>
+            <w:tcMar>
+              <w:top w:type="dxa" w:w="60"/>
+              <w:left w:type="dxa" w:w="100"/>
+              <w:bottom w:type="dxa" w:w="60"/>
+              <w:right w:type="dxa" w:w="100"/>
+            </w:tcMar>
+          </w:tcPr>
+          <w:p>
+            <w:r>
+              <w:rPr>
+                <w:sz w:val="19"/>
+                <w:szCs w:val="19"/>
+              </w:rPr>
+              <w:t xml:space="preserve">2</w:t>
+            </w:r>
+          </w:p>
+        </w:tc>
+        <w:tc>
+          <w:tcPr>
+            <w:tcW w:type="dxa" w:w="2520"/>
+            <w:tcBorders>
+              <w:top w:val="single" w:color="C9D3DF" w:sz="4"/>
+              <w:left w:val="single" w:color="C9D3DF" w:sz="4"/>
+              <w:bottom w:val="single" w:color="C9D3DF" w:sz="4"/>
+              <w:right w:val="single" w:color="C9D3DF" w:sz="4"/>
+            </w:tcBorders>
+            <w:tcMar>
+              <w:top w:type="dxa" w:w="60"/>
+              <w:left w:type="dxa" w:w="100"/>
+              <w:bottom w:type="dxa" w:w="60"/>
+              <w:right w:type="dxa" w:w="100"/>
+            </w:tcMar>
+          </w:tcPr>
+          <w:p>
+            <w:r>
+              <w:rPr>
+                <w:sz w:val="19"/>
+                <w:szCs w:val="19"/>
+              </w:rPr>
+              <w:t xml:space="preserve">Title, H1, Intro</w:t>
             </w:r>
           </w:p>
         </w:tc>
@@ -372,7 +429,7 @@
         </w:trPr>
         <w:tc>
           <w:tcPr>
-            <w:tcW w:type="dxa" w:w="3360"/>
+            <w:tcW w:type="dxa" w:w="2520"/>
             <w:tcBorders>
               <w:top w:val="single" w:color="C9D3DF" w:sz="4"/>
               <w:left w:val="single" w:color="C9D3DF" w:sz="4"/>
@@ -398,7 +455,7 @@
         </w:tc>
         <w:tc>
           <w:tcPr>
-            <w:tcW w:type="dxa" w:w="3360"/>
+            <w:tcW w:type="dxa" w:w="2520"/>
             <w:tcBorders>
               <w:top w:val="single" w:color="C9D3DF" w:sz="4"/>
               <w:left w:val="single" w:color="C9D3DF" w:sz="4"/>
@@ -424,27 +481,53 @@
         </w:tc>
         <w:tc>
           <w:tcPr>
-            <w:tcW w:type="dxa" w:w="3360"/>
-            <w:tcBorders>
-              <w:top w:val="single" w:color="C9D3DF" w:sz="4"/>
-              <w:left w:val="single" w:color="C9D3DF" w:sz="4"/>
-              <w:bottom w:val="single" w:color="C9D3DF" w:sz="4"/>
-              <w:right w:val="single" w:color="C9D3DF" w:sz="4"/>
-            </w:tcBorders>
-            <w:tcMar>
-              <w:top w:type="dxa" w:w="60"/>
-              <w:left w:type="dxa" w:w="100"/>
-              <w:bottom w:type="dxa" w:w="60"/>
-              <w:right w:type="dxa" w:w="100"/>
-            </w:tcMar>
-          </w:tcPr>
-          <w:p>
-            <w:r>
-              <w:rPr>
-                <w:sz w:val="19"/>
-                <w:szCs w:val="19"/>
-              </w:rPr>
-              <w:t xml:space="preserve">Title, "So, what is Lynkk?" section</w:t>
+            <w:tcW w:type="dxa" w:w="2520"/>
+            <w:tcBorders>
+              <w:top w:val="single" w:color="C9D3DF" w:sz="4"/>
+              <w:left w:val="single" w:color="C9D3DF" w:sz="4"/>
+              <w:bottom w:val="single" w:color="C9D3DF" w:sz="4"/>
+              <w:right w:val="single" w:color="C9D3DF" w:sz="4"/>
+            </w:tcBorders>
+            <w:tcMar>
+              <w:top w:type="dxa" w:w="60"/>
+              <w:left w:type="dxa" w:w="100"/>
+              <w:bottom w:type="dxa" w:w="60"/>
+              <w:right w:type="dxa" w:w="100"/>
+            </w:tcMar>
+          </w:tcPr>
+          <w:p>
+            <w:r>
+              <w:rPr>
+                <w:sz w:val="19"/>
+                <w:szCs w:val="19"/>
+              </w:rPr>
+              <w:t xml:space="preserve">1</w:t>
+            </w:r>
+          </w:p>
+        </w:tc>
+        <w:tc>
+          <w:tcPr>
+            <w:tcW w:type="dxa" w:w="2520"/>
+            <w:tcBorders>
+              <w:top w:val="single" w:color="C9D3DF" w:sz="4"/>
+              <w:left w:val="single" w:color="C9D3DF" w:sz="4"/>
+              <w:bottom w:val="single" w:color="C9D3DF" w:sz="4"/>
+              <w:right w:val="single" w:color="C9D3DF" w:sz="4"/>
+            </w:tcBorders>
+            <w:tcMar>
+              <w:top w:type="dxa" w:w="60"/>
+              <w:left w:type="dxa" w:w="100"/>
+              <w:bottom w:type="dxa" w:w="60"/>
+              <w:right w:type="dxa" w:w="100"/>
+            </w:tcMar>
+          </w:tcPr>
+          <w:p>
+            <w:r>
+              <w:rPr>
+                <w:sz w:val="19"/>
+                <w:szCs w:val="19"/>
+              </w:rPr>
+              <w:t xml:space="preserve">Title, Meta, "So, what is Lynkk?" section</w:t>
             </w:r>
           </w:p>
         </w:tc>
@@ -455,7 +538,7 @@
         </w:trPr>
         <w:tc>
           <w:tcPr>
-            <w:tcW w:type="dxa" w:w="3360"/>
+            <w:tcW w:type="dxa" w:w="2520"/>
             <w:tcBorders>
               <w:top w:val="single" w:color="C9D3DF" w:sz="4"/>
               <w:left w:val="single" w:color="C9D3DF" w:sz="4"/>
@@ -481,7 +564,7 @@
         </w:tc>
         <w:tc>
           <w:tcPr>
-            <w:tcW w:type="dxa" w:w="3360"/>
+            <w:tcW w:type="dxa" w:w="2520"/>
             <w:tcBorders>
               <w:top w:val="single" w:color="C9D3DF" w:sz="4"/>
               <w:left w:val="single" w:color="C9D3DF" w:sz="4"/>
@@ -507,27 +590,53 @@
         </w:tc>
         <w:tc>
           <w:tcPr>
-            <w:tcW w:type="dxa" w:w="3360"/>
-            <w:tcBorders>
-              <w:top w:val="single" w:color="C9D3DF" w:sz="4"/>
-              <w:left w:val="single" w:color="C9D3DF" w:sz="4"/>
-              <w:bottom w:val="single" w:color="C9D3DF" w:sz="4"/>
-              <w:right w:val="single" w:color="C9D3DF" w:sz="4"/>
-            </w:tcBorders>
-            <w:tcMar>
-              <w:top w:type="dxa" w:w="60"/>
-              <w:left w:type="dxa" w:w="100"/>
-              <w:bottom w:type="dxa" w:w="60"/>
-              <w:right w:type="dxa" w:w="100"/>
-            </w:tcMar>
-          </w:tcPr>
-          <w:p>
-            <w:r>
-              <w:rPr>
-                <w:sz w:val="19"/>
-                <w:szCs w:val="19"/>
-              </w:rPr>
-              <w:t xml:space="preserve">FAQ</w:t>
+            <w:tcW w:type="dxa" w:w="2520"/>
+            <w:tcBorders>
+              <w:top w:val="single" w:color="C9D3DF" w:sz="4"/>
+              <w:left w:val="single" w:color="C9D3DF" w:sz="4"/>
+              <w:bottom w:val="single" w:color="C9D3DF" w:sz="4"/>
+              <w:right w:val="single" w:color="C9D3DF" w:sz="4"/>
+            </w:tcBorders>
+            <w:tcMar>
+              <w:top w:type="dxa" w:w="60"/>
+              <w:left w:type="dxa" w:w="100"/>
+              <w:bottom w:type="dxa" w:w="60"/>
+              <w:right w:type="dxa" w:w="100"/>
+            </w:tcMar>
+          </w:tcPr>
+          <w:p>
+            <w:r>
+              <w:rPr>
+                <w:sz w:val="19"/>
+                <w:szCs w:val="19"/>
+              </w:rPr>
+              <w:t xml:space="preserve">2</w:t>
+            </w:r>
+          </w:p>
+        </w:tc>
+        <w:tc>
+          <w:tcPr>
+            <w:tcW w:type="dxa" w:w="2520"/>
+            <w:tcBorders>
+              <w:top w:val="single" w:color="C9D3DF" w:sz="4"/>
+              <w:left w:val="single" w:color="C9D3DF" w:sz="4"/>
+              <w:bottom w:val="single" w:color="C9D3DF" w:sz="4"/>
+              <w:right w:val="single" w:color="C9D3DF" w:sz="4"/>
+            </w:tcBorders>
+            <w:tcMar>
+              <w:top w:type="dxa" w:w="60"/>
+              <w:left w:type="dxa" w:w="100"/>
+              <w:bottom w:type="dxa" w:w="60"/>
+              <w:right w:type="dxa" w:w="100"/>
+            </w:tcMar>
+          </w:tcPr>
+          <w:p>
+            <w:r>
+              <w:rPr>
+                <w:sz w:val="19"/>
+                <w:szCs w:val="19"/>
+              </w:rPr>
+              <w:t xml:space="preserve">"Questions people ask" section</w:t>
             </w:r>
           </w:p>
         </w:tc>
@@ -538,7 +647,7 @@
         </w:trPr>
         <w:tc>
           <w:tcPr>
-            <w:tcW w:type="dxa" w:w="3360"/>
+            <w:tcW w:type="dxa" w:w="2520"/>
             <w:tcBorders>
               <w:top w:val="single" w:color="C9D3DF" w:sz="4"/>
               <w:left w:val="single" w:color="C9D3DF" w:sz="4"/>
@@ -564,7 +673,7 @@
         </w:tc>
         <w:tc>
           <w:tcPr>
-            <w:tcW w:type="dxa" w:w="3360"/>
+            <w:tcW w:type="dxa" w:w="2520"/>
             <w:tcBorders>
               <w:top w:val="single" w:color="C9D3DF" w:sz="4"/>
               <w:left w:val="single" w:color="C9D3DF" w:sz="4"/>
@@ -590,27 +699,53 @@
         </w:tc>
         <w:tc>
           <w:tcPr>
-            <w:tcW w:type="dxa" w:w="3360"/>
-            <w:tcBorders>
-              <w:top w:val="single" w:color="C9D3DF" w:sz="4"/>
-              <w:left w:val="single" w:color="C9D3DF" w:sz="4"/>
-              <w:bottom w:val="single" w:color="C9D3DF" w:sz="4"/>
-              <w:right w:val="single" w:color="C9D3DF" w:sz="4"/>
-            </w:tcBorders>
-            <w:tcMar>
-              <w:top w:type="dxa" w:w="60"/>
-              <w:left w:type="dxa" w:w="100"/>
-              <w:bottom w:type="dxa" w:w="60"/>
-              <w:right w:type="dxa" w:w="100"/>
-            </w:tcMar>
-          </w:tcPr>
-          <w:p>
-            <w:r>
-              <w:rPr>
-                <w:sz w:val="19"/>
-                <w:szCs w:val="19"/>
-              </w:rPr>
-              <w:t xml:space="preserve">Meta description, "So, what is Lynkk?" section</w:t>
+            <w:tcW w:type="dxa" w:w="2520"/>
+            <w:tcBorders>
+              <w:top w:val="single" w:color="C9D3DF" w:sz="4"/>
+              <w:left w:val="single" w:color="C9D3DF" w:sz="4"/>
+              <w:bottom w:val="single" w:color="C9D3DF" w:sz="4"/>
+              <w:right w:val="single" w:color="C9D3DF" w:sz="4"/>
+            </w:tcBorders>
+            <w:tcMar>
+              <w:top w:type="dxa" w:w="60"/>
+              <w:left w:type="dxa" w:w="100"/>
+              <w:bottom w:type="dxa" w:w="60"/>
+              <w:right w:type="dxa" w:w="100"/>
+            </w:tcMar>
+          </w:tcPr>
+          <w:p>
+            <w:r>
+              <w:rPr>
+                <w:sz w:val="19"/>
+                <w:szCs w:val="19"/>
+              </w:rPr>
+              <w:t xml:space="preserve">1</w:t>
+            </w:r>
+          </w:p>
+        </w:tc>
+        <w:tc>
+          <w:tcPr>
+            <w:tcW w:type="dxa" w:w="2520"/>
+            <w:tcBorders>
+              <w:top w:val="single" w:color="C9D3DF" w:sz="4"/>
+              <w:left w:val="single" w:color="C9D3DF" w:sz="4"/>
+              <w:bottom w:val="single" w:color="C9D3DF" w:sz="4"/>
+              <w:right w:val="single" w:color="C9D3DF" w:sz="4"/>
+            </w:tcBorders>
+            <w:tcMar>
+              <w:top w:type="dxa" w:w="60"/>
+              <w:left w:type="dxa" w:w="100"/>
+              <w:bottom w:type="dxa" w:w="60"/>
+              <w:right w:type="dxa" w:w="100"/>
+            </w:tcMar>
+          </w:tcPr>
+          <w:p>
+            <w:r>
+              <w:rPr>
+                <w:sz w:val="19"/>
+                <w:szCs w:val="19"/>
+              </w:rPr>
+              <w:t xml:space="preserve">Meta, "So, what is Lynkk?" section</w:t>
             </w:r>
           </w:p>
         </w:tc>
@@ -621,7 +756,7 @@
         </w:trPr>
         <w:tc>
           <w:tcPr>
-            <w:tcW w:type="dxa" w:w="3360"/>
+            <w:tcW w:type="dxa" w:w="2520"/>
             <w:tcBorders>
               <w:top w:val="single" w:color="C9D3DF" w:sz="4"/>
               <w:left w:val="single" w:color="C9D3DF" w:sz="4"/>
@@ -647,7 +782,7 @@
         </w:tc>
         <w:tc>
           <w:tcPr>
-            <w:tcW w:type="dxa" w:w="3360"/>
+            <w:tcW w:type="dxa" w:w="2520"/>
             <w:tcBorders>
               <w:top w:val="single" w:color="C9D3DF" w:sz="4"/>
               <w:left w:val="single" w:color="C9D3DF" w:sz="4"/>
@@ -673,27 +808,53 @@
         </w:tc>
         <w:tc>
           <w:tcPr>
-            <w:tcW w:type="dxa" w:w="3360"/>
-            <w:tcBorders>
-              <w:top w:val="single" w:color="C9D3DF" w:sz="4"/>
-              <w:left w:val="single" w:color="C9D3DF" w:sz="4"/>
-              <w:bottom w:val="single" w:color="C9D3DF" w:sz="4"/>
-              <w:right w:val="single" w:color="C9D3DF" w:sz="4"/>
-            </w:tcBorders>
-            <w:tcMar>
-              <w:top w:type="dxa" w:w="60"/>
-              <w:left w:type="dxa" w:w="100"/>
-              <w:bottom w:type="dxa" w:w="60"/>
-              <w:right w:type="dxa" w:w="100"/>
-            </w:tcMar>
-          </w:tcPr>
-          <w:p>
-            <w:r>
-              <w:rPr>
-                <w:sz w:val="19"/>
-                <w:szCs w:val="19"/>
-              </w:rPr>
-              <w:t xml:space="preserve">H1, story, headings</w:t>
+            <w:tcW w:type="dxa" w:w="2520"/>
+            <w:tcBorders>
+              <w:top w:val="single" w:color="C9D3DF" w:sz="4"/>
+              <w:left w:val="single" w:color="C9D3DF" w:sz="4"/>
+              <w:bottom w:val="single" w:color="C9D3DF" w:sz="4"/>
+              <w:right w:val="single" w:color="C9D3DF" w:sz="4"/>
+            </w:tcBorders>
+            <w:tcMar>
+              <w:top w:type="dxa" w:w="60"/>
+              <w:left w:type="dxa" w:w="100"/>
+              <w:bottom w:type="dxa" w:w="60"/>
+              <w:right w:type="dxa" w:w="100"/>
+            </w:tcMar>
+          </w:tcPr>
+          <w:p>
+            <w:r>
+              <w:rPr>
+                <w:sz w:val="19"/>
+                <w:szCs w:val="19"/>
+              </w:rPr>
+              <w:t xml:space="preserve">8</w:t>
+            </w:r>
+          </w:p>
+        </w:tc>
+        <w:tc>
+          <w:tcPr>
+            <w:tcW w:type="dxa" w:w="2520"/>
+            <w:tcBorders>
+              <w:top w:val="single" w:color="C9D3DF" w:sz="4"/>
+              <w:left w:val="single" w:color="C9D3DF" w:sz="4"/>
+              <w:bottom w:val="single" w:color="C9D3DF" w:sz="4"/>
+              <w:right w:val="single" w:color="C9D3DF" w:sz="4"/>
+            </w:tcBorders>
+            <w:tcMar>
+              <w:top w:type="dxa" w:w="60"/>
+              <w:left w:type="dxa" w:w="100"/>
+              <w:bottom w:type="dxa" w:w="60"/>
+              <w:right w:type="dxa" w:w="100"/>
+            </w:tcMar>
+          </w:tcPr>
+          <w:p>
+            <w:r>
+              <w:rPr>
+                <w:sz w:val="19"/>
+                <w:szCs w:val="19"/>
+              </w:rPr>
+              <w:t xml:space="preserve">Title, Meta, H1, Intro, "Meet Jessica" section</w:t>
             </w:r>
           </w:p>
         </w:tc>
@@ -704,7 +865,7 @@
         </w:trPr>
         <w:tc>
           <w:tcPr>
-            <w:tcW w:type="dxa" w:w="3360"/>
+            <w:tcW w:type="dxa" w:w="2520"/>
             <w:tcBorders>
               <w:top w:val="single" w:color="C9D3DF" w:sz="4"/>
               <w:left w:val="single" w:color="C9D3DF" w:sz="4"/>
@@ -730,7 +891,7 @@
         </w:tc>
         <w:tc>
           <w:tcPr>
-            <w:tcW w:type="dxa" w:w="3360"/>
+            <w:tcW w:type="dxa" w:w="2520"/>
             <w:tcBorders>
               <w:top w:val="single" w:color="C9D3DF" w:sz="4"/>
               <w:left w:val="single" w:color="C9D3DF" w:sz="4"/>
@@ -756,27 +917,53 @@
         </w:tc>
         <w:tc>
           <w:tcPr>
-            <w:tcW w:type="dxa" w:w="3360"/>
-            <w:tcBorders>
-              <w:top w:val="single" w:color="C9D3DF" w:sz="4"/>
-              <w:left w:val="single" w:color="C9D3DF" w:sz="4"/>
-              <w:bottom w:val="single" w:color="C9D3DF" w:sz="4"/>
-              <w:right w:val="single" w:color="C9D3DF" w:sz="4"/>
-            </w:tcBorders>
-            <w:tcMar>
-              <w:top w:type="dxa" w:w="60"/>
-              <w:left w:type="dxa" w:w="100"/>
-              <w:bottom w:type="dxa" w:w="60"/>
-              <w:right w:type="dxa" w:w="100"/>
-            </w:tcMar>
-          </w:tcPr>
-          <w:p>
-            <w:r>
-              <w:rPr>
-                <w:sz w:val="19"/>
-                <w:szCs w:val="19"/>
-              </w:rPr>
-              <w:t xml:space="preserve">Story heading, "So, what is Lynkk?" section</w:t>
+            <w:tcW w:type="dxa" w:w="2520"/>
+            <w:tcBorders>
+              <w:top w:val="single" w:color="C9D3DF" w:sz="4"/>
+              <w:left w:val="single" w:color="C9D3DF" w:sz="4"/>
+              <w:bottom w:val="single" w:color="C9D3DF" w:sz="4"/>
+              <w:right w:val="single" w:color="C9D3DF" w:sz="4"/>
+            </w:tcBorders>
+            <w:tcMar>
+              <w:top w:type="dxa" w:w="60"/>
+              <w:left w:type="dxa" w:w="100"/>
+              <w:bottom w:type="dxa" w:w="60"/>
+              <w:right w:type="dxa" w:w="100"/>
+            </w:tcMar>
+          </w:tcPr>
+          <w:p>
+            <w:r>
+              <w:rPr>
+                <w:sz w:val="19"/>
+                <w:szCs w:val="19"/>
+              </w:rPr>
+              <w:t xml:space="preserve">1</w:t>
+            </w:r>
+          </w:p>
+        </w:tc>
+        <w:tc>
+          <w:tcPr>
+            <w:tcW w:type="dxa" w:w="2520"/>
+            <w:tcBorders>
+              <w:top w:val="single" w:color="C9D3DF" w:sz="4"/>
+              <w:left w:val="single" w:color="C9D3DF" w:sz="4"/>
+              <w:bottom w:val="single" w:color="C9D3DF" w:sz="4"/>
+              <w:right w:val="single" w:color="C9D3DF" w:sz="4"/>
+            </w:tcBorders>
+            <w:tcMar>
+              <w:top w:type="dxa" w:w="60"/>
+              <w:left w:type="dxa" w:w="100"/>
+              <w:bottom w:type="dxa" w:w="60"/>
+              <w:right w:type="dxa" w:w="100"/>
+            </w:tcMar>
+          </w:tcPr>
+          <w:p>
+            <w:r>
+              <w:rPr>
+                <w:sz w:val="19"/>
+                <w:szCs w:val="19"/>
+              </w:rPr>
+              <w:t xml:space="preserve">Meta, "How Lynkk helps Jessica on her next sales call" section</w:t>
             </w:r>
           </w:p>
         </w:tc>
@@ -787,7 +974,7 @@
         </w:trPr>
         <w:tc>
           <w:tcPr>
-            <w:tcW w:type="dxa" w:w="3360"/>
+            <w:tcW w:type="dxa" w:w="2520"/>
             <w:tcBorders>
               <w:top w:val="single" w:color="C9D3DF" w:sz="4"/>
               <w:left w:val="single" w:color="C9D3DF" w:sz="4"/>
@@ -813,7 +1000,7 @@
         </w:tc>
         <w:tc>
           <w:tcPr>
-            <w:tcW w:type="dxa" w:w="3360"/>
+            <w:tcW w:type="dxa" w:w="2520"/>
             <w:tcBorders>
               <w:top w:val="single" w:color="C9D3DF" w:sz="4"/>
               <w:left w:val="single" w:color="C9D3DF" w:sz="4"/>
@@ -839,27 +1026,53 @@
         </w:tc>
         <w:tc>
           <w:tcPr>
-            <w:tcW w:type="dxa" w:w="3360"/>
-            <w:tcBorders>
-              <w:top w:val="single" w:color="C9D3DF" w:sz="4"/>
-              <w:left w:val="single" w:color="C9D3DF" w:sz="4"/>
-              <w:bottom w:val="single" w:color="C9D3DF" w:sz="4"/>
-              <w:right w:val="single" w:color="C9D3DF" w:sz="4"/>
-            </w:tcBorders>
-            <w:tcMar>
-              <w:top w:type="dxa" w:w="60"/>
-              <w:left w:type="dxa" w:w="100"/>
-              <w:bottom w:type="dxa" w:w="60"/>
-              <w:right w:type="dxa" w:w="100"/>
-            </w:tcMar>
-          </w:tcPr>
-          <w:p>
-            <w:r>
-              <w:rPr>
-                <w:sz w:val="19"/>
-                <w:szCs w:val="19"/>
-              </w:rPr>
-              <w:t xml:space="preserve">FAQ</w:t>
+            <w:tcW w:type="dxa" w:w="2520"/>
+            <w:tcBorders>
+              <w:top w:val="single" w:color="C9D3DF" w:sz="4"/>
+              <w:left w:val="single" w:color="C9D3DF" w:sz="4"/>
+              <w:bottom w:val="single" w:color="C9D3DF" w:sz="4"/>
+              <w:right w:val="single" w:color="C9D3DF" w:sz="4"/>
+            </w:tcBorders>
+            <w:tcMar>
+              <w:top w:type="dxa" w:w="60"/>
+              <w:left w:type="dxa" w:w="100"/>
+              <w:bottom w:type="dxa" w:w="60"/>
+              <w:right w:type="dxa" w:w="100"/>
+            </w:tcMar>
+          </w:tcPr>
+          <w:p>
+            <w:r>
+              <w:rPr>
+                <w:sz w:val="19"/>
+                <w:szCs w:val="19"/>
+              </w:rPr>
+              <w:t xml:space="preserve">1</w:t>
+            </w:r>
+          </w:p>
+        </w:tc>
+        <w:tc>
+          <w:tcPr>
+            <w:tcW w:type="dxa" w:w="2520"/>
+            <w:tcBorders>
+              <w:top w:val="single" w:color="C9D3DF" w:sz="4"/>
+              <w:left w:val="single" w:color="C9D3DF" w:sz="4"/>
+              <w:bottom w:val="single" w:color="C9D3DF" w:sz="4"/>
+              <w:right w:val="single" w:color="C9D3DF" w:sz="4"/>
+            </w:tcBorders>
+            <w:tcMar>
+              <w:top w:type="dxa" w:w="60"/>
+              <w:left w:type="dxa" w:w="100"/>
+              <w:bottom w:type="dxa" w:w="60"/>
+              <w:right w:type="dxa" w:w="100"/>
+            </w:tcMar>
+          </w:tcPr>
+          <w:p>
+            <w:r>
+              <w:rPr>
+                <w:sz w:val="19"/>
+                <w:szCs w:val="19"/>
+              </w:rPr>
+              <w:t xml:space="preserve">"Questions people ask" section</w:t>
             </w:r>
           </w:p>
         </w:tc>
@@ -1820,7 +2033,7 @@
       <w:r>
         <w:t xml:space="preserve">Your notes are private unless you share them. Your data is encrypted and stays in the region you choose. Lynkk never uses your calls to train AI. </w:t>
       </w:r>
-      <w:hyperlink w:history="1" r:id="rId0xc1iwydrx8shgvm6lwpb">
+      <w:hyperlink w:history="1" r:id="rIddfmgmsdyzlamcaufh__rw">
         <w:r>
           <w:rPr>
             <w:rStyle w:val="Hyperlink"/>
@@ -2042,7 +2255,7 @@
       <w:pPr>
         <w:spacing w:after="140"/>
       </w:pPr>
-      <w:hyperlink w:history="1" r:id="rIduf04lanvj6s7ig42dnff8">
+      <w:hyperlink w:history="1" r:id="rIdnkhyj4a0ytxk0cxcspwol">
         <w:r>
           <w:rPr>
             <w:rStyle w:val="Hyperlink"/>
@@ -2229,9 +2442,10 @@
         </w:tblBorders>
       </w:tblPr>
       <w:tblGrid>
-        <w:gridCol w:w="3360"/>
-        <w:gridCol w:w="3360"/>
-        <w:gridCol w:w="3360"/>
+        <w:gridCol w:w="2520"/>
+        <w:gridCol w:w="2520"/>
+        <w:gridCol w:w="2520"/>
+        <w:gridCol w:w="2520"/>
       </w:tblGrid>
       <w:tr>
         <w:trPr>
@@ -2239,7 +2453,7 @@
         </w:trPr>
         <w:tc>
           <w:tcPr>
-            <w:tcW w:type="dxa" w:w="3360"/>
+            <w:tcW w:type="dxa" w:w="2520"/>
             <w:tcBorders>
               <w:top w:val="single" w:color="C9D3DF" w:sz="4"/>
               <w:left w:val="single" w:color="C9D3DF" w:sz="4"/>
@@ -2269,7 +2483,7 @@
         </w:tc>
         <w:tc>
           <w:tcPr>
-            <w:tcW w:type="dxa" w:w="3360"/>
+            <w:tcW w:type="dxa" w:w="2520"/>
             <w:tcBorders>
               <w:top w:val="single" w:color="C9D3DF" w:sz="4"/>
               <w:left w:val="single" w:color="C9D3DF" w:sz="4"/>
@@ -2299,7 +2513,37 @@
         </w:tc>
         <w:tc>
           <w:tcPr>
-            <w:tcW w:type="dxa" w:w="3360"/>
+            <w:tcW w:type="dxa" w:w="2520"/>
+            <w:tcBorders>
+              <w:top w:val="single" w:color="C9D3DF" w:sz="4"/>
+              <w:left w:val="single" w:color="C9D3DF" w:sz="4"/>
+              <w:bottom w:val="single" w:color="C9D3DF" w:sz="4"/>
+              <w:right w:val="single" w:color="C9D3DF" w:sz="4"/>
+            </w:tcBorders>
+            <w:shd w:fill="1F3A5F" w:color="auto" w:val="clear"/>
+            <w:tcMar>
+              <w:top w:type="dxa" w:w="60"/>
+              <w:left w:type="dxa" w:w="100"/>
+              <w:bottom w:type="dxa" w:w="60"/>
+              <w:right w:type="dxa" w:w="100"/>
+            </w:tcMar>
+          </w:tcPr>
+          <w:p>
+            <w:r>
+              <w:rPr>
+                <w:b/>
+                <w:bCs/>
+                <w:color w:val="FFFFFF"/>
+                <w:sz w:val="19"/>
+                <w:szCs w:val="19"/>
+              </w:rPr>
+              <w:t xml:space="preserve">Uses on page</w:t>
+            </w:r>
+          </w:p>
+        </w:tc>
+        <w:tc>
+          <w:tcPr>
+            <w:tcW w:type="dxa" w:w="2520"/>
             <w:tcBorders>
               <w:top w:val="single" w:color="C9D3DF" w:sz="4"/>
               <w:left w:val="single" w:color="C9D3DF" w:sz="4"/>
@@ -2334,7 +2578,7 @@
         </w:trPr>
         <w:tc>
           <w:tcPr>
-            <w:tcW w:type="dxa" w:w="3360"/>
+            <w:tcW w:type="dxa" w:w="2520"/>
             <w:tcBorders>
               <w:top w:val="single" w:color="C9D3DF" w:sz="4"/>
               <w:left w:val="single" w:color="C9D3DF" w:sz="4"/>
@@ -2360,7 +2604,7 @@
         </w:tc>
         <w:tc>
           <w:tcPr>
-            <w:tcW w:type="dxa" w:w="3360"/>
+            <w:tcW w:type="dxa" w:w="2520"/>
             <w:tcBorders>
               <w:top w:val="single" w:color="C9D3DF" w:sz="4"/>
               <w:left w:val="single" w:color="C9D3DF" w:sz="4"/>
@@ -2386,7 +2630,33 @@
         </w:tc>
         <w:tc>
           <w:tcPr>
-            <w:tcW w:type="dxa" w:w="3360"/>
+            <w:tcW w:type="dxa" w:w="2520"/>
+            <w:tcBorders>
+              <w:top w:val="single" w:color="C9D3DF" w:sz="4"/>
+              <w:left w:val="single" w:color="C9D3DF" w:sz="4"/>
+              <w:bottom w:val="single" w:color="C9D3DF" w:sz="4"/>
+              <w:right w:val="single" w:color="C9D3DF" w:sz="4"/>
+            </w:tcBorders>
+            <w:tcMar>
+              <w:top w:type="dxa" w:w="60"/>
+              <w:left w:type="dxa" w:w="100"/>
+              <w:bottom w:type="dxa" w:w="60"/>
+              <w:right w:type="dxa" w:w="100"/>
+            </w:tcMar>
+          </w:tcPr>
+          <w:p>
+            <w:r>
+              <w:rPr>
+                <w:sz w:val="19"/>
+                <w:szCs w:val="19"/>
+              </w:rPr>
+              <w:t xml:space="preserve">1</w:t>
+            </w:r>
+          </w:p>
+        </w:tc>
+        <w:tc>
+          <w:tcPr>
+            <w:tcW w:type="dxa" w:w="2520"/>
             <w:tcBorders>
               <w:top w:val="single" w:color="C9D3DF" w:sz="4"/>
               <w:left w:val="single" w:color="C9D3DF" w:sz="4"/>
@@ -2417,7 +2687,7 @@
         </w:trPr>
         <w:tc>
           <w:tcPr>
-            <w:tcW w:type="dxa" w:w="3360"/>
+            <w:tcW w:type="dxa" w:w="2520"/>
             <w:tcBorders>
               <w:top w:val="single" w:color="C9D3DF" w:sz="4"/>
               <w:left w:val="single" w:color="C9D3DF" w:sz="4"/>
@@ -2443,7 +2713,7 @@
         </w:tc>
         <w:tc>
           <w:tcPr>
-            <w:tcW w:type="dxa" w:w="3360"/>
+            <w:tcW w:type="dxa" w:w="2520"/>
             <w:tcBorders>
               <w:top w:val="single" w:color="C9D3DF" w:sz="4"/>
               <w:left w:val="single" w:color="C9D3DF" w:sz="4"/>
@@ -2469,27 +2739,53 @@
         </w:tc>
         <w:tc>
           <w:tcPr>
-            <w:tcW w:type="dxa" w:w="3360"/>
-            <w:tcBorders>
-              <w:top w:val="single" w:color="C9D3DF" w:sz="4"/>
-              <w:left w:val="single" w:color="C9D3DF" w:sz="4"/>
-              <w:bottom w:val="single" w:color="C9D3DF" w:sz="4"/>
-              <w:right w:val="single" w:color="C9D3DF" w:sz="4"/>
-            </w:tcBorders>
-            <w:tcMar>
-              <w:top w:type="dxa" w:w="60"/>
-              <w:left w:type="dxa" w:w="100"/>
-              <w:bottom w:type="dxa" w:w="60"/>
-              <w:right w:type="dxa" w:w="100"/>
-            </w:tcMar>
-          </w:tcPr>
-          <w:p>
-            <w:r>
-              <w:rPr>
-                <w:sz w:val="19"/>
-                <w:szCs w:val="19"/>
-              </w:rPr>
-              <w:t xml:space="preserve">Title, H1, intro</w:t>
+            <w:tcW w:type="dxa" w:w="2520"/>
+            <w:tcBorders>
+              <w:top w:val="single" w:color="C9D3DF" w:sz="4"/>
+              <w:left w:val="single" w:color="C9D3DF" w:sz="4"/>
+              <w:bottom w:val="single" w:color="C9D3DF" w:sz="4"/>
+              <w:right w:val="single" w:color="C9D3DF" w:sz="4"/>
+            </w:tcBorders>
+            <w:tcMar>
+              <w:top w:type="dxa" w:w="60"/>
+              <w:left w:type="dxa" w:w="100"/>
+              <w:bottom w:type="dxa" w:w="60"/>
+              <w:right w:type="dxa" w:w="100"/>
+            </w:tcMar>
+          </w:tcPr>
+          <w:p>
+            <w:r>
+              <w:rPr>
+                <w:sz w:val="19"/>
+                <w:szCs w:val="19"/>
+              </w:rPr>
+              <w:t xml:space="preserve">2</w:t>
+            </w:r>
+          </w:p>
+        </w:tc>
+        <w:tc>
+          <w:tcPr>
+            <w:tcW w:type="dxa" w:w="2520"/>
+            <w:tcBorders>
+              <w:top w:val="single" w:color="C9D3DF" w:sz="4"/>
+              <w:left w:val="single" w:color="C9D3DF" w:sz="4"/>
+              <w:bottom w:val="single" w:color="C9D3DF" w:sz="4"/>
+              <w:right w:val="single" w:color="C9D3DF" w:sz="4"/>
+            </w:tcBorders>
+            <w:tcMar>
+              <w:top w:type="dxa" w:w="60"/>
+              <w:left w:type="dxa" w:w="100"/>
+              <w:bottom w:type="dxa" w:w="60"/>
+              <w:right w:type="dxa" w:w="100"/>
+            </w:tcMar>
+          </w:tcPr>
+          <w:p>
+            <w:r>
+              <w:rPr>
+                <w:sz w:val="19"/>
+                <w:szCs w:val="19"/>
+              </w:rPr>
+              <w:t xml:space="preserve">Title, H1, "Questions people ask" section</w:t>
             </w:r>
           </w:p>
         </w:tc>
@@ -2500,7 +2796,7 @@
         </w:trPr>
         <w:tc>
           <w:tcPr>
-            <w:tcW w:type="dxa" w:w="3360"/>
+            <w:tcW w:type="dxa" w:w="2520"/>
             <w:tcBorders>
               <w:top w:val="single" w:color="C9D3DF" w:sz="4"/>
               <w:left w:val="single" w:color="C9D3DF" w:sz="4"/>
@@ -2526,7 +2822,7 @@
         </w:tc>
         <w:tc>
           <w:tcPr>
-            <w:tcW w:type="dxa" w:w="3360"/>
+            <w:tcW w:type="dxa" w:w="2520"/>
             <w:tcBorders>
               <w:top w:val="single" w:color="C9D3DF" w:sz="4"/>
               <w:left w:val="single" w:color="C9D3DF" w:sz="4"/>
@@ -2552,27 +2848,53 @@
         </w:tc>
         <w:tc>
           <w:tcPr>
-            <w:tcW w:type="dxa" w:w="3360"/>
-            <w:tcBorders>
-              <w:top w:val="single" w:color="C9D3DF" w:sz="4"/>
-              <w:left w:val="single" w:color="C9D3DF" w:sz="4"/>
-              <w:bottom w:val="single" w:color="C9D3DF" w:sz="4"/>
-              <w:right w:val="single" w:color="C9D3DF" w:sz="4"/>
-            </w:tcBorders>
-            <w:tcMar>
-              <w:top w:type="dxa" w:w="60"/>
-              <w:left w:type="dxa" w:w="100"/>
-              <w:bottom w:type="dxa" w:w="60"/>
-              <w:right w:type="dxa" w:w="100"/>
-            </w:tcMar>
-          </w:tcPr>
-          <w:p>
-            <w:r>
-              <w:rPr>
-                <w:sz w:val="19"/>
-                <w:szCs w:val="19"/>
-              </w:rPr>
-              <w:t xml:space="preserve">Title, story</w:t>
+            <w:tcW w:type="dxa" w:w="2520"/>
+            <w:tcBorders>
+              <w:top w:val="single" w:color="C9D3DF" w:sz="4"/>
+              <w:left w:val="single" w:color="C9D3DF" w:sz="4"/>
+              <w:bottom w:val="single" w:color="C9D3DF" w:sz="4"/>
+              <w:right w:val="single" w:color="C9D3DF" w:sz="4"/>
+            </w:tcBorders>
+            <w:tcMar>
+              <w:top w:type="dxa" w:w="60"/>
+              <w:left w:type="dxa" w:w="100"/>
+              <w:bottom w:type="dxa" w:w="60"/>
+              <w:right w:type="dxa" w:w="100"/>
+            </w:tcMar>
+          </w:tcPr>
+          <w:p>
+            <w:r>
+              <w:rPr>
+                <w:sz w:val="19"/>
+                <w:szCs w:val="19"/>
+              </w:rPr>
+              <w:t xml:space="preserve">3</w:t>
+            </w:r>
+          </w:p>
+        </w:tc>
+        <w:tc>
+          <w:tcPr>
+            <w:tcW w:type="dxa" w:w="2520"/>
+            <w:tcBorders>
+              <w:top w:val="single" w:color="C9D3DF" w:sz="4"/>
+              <w:left w:val="single" w:color="C9D3DF" w:sz="4"/>
+              <w:bottom w:val="single" w:color="C9D3DF" w:sz="4"/>
+              <w:right w:val="single" w:color="C9D3DF" w:sz="4"/>
+            </w:tcBorders>
+            <w:tcMar>
+              <w:top w:type="dxa" w:w="60"/>
+              <w:left w:type="dxa" w:w="100"/>
+              <w:bottom w:type="dxa" w:w="60"/>
+              <w:right w:type="dxa" w:w="100"/>
+            </w:tcMar>
+          </w:tcPr>
+          <w:p>
+            <w:r>
+              <w:rPr>
+                <w:sz w:val="19"/>
+                <w:szCs w:val="19"/>
+              </w:rPr>
+              <w:t xml:space="preserve">Title, Meta, H1, "Meet Rachel" section, "How Lynkk helps Rachel transcribe interviews" section</w:t>
             </w:r>
           </w:p>
         </w:tc>
@@ -2583,7 +2905,7 @@
         </w:trPr>
         <w:tc>
           <w:tcPr>
-            <w:tcW w:type="dxa" w:w="3360"/>
+            <w:tcW w:type="dxa" w:w="2520"/>
             <w:tcBorders>
               <w:top w:val="single" w:color="C9D3DF" w:sz="4"/>
               <w:left w:val="single" w:color="C9D3DF" w:sz="4"/>
@@ -2609,7 +2931,7 @@
         </w:tc>
         <w:tc>
           <w:tcPr>
-            <w:tcW w:type="dxa" w:w="3360"/>
+            <w:tcW w:type="dxa" w:w="2520"/>
             <w:tcBorders>
               <w:top w:val="single" w:color="C9D3DF" w:sz="4"/>
               <w:left w:val="single" w:color="C9D3DF" w:sz="4"/>
@@ -2635,27 +2957,53 @@
         </w:tc>
         <w:tc>
           <w:tcPr>
-            <w:tcW w:type="dxa" w:w="3360"/>
-            <w:tcBorders>
-              <w:top w:val="single" w:color="C9D3DF" w:sz="4"/>
-              <w:left w:val="single" w:color="C9D3DF" w:sz="4"/>
-              <w:bottom w:val="single" w:color="C9D3DF" w:sz="4"/>
-              <w:right w:val="single" w:color="C9D3DF" w:sz="4"/>
-            </w:tcBorders>
-            <w:tcMar>
-              <w:top w:type="dxa" w:w="60"/>
-              <w:left w:type="dxa" w:w="100"/>
-              <w:bottom w:type="dxa" w:w="60"/>
-              <w:right w:type="dxa" w:w="100"/>
-            </w:tcMar>
-          </w:tcPr>
-          <w:p>
-            <w:r>
-              <w:rPr>
-                <w:sz w:val="19"/>
-                <w:szCs w:val="19"/>
-              </w:rPr>
-              <w:t xml:space="preserve">FAQ</w:t>
+            <w:tcW w:type="dxa" w:w="2520"/>
+            <w:tcBorders>
+              <w:top w:val="single" w:color="C9D3DF" w:sz="4"/>
+              <w:left w:val="single" w:color="C9D3DF" w:sz="4"/>
+              <w:bottom w:val="single" w:color="C9D3DF" w:sz="4"/>
+              <w:right w:val="single" w:color="C9D3DF" w:sz="4"/>
+            </w:tcBorders>
+            <w:tcMar>
+              <w:top w:type="dxa" w:w="60"/>
+              <w:left w:type="dxa" w:w="100"/>
+              <w:bottom w:type="dxa" w:w="60"/>
+              <w:right w:type="dxa" w:w="100"/>
+            </w:tcMar>
+          </w:tcPr>
+          <w:p>
+            <w:r>
+              <w:rPr>
+                <w:sz w:val="19"/>
+                <w:szCs w:val="19"/>
+              </w:rPr>
+              <w:t xml:space="preserve">1</w:t>
+            </w:r>
+          </w:p>
+        </w:tc>
+        <w:tc>
+          <w:tcPr>
+            <w:tcW w:type="dxa" w:w="2520"/>
+            <w:tcBorders>
+              <w:top w:val="single" w:color="C9D3DF" w:sz="4"/>
+              <w:left w:val="single" w:color="C9D3DF" w:sz="4"/>
+              <w:bottom w:val="single" w:color="C9D3DF" w:sz="4"/>
+              <w:right w:val="single" w:color="C9D3DF" w:sz="4"/>
+            </w:tcBorders>
+            <w:tcMar>
+              <w:top w:type="dxa" w:w="60"/>
+              <w:left w:type="dxa" w:w="100"/>
+              <w:bottom w:type="dxa" w:w="60"/>
+              <w:right w:type="dxa" w:w="100"/>
+            </w:tcMar>
+          </w:tcPr>
+          <w:p>
+            <w:r>
+              <w:rPr>
+                <w:sz w:val="19"/>
+                <w:szCs w:val="19"/>
+              </w:rPr>
+              <w:t xml:space="preserve">"Questions people ask" section</w:t>
             </w:r>
           </w:p>
         </w:tc>
@@ -2666,7 +3014,7 @@
         </w:trPr>
         <w:tc>
           <w:tcPr>
-            <w:tcW w:type="dxa" w:w="3360"/>
+            <w:tcW w:type="dxa" w:w="2520"/>
             <w:tcBorders>
               <w:top w:val="single" w:color="C9D3DF" w:sz="4"/>
               <w:left w:val="single" w:color="C9D3DF" w:sz="4"/>
@@ -2692,7 +3040,7 @@
         </w:tc>
         <w:tc>
           <w:tcPr>
-            <w:tcW w:type="dxa" w:w="3360"/>
+            <w:tcW w:type="dxa" w:w="2520"/>
             <w:tcBorders>
               <w:top w:val="single" w:color="C9D3DF" w:sz="4"/>
               <w:left w:val="single" w:color="C9D3DF" w:sz="4"/>
@@ -2718,27 +3066,53 @@
         </w:tc>
         <w:tc>
           <w:tcPr>
-            <w:tcW w:type="dxa" w:w="3360"/>
-            <w:tcBorders>
-              <w:top w:val="single" w:color="C9D3DF" w:sz="4"/>
-              <w:left w:val="single" w:color="C9D3DF" w:sz="4"/>
-              <w:bottom w:val="single" w:color="C9D3DF" w:sz="4"/>
-              <w:right w:val="single" w:color="C9D3DF" w:sz="4"/>
-            </w:tcBorders>
-            <w:tcMar>
-              <w:top w:type="dxa" w:w="60"/>
-              <w:left w:type="dxa" w:w="100"/>
-              <w:bottom w:type="dxa" w:w="60"/>
-              <w:right w:type="dxa" w:w="100"/>
-            </w:tcMar>
-          </w:tcPr>
-          <w:p>
-            <w:r>
-              <w:rPr>
-                <w:sz w:val="19"/>
-                <w:szCs w:val="19"/>
-              </w:rPr>
-              <w:t xml:space="preserve">FAQ</w:t>
+            <w:tcW w:type="dxa" w:w="2520"/>
+            <w:tcBorders>
+              <w:top w:val="single" w:color="C9D3DF" w:sz="4"/>
+              <w:left w:val="single" w:color="C9D3DF" w:sz="4"/>
+              <w:bottom w:val="single" w:color="C9D3DF" w:sz="4"/>
+              <w:right w:val="single" w:color="C9D3DF" w:sz="4"/>
+            </w:tcBorders>
+            <w:tcMar>
+              <w:top w:type="dxa" w:w="60"/>
+              <w:left w:type="dxa" w:w="100"/>
+              <w:bottom w:type="dxa" w:w="60"/>
+              <w:right w:type="dxa" w:w="100"/>
+            </w:tcMar>
+          </w:tcPr>
+          <w:p>
+            <w:r>
+              <w:rPr>
+                <w:sz w:val="19"/>
+                <w:szCs w:val="19"/>
+              </w:rPr>
+              <w:t xml:space="preserve">1</w:t>
+            </w:r>
+          </w:p>
+        </w:tc>
+        <w:tc>
+          <w:tcPr>
+            <w:tcW w:type="dxa" w:w="2520"/>
+            <w:tcBorders>
+              <w:top w:val="single" w:color="C9D3DF" w:sz="4"/>
+              <w:left w:val="single" w:color="C9D3DF" w:sz="4"/>
+              <w:bottom w:val="single" w:color="C9D3DF" w:sz="4"/>
+              <w:right w:val="single" w:color="C9D3DF" w:sz="4"/>
+            </w:tcBorders>
+            <w:tcMar>
+              <w:top w:type="dxa" w:w="60"/>
+              <w:left w:type="dxa" w:w="100"/>
+              <w:bottom w:type="dxa" w:w="60"/>
+              <w:right w:type="dxa" w:w="100"/>
+            </w:tcMar>
+          </w:tcPr>
+          <w:p>
+            <w:r>
+              <w:rPr>
+                <w:sz w:val="19"/>
+                <w:szCs w:val="19"/>
+              </w:rPr>
+              <w:t xml:space="preserve">"Questions people ask" section</w:t>
             </w:r>
           </w:p>
         </w:tc>
@@ -2749,7 +3123,7 @@
         </w:trPr>
         <w:tc>
           <w:tcPr>
-            <w:tcW w:type="dxa" w:w="3360"/>
+            <w:tcW w:type="dxa" w:w="2520"/>
             <w:tcBorders>
               <w:top w:val="single" w:color="C9D3DF" w:sz="4"/>
               <w:left w:val="single" w:color="C9D3DF" w:sz="4"/>
@@ -2775,7 +3149,7 @@
         </w:tc>
         <w:tc>
           <w:tcPr>
-            <w:tcW w:type="dxa" w:w="3360"/>
+            <w:tcW w:type="dxa" w:w="2520"/>
             <w:tcBorders>
               <w:top w:val="single" w:color="C9D3DF" w:sz="4"/>
               <w:left w:val="single" w:color="C9D3DF" w:sz="4"/>
@@ -2801,27 +3175,53 @@
         </w:tc>
         <w:tc>
           <w:tcPr>
-            <w:tcW w:type="dxa" w:w="3360"/>
-            <w:tcBorders>
-              <w:top w:val="single" w:color="C9D3DF" w:sz="4"/>
-              <w:left w:val="single" w:color="C9D3DF" w:sz="4"/>
-              <w:bottom w:val="single" w:color="C9D3DF" w:sz="4"/>
-              <w:right w:val="single" w:color="C9D3DF" w:sz="4"/>
-            </w:tcBorders>
-            <w:tcMar>
-              <w:top w:type="dxa" w:w="60"/>
-              <w:left w:type="dxa" w:w="100"/>
-              <w:bottom w:type="dxa" w:w="60"/>
-              <w:right w:type="dxa" w:w="100"/>
-            </w:tcMar>
-          </w:tcPr>
-          <w:p>
-            <w:r>
-              <w:rPr>
-                <w:sz w:val="19"/>
-                <w:szCs w:val="19"/>
-              </w:rPr>
-              <w:t xml:space="preserve">Story heading</w:t>
+            <w:tcW w:type="dxa" w:w="2520"/>
+            <w:tcBorders>
+              <w:top w:val="single" w:color="C9D3DF" w:sz="4"/>
+              <w:left w:val="single" w:color="C9D3DF" w:sz="4"/>
+              <w:bottom w:val="single" w:color="C9D3DF" w:sz="4"/>
+              <w:right w:val="single" w:color="C9D3DF" w:sz="4"/>
+            </w:tcBorders>
+            <w:tcMar>
+              <w:top w:type="dxa" w:w="60"/>
+              <w:left w:type="dxa" w:w="100"/>
+              <w:bottom w:type="dxa" w:w="60"/>
+              <w:right w:type="dxa" w:w="100"/>
+            </w:tcMar>
+          </w:tcPr>
+          <w:p>
+            <w:r>
+              <w:rPr>
+                <w:sz w:val="19"/>
+                <w:szCs w:val="19"/>
+              </w:rPr>
+              <w:t xml:space="preserve">1</w:t>
+            </w:r>
+          </w:p>
+        </w:tc>
+        <w:tc>
+          <w:tcPr>
+            <w:tcW w:type="dxa" w:w="2520"/>
+            <w:tcBorders>
+              <w:top w:val="single" w:color="C9D3DF" w:sz="4"/>
+              <w:left w:val="single" w:color="C9D3DF" w:sz="4"/>
+              <w:bottom w:val="single" w:color="C9D3DF" w:sz="4"/>
+              <w:right w:val="single" w:color="C9D3DF" w:sz="4"/>
+            </w:tcBorders>
+            <w:tcMar>
+              <w:top w:type="dxa" w:w="60"/>
+              <w:left w:type="dxa" w:w="100"/>
+              <w:bottom w:type="dxa" w:w="60"/>
+              <w:right w:type="dxa" w:w="100"/>
+            </w:tcMar>
+          </w:tcPr>
+          <w:p>
+            <w:r>
+              <w:rPr>
+                <w:sz w:val="19"/>
+                <w:szCs w:val="19"/>
+              </w:rPr>
+              <w:t xml:space="preserve">"How Lynkk helps Rachel transcribe interviews" heading</w:t>
             </w:r>
           </w:p>
         </w:tc>
@@ -3796,7 +4196,7 @@
       <w:r>
         <w:t xml:space="preserve">Your notes are private unless you share them. Your data is encrypted and stays in the region you choose. Lynkk never uses your recordings to train AI. </w:t>
       </w:r>
-      <w:hyperlink w:history="1" r:id="rIdcwpjb6wchfrlhyvt9cmcs">
+      <w:hyperlink w:history="1" r:id="rIdcmepe78jat1ccy_lvfalv">
         <w:r>
           <w:rPr>
             <w:rStyle w:val="Hyperlink"/>
@@ -4018,7 +4418,7 @@
       <w:pPr>
         <w:spacing w:after="140"/>
       </w:pPr>
-      <w:hyperlink w:history="1" r:id="rIdljw72ihnfo-9sk-98uvhs">
+      <w:hyperlink w:history="1" r:id="rIdf8lu1ioorozq0g3gmntm4">
         <w:r>
           <w:rPr>
             <w:rStyle w:val="Hyperlink"/>
@@ -4205,9 +4605,10 @@
         </w:tblBorders>
       </w:tblPr>
       <w:tblGrid>
-        <w:gridCol w:w="3360"/>
-        <w:gridCol w:w="3360"/>
-        <w:gridCol w:w="3360"/>
+        <w:gridCol w:w="2520"/>
+        <w:gridCol w:w="2520"/>
+        <w:gridCol w:w="2520"/>
+        <w:gridCol w:w="2520"/>
       </w:tblGrid>
       <w:tr>
         <w:trPr>
@@ -4215,7 +4616,7 @@
         </w:trPr>
         <w:tc>
           <w:tcPr>
-            <w:tcW w:type="dxa" w:w="3360"/>
+            <w:tcW w:type="dxa" w:w="2520"/>
             <w:tcBorders>
               <w:top w:val="single" w:color="C9D3DF" w:sz="4"/>
               <w:left w:val="single" w:color="C9D3DF" w:sz="4"/>
@@ -4245,7 +4646,7 @@
         </w:tc>
         <w:tc>
           <w:tcPr>
-            <w:tcW w:type="dxa" w:w="3360"/>
+            <w:tcW w:type="dxa" w:w="2520"/>
             <w:tcBorders>
               <w:top w:val="single" w:color="C9D3DF" w:sz="4"/>
               <w:left w:val="single" w:color="C9D3DF" w:sz="4"/>
@@ -4275,7 +4676,37 @@
         </w:tc>
         <w:tc>
           <w:tcPr>
-            <w:tcW w:type="dxa" w:w="3360"/>
+            <w:tcW w:type="dxa" w:w="2520"/>
+            <w:tcBorders>
+              <w:top w:val="single" w:color="C9D3DF" w:sz="4"/>
+              <w:left w:val="single" w:color="C9D3DF" w:sz="4"/>
+              <w:bottom w:val="single" w:color="C9D3DF" w:sz="4"/>
+              <w:right w:val="single" w:color="C9D3DF" w:sz="4"/>
+            </w:tcBorders>
+            <w:shd w:fill="1F3A5F" w:color="auto" w:val="clear"/>
+            <w:tcMar>
+              <w:top w:type="dxa" w:w="60"/>
+              <w:left w:type="dxa" w:w="100"/>
+              <w:bottom w:type="dxa" w:w="60"/>
+              <w:right w:type="dxa" w:w="100"/>
+            </w:tcMar>
+          </w:tcPr>
+          <w:p>
+            <w:r>
+              <w:rPr>
+                <w:b/>
+                <w:bCs/>
+                <w:color w:val="FFFFFF"/>
+                <w:sz w:val="19"/>
+                <w:szCs w:val="19"/>
+              </w:rPr>
+              <w:t xml:space="preserve">Uses on page</w:t>
+            </w:r>
+          </w:p>
+        </w:tc>
+        <w:tc>
+          <w:tcPr>
+            <w:tcW w:type="dxa" w:w="2520"/>
             <w:tcBorders>
               <w:top w:val="single" w:color="C9D3DF" w:sz="4"/>
               <w:left w:val="single" w:color="C9D3DF" w:sz="4"/>
@@ -4310,7 +4741,7 @@
         </w:trPr>
         <w:tc>
           <w:tcPr>
-            <w:tcW w:type="dxa" w:w="3360"/>
+            <w:tcW w:type="dxa" w:w="2520"/>
             <w:tcBorders>
               <w:top w:val="single" w:color="C9D3DF" w:sz="4"/>
               <w:left w:val="single" w:color="C9D3DF" w:sz="4"/>
@@ -4336,7 +4767,7 @@
         </w:tc>
         <w:tc>
           <w:tcPr>
-            <w:tcW w:type="dxa" w:w="3360"/>
+            <w:tcW w:type="dxa" w:w="2520"/>
             <w:tcBorders>
               <w:top w:val="single" w:color="C9D3DF" w:sz="4"/>
               <w:left w:val="single" w:color="C9D3DF" w:sz="4"/>
@@ -4362,27 +4793,53 @@
         </w:tc>
         <w:tc>
           <w:tcPr>
-            <w:tcW w:type="dxa" w:w="3360"/>
-            <w:tcBorders>
-              <w:top w:val="single" w:color="C9D3DF" w:sz="4"/>
-              <w:left w:val="single" w:color="C9D3DF" w:sz="4"/>
-              <w:bottom w:val="single" w:color="C9D3DF" w:sz="4"/>
-              <w:right w:val="single" w:color="C9D3DF" w:sz="4"/>
-            </w:tcBorders>
-            <w:tcMar>
-              <w:top w:type="dxa" w:w="60"/>
-              <w:left w:type="dxa" w:w="100"/>
-              <w:bottom w:type="dxa" w:w="60"/>
-              <w:right w:type="dxa" w:w="100"/>
-            </w:tcMar>
-          </w:tcPr>
-          <w:p>
-            <w:r>
-              <w:rPr>
-                <w:sz w:val="19"/>
-                <w:szCs w:val="19"/>
-              </w:rPr>
-              <w:t xml:space="preserve">Title, H1, "So, what is Lynkk?"</w:t>
+            <w:tcW w:type="dxa" w:w="2520"/>
+            <w:tcBorders>
+              <w:top w:val="single" w:color="C9D3DF" w:sz="4"/>
+              <w:left w:val="single" w:color="C9D3DF" w:sz="4"/>
+              <w:bottom w:val="single" w:color="C9D3DF" w:sz="4"/>
+              <w:right w:val="single" w:color="C9D3DF" w:sz="4"/>
+            </w:tcBorders>
+            <w:tcMar>
+              <w:top w:type="dxa" w:w="60"/>
+              <w:left w:type="dxa" w:w="100"/>
+              <w:bottom w:type="dxa" w:w="60"/>
+              <w:right w:type="dxa" w:w="100"/>
+            </w:tcMar>
+          </w:tcPr>
+          <w:p>
+            <w:r>
+              <w:rPr>
+                <w:sz w:val="19"/>
+                <w:szCs w:val="19"/>
+              </w:rPr>
+              <w:t xml:space="preserve">2</w:t>
+            </w:r>
+          </w:p>
+        </w:tc>
+        <w:tc>
+          <w:tcPr>
+            <w:tcW w:type="dxa" w:w="2520"/>
+            <w:tcBorders>
+              <w:top w:val="single" w:color="C9D3DF" w:sz="4"/>
+              <w:left w:val="single" w:color="C9D3DF" w:sz="4"/>
+              <w:bottom w:val="single" w:color="C9D3DF" w:sz="4"/>
+              <w:right w:val="single" w:color="C9D3DF" w:sz="4"/>
+            </w:tcBorders>
+            <w:tcMar>
+              <w:top w:type="dxa" w:w="60"/>
+              <w:left w:type="dxa" w:w="100"/>
+              <w:bottom w:type="dxa" w:w="60"/>
+              <w:right w:type="dxa" w:w="100"/>
+            </w:tcMar>
+          </w:tcPr>
+          <w:p>
+            <w:r>
+              <w:rPr>
+                <w:sz w:val="19"/>
+                <w:szCs w:val="19"/>
+              </w:rPr>
+              <w:t xml:space="preserve">Title, Meta, H1, "So, what is Lynkk?" section</w:t>
             </w:r>
           </w:p>
         </w:tc>
@@ -4393,7 +4850,7 @@
         </w:trPr>
         <w:tc>
           <w:tcPr>
-            <w:tcW w:type="dxa" w:w="3360"/>
+            <w:tcW w:type="dxa" w:w="2520"/>
             <w:tcBorders>
               <w:top w:val="single" w:color="C9D3DF" w:sz="4"/>
               <w:left w:val="single" w:color="C9D3DF" w:sz="4"/>
@@ -4419,7 +4876,7 @@
         </w:tc>
         <w:tc>
           <w:tcPr>
-            <w:tcW w:type="dxa" w:w="3360"/>
+            <w:tcW w:type="dxa" w:w="2520"/>
             <w:tcBorders>
               <w:top w:val="single" w:color="C9D3DF" w:sz="4"/>
               <w:left w:val="single" w:color="C9D3DF" w:sz="4"/>
@@ -4445,27 +4902,53 @@
         </w:tc>
         <w:tc>
           <w:tcPr>
-            <w:tcW w:type="dxa" w:w="3360"/>
-            <w:tcBorders>
-              <w:top w:val="single" w:color="C9D3DF" w:sz="4"/>
-              <w:left w:val="single" w:color="C9D3DF" w:sz="4"/>
-              <w:bottom w:val="single" w:color="C9D3DF" w:sz="4"/>
-              <w:right w:val="single" w:color="C9D3DF" w:sz="4"/>
-            </w:tcBorders>
-            <w:tcMar>
-              <w:top w:type="dxa" w:w="60"/>
-              <w:left w:type="dxa" w:w="100"/>
-              <w:bottom w:type="dxa" w:w="60"/>
-              <w:right w:type="dxa" w:w="100"/>
-            </w:tcMar>
-          </w:tcPr>
-          <w:p>
-            <w:r>
-              <w:rPr>
-                <w:sz w:val="19"/>
-                <w:szCs w:val="19"/>
-              </w:rPr>
-              <w:t xml:space="preserve">Title, story</w:t>
+            <w:tcW w:type="dxa" w:w="2520"/>
+            <w:tcBorders>
+              <w:top w:val="single" w:color="C9D3DF" w:sz="4"/>
+              <w:left w:val="single" w:color="C9D3DF" w:sz="4"/>
+              <w:bottom w:val="single" w:color="C9D3DF" w:sz="4"/>
+              <w:right w:val="single" w:color="C9D3DF" w:sz="4"/>
+            </w:tcBorders>
+            <w:tcMar>
+              <w:top w:type="dxa" w:w="60"/>
+              <w:left w:type="dxa" w:w="100"/>
+              <w:bottom w:type="dxa" w:w="60"/>
+              <w:right w:type="dxa" w:w="100"/>
+            </w:tcMar>
+          </w:tcPr>
+          <w:p>
+            <w:r>
+              <w:rPr>
+                <w:sz w:val="19"/>
+                <w:szCs w:val="19"/>
+              </w:rPr>
+              <w:t xml:space="preserve">5</w:t>
+            </w:r>
+          </w:p>
+        </w:tc>
+        <w:tc>
+          <w:tcPr>
+            <w:tcW w:type="dxa" w:w="2520"/>
+            <w:tcBorders>
+              <w:top w:val="single" w:color="C9D3DF" w:sz="4"/>
+              <w:left w:val="single" w:color="C9D3DF" w:sz="4"/>
+              <w:bottom w:val="single" w:color="C9D3DF" w:sz="4"/>
+              <w:right w:val="single" w:color="C9D3DF" w:sz="4"/>
+            </w:tcBorders>
+            <w:tcMar>
+              <w:top w:type="dxa" w:w="60"/>
+              <w:left w:type="dxa" w:w="100"/>
+              <w:bottom w:type="dxa" w:w="60"/>
+              <w:right w:type="dxa" w:w="100"/>
+            </w:tcMar>
+          </w:tcPr>
+          <w:p>
+            <w:r>
+              <w:rPr>
+                <w:sz w:val="19"/>
+                <w:szCs w:val="19"/>
+              </w:rPr>
+              <w:t xml:space="preserve">Title, Meta, H1, Intro, "Meet Jake" section</w:t>
             </w:r>
           </w:p>
         </w:tc>
@@ -4476,7 +4959,7 @@
         </w:trPr>
         <w:tc>
           <w:tcPr>
-            <w:tcW w:type="dxa" w:w="3360"/>
+            <w:tcW w:type="dxa" w:w="2520"/>
             <w:tcBorders>
               <w:top w:val="single" w:color="C9D3DF" w:sz="4"/>
               <w:left w:val="single" w:color="C9D3DF" w:sz="4"/>
@@ -4502,7 +4985,7 @@
         </w:tc>
         <w:tc>
           <w:tcPr>
-            <w:tcW w:type="dxa" w:w="3360"/>
+            <w:tcW w:type="dxa" w:w="2520"/>
             <w:tcBorders>
               <w:top w:val="single" w:color="C9D3DF" w:sz="4"/>
               <w:left w:val="single" w:color="C9D3DF" w:sz="4"/>
@@ -4528,27 +5011,53 @@
         </w:tc>
         <w:tc>
           <w:tcPr>
-            <w:tcW w:type="dxa" w:w="3360"/>
-            <w:tcBorders>
-              <w:top w:val="single" w:color="C9D3DF" w:sz="4"/>
-              <w:left w:val="single" w:color="C9D3DF" w:sz="4"/>
-              <w:bottom w:val="single" w:color="C9D3DF" w:sz="4"/>
-              <w:right w:val="single" w:color="C9D3DF" w:sz="4"/>
-            </w:tcBorders>
-            <w:tcMar>
-              <w:top w:type="dxa" w:w="60"/>
-              <w:left w:type="dxa" w:w="100"/>
-              <w:bottom w:type="dxa" w:w="60"/>
-              <w:right w:type="dxa" w:w="100"/>
-            </w:tcMar>
-          </w:tcPr>
-          <w:p>
-            <w:r>
-              <w:rPr>
-                <w:sz w:val="19"/>
-                <w:szCs w:val="19"/>
-              </w:rPr>
-              <w:t xml:space="preserve">Meta description, story heading</w:t>
+            <w:tcW w:type="dxa" w:w="2520"/>
+            <w:tcBorders>
+              <w:top w:val="single" w:color="C9D3DF" w:sz="4"/>
+              <w:left w:val="single" w:color="C9D3DF" w:sz="4"/>
+              <w:bottom w:val="single" w:color="C9D3DF" w:sz="4"/>
+              <w:right w:val="single" w:color="C9D3DF" w:sz="4"/>
+            </w:tcBorders>
+            <w:tcMar>
+              <w:top w:type="dxa" w:w="60"/>
+              <w:left w:type="dxa" w:w="100"/>
+              <w:bottom w:type="dxa" w:w="60"/>
+              <w:right w:type="dxa" w:w="100"/>
+            </w:tcMar>
+          </w:tcPr>
+          <w:p>
+            <w:r>
+              <w:rPr>
+                <w:sz w:val="19"/>
+                <w:szCs w:val="19"/>
+              </w:rPr>
+              <w:t xml:space="preserve">2</w:t>
+            </w:r>
+          </w:p>
+        </w:tc>
+        <w:tc>
+          <w:tcPr>
+            <w:tcW w:type="dxa" w:w="2520"/>
+            <w:tcBorders>
+              <w:top w:val="single" w:color="C9D3DF" w:sz="4"/>
+              <w:left w:val="single" w:color="C9D3DF" w:sz="4"/>
+              <w:bottom w:val="single" w:color="C9D3DF" w:sz="4"/>
+              <w:right w:val="single" w:color="C9D3DF" w:sz="4"/>
+            </w:tcBorders>
+            <w:tcMar>
+              <w:top w:type="dxa" w:w="60"/>
+              <w:left w:type="dxa" w:w="100"/>
+              <w:bottom w:type="dxa" w:w="60"/>
+              <w:right w:type="dxa" w:w="100"/>
+            </w:tcMar>
+          </w:tcPr>
+          <w:p>
+            <w:r>
+              <w:rPr>
+                <w:sz w:val="19"/>
+                <w:szCs w:val="19"/>
+              </w:rPr>
+              <w:t xml:space="preserve">Meta, "How Lynkk helps Jake with the daily standup meeting" heading, "How Lynkk helps Jake with the daily standup meeting" section</w:t>
             </w:r>
           </w:p>
         </w:tc>
@@ -4559,7 +5068,7 @@
         </w:trPr>
         <w:tc>
           <w:tcPr>
-            <w:tcW w:type="dxa" w:w="3360"/>
+            <w:tcW w:type="dxa" w:w="2520"/>
             <w:tcBorders>
               <w:top w:val="single" w:color="C9D3DF" w:sz="4"/>
               <w:left w:val="single" w:color="C9D3DF" w:sz="4"/>
@@ -4585,7 +5094,7 @@
         </w:tc>
         <w:tc>
           <w:tcPr>
-            <w:tcW w:type="dxa" w:w="3360"/>
+            <w:tcW w:type="dxa" w:w="2520"/>
             <w:tcBorders>
               <w:top w:val="single" w:color="C9D3DF" w:sz="4"/>
               <w:left w:val="single" w:color="C9D3DF" w:sz="4"/>
@@ -4611,27 +5120,53 @@
         </w:tc>
         <w:tc>
           <w:tcPr>
-            <w:tcW w:type="dxa" w:w="3360"/>
-            <w:tcBorders>
-              <w:top w:val="single" w:color="C9D3DF" w:sz="4"/>
-              <w:left w:val="single" w:color="C9D3DF" w:sz="4"/>
-              <w:bottom w:val="single" w:color="C9D3DF" w:sz="4"/>
-              <w:right w:val="single" w:color="C9D3DF" w:sz="4"/>
-            </w:tcBorders>
-            <w:tcMar>
-              <w:top w:type="dxa" w:w="60"/>
-              <w:left w:type="dxa" w:w="100"/>
-              <w:bottom w:type="dxa" w:w="60"/>
-              <w:right w:type="dxa" w:w="100"/>
-            </w:tcMar>
-          </w:tcPr>
-          <w:p>
-            <w:r>
-              <w:rPr>
-                <w:sz w:val="19"/>
-                <w:szCs w:val="19"/>
-              </w:rPr>
-              <w:t xml:space="preserve">FAQ</w:t>
+            <w:tcW w:type="dxa" w:w="2520"/>
+            <w:tcBorders>
+              <w:top w:val="single" w:color="C9D3DF" w:sz="4"/>
+              <w:left w:val="single" w:color="C9D3DF" w:sz="4"/>
+              <w:bottom w:val="single" w:color="C9D3DF" w:sz="4"/>
+              <w:right w:val="single" w:color="C9D3DF" w:sz="4"/>
+            </w:tcBorders>
+            <w:tcMar>
+              <w:top w:type="dxa" w:w="60"/>
+              <w:left w:type="dxa" w:w="100"/>
+              <w:bottom w:type="dxa" w:w="60"/>
+              <w:right w:type="dxa" w:w="100"/>
+            </w:tcMar>
+          </w:tcPr>
+          <w:p>
+            <w:r>
+              <w:rPr>
+                <w:sz w:val="19"/>
+                <w:szCs w:val="19"/>
+              </w:rPr>
+              <w:t xml:space="preserve">1</w:t>
+            </w:r>
+          </w:p>
+        </w:tc>
+        <w:tc>
+          <w:tcPr>
+            <w:tcW w:type="dxa" w:w="2520"/>
+            <w:tcBorders>
+              <w:top w:val="single" w:color="C9D3DF" w:sz="4"/>
+              <w:left w:val="single" w:color="C9D3DF" w:sz="4"/>
+              <w:bottom w:val="single" w:color="C9D3DF" w:sz="4"/>
+              <w:right w:val="single" w:color="C9D3DF" w:sz="4"/>
+            </w:tcBorders>
+            <w:tcMar>
+              <w:top w:type="dxa" w:w="60"/>
+              <w:left w:type="dxa" w:w="100"/>
+              <w:bottom w:type="dxa" w:w="60"/>
+              <w:right w:type="dxa" w:w="100"/>
+            </w:tcMar>
+          </w:tcPr>
+          <w:p>
+            <w:r>
+              <w:rPr>
+                <w:sz w:val="19"/>
+                <w:szCs w:val="19"/>
+              </w:rPr>
+              <w:t xml:space="preserve">"Questions people ask" section</w:t>
             </w:r>
           </w:p>
         </w:tc>
@@ -4642,7 +5177,7 @@
         </w:trPr>
         <w:tc>
           <w:tcPr>
-            <w:tcW w:type="dxa" w:w="3360"/>
+            <w:tcW w:type="dxa" w:w="2520"/>
             <w:tcBorders>
               <w:top w:val="single" w:color="C9D3DF" w:sz="4"/>
               <w:left w:val="single" w:color="C9D3DF" w:sz="4"/>
@@ -4668,7 +5203,7 @@
         </w:tc>
         <w:tc>
           <w:tcPr>
-            <w:tcW w:type="dxa" w:w="3360"/>
+            <w:tcW w:type="dxa" w:w="2520"/>
             <w:tcBorders>
               <w:top w:val="single" w:color="C9D3DF" w:sz="4"/>
               <w:left w:val="single" w:color="C9D3DF" w:sz="4"/>
@@ -4694,27 +5229,53 @@
         </w:tc>
         <w:tc>
           <w:tcPr>
-            <w:tcW w:type="dxa" w:w="3360"/>
-            <w:tcBorders>
-              <w:top w:val="single" w:color="C9D3DF" w:sz="4"/>
-              <w:left w:val="single" w:color="C9D3DF" w:sz="4"/>
-              <w:bottom w:val="single" w:color="C9D3DF" w:sz="4"/>
-              <w:right w:val="single" w:color="C9D3DF" w:sz="4"/>
-            </w:tcBorders>
-            <w:tcMar>
-              <w:top w:type="dxa" w:w="60"/>
-              <w:left w:type="dxa" w:w="100"/>
-              <w:bottom w:type="dxa" w:w="60"/>
-              <w:right w:type="dxa" w:w="100"/>
-            </w:tcMar>
-          </w:tcPr>
-          <w:p>
-            <w:r>
-              <w:rPr>
-                <w:sz w:val="19"/>
-                <w:szCs w:val="19"/>
-              </w:rPr>
-              <w:t xml:space="preserve">FAQ</w:t>
+            <w:tcW w:type="dxa" w:w="2520"/>
+            <w:tcBorders>
+              <w:top w:val="single" w:color="C9D3DF" w:sz="4"/>
+              <w:left w:val="single" w:color="C9D3DF" w:sz="4"/>
+              <w:bottom w:val="single" w:color="C9D3DF" w:sz="4"/>
+              <w:right w:val="single" w:color="C9D3DF" w:sz="4"/>
+            </w:tcBorders>
+            <w:tcMar>
+              <w:top w:type="dxa" w:w="60"/>
+              <w:left w:type="dxa" w:w="100"/>
+              <w:bottom w:type="dxa" w:w="60"/>
+              <w:right w:type="dxa" w:w="100"/>
+            </w:tcMar>
+          </w:tcPr>
+          <w:p>
+            <w:r>
+              <w:rPr>
+                <w:sz w:val="19"/>
+                <w:szCs w:val="19"/>
+              </w:rPr>
+              <w:t xml:space="preserve">2</w:t>
+            </w:r>
+          </w:p>
+        </w:tc>
+        <w:tc>
+          <w:tcPr>
+            <w:tcW w:type="dxa" w:w="2520"/>
+            <w:tcBorders>
+              <w:top w:val="single" w:color="C9D3DF" w:sz="4"/>
+              <w:left w:val="single" w:color="C9D3DF" w:sz="4"/>
+              <w:bottom w:val="single" w:color="C9D3DF" w:sz="4"/>
+              <w:right w:val="single" w:color="C9D3DF" w:sz="4"/>
+            </w:tcBorders>
+            <w:tcMar>
+              <w:top w:type="dxa" w:w="60"/>
+              <w:left w:type="dxa" w:w="100"/>
+              <w:bottom w:type="dxa" w:w="60"/>
+              <w:right w:type="dxa" w:w="100"/>
+            </w:tcMar>
+          </w:tcPr>
+          <w:p>
+            <w:r>
+              <w:rPr>
+                <w:sz w:val="19"/>
+                <w:szCs w:val="19"/>
+              </w:rPr>
+              <w:t xml:space="preserve">"Questions people ask" section</w:t>
             </w:r>
           </w:p>
         </w:tc>
@@ -5162,7 +5723,7 @@
       <w:r>
         <w:t xml:space="preserve">New to standups? Read our guide to the </w:t>
       </w:r>
-      <w:hyperlink w:history="1" r:id="rIdu1df3tehzplfmiupeurd7">
+      <w:hyperlink w:history="1" r:id="rIdacg_-ehtzpn-t3mgopbcu">
         <w:r>
           <w:rPr>
             <w:rStyle w:val="Hyperlink"/>
@@ -5672,7 +6233,7 @@
       <w:r>
         <w:t xml:space="preserve">Notes are private unless you share them. Your data is encrypted and stays in the region you choose. Lynkk never uses your meetings to train AI. </w:t>
       </w:r>
-      <w:hyperlink w:history="1" r:id="rIdnj_aqopto_b5vxoixe-mr">
+      <w:hyperlink w:history="1" r:id="rIdrjdf7egp9klyetmlo5pyo">
         <w:r>
           <w:rPr>
             <w:rStyle w:val="Hyperlink"/>
@@ -5894,7 +6455,7 @@
       <w:pPr>
         <w:spacing w:after="140"/>
       </w:pPr>
-      <w:hyperlink w:history="1" r:id="rIdqog8dgalyru-rcgatngoi">
+      <w:hyperlink w:history="1" r:id="rId333tgasfbnrn7mosphlz-">
         <w:r>
           <w:rPr>
             <w:rStyle w:val="Hyperlink"/>
@@ -6081,9 +6642,10 @@
         </w:tblBorders>
       </w:tblPr>
       <w:tblGrid>
-        <w:gridCol w:w="3360"/>
-        <w:gridCol w:w="3360"/>
-        <w:gridCol w:w="3360"/>
+        <w:gridCol w:w="2520"/>
+        <w:gridCol w:w="2520"/>
+        <w:gridCol w:w="2520"/>
+        <w:gridCol w:w="2520"/>
       </w:tblGrid>
       <w:tr>
         <w:trPr>
@@ -6091,7 +6653,7 @@
         </w:trPr>
         <w:tc>
           <w:tcPr>
-            <w:tcW w:type="dxa" w:w="3360"/>
+            <w:tcW w:type="dxa" w:w="2520"/>
             <w:tcBorders>
               <w:top w:val="single" w:color="C9D3DF" w:sz="4"/>
               <w:left w:val="single" w:color="C9D3DF" w:sz="4"/>
@@ -6121,7 +6683,7 @@
         </w:tc>
         <w:tc>
           <w:tcPr>
-            <w:tcW w:type="dxa" w:w="3360"/>
+            <w:tcW w:type="dxa" w:w="2520"/>
             <w:tcBorders>
               <w:top w:val="single" w:color="C9D3DF" w:sz="4"/>
               <w:left w:val="single" w:color="C9D3DF" w:sz="4"/>
@@ -6151,7 +6713,37 @@
         </w:tc>
         <w:tc>
           <w:tcPr>
-            <w:tcW w:type="dxa" w:w="3360"/>
+            <w:tcW w:type="dxa" w:w="2520"/>
+            <w:tcBorders>
+              <w:top w:val="single" w:color="C9D3DF" w:sz="4"/>
+              <w:left w:val="single" w:color="C9D3DF" w:sz="4"/>
+              <w:bottom w:val="single" w:color="C9D3DF" w:sz="4"/>
+              <w:right w:val="single" w:color="C9D3DF" w:sz="4"/>
+            </w:tcBorders>
+            <w:shd w:fill="1F3A5F" w:color="auto" w:val="clear"/>
+            <w:tcMar>
+              <w:top w:type="dxa" w:w="60"/>
+              <w:left w:type="dxa" w:w="100"/>
+              <w:bottom w:type="dxa" w:w="60"/>
+              <w:right w:type="dxa" w:w="100"/>
+            </w:tcMar>
+          </w:tcPr>
+          <w:p>
+            <w:r>
+              <w:rPr>
+                <w:b/>
+                <w:bCs/>
+                <w:color w:val="FFFFFF"/>
+                <w:sz w:val="19"/>
+                <w:szCs w:val="19"/>
+              </w:rPr>
+              <w:t xml:space="preserve">Uses on page</w:t>
+            </w:r>
+          </w:p>
+        </w:tc>
+        <w:tc>
+          <w:tcPr>
+            <w:tcW w:type="dxa" w:w="2520"/>
             <w:tcBorders>
               <w:top w:val="single" w:color="C9D3DF" w:sz="4"/>
               <w:left w:val="single" w:color="C9D3DF" w:sz="4"/>
@@ -6186,7 +6778,7 @@
         </w:trPr>
         <w:tc>
           <w:tcPr>
-            <w:tcW w:type="dxa" w:w="3360"/>
+            <w:tcW w:type="dxa" w:w="2520"/>
             <w:tcBorders>
               <w:top w:val="single" w:color="C9D3DF" w:sz="4"/>
               <w:left w:val="single" w:color="C9D3DF" w:sz="4"/>
@@ -6212,7 +6804,7 @@
         </w:tc>
         <w:tc>
           <w:tcPr>
-            <w:tcW w:type="dxa" w:w="3360"/>
+            <w:tcW w:type="dxa" w:w="2520"/>
             <w:tcBorders>
               <w:top w:val="single" w:color="C9D3DF" w:sz="4"/>
               <w:left w:val="single" w:color="C9D3DF" w:sz="4"/>
@@ -6238,27 +6830,53 @@
         </w:tc>
         <w:tc>
           <w:tcPr>
-            <w:tcW w:type="dxa" w:w="3360"/>
-            <w:tcBorders>
-              <w:top w:val="single" w:color="C9D3DF" w:sz="4"/>
-              <w:left w:val="single" w:color="C9D3DF" w:sz="4"/>
-              <w:bottom w:val="single" w:color="C9D3DF" w:sz="4"/>
-              <w:right w:val="single" w:color="C9D3DF" w:sz="4"/>
-            </w:tcBorders>
-            <w:tcMar>
-              <w:top w:type="dxa" w:w="60"/>
-              <w:left w:type="dxa" w:w="100"/>
-              <w:bottom w:type="dxa" w:w="60"/>
-              <w:right w:type="dxa" w:w="100"/>
-            </w:tcMar>
-          </w:tcPr>
-          <w:p>
-            <w:r>
-              <w:rPr>
-                <w:sz w:val="19"/>
-                <w:szCs w:val="19"/>
-              </w:rPr>
-              <w:t xml:space="preserve">Story, "So, what is Lynkk?"</w:t>
+            <w:tcW w:type="dxa" w:w="2520"/>
+            <w:tcBorders>
+              <w:top w:val="single" w:color="C9D3DF" w:sz="4"/>
+              <w:left w:val="single" w:color="C9D3DF" w:sz="4"/>
+              <w:bottom w:val="single" w:color="C9D3DF" w:sz="4"/>
+              <w:right w:val="single" w:color="C9D3DF" w:sz="4"/>
+            </w:tcBorders>
+            <w:tcMar>
+              <w:top w:type="dxa" w:w="60"/>
+              <w:left w:type="dxa" w:w="100"/>
+              <w:bottom w:type="dxa" w:w="60"/>
+              <w:right w:type="dxa" w:w="100"/>
+            </w:tcMar>
+          </w:tcPr>
+          <w:p>
+            <w:r>
+              <w:rPr>
+                <w:sz w:val="19"/>
+                <w:szCs w:val="19"/>
+              </w:rPr>
+              <w:t xml:space="preserve">2</w:t>
+            </w:r>
+          </w:p>
+        </w:tc>
+        <w:tc>
+          <w:tcPr>
+            <w:tcW w:type="dxa" w:w="2520"/>
+            <w:tcBorders>
+              <w:top w:val="single" w:color="C9D3DF" w:sz="4"/>
+              <w:left w:val="single" w:color="C9D3DF" w:sz="4"/>
+              <w:bottom w:val="single" w:color="C9D3DF" w:sz="4"/>
+              <w:right w:val="single" w:color="C9D3DF" w:sz="4"/>
+            </w:tcBorders>
+            <w:tcMar>
+              <w:top w:type="dxa" w:w="60"/>
+              <w:left w:type="dxa" w:w="100"/>
+              <w:bottom w:type="dxa" w:w="60"/>
+              <w:right w:type="dxa" w:w="100"/>
+            </w:tcMar>
+          </w:tcPr>
+          <w:p>
+            <w:r>
+              <w:rPr>
+                <w:sz w:val="19"/>
+                <w:szCs w:val="19"/>
+              </w:rPr>
+              <w:t xml:space="preserve">"Meet Emily" section, "So, what is Lynkk?" section</w:t>
             </w:r>
           </w:p>
         </w:tc>
@@ -6269,7 +6887,7 @@
         </w:trPr>
         <w:tc>
           <w:tcPr>
-            <w:tcW w:type="dxa" w:w="3360"/>
+            <w:tcW w:type="dxa" w:w="2520"/>
             <w:tcBorders>
               <w:top w:val="single" w:color="C9D3DF" w:sz="4"/>
               <w:left w:val="single" w:color="C9D3DF" w:sz="4"/>
@@ -6295,7 +6913,7 @@
         </w:tc>
         <w:tc>
           <w:tcPr>
-            <w:tcW w:type="dxa" w:w="3360"/>
+            <w:tcW w:type="dxa" w:w="2520"/>
             <w:tcBorders>
               <w:top w:val="single" w:color="C9D3DF" w:sz="4"/>
               <w:left w:val="single" w:color="C9D3DF" w:sz="4"/>
@@ -6321,27 +6939,53 @@
         </w:tc>
         <w:tc>
           <w:tcPr>
-            <w:tcW w:type="dxa" w:w="3360"/>
-            <w:tcBorders>
-              <w:top w:val="single" w:color="C9D3DF" w:sz="4"/>
-              <w:left w:val="single" w:color="C9D3DF" w:sz="4"/>
-              <w:bottom w:val="single" w:color="C9D3DF" w:sz="4"/>
-              <w:right w:val="single" w:color="C9D3DF" w:sz="4"/>
-            </w:tcBorders>
-            <w:tcMar>
-              <w:top w:type="dxa" w:w="60"/>
-              <w:left w:type="dxa" w:w="100"/>
-              <w:bottom w:type="dxa" w:w="60"/>
-              <w:right w:type="dxa" w:w="100"/>
-            </w:tcMar>
-          </w:tcPr>
-          <w:p>
-            <w:r>
-              <w:rPr>
-                <w:sz w:val="19"/>
-                <w:szCs w:val="19"/>
-              </w:rPr>
-              <w:t xml:space="preserve">H1, meta description, FAQ</w:t>
+            <w:tcW w:type="dxa" w:w="2520"/>
+            <w:tcBorders>
+              <w:top w:val="single" w:color="C9D3DF" w:sz="4"/>
+              <w:left w:val="single" w:color="C9D3DF" w:sz="4"/>
+              <w:bottom w:val="single" w:color="C9D3DF" w:sz="4"/>
+              <w:right w:val="single" w:color="C9D3DF" w:sz="4"/>
+            </w:tcBorders>
+            <w:tcMar>
+              <w:top w:type="dxa" w:w="60"/>
+              <w:left w:type="dxa" w:w="100"/>
+              <w:bottom w:type="dxa" w:w="60"/>
+              <w:right w:type="dxa" w:w="100"/>
+            </w:tcMar>
+          </w:tcPr>
+          <w:p>
+            <w:r>
+              <w:rPr>
+                <w:sz w:val="19"/>
+                <w:szCs w:val="19"/>
+              </w:rPr>
+              <w:t xml:space="preserve">2</w:t>
+            </w:r>
+          </w:p>
+        </w:tc>
+        <w:tc>
+          <w:tcPr>
+            <w:tcW w:type="dxa" w:w="2520"/>
+            <w:tcBorders>
+              <w:top w:val="single" w:color="C9D3DF" w:sz="4"/>
+              <w:left w:val="single" w:color="C9D3DF" w:sz="4"/>
+              <w:bottom w:val="single" w:color="C9D3DF" w:sz="4"/>
+              <w:right w:val="single" w:color="C9D3DF" w:sz="4"/>
+            </w:tcBorders>
+            <w:tcMar>
+              <w:top w:type="dxa" w:w="60"/>
+              <w:left w:type="dxa" w:w="100"/>
+              <w:bottom w:type="dxa" w:w="60"/>
+              <w:right w:type="dxa" w:w="100"/>
+            </w:tcMar>
+          </w:tcPr>
+          <w:p>
+            <w:r>
+              <w:rPr>
+                <w:sz w:val="19"/>
+                <w:szCs w:val="19"/>
+              </w:rPr>
+              <w:t xml:space="preserve">Meta, H1, "Questions people ask" section</w:t>
             </w:r>
           </w:p>
         </w:tc>
@@ -6352,7 +6996,7 @@
         </w:trPr>
         <w:tc>
           <w:tcPr>
-            <w:tcW w:type="dxa" w:w="3360"/>
+            <w:tcW w:type="dxa" w:w="2520"/>
             <w:tcBorders>
               <w:top w:val="single" w:color="C9D3DF" w:sz="4"/>
               <w:left w:val="single" w:color="C9D3DF" w:sz="4"/>
@@ -6378,7 +7022,7 @@
         </w:tc>
         <w:tc>
           <w:tcPr>
-            <w:tcW w:type="dxa" w:w="3360"/>
+            <w:tcW w:type="dxa" w:w="2520"/>
             <w:tcBorders>
               <w:top w:val="single" w:color="C9D3DF" w:sz="4"/>
               <w:left w:val="single" w:color="C9D3DF" w:sz="4"/>
@@ -6404,27 +7048,53 @@
         </w:tc>
         <w:tc>
           <w:tcPr>
-            <w:tcW w:type="dxa" w:w="3360"/>
-            <w:tcBorders>
-              <w:top w:val="single" w:color="C9D3DF" w:sz="4"/>
-              <w:left w:val="single" w:color="C9D3DF" w:sz="4"/>
-              <w:bottom w:val="single" w:color="C9D3DF" w:sz="4"/>
-              <w:right w:val="single" w:color="C9D3DF" w:sz="4"/>
-            </w:tcBorders>
-            <w:tcMar>
-              <w:top w:type="dxa" w:w="60"/>
-              <w:left w:type="dxa" w:w="100"/>
-              <w:bottom w:type="dxa" w:w="60"/>
-              <w:right w:type="dxa" w:w="100"/>
-            </w:tcMar>
-          </w:tcPr>
-          <w:p>
-            <w:r>
-              <w:rPr>
-                <w:sz w:val="19"/>
-                <w:szCs w:val="19"/>
-              </w:rPr>
-              <w:t xml:space="preserve">Title, "So, what is Lynkk?"</w:t>
+            <w:tcW w:type="dxa" w:w="2520"/>
+            <w:tcBorders>
+              <w:top w:val="single" w:color="C9D3DF" w:sz="4"/>
+              <w:left w:val="single" w:color="C9D3DF" w:sz="4"/>
+              <w:bottom w:val="single" w:color="C9D3DF" w:sz="4"/>
+              <w:right w:val="single" w:color="C9D3DF" w:sz="4"/>
+            </w:tcBorders>
+            <w:tcMar>
+              <w:top w:type="dxa" w:w="60"/>
+              <w:left w:type="dxa" w:w="100"/>
+              <w:bottom w:type="dxa" w:w="60"/>
+              <w:right w:type="dxa" w:w="100"/>
+            </w:tcMar>
+          </w:tcPr>
+          <w:p>
+            <w:r>
+              <w:rPr>
+                <w:sz w:val="19"/>
+                <w:szCs w:val="19"/>
+              </w:rPr>
+              <w:t xml:space="preserve">1</w:t>
+            </w:r>
+          </w:p>
+        </w:tc>
+        <w:tc>
+          <w:tcPr>
+            <w:tcW w:type="dxa" w:w="2520"/>
+            <w:tcBorders>
+              <w:top w:val="single" w:color="C9D3DF" w:sz="4"/>
+              <w:left w:val="single" w:color="C9D3DF" w:sz="4"/>
+              <w:bottom w:val="single" w:color="C9D3DF" w:sz="4"/>
+              <w:right w:val="single" w:color="C9D3DF" w:sz="4"/>
+            </w:tcBorders>
+            <w:tcMar>
+              <w:top w:type="dxa" w:w="60"/>
+              <w:left w:type="dxa" w:w="100"/>
+              <w:bottom w:type="dxa" w:w="60"/>
+              <w:right w:type="dxa" w:w="100"/>
+            </w:tcMar>
+          </w:tcPr>
+          <w:p>
+            <w:r>
+              <w:rPr>
+                <w:sz w:val="19"/>
+                <w:szCs w:val="19"/>
+              </w:rPr>
+              <w:t xml:space="preserve">Title, "So, what is Lynkk?" section</w:t>
             </w:r>
           </w:p>
         </w:tc>
@@ -6435,7 +7105,7 @@
         </w:trPr>
         <w:tc>
           <w:tcPr>
-            <w:tcW w:type="dxa" w:w="3360"/>
+            <w:tcW w:type="dxa" w:w="2520"/>
             <w:tcBorders>
               <w:top w:val="single" w:color="C9D3DF" w:sz="4"/>
               <w:left w:val="single" w:color="C9D3DF" w:sz="4"/>
@@ -6461,7 +7131,7 @@
         </w:tc>
         <w:tc>
           <w:tcPr>
-            <w:tcW w:type="dxa" w:w="3360"/>
+            <w:tcW w:type="dxa" w:w="2520"/>
             <w:tcBorders>
               <w:top w:val="single" w:color="C9D3DF" w:sz="4"/>
               <w:left w:val="single" w:color="C9D3DF" w:sz="4"/>
@@ -6487,27 +7157,53 @@
         </w:tc>
         <w:tc>
           <w:tcPr>
-            <w:tcW w:type="dxa" w:w="3360"/>
-            <w:tcBorders>
-              <w:top w:val="single" w:color="C9D3DF" w:sz="4"/>
-              <w:left w:val="single" w:color="C9D3DF" w:sz="4"/>
-              <w:bottom w:val="single" w:color="C9D3DF" w:sz="4"/>
-              <w:right w:val="single" w:color="C9D3DF" w:sz="4"/>
-            </w:tcBorders>
-            <w:tcMar>
-              <w:top w:type="dxa" w:w="60"/>
-              <w:left w:type="dxa" w:w="100"/>
-              <w:bottom w:type="dxa" w:w="60"/>
-              <w:right w:type="dxa" w:w="100"/>
-            </w:tcMar>
-          </w:tcPr>
-          <w:p>
-            <w:r>
-              <w:rPr>
-                <w:sz w:val="19"/>
-                <w:szCs w:val="19"/>
-              </w:rPr>
-              <w:t xml:space="preserve">Title, H1</w:t>
+            <w:tcW w:type="dxa" w:w="2520"/>
+            <w:tcBorders>
+              <w:top w:val="single" w:color="C9D3DF" w:sz="4"/>
+              <w:left w:val="single" w:color="C9D3DF" w:sz="4"/>
+              <w:bottom w:val="single" w:color="C9D3DF" w:sz="4"/>
+              <w:right w:val="single" w:color="C9D3DF" w:sz="4"/>
+            </w:tcBorders>
+            <w:tcMar>
+              <w:top w:type="dxa" w:w="60"/>
+              <w:left w:type="dxa" w:w="100"/>
+              <w:bottom w:type="dxa" w:w="60"/>
+              <w:right w:type="dxa" w:w="100"/>
+            </w:tcMar>
+          </w:tcPr>
+          <w:p>
+            <w:r>
+              <w:rPr>
+                <w:sz w:val="19"/>
+                <w:szCs w:val="19"/>
+              </w:rPr>
+              <w:t xml:space="preserve">3</w:t>
+            </w:r>
+          </w:p>
+        </w:tc>
+        <w:tc>
+          <w:tcPr>
+            <w:tcW w:type="dxa" w:w="2520"/>
+            <w:tcBorders>
+              <w:top w:val="single" w:color="C9D3DF" w:sz="4"/>
+              <w:left w:val="single" w:color="C9D3DF" w:sz="4"/>
+              <w:bottom w:val="single" w:color="C9D3DF" w:sz="4"/>
+              <w:right w:val="single" w:color="C9D3DF" w:sz="4"/>
+            </w:tcBorders>
+            <w:tcMar>
+              <w:top w:type="dxa" w:w="60"/>
+              <w:left w:type="dxa" w:w="100"/>
+              <w:bottom w:type="dxa" w:w="60"/>
+              <w:right w:type="dxa" w:w="100"/>
+            </w:tcMar>
+          </w:tcPr>
+          <w:p>
+            <w:r>
+              <w:rPr>
+                <w:sz w:val="19"/>
+                <w:szCs w:val="19"/>
+              </w:rPr>
+              <w:t xml:space="preserve">Title, Meta, H1, "How Lynkk helps Emily with field interviews" heading, "Field interviews, before and after Lynkk" heading</w:t>
             </w:r>
           </w:p>
         </w:tc>
@@ -6518,7 +7214,7 @@
         </w:trPr>
         <w:tc>
           <w:tcPr>
-            <w:tcW w:type="dxa" w:w="3360"/>
+            <w:tcW w:type="dxa" w:w="2520"/>
             <w:tcBorders>
               <w:top w:val="single" w:color="C9D3DF" w:sz="4"/>
               <w:left w:val="single" w:color="C9D3DF" w:sz="4"/>
@@ -6544,7 +7240,7 @@
         </w:tc>
         <w:tc>
           <w:tcPr>
-            <w:tcW w:type="dxa" w:w="3360"/>
+            <w:tcW w:type="dxa" w:w="2520"/>
             <w:tcBorders>
               <w:top w:val="single" w:color="C9D3DF" w:sz="4"/>
               <w:left w:val="single" w:color="C9D3DF" w:sz="4"/>
@@ -6570,27 +7266,53 @@
         </w:tc>
         <w:tc>
           <w:tcPr>
-            <w:tcW w:type="dxa" w:w="3360"/>
-            <w:tcBorders>
-              <w:top w:val="single" w:color="C9D3DF" w:sz="4"/>
-              <w:left w:val="single" w:color="C9D3DF" w:sz="4"/>
-              <w:bottom w:val="single" w:color="C9D3DF" w:sz="4"/>
-              <w:right w:val="single" w:color="C9D3DF" w:sz="4"/>
-            </w:tcBorders>
-            <w:tcMar>
-              <w:top w:type="dxa" w:w="60"/>
-              <w:left w:type="dxa" w:w="100"/>
-              <w:bottom w:type="dxa" w:w="60"/>
-              <w:right w:type="dxa" w:w="100"/>
-            </w:tcMar>
-          </w:tcPr>
-          <w:p>
-            <w:r>
-              <w:rPr>
-                <w:sz w:val="19"/>
-                <w:szCs w:val="19"/>
-              </w:rPr>
-              <w:t xml:space="preserve">FAQ</w:t>
+            <w:tcW w:type="dxa" w:w="2520"/>
+            <w:tcBorders>
+              <w:top w:val="single" w:color="C9D3DF" w:sz="4"/>
+              <w:left w:val="single" w:color="C9D3DF" w:sz="4"/>
+              <w:bottom w:val="single" w:color="C9D3DF" w:sz="4"/>
+              <w:right w:val="single" w:color="C9D3DF" w:sz="4"/>
+            </w:tcBorders>
+            <w:tcMar>
+              <w:top w:type="dxa" w:w="60"/>
+              <w:left w:type="dxa" w:w="100"/>
+              <w:bottom w:type="dxa" w:w="60"/>
+              <w:right w:type="dxa" w:w="100"/>
+            </w:tcMar>
+          </w:tcPr>
+          <w:p>
+            <w:r>
+              <w:rPr>
+                <w:sz w:val="19"/>
+                <w:szCs w:val="19"/>
+              </w:rPr>
+              <w:t xml:space="preserve">1</w:t>
+            </w:r>
+          </w:p>
+        </w:tc>
+        <w:tc>
+          <w:tcPr>
+            <w:tcW w:type="dxa" w:w="2520"/>
+            <w:tcBorders>
+              <w:top w:val="single" w:color="C9D3DF" w:sz="4"/>
+              <w:left w:val="single" w:color="C9D3DF" w:sz="4"/>
+              <w:bottom w:val="single" w:color="C9D3DF" w:sz="4"/>
+              <w:right w:val="single" w:color="C9D3DF" w:sz="4"/>
+            </w:tcBorders>
+            <w:tcMar>
+              <w:top w:type="dxa" w:w="60"/>
+              <w:left w:type="dxa" w:w="100"/>
+              <w:bottom w:type="dxa" w:w="60"/>
+              <w:right w:type="dxa" w:w="100"/>
+            </w:tcMar>
+          </w:tcPr>
+          <w:p>
+            <w:r>
+              <w:rPr>
+                <w:sz w:val="19"/>
+                <w:szCs w:val="19"/>
+              </w:rPr>
+              <w:t xml:space="preserve">"Questions people ask" section</w:t>
             </w:r>
           </w:p>
         </w:tc>
@@ -6601,7 +7323,7 @@
         </w:trPr>
         <w:tc>
           <w:tcPr>
-            <w:tcW w:type="dxa" w:w="3360"/>
+            <w:tcW w:type="dxa" w:w="2520"/>
             <w:tcBorders>
               <w:top w:val="single" w:color="C9D3DF" w:sz="4"/>
               <w:left w:val="single" w:color="C9D3DF" w:sz="4"/>
@@ -6627,7 +7349,7 @@
         </w:tc>
         <w:tc>
           <w:tcPr>
-            <w:tcW w:type="dxa" w:w="3360"/>
+            <w:tcW w:type="dxa" w:w="2520"/>
             <w:tcBorders>
               <w:top w:val="single" w:color="C9D3DF" w:sz="4"/>
               <w:left w:val="single" w:color="C9D3DF" w:sz="4"/>
@@ -6653,7 +7375,33 @@
         </w:tc>
         <w:tc>
           <w:tcPr>
-            <w:tcW w:type="dxa" w:w="3360"/>
+            <w:tcW w:type="dxa" w:w="2520"/>
+            <w:tcBorders>
+              <w:top w:val="single" w:color="C9D3DF" w:sz="4"/>
+              <w:left w:val="single" w:color="C9D3DF" w:sz="4"/>
+              <w:bottom w:val="single" w:color="C9D3DF" w:sz="4"/>
+              <w:right w:val="single" w:color="C9D3DF" w:sz="4"/>
+            </w:tcBorders>
+            <w:tcMar>
+              <w:top w:type="dxa" w:w="60"/>
+              <w:left w:type="dxa" w:w="100"/>
+              <w:bottom w:type="dxa" w:w="60"/>
+              <w:right w:type="dxa" w:w="100"/>
+            </w:tcMar>
+          </w:tcPr>
+          <w:p>
+            <w:r>
+              <w:rPr>
+                <w:sz w:val="19"/>
+                <w:szCs w:val="19"/>
+              </w:rPr>
+              <w:t xml:space="preserve">1</w:t>
+            </w:r>
+          </w:p>
+        </w:tc>
+        <w:tc>
+          <w:tcPr>
+            <w:tcW w:type="dxa" w:w="2520"/>
             <w:tcBorders>
               <w:top w:val="single" w:color="C9D3DF" w:sz="4"/>
               <w:left w:val="single" w:color="C9D3DF" w:sz="4"/>
@@ -7626,7 +8374,7 @@
       <w:r>
         <w:t xml:space="preserve">Your notes are private unless you share them. Your data is encrypted and stays in the region you choose. Lynkk never uses your recordings to train AI. </w:t>
       </w:r>
-      <w:hyperlink w:history="1" r:id="rIdu7o6uvyzkbr1wc9fvs3ae">
+      <w:hyperlink w:history="1" r:id="rId9ed5evfbvo4nzfkdxkhsb">
         <w:r>
           <w:rPr>
             <w:rStyle w:val="Hyperlink"/>
@@ -7848,7 +8596,7 @@
       <w:pPr>
         <w:spacing w:after="140"/>
       </w:pPr>
-      <w:hyperlink w:history="1" r:id="rIdstalqkddykazdpf3lwplw">
+      <w:hyperlink w:history="1" r:id="rIdlpavzfhzin-bue2xmf_g6">
         <w:r>
           <w:rPr>
             <w:rStyle w:val="Hyperlink"/>
@@ -8035,9 +8783,10 @@
         </w:tblBorders>
       </w:tblPr>
       <w:tblGrid>
-        <w:gridCol w:w="3360"/>
-        <w:gridCol w:w="3360"/>
-        <w:gridCol w:w="3360"/>
+        <w:gridCol w:w="2520"/>
+        <w:gridCol w:w="2520"/>
+        <w:gridCol w:w="2520"/>
+        <w:gridCol w:w="2520"/>
       </w:tblGrid>
       <w:tr>
         <w:trPr>
@@ -8045,7 +8794,7 @@
         </w:trPr>
         <w:tc>
           <w:tcPr>
-            <w:tcW w:type="dxa" w:w="3360"/>
+            <w:tcW w:type="dxa" w:w="2520"/>
             <w:tcBorders>
               <w:top w:val="single" w:color="C9D3DF" w:sz="4"/>
               <w:left w:val="single" w:color="C9D3DF" w:sz="4"/>
@@ -8075,7 +8824,7 @@
         </w:tc>
         <w:tc>
           <w:tcPr>
-            <w:tcW w:type="dxa" w:w="3360"/>
+            <w:tcW w:type="dxa" w:w="2520"/>
             <w:tcBorders>
               <w:top w:val="single" w:color="C9D3DF" w:sz="4"/>
               <w:left w:val="single" w:color="C9D3DF" w:sz="4"/>
@@ -8105,7 +8854,37 @@
         </w:tc>
         <w:tc>
           <w:tcPr>
-            <w:tcW w:type="dxa" w:w="3360"/>
+            <w:tcW w:type="dxa" w:w="2520"/>
+            <w:tcBorders>
+              <w:top w:val="single" w:color="C9D3DF" w:sz="4"/>
+              <w:left w:val="single" w:color="C9D3DF" w:sz="4"/>
+              <w:bottom w:val="single" w:color="C9D3DF" w:sz="4"/>
+              <w:right w:val="single" w:color="C9D3DF" w:sz="4"/>
+            </w:tcBorders>
+            <w:shd w:fill="1F3A5F" w:color="auto" w:val="clear"/>
+            <w:tcMar>
+              <w:top w:type="dxa" w:w="60"/>
+              <w:left w:type="dxa" w:w="100"/>
+              <w:bottom w:type="dxa" w:w="60"/>
+              <w:right w:type="dxa" w:w="100"/>
+            </w:tcMar>
+          </w:tcPr>
+          <w:p>
+            <w:r>
+              <w:rPr>
+                <w:b/>
+                <w:bCs/>
+                <w:color w:val="FFFFFF"/>
+                <w:sz w:val="19"/>
+                <w:szCs w:val="19"/>
+              </w:rPr>
+              <w:t xml:space="preserve">Uses on page</w:t>
+            </w:r>
+          </w:p>
+        </w:tc>
+        <w:tc>
+          <w:tcPr>
+            <w:tcW w:type="dxa" w:w="2520"/>
             <w:tcBorders>
               <w:top w:val="single" w:color="C9D3DF" w:sz="4"/>
               <w:left w:val="single" w:color="C9D3DF" w:sz="4"/>
@@ -8140,7 +8919,7 @@
         </w:trPr>
         <w:tc>
           <w:tcPr>
-            <w:tcW w:type="dxa" w:w="3360"/>
+            <w:tcW w:type="dxa" w:w="2520"/>
             <w:tcBorders>
               <w:top w:val="single" w:color="C9D3DF" w:sz="4"/>
               <w:left w:val="single" w:color="C9D3DF" w:sz="4"/>
@@ -8166,7 +8945,7 @@
         </w:tc>
         <w:tc>
           <w:tcPr>
-            <w:tcW w:type="dxa" w:w="3360"/>
+            <w:tcW w:type="dxa" w:w="2520"/>
             <w:tcBorders>
               <w:top w:val="single" w:color="C9D3DF" w:sz="4"/>
               <w:left w:val="single" w:color="C9D3DF" w:sz="4"/>
@@ -8192,7 +8971,33 @@
         </w:tc>
         <w:tc>
           <w:tcPr>
-            <w:tcW w:type="dxa" w:w="3360"/>
+            <w:tcW w:type="dxa" w:w="2520"/>
+            <w:tcBorders>
+              <w:top w:val="single" w:color="C9D3DF" w:sz="4"/>
+              <w:left w:val="single" w:color="C9D3DF" w:sz="4"/>
+              <w:bottom w:val="single" w:color="C9D3DF" w:sz="4"/>
+              <w:right w:val="single" w:color="C9D3DF" w:sz="4"/>
+            </w:tcBorders>
+            <w:tcMar>
+              <w:top w:type="dxa" w:w="60"/>
+              <w:left w:type="dxa" w:w="100"/>
+              <w:bottom w:type="dxa" w:w="60"/>
+              <w:right w:type="dxa" w:w="100"/>
+            </w:tcMar>
+          </w:tcPr>
+          <w:p>
+            <w:r>
+              <w:rPr>
+                <w:sz w:val="19"/>
+                <w:szCs w:val="19"/>
+              </w:rPr>
+              <w:t xml:space="preserve">1</w:t>
+            </w:r>
+          </w:p>
+        </w:tc>
+        <w:tc>
+          <w:tcPr>
+            <w:tcW w:type="dxa" w:w="2520"/>
             <w:tcBorders>
               <w:top w:val="single" w:color="C9D3DF" w:sz="4"/>
               <w:left w:val="single" w:color="C9D3DF" w:sz="4"/>
@@ -8223,7 +9028,7 @@
         </w:trPr>
         <w:tc>
           <w:tcPr>
-            <w:tcW w:type="dxa" w:w="3360"/>
+            <w:tcW w:type="dxa" w:w="2520"/>
             <w:tcBorders>
               <w:top w:val="single" w:color="C9D3DF" w:sz="4"/>
               <w:left w:val="single" w:color="C9D3DF" w:sz="4"/>
@@ -8249,7 +9054,7 @@
         </w:tc>
         <w:tc>
           <w:tcPr>
-            <w:tcW w:type="dxa" w:w="3360"/>
+            <w:tcW w:type="dxa" w:w="2520"/>
             <w:tcBorders>
               <w:top w:val="single" w:color="C9D3DF" w:sz="4"/>
               <w:left w:val="single" w:color="C9D3DF" w:sz="4"/>
@@ -8275,27 +9080,53 @@
         </w:tc>
         <w:tc>
           <w:tcPr>
-            <w:tcW w:type="dxa" w:w="3360"/>
-            <w:tcBorders>
-              <w:top w:val="single" w:color="C9D3DF" w:sz="4"/>
-              <w:left w:val="single" w:color="C9D3DF" w:sz="4"/>
-              <w:bottom w:val="single" w:color="C9D3DF" w:sz="4"/>
-              <w:right w:val="single" w:color="C9D3DF" w:sz="4"/>
-            </w:tcBorders>
-            <w:tcMar>
-              <w:top w:type="dxa" w:w="60"/>
-              <w:left w:type="dxa" w:w="100"/>
-              <w:bottom w:type="dxa" w:w="60"/>
-              <w:right w:type="dxa" w:w="100"/>
-            </w:tcMar>
-          </w:tcPr>
-          <w:p>
-            <w:r>
-              <w:rPr>
-                <w:sz w:val="19"/>
-                <w:szCs w:val="19"/>
-              </w:rPr>
-              <w:t xml:space="preserve">Story heading, intro</w:t>
+            <w:tcW w:type="dxa" w:w="2520"/>
+            <w:tcBorders>
+              <w:top w:val="single" w:color="C9D3DF" w:sz="4"/>
+              <w:left w:val="single" w:color="C9D3DF" w:sz="4"/>
+              <w:bottom w:val="single" w:color="C9D3DF" w:sz="4"/>
+              <w:right w:val="single" w:color="C9D3DF" w:sz="4"/>
+            </w:tcBorders>
+            <w:tcMar>
+              <w:top w:type="dxa" w:w="60"/>
+              <w:left w:type="dxa" w:w="100"/>
+              <w:bottom w:type="dxa" w:w="60"/>
+              <w:right w:type="dxa" w:w="100"/>
+            </w:tcMar>
+          </w:tcPr>
+          <w:p>
+            <w:r>
+              <w:rPr>
+                <w:sz w:val="19"/>
+                <w:szCs w:val="19"/>
+              </w:rPr>
+              <w:t xml:space="preserve">3</w:t>
+            </w:r>
+          </w:p>
+        </w:tc>
+        <w:tc>
+          <w:tcPr>
+            <w:tcW w:type="dxa" w:w="2520"/>
+            <w:tcBorders>
+              <w:top w:val="single" w:color="C9D3DF" w:sz="4"/>
+              <w:left w:val="single" w:color="C9D3DF" w:sz="4"/>
+              <w:bottom w:val="single" w:color="C9D3DF" w:sz="4"/>
+              <w:right w:val="single" w:color="C9D3DF" w:sz="4"/>
+            </w:tcBorders>
+            <w:tcMar>
+              <w:top w:type="dxa" w:w="60"/>
+              <w:left w:type="dxa" w:w="100"/>
+              <w:bottom w:type="dxa" w:w="60"/>
+              <w:right w:type="dxa" w:w="100"/>
+            </w:tcMar>
+          </w:tcPr>
+          <w:p>
+            <w:r>
+              <w:rPr>
+                <w:sz w:val="19"/>
+                <w:szCs w:val="19"/>
+              </w:rPr>
+              <w:t xml:space="preserve">Meta, Intro, "How Lynkk helps Ethan record lectures" heading, "Simple pricing" section</w:t>
             </w:r>
           </w:p>
         </w:tc>
@@ -8306,7 +9137,7 @@
         </w:trPr>
         <w:tc>
           <w:tcPr>
-            <w:tcW w:type="dxa" w:w="3360"/>
+            <w:tcW w:type="dxa" w:w="2520"/>
             <w:tcBorders>
               <w:top w:val="single" w:color="C9D3DF" w:sz="4"/>
               <w:left w:val="single" w:color="C9D3DF" w:sz="4"/>
@@ -8332,7 +9163,7 @@
         </w:tc>
         <w:tc>
           <w:tcPr>
-            <w:tcW w:type="dxa" w:w="3360"/>
+            <w:tcW w:type="dxa" w:w="2520"/>
             <w:tcBorders>
               <w:top w:val="single" w:color="C9D3DF" w:sz="4"/>
               <w:left w:val="single" w:color="C9D3DF" w:sz="4"/>
@@ -8358,27 +9189,53 @@
         </w:tc>
         <w:tc>
           <w:tcPr>
-            <w:tcW w:type="dxa" w:w="3360"/>
-            <w:tcBorders>
-              <w:top w:val="single" w:color="C9D3DF" w:sz="4"/>
-              <w:left w:val="single" w:color="C9D3DF" w:sz="4"/>
-              <w:bottom w:val="single" w:color="C9D3DF" w:sz="4"/>
-              <w:right w:val="single" w:color="C9D3DF" w:sz="4"/>
-            </w:tcBorders>
-            <w:tcMar>
-              <w:top w:type="dxa" w:w="60"/>
-              <w:left w:type="dxa" w:w="100"/>
-              <w:bottom w:type="dxa" w:w="60"/>
-              <w:right w:type="dxa" w:w="100"/>
-            </w:tcMar>
-          </w:tcPr>
-          <w:p>
-            <w:r>
-              <w:rPr>
-                <w:sz w:val="19"/>
-                <w:szCs w:val="19"/>
-              </w:rPr>
-              <w:t xml:space="preserve">"So, what is Lynkk?"</w:t>
+            <w:tcW w:type="dxa" w:w="2520"/>
+            <w:tcBorders>
+              <w:top w:val="single" w:color="C9D3DF" w:sz="4"/>
+              <w:left w:val="single" w:color="C9D3DF" w:sz="4"/>
+              <w:bottom w:val="single" w:color="C9D3DF" w:sz="4"/>
+              <w:right w:val="single" w:color="C9D3DF" w:sz="4"/>
+            </w:tcBorders>
+            <w:tcMar>
+              <w:top w:type="dxa" w:w="60"/>
+              <w:left w:type="dxa" w:w="100"/>
+              <w:bottom w:type="dxa" w:w="60"/>
+              <w:right w:type="dxa" w:w="100"/>
+            </w:tcMar>
+          </w:tcPr>
+          <w:p>
+            <w:r>
+              <w:rPr>
+                <w:sz w:val="19"/>
+                <w:szCs w:val="19"/>
+              </w:rPr>
+              <w:t xml:space="preserve">1</w:t>
+            </w:r>
+          </w:p>
+        </w:tc>
+        <w:tc>
+          <w:tcPr>
+            <w:tcW w:type="dxa" w:w="2520"/>
+            <w:tcBorders>
+              <w:top w:val="single" w:color="C9D3DF" w:sz="4"/>
+              <w:left w:val="single" w:color="C9D3DF" w:sz="4"/>
+              <w:bottom w:val="single" w:color="C9D3DF" w:sz="4"/>
+              <w:right w:val="single" w:color="C9D3DF" w:sz="4"/>
+            </w:tcBorders>
+            <w:tcMar>
+              <w:top w:type="dxa" w:w="60"/>
+              <w:left w:type="dxa" w:w="100"/>
+              <w:bottom w:type="dxa" w:w="60"/>
+              <w:right w:type="dxa" w:w="100"/>
+            </w:tcMar>
+          </w:tcPr>
+          <w:p>
+            <w:r>
+              <w:rPr>
+                <w:sz w:val="19"/>
+                <w:szCs w:val="19"/>
+              </w:rPr>
+              <w:t xml:space="preserve">"So, what is Lynkk?" section</w:t>
             </w:r>
           </w:p>
         </w:tc>
@@ -8389,7 +9246,7 @@
         </w:trPr>
         <w:tc>
           <w:tcPr>
-            <w:tcW w:type="dxa" w:w="3360"/>
+            <w:tcW w:type="dxa" w:w="2520"/>
             <w:tcBorders>
               <w:top w:val="single" w:color="C9D3DF" w:sz="4"/>
               <w:left w:val="single" w:color="C9D3DF" w:sz="4"/>
@@ -8415,7 +9272,7 @@
         </w:tc>
         <w:tc>
           <w:tcPr>
-            <w:tcW w:type="dxa" w:w="3360"/>
+            <w:tcW w:type="dxa" w:w="2520"/>
             <w:tcBorders>
               <w:top w:val="single" w:color="C9D3DF" w:sz="4"/>
               <w:left w:val="single" w:color="C9D3DF" w:sz="4"/>
@@ -8441,27 +9298,53 @@
         </w:tc>
         <w:tc>
           <w:tcPr>
-            <w:tcW w:type="dxa" w:w="3360"/>
-            <w:tcBorders>
-              <w:top w:val="single" w:color="C9D3DF" w:sz="4"/>
-              <w:left w:val="single" w:color="C9D3DF" w:sz="4"/>
-              <w:bottom w:val="single" w:color="C9D3DF" w:sz="4"/>
-              <w:right w:val="single" w:color="C9D3DF" w:sz="4"/>
-            </w:tcBorders>
-            <w:tcMar>
-              <w:top w:type="dxa" w:w="60"/>
-              <w:left w:type="dxa" w:w="100"/>
-              <w:bottom w:type="dxa" w:w="60"/>
-              <w:right w:type="dxa" w:w="100"/>
-            </w:tcMar>
-          </w:tcPr>
-          <w:p>
-            <w:r>
-              <w:rPr>
-                <w:sz w:val="19"/>
-                <w:szCs w:val="19"/>
-              </w:rPr>
-              <w:t xml:space="preserve">Title, H1</w:t>
+            <w:tcW w:type="dxa" w:w="2520"/>
+            <w:tcBorders>
+              <w:top w:val="single" w:color="C9D3DF" w:sz="4"/>
+              <w:left w:val="single" w:color="C9D3DF" w:sz="4"/>
+              <w:bottom w:val="single" w:color="C9D3DF" w:sz="4"/>
+              <w:right w:val="single" w:color="C9D3DF" w:sz="4"/>
+            </w:tcBorders>
+            <w:tcMar>
+              <w:top w:type="dxa" w:w="60"/>
+              <w:left w:type="dxa" w:w="100"/>
+              <w:bottom w:type="dxa" w:w="60"/>
+              <w:right w:type="dxa" w:w="100"/>
+            </w:tcMar>
+          </w:tcPr>
+          <w:p>
+            <w:r>
+              <w:rPr>
+                <w:sz w:val="19"/>
+                <w:szCs w:val="19"/>
+              </w:rPr>
+              <w:t xml:space="preserve">1</w:t>
+            </w:r>
+          </w:p>
+        </w:tc>
+        <w:tc>
+          <w:tcPr>
+            <w:tcW w:type="dxa" w:w="2520"/>
+            <w:tcBorders>
+              <w:top w:val="single" w:color="C9D3DF" w:sz="4"/>
+              <w:left w:val="single" w:color="C9D3DF" w:sz="4"/>
+              <w:bottom w:val="single" w:color="C9D3DF" w:sz="4"/>
+              <w:right w:val="single" w:color="C9D3DF" w:sz="4"/>
+            </w:tcBorders>
+            <w:tcMar>
+              <w:top w:type="dxa" w:w="60"/>
+              <w:left w:type="dxa" w:w="100"/>
+              <w:bottom w:type="dxa" w:w="60"/>
+              <w:right w:type="dxa" w:w="100"/>
+            </w:tcMar>
+          </w:tcPr>
+          <w:p>
+            <w:r>
+              <w:rPr>
+                <w:sz w:val="19"/>
+                <w:szCs w:val="19"/>
+              </w:rPr>
+              <w:t xml:space="preserve">Title, Meta, H1</w:t>
             </w:r>
           </w:p>
         </w:tc>
@@ -8472,7 +9355,7 @@
         </w:trPr>
         <w:tc>
           <w:tcPr>
-            <w:tcW w:type="dxa" w:w="3360"/>
+            <w:tcW w:type="dxa" w:w="2520"/>
             <w:tcBorders>
               <w:top w:val="single" w:color="C9D3DF" w:sz="4"/>
               <w:left w:val="single" w:color="C9D3DF" w:sz="4"/>
@@ -8498,7 +9381,7 @@
         </w:tc>
         <w:tc>
           <w:tcPr>
-            <w:tcW w:type="dxa" w:w="3360"/>
+            <w:tcW w:type="dxa" w:w="2520"/>
             <w:tcBorders>
               <w:top w:val="single" w:color="C9D3DF" w:sz="4"/>
               <w:left w:val="single" w:color="C9D3DF" w:sz="4"/>
@@ -8524,27 +9407,53 @@
         </w:tc>
         <w:tc>
           <w:tcPr>
-            <w:tcW w:type="dxa" w:w="3360"/>
-            <w:tcBorders>
-              <w:top w:val="single" w:color="C9D3DF" w:sz="4"/>
-              <w:left w:val="single" w:color="C9D3DF" w:sz="4"/>
-              <w:bottom w:val="single" w:color="C9D3DF" w:sz="4"/>
-              <w:right w:val="single" w:color="C9D3DF" w:sz="4"/>
-            </w:tcBorders>
-            <w:tcMar>
-              <w:top w:type="dxa" w:w="60"/>
-              <w:left w:type="dxa" w:w="100"/>
-              <w:bottom w:type="dxa" w:w="60"/>
-              <w:right w:type="dxa" w:w="100"/>
-            </w:tcMar>
-          </w:tcPr>
-          <w:p>
-            <w:r>
-              <w:rPr>
-                <w:sz w:val="19"/>
-                <w:szCs w:val="19"/>
-              </w:rPr>
-              <w:t xml:space="preserve">FAQ</w:t>
+            <w:tcW w:type="dxa" w:w="2520"/>
+            <w:tcBorders>
+              <w:top w:val="single" w:color="C9D3DF" w:sz="4"/>
+              <w:left w:val="single" w:color="C9D3DF" w:sz="4"/>
+              <w:bottom w:val="single" w:color="C9D3DF" w:sz="4"/>
+              <w:right w:val="single" w:color="C9D3DF" w:sz="4"/>
+            </w:tcBorders>
+            <w:tcMar>
+              <w:top w:type="dxa" w:w="60"/>
+              <w:left w:type="dxa" w:w="100"/>
+              <w:bottom w:type="dxa" w:w="60"/>
+              <w:right w:type="dxa" w:w="100"/>
+            </w:tcMar>
+          </w:tcPr>
+          <w:p>
+            <w:r>
+              <w:rPr>
+                <w:sz w:val="19"/>
+                <w:szCs w:val="19"/>
+              </w:rPr>
+              <w:t xml:space="preserve">1</w:t>
+            </w:r>
+          </w:p>
+        </w:tc>
+        <w:tc>
+          <w:tcPr>
+            <w:tcW w:type="dxa" w:w="2520"/>
+            <w:tcBorders>
+              <w:top w:val="single" w:color="C9D3DF" w:sz="4"/>
+              <w:left w:val="single" w:color="C9D3DF" w:sz="4"/>
+              <w:bottom w:val="single" w:color="C9D3DF" w:sz="4"/>
+              <w:right w:val="single" w:color="C9D3DF" w:sz="4"/>
+            </w:tcBorders>
+            <w:tcMar>
+              <w:top w:type="dxa" w:w="60"/>
+              <w:left w:type="dxa" w:w="100"/>
+              <w:bottom w:type="dxa" w:w="60"/>
+              <w:right w:type="dxa" w:w="100"/>
+            </w:tcMar>
+          </w:tcPr>
+          <w:p>
+            <w:r>
+              <w:rPr>
+                <w:sz w:val="19"/>
+                <w:szCs w:val="19"/>
+              </w:rPr>
+              <w:t xml:space="preserve">"Questions people ask" section</w:t>
             </w:r>
           </w:p>
         </w:tc>
@@ -9715,7 +10624,7 @@
       <w:pPr>
         <w:spacing w:after="140"/>
       </w:pPr>
-      <w:hyperlink w:history="1" r:id="rId5hcxdhbqeh_bqsqk-wocw">
+      <w:hyperlink w:history="1" r:id="rId8j_anfswxissjpmooz6en">
         <w:r>
           <w:rPr>
             <w:rStyle w:val="Hyperlink"/>
@@ -9902,9 +10811,10 @@
         </w:tblBorders>
       </w:tblPr>
       <w:tblGrid>
-        <w:gridCol w:w="3360"/>
-        <w:gridCol w:w="3360"/>
-        <w:gridCol w:w="3360"/>
+        <w:gridCol w:w="2520"/>
+        <w:gridCol w:w="2520"/>
+        <w:gridCol w:w="2520"/>
+        <w:gridCol w:w="2520"/>
       </w:tblGrid>
       <w:tr>
         <w:trPr>
@@ -9912,7 +10822,7 @@
         </w:trPr>
         <w:tc>
           <w:tcPr>
-            <w:tcW w:type="dxa" w:w="3360"/>
+            <w:tcW w:type="dxa" w:w="2520"/>
             <w:tcBorders>
               <w:top w:val="single" w:color="C9D3DF" w:sz="4"/>
               <w:left w:val="single" w:color="C9D3DF" w:sz="4"/>
@@ -9942,7 +10852,7 @@
         </w:tc>
         <w:tc>
           <w:tcPr>
-            <w:tcW w:type="dxa" w:w="3360"/>
+            <w:tcW w:type="dxa" w:w="2520"/>
             <w:tcBorders>
               <w:top w:val="single" w:color="C9D3DF" w:sz="4"/>
               <w:left w:val="single" w:color="C9D3DF" w:sz="4"/>
@@ -9972,7 +10882,37 @@
         </w:tc>
         <w:tc>
           <w:tcPr>
-            <w:tcW w:type="dxa" w:w="3360"/>
+            <w:tcW w:type="dxa" w:w="2520"/>
+            <w:tcBorders>
+              <w:top w:val="single" w:color="C9D3DF" w:sz="4"/>
+              <w:left w:val="single" w:color="C9D3DF" w:sz="4"/>
+              <w:bottom w:val="single" w:color="C9D3DF" w:sz="4"/>
+              <w:right w:val="single" w:color="C9D3DF" w:sz="4"/>
+            </w:tcBorders>
+            <w:shd w:fill="1F3A5F" w:color="auto" w:val="clear"/>
+            <w:tcMar>
+              <w:top w:type="dxa" w:w="60"/>
+              <w:left w:type="dxa" w:w="100"/>
+              <w:bottom w:type="dxa" w:w="60"/>
+              <w:right w:type="dxa" w:w="100"/>
+            </w:tcMar>
+          </w:tcPr>
+          <w:p>
+            <w:r>
+              <w:rPr>
+                <w:b/>
+                <w:bCs/>
+                <w:color w:val="FFFFFF"/>
+                <w:sz w:val="19"/>
+                <w:szCs w:val="19"/>
+              </w:rPr>
+              <w:t xml:space="preserve">Uses on page</w:t>
+            </w:r>
+          </w:p>
+        </w:tc>
+        <w:tc>
+          <w:tcPr>
+            <w:tcW w:type="dxa" w:w="2520"/>
             <w:tcBorders>
               <w:top w:val="single" w:color="C9D3DF" w:sz="4"/>
               <w:left w:val="single" w:color="C9D3DF" w:sz="4"/>
@@ -10007,7 +10947,7 @@
         </w:trPr>
         <w:tc>
           <w:tcPr>
-            <w:tcW w:type="dxa" w:w="3360"/>
+            <w:tcW w:type="dxa" w:w="2520"/>
             <w:tcBorders>
               <w:top w:val="single" w:color="C9D3DF" w:sz="4"/>
               <w:left w:val="single" w:color="C9D3DF" w:sz="4"/>
@@ -10033,7 +10973,7 @@
         </w:tc>
         <w:tc>
           <w:tcPr>
-            <w:tcW w:type="dxa" w:w="3360"/>
+            <w:tcW w:type="dxa" w:w="2520"/>
             <w:tcBorders>
               <w:top w:val="single" w:color="C9D3DF" w:sz="4"/>
               <w:left w:val="single" w:color="C9D3DF" w:sz="4"/>
@@ -10059,27 +10999,53 @@
         </w:tc>
         <w:tc>
           <w:tcPr>
-            <w:tcW w:type="dxa" w:w="3360"/>
-            <w:tcBorders>
-              <w:top w:val="single" w:color="C9D3DF" w:sz="4"/>
-              <w:left w:val="single" w:color="C9D3DF" w:sz="4"/>
-              <w:bottom w:val="single" w:color="C9D3DF" w:sz="4"/>
-              <w:right w:val="single" w:color="C9D3DF" w:sz="4"/>
-            </w:tcBorders>
-            <w:tcMar>
-              <w:top w:type="dxa" w:w="60"/>
-              <w:left w:type="dxa" w:w="100"/>
-              <w:bottom w:type="dxa" w:w="60"/>
-              <w:right w:type="dxa" w:w="100"/>
-            </w:tcMar>
-          </w:tcPr>
-          <w:p>
-            <w:r>
-              <w:rPr>
-                <w:sz w:val="19"/>
-                <w:szCs w:val="19"/>
-              </w:rPr>
-              <w:t xml:space="preserve">Title, H1</w:t>
+            <w:tcW w:type="dxa" w:w="2520"/>
+            <w:tcBorders>
+              <w:top w:val="single" w:color="C9D3DF" w:sz="4"/>
+              <w:left w:val="single" w:color="C9D3DF" w:sz="4"/>
+              <w:bottom w:val="single" w:color="C9D3DF" w:sz="4"/>
+              <w:right w:val="single" w:color="C9D3DF" w:sz="4"/>
+            </w:tcBorders>
+            <w:tcMar>
+              <w:top w:type="dxa" w:w="60"/>
+              <w:left w:type="dxa" w:w="100"/>
+              <w:bottom w:type="dxa" w:w="60"/>
+              <w:right w:type="dxa" w:w="100"/>
+            </w:tcMar>
+          </w:tcPr>
+          <w:p>
+            <w:r>
+              <w:rPr>
+                <w:sz w:val="19"/>
+                <w:szCs w:val="19"/>
+              </w:rPr>
+              <w:t xml:space="preserve">2</w:t>
+            </w:r>
+          </w:p>
+        </w:tc>
+        <w:tc>
+          <w:tcPr>
+            <w:tcW w:type="dxa" w:w="2520"/>
+            <w:tcBorders>
+              <w:top w:val="single" w:color="C9D3DF" w:sz="4"/>
+              <w:left w:val="single" w:color="C9D3DF" w:sz="4"/>
+              <w:bottom w:val="single" w:color="C9D3DF" w:sz="4"/>
+              <w:right w:val="single" w:color="C9D3DF" w:sz="4"/>
+            </w:tcBorders>
+            <w:tcMar>
+              <w:top w:type="dxa" w:w="60"/>
+              <w:left w:type="dxa" w:w="100"/>
+              <w:bottom w:type="dxa" w:w="60"/>
+              <w:right w:type="dxa" w:w="100"/>
+            </w:tcMar>
+          </w:tcPr>
+          <w:p>
+            <w:r>
+              <w:rPr>
+                <w:sz w:val="19"/>
+                <w:szCs w:val="19"/>
+              </w:rPr>
+              <w:t xml:space="preserve">Title, Meta, H1, "So, what is Lynkk?" section</w:t>
             </w:r>
           </w:p>
         </w:tc>
@@ -10090,7 +11056,7 @@
         </w:trPr>
         <w:tc>
           <w:tcPr>
-            <w:tcW w:type="dxa" w:w="3360"/>
+            <w:tcW w:type="dxa" w:w="2520"/>
             <w:tcBorders>
               <w:top w:val="single" w:color="C9D3DF" w:sz="4"/>
               <w:left w:val="single" w:color="C9D3DF" w:sz="4"/>
@@ -10116,7 +11082,7 @@
         </w:tc>
         <w:tc>
           <w:tcPr>
-            <w:tcW w:type="dxa" w:w="3360"/>
+            <w:tcW w:type="dxa" w:w="2520"/>
             <w:tcBorders>
               <w:top w:val="single" w:color="C9D3DF" w:sz="4"/>
               <w:left w:val="single" w:color="C9D3DF" w:sz="4"/>
@@ -10142,27 +11108,53 @@
         </w:tc>
         <w:tc>
           <w:tcPr>
-            <w:tcW w:type="dxa" w:w="3360"/>
-            <w:tcBorders>
-              <w:top w:val="single" w:color="C9D3DF" w:sz="4"/>
-              <w:left w:val="single" w:color="C9D3DF" w:sz="4"/>
-              <w:bottom w:val="single" w:color="C9D3DF" w:sz="4"/>
-              <w:right w:val="single" w:color="C9D3DF" w:sz="4"/>
-            </w:tcBorders>
-            <w:tcMar>
-              <w:top w:type="dxa" w:w="60"/>
-              <w:left w:type="dxa" w:w="100"/>
-              <w:bottom w:type="dxa" w:w="60"/>
-              <w:right w:type="dxa" w:w="100"/>
-            </w:tcMar>
-          </w:tcPr>
-          <w:p>
-            <w:r>
-              <w:rPr>
-                <w:sz w:val="19"/>
-                <w:szCs w:val="19"/>
-              </w:rPr>
-              <w:t xml:space="preserve">Title, H1, "So, what is Lynkk?"</w:t>
+            <w:tcW w:type="dxa" w:w="2520"/>
+            <w:tcBorders>
+              <w:top w:val="single" w:color="C9D3DF" w:sz="4"/>
+              <w:left w:val="single" w:color="C9D3DF" w:sz="4"/>
+              <w:bottom w:val="single" w:color="C9D3DF" w:sz="4"/>
+              <w:right w:val="single" w:color="C9D3DF" w:sz="4"/>
+            </w:tcBorders>
+            <w:tcMar>
+              <w:top w:type="dxa" w:w="60"/>
+              <w:left w:type="dxa" w:w="100"/>
+              <w:bottom w:type="dxa" w:w="60"/>
+              <w:right w:type="dxa" w:w="100"/>
+            </w:tcMar>
+          </w:tcPr>
+          <w:p>
+            <w:r>
+              <w:rPr>
+                <w:sz w:val="19"/>
+                <w:szCs w:val="19"/>
+              </w:rPr>
+              <w:t xml:space="preserve">3</w:t>
+            </w:r>
+          </w:p>
+        </w:tc>
+        <w:tc>
+          <w:tcPr>
+            <w:tcW w:type="dxa" w:w="2520"/>
+            <w:tcBorders>
+              <w:top w:val="single" w:color="C9D3DF" w:sz="4"/>
+              <w:left w:val="single" w:color="C9D3DF" w:sz="4"/>
+              <w:bottom w:val="single" w:color="C9D3DF" w:sz="4"/>
+              <w:right w:val="single" w:color="C9D3DF" w:sz="4"/>
+            </w:tcBorders>
+            <w:tcMar>
+              <w:top w:type="dxa" w:w="60"/>
+              <w:left w:type="dxa" w:w="100"/>
+              <w:bottom w:type="dxa" w:w="60"/>
+              <w:right w:type="dxa" w:w="100"/>
+            </w:tcMar>
+          </w:tcPr>
+          <w:p>
+            <w:r>
+              <w:rPr>
+                <w:sz w:val="19"/>
+                <w:szCs w:val="19"/>
+              </w:rPr>
+              <w:t xml:space="preserve">Title, H1, "How Lynkk helps Sarah find the voice of customer" heading, "So, what is Lynkk?" section</w:t>
             </w:r>
           </w:p>
         </w:tc>
@@ -10173,7 +11165,7 @@
         </w:trPr>
         <w:tc>
           <w:tcPr>
-            <w:tcW w:type="dxa" w:w="3360"/>
+            <w:tcW w:type="dxa" w:w="2520"/>
             <w:tcBorders>
               <w:top w:val="single" w:color="C9D3DF" w:sz="4"/>
               <w:left w:val="single" w:color="C9D3DF" w:sz="4"/>
@@ -10199,7 +11191,7 @@
         </w:tc>
         <w:tc>
           <w:tcPr>
-            <w:tcW w:type="dxa" w:w="3360"/>
+            <w:tcW w:type="dxa" w:w="2520"/>
             <w:tcBorders>
               <w:top w:val="single" w:color="C9D3DF" w:sz="4"/>
               <w:left w:val="single" w:color="C9D3DF" w:sz="4"/>
@@ -10225,27 +11217,53 @@
         </w:tc>
         <w:tc>
           <w:tcPr>
-            <w:tcW w:type="dxa" w:w="3360"/>
-            <w:tcBorders>
-              <w:top w:val="single" w:color="C9D3DF" w:sz="4"/>
-              <w:left w:val="single" w:color="C9D3DF" w:sz="4"/>
-              <w:bottom w:val="single" w:color="C9D3DF" w:sz="4"/>
-              <w:right w:val="single" w:color="C9D3DF" w:sz="4"/>
-            </w:tcBorders>
-            <w:tcMar>
-              <w:top w:type="dxa" w:w="60"/>
-              <w:left w:type="dxa" w:w="100"/>
-              <w:bottom w:type="dxa" w:w="60"/>
-              <w:right w:type="dxa" w:w="100"/>
-            </w:tcMar>
-          </w:tcPr>
-          <w:p>
-            <w:r>
-              <w:rPr>
-                <w:sz w:val="19"/>
-                <w:szCs w:val="19"/>
-              </w:rPr>
-              <w:t xml:space="preserve">FAQ</w:t>
+            <w:tcW w:type="dxa" w:w="2520"/>
+            <w:tcBorders>
+              <w:top w:val="single" w:color="C9D3DF" w:sz="4"/>
+              <w:left w:val="single" w:color="C9D3DF" w:sz="4"/>
+              <w:bottom w:val="single" w:color="C9D3DF" w:sz="4"/>
+              <w:right w:val="single" w:color="C9D3DF" w:sz="4"/>
+            </w:tcBorders>
+            <w:tcMar>
+              <w:top w:type="dxa" w:w="60"/>
+              <w:left w:type="dxa" w:w="100"/>
+              <w:bottom w:type="dxa" w:w="60"/>
+              <w:right w:type="dxa" w:w="100"/>
+            </w:tcMar>
+          </w:tcPr>
+          <w:p>
+            <w:r>
+              <w:rPr>
+                <w:sz w:val="19"/>
+                <w:szCs w:val="19"/>
+              </w:rPr>
+              <w:t xml:space="preserve">1</w:t>
+            </w:r>
+          </w:p>
+        </w:tc>
+        <w:tc>
+          <w:tcPr>
+            <w:tcW w:type="dxa" w:w="2520"/>
+            <w:tcBorders>
+              <w:top w:val="single" w:color="C9D3DF" w:sz="4"/>
+              <w:left w:val="single" w:color="C9D3DF" w:sz="4"/>
+              <w:bottom w:val="single" w:color="C9D3DF" w:sz="4"/>
+              <w:right w:val="single" w:color="C9D3DF" w:sz="4"/>
+            </w:tcBorders>
+            <w:tcMar>
+              <w:top w:type="dxa" w:w="60"/>
+              <w:left w:type="dxa" w:w="100"/>
+              <w:bottom w:type="dxa" w:w="60"/>
+              <w:right w:type="dxa" w:w="100"/>
+            </w:tcMar>
+          </w:tcPr>
+          <w:p>
+            <w:r>
+              <w:rPr>
+                <w:sz w:val="19"/>
+                <w:szCs w:val="19"/>
+              </w:rPr>
+              <w:t xml:space="preserve">"Questions people ask" section</w:t>
             </w:r>
           </w:p>
         </w:tc>
@@ -11154,7 +12172,7 @@
       <w:r>
         <w:t xml:space="preserve">Notes are private unless you share them. Your data is encrypted and stays in the region you choose. Lynkk never uses your calls to train AI. </w:t>
       </w:r>
-      <w:hyperlink w:history="1" r:id="rIddyv-bhyvhxkz6qx4a9-or">
+      <w:hyperlink w:history="1" r:id="rIdqxok0oadhsuxdtcruyihv">
         <w:r>
           <w:rPr>
             <w:rStyle w:val="Hyperlink"/>
@@ -11376,7 +12394,7 @@
       <w:pPr>
         <w:spacing w:after="140"/>
       </w:pPr>
-      <w:hyperlink w:history="1" r:id="rIdmbupxyenwcrvujl-qtfta">
+      <w:hyperlink w:history="1" r:id="rIdbs1_e9u2n9h2c29arge-a">
         <w:r>
           <w:rPr>
             <w:rStyle w:val="Hyperlink"/>
@@ -11563,9 +12581,10 @@
         </w:tblBorders>
       </w:tblPr>
       <w:tblGrid>
-        <w:gridCol w:w="3360"/>
-        <w:gridCol w:w="3360"/>
-        <w:gridCol w:w="3360"/>
+        <w:gridCol w:w="2520"/>
+        <w:gridCol w:w="2520"/>
+        <w:gridCol w:w="2520"/>
+        <w:gridCol w:w="2520"/>
       </w:tblGrid>
       <w:tr>
         <w:trPr>
@@ -11573,7 +12592,7 @@
         </w:trPr>
         <w:tc>
           <w:tcPr>
-            <w:tcW w:type="dxa" w:w="3360"/>
+            <w:tcW w:type="dxa" w:w="2520"/>
             <w:tcBorders>
               <w:top w:val="single" w:color="C9D3DF" w:sz="4"/>
               <w:left w:val="single" w:color="C9D3DF" w:sz="4"/>
@@ -11603,7 +12622,7 @@
         </w:tc>
         <w:tc>
           <w:tcPr>
-            <w:tcW w:type="dxa" w:w="3360"/>
+            <w:tcW w:type="dxa" w:w="2520"/>
             <w:tcBorders>
               <w:top w:val="single" w:color="C9D3DF" w:sz="4"/>
               <w:left w:val="single" w:color="C9D3DF" w:sz="4"/>
@@ -11633,7 +12652,37 @@
         </w:tc>
         <w:tc>
           <w:tcPr>
-            <w:tcW w:type="dxa" w:w="3360"/>
+            <w:tcW w:type="dxa" w:w="2520"/>
+            <w:tcBorders>
+              <w:top w:val="single" w:color="C9D3DF" w:sz="4"/>
+              <w:left w:val="single" w:color="C9D3DF" w:sz="4"/>
+              <w:bottom w:val="single" w:color="C9D3DF" w:sz="4"/>
+              <w:right w:val="single" w:color="C9D3DF" w:sz="4"/>
+            </w:tcBorders>
+            <w:shd w:fill="1F3A5F" w:color="auto" w:val="clear"/>
+            <w:tcMar>
+              <w:top w:type="dxa" w:w="60"/>
+              <w:left w:type="dxa" w:w="100"/>
+              <w:bottom w:type="dxa" w:w="60"/>
+              <w:right w:type="dxa" w:w="100"/>
+            </w:tcMar>
+          </w:tcPr>
+          <w:p>
+            <w:r>
+              <w:rPr>
+                <w:b/>
+                <w:bCs/>
+                <w:color w:val="FFFFFF"/>
+                <w:sz w:val="19"/>
+                <w:szCs w:val="19"/>
+              </w:rPr>
+              <w:t xml:space="preserve">Uses on page</w:t>
+            </w:r>
+          </w:p>
+        </w:tc>
+        <w:tc>
+          <w:tcPr>
+            <w:tcW w:type="dxa" w:w="2520"/>
             <w:tcBorders>
               <w:top w:val="single" w:color="C9D3DF" w:sz="4"/>
               <w:left w:val="single" w:color="C9D3DF" w:sz="4"/>
@@ -11668,7 +12717,7 @@
         </w:trPr>
         <w:tc>
           <w:tcPr>
-            <w:tcW w:type="dxa" w:w="3360"/>
+            <w:tcW w:type="dxa" w:w="2520"/>
             <w:tcBorders>
               <w:top w:val="single" w:color="C9D3DF" w:sz="4"/>
               <w:left w:val="single" w:color="C9D3DF" w:sz="4"/>
@@ -11694,7 +12743,7 @@
         </w:tc>
         <w:tc>
           <w:tcPr>
-            <w:tcW w:type="dxa" w:w="3360"/>
+            <w:tcW w:type="dxa" w:w="2520"/>
             <w:tcBorders>
               <w:top w:val="single" w:color="C9D3DF" w:sz="4"/>
               <w:left w:val="single" w:color="C9D3DF" w:sz="4"/>
@@ -11720,7 +12769,33 @@
         </w:tc>
         <w:tc>
           <w:tcPr>
-            <w:tcW w:type="dxa" w:w="3360"/>
+            <w:tcW w:type="dxa" w:w="2520"/>
+            <w:tcBorders>
+              <w:top w:val="single" w:color="C9D3DF" w:sz="4"/>
+              <w:left w:val="single" w:color="C9D3DF" w:sz="4"/>
+              <w:bottom w:val="single" w:color="C9D3DF" w:sz="4"/>
+              <w:right w:val="single" w:color="C9D3DF" w:sz="4"/>
+            </w:tcBorders>
+            <w:tcMar>
+              <w:top w:type="dxa" w:w="60"/>
+              <w:left w:type="dxa" w:w="100"/>
+              <w:bottom w:type="dxa" w:w="60"/>
+              <w:right w:type="dxa" w:w="100"/>
+            </w:tcMar>
+          </w:tcPr>
+          <w:p>
+            <w:r>
+              <w:rPr>
+                <w:sz w:val="19"/>
+                <w:szCs w:val="19"/>
+              </w:rPr>
+              <w:t xml:space="preserve">1</w:t>
+            </w:r>
+          </w:p>
+        </w:tc>
+        <w:tc>
+          <w:tcPr>
+            <w:tcW w:type="dxa" w:w="2520"/>
             <w:tcBorders>
               <w:top w:val="single" w:color="C9D3DF" w:sz="4"/>
               <w:left w:val="single" w:color="C9D3DF" w:sz="4"/>
@@ -11751,7 +12826,7 @@
         </w:trPr>
         <w:tc>
           <w:tcPr>
-            <w:tcW w:type="dxa" w:w="3360"/>
+            <w:tcW w:type="dxa" w:w="2520"/>
             <w:tcBorders>
               <w:top w:val="single" w:color="C9D3DF" w:sz="4"/>
               <w:left w:val="single" w:color="C9D3DF" w:sz="4"/>
@@ -11777,7 +12852,7 @@
         </w:tc>
         <w:tc>
           <w:tcPr>
-            <w:tcW w:type="dxa" w:w="3360"/>
+            <w:tcW w:type="dxa" w:w="2520"/>
             <w:tcBorders>
               <w:top w:val="single" w:color="C9D3DF" w:sz="4"/>
               <w:left w:val="single" w:color="C9D3DF" w:sz="4"/>
@@ -11803,27 +12878,53 @@
         </w:tc>
         <w:tc>
           <w:tcPr>
-            <w:tcW w:type="dxa" w:w="3360"/>
-            <w:tcBorders>
-              <w:top w:val="single" w:color="C9D3DF" w:sz="4"/>
-              <w:left w:val="single" w:color="C9D3DF" w:sz="4"/>
-              <w:bottom w:val="single" w:color="C9D3DF" w:sz="4"/>
-              <w:right w:val="single" w:color="C9D3DF" w:sz="4"/>
-            </w:tcBorders>
-            <w:tcMar>
-              <w:top w:type="dxa" w:w="60"/>
-              <w:left w:type="dxa" w:w="100"/>
-              <w:bottom w:type="dxa" w:w="60"/>
-              <w:right w:type="dxa" w:w="100"/>
-            </w:tcMar>
-          </w:tcPr>
-          <w:p>
-            <w:r>
-              <w:rPr>
-                <w:sz w:val="19"/>
-                <w:szCs w:val="19"/>
-              </w:rPr>
-              <w:t xml:space="preserve">Meta description, "So, what is Lynkk?"</w:t>
+            <w:tcW w:type="dxa" w:w="2520"/>
+            <w:tcBorders>
+              <w:top w:val="single" w:color="C9D3DF" w:sz="4"/>
+              <w:left w:val="single" w:color="C9D3DF" w:sz="4"/>
+              <w:bottom w:val="single" w:color="C9D3DF" w:sz="4"/>
+              <w:right w:val="single" w:color="C9D3DF" w:sz="4"/>
+            </w:tcBorders>
+            <w:tcMar>
+              <w:top w:type="dxa" w:w="60"/>
+              <w:left w:type="dxa" w:w="100"/>
+              <w:bottom w:type="dxa" w:w="60"/>
+              <w:right w:type="dxa" w:w="100"/>
+            </w:tcMar>
+          </w:tcPr>
+          <w:p>
+            <w:r>
+              <w:rPr>
+                <w:sz w:val="19"/>
+                <w:szCs w:val="19"/>
+              </w:rPr>
+              <w:t xml:space="preserve">1</w:t>
+            </w:r>
+          </w:p>
+        </w:tc>
+        <w:tc>
+          <w:tcPr>
+            <w:tcW w:type="dxa" w:w="2520"/>
+            <w:tcBorders>
+              <w:top w:val="single" w:color="C9D3DF" w:sz="4"/>
+              <w:left w:val="single" w:color="C9D3DF" w:sz="4"/>
+              <w:bottom w:val="single" w:color="C9D3DF" w:sz="4"/>
+              <w:right w:val="single" w:color="C9D3DF" w:sz="4"/>
+            </w:tcBorders>
+            <w:tcMar>
+              <w:top w:type="dxa" w:w="60"/>
+              <w:left w:type="dxa" w:w="100"/>
+              <w:bottom w:type="dxa" w:w="60"/>
+              <w:right w:type="dxa" w:w="100"/>
+            </w:tcMar>
+          </w:tcPr>
+          <w:p>
+            <w:r>
+              <w:rPr>
+                <w:sz w:val="19"/>
+                <w:szCs w:val="19"/>
+              </w:rPr>
+              <w:t xml:space="preserve">Meta, "So, what is Lynkk?" section</w:t>
             </w:r>
           </w:p>
         </w:tc>
@@ -11834,7 +12935,7 @@
         </w:trPr>
         <w:tc>
           <w:tcPr>
-            <w:tcW w:type="dxa" w:w="3360"/>
+            <w:tcW w:type="dxa" w:w="2520"/>
             <w:tcBorders>
               <w:top w:val="single" w:color="C9D3DF" w:sz="4"/>
               <w:left w:val="single" w:color="C9D3DF" w:sz="4"/>
@@ -11860,7 +12961,7 @@
         </w:tc>
         <w:tc>
           <w:tcPr>
-            <w:tcW w:type="dxa" w:w="3360"/>
+            <w:tcW w:type="dxa" w:w="2520"/>
             <w:tcBorders>
               <w:top w:val="single" w:color="C9D3DF" w:sz="4"/>
               <w:left w:val="single" w:color="C9D3DF" w:sz="4"/>
@@ -11886,27 +12987,53 @@
         </w:tc>
         <w:tc>
           <w:tcPr>
-            <w:tcW w:type="dxa" w:w="3360"/>
-            <w:tcBorders>
-              <w:top w:val="single" w:color="C9D3DF" w:sz="4"/>
-              <w:left w:val="single" w:color="C9D3DF" w:sz="4"/>
-              <w:bottom w:val="single" w:color="C9D3DF" w:sz="4"/>
-              <w:right w:val="single" w:color="C9D3DF" w:sz="4"/>
-            </w:tcBorders>
-            <w:tcMar>
-              <w:top w:type="dxa" w:w="60"/>
-              <w:left w:type="dxa" w:w="100"/>
-              <w:bottom w:type="dxa" w:w="60"/>
-              <w:right w:type="dxa" w:w="100"/>
-            </w:tcMar>
-          </w:tcPr>
-          <w:p>
-            <w:r>
-              <w:rPr>
-                <w:sz w:val="19"/>
-                <w:szCs w:val="19"/>
-              </w:rPr>
-              <w:t xml:space="preserve">FAQ</w:t>
+            <w:tcW w:type="dxa" w:w="2520"/>
+            <w:tcBorders>
+              <w:top w:val="single" w:color="C9D3DF" w:sz="4"/>
+              <w:left w:val="single" w:color="C9D3DF" w:sz="4"/>
+              <w:bottom w:val="single" w:color="C9D3DF" w:sz="4"/>
+              <w:right w:val="single" w:color="C9D3DF" w:sz="4"/>
+            </w:tcBorders>
+            <w:tcMar>
+              <w:top w:type="dxa" w:w="60"/>
+              <w:left w:type="dxa" w:w="100"/>
+              <w:bottom w:type="dxa" w:w="60"/>
+              <w:right w:type="dxa" w:w="100"/>
+            </w:tcMar>
+          </w:tcPr>
+          <w:p>
+            <w:r>
+              <w:rPr>
+                <w:sz w:val="19"/>
+                <w:szCs w:val="19"/>
+              </w:rPr>
+              <w:t xml:space="preserve">2</w:t>
+            </w:r>
+          </w:p>
+        </w:tc>
+        <w:tc>
+          <w:tcPr>
+            <w:tcW w:type="dxa" w:w="2520"/>
+            <w:tcBorders>
+              <w:top w:val="single" w:color="C9D3DF" w:sz="4"/>
+              <w:left w:val="single" w:color="C9D3DF" w:sz="4"/>
+              <w:bottom w:val="single" w:color="C9D3DF" w:sz="4"/>
+              <w:right w:val="single" w:color="C9D3DF" w:sz="4"/>
+            </w:tcBorders>
+            <w:tcMar>
+              <w:top w:type="dxa" w:w="60"/>
+              <w:left w:type="dxa" w:w="100"/>
+              <w:bottom w:type="dxa" w:w="60"/>
+              <w:right w:type="dxa" w:w="100"/>
+            </w:tcMar>
+          </w:tcPr>
+          <w:p>
+            <w:r>
+              <w:rPr>
+                <w:sz w:val="19"/>
+                <w:szCs w:val="19"/>
+              </w:rPr>
+              <w:t xml:space="preserve">"Questions people ask" section</w:t>
             </w:r>
           </w:p>
         </w:tc>
@@ -12830,7 +13957,7 @@
       <w:r>
         <w:t xml:space="preserve">Notes are private unless you share them. Your data is encrypted. Lynkk never uses your meetings to train AI. </w:t>
       </w:r>
-      <w:hyperlink w:history="1" r:id="rIddev5gvhcxy_wfe5yhs4et">
+      <w:hyperlink w:history="1" r:id="rIdhzww-auiki4p8lpaj9drb">
         <w:r>
           <w:rPr>
             <w:rStyle w:val="Hyperlink"/>
@@ -13052,7 +14179,7 @@
       <w:pPr>
         <w:spacing w:after="140"/>
       </w:pPr>
-      <w:hyperlink w:history="1" r:id="rId7o37p3htstny6ywc9eqyu">
+      <w:hyperlink w:history="1" r:id="rIdvycu7sjufuqc9f73rvnot">
         <w:r>
           <w:rPr>
             <w:rStyle w:val="Hyperlink"/>
@@ -13088,7 +14215,7 @@
       <w:r>
         <w:t xml:space="preserve">No. Lynkk writes notes and text for your own work. It isn't a certified court transcript. See our guide to </w:t>
       </w:r>
-      <w:hyperlink w:history="1" r:id="rIdqzy6pvyhdrlokxbiczfad">
+      <w:hyperlink w:history="1" r:id="rIdklanvg5uh4kd6egerc_qv">
         <w:r>
           <w:rPr>
             <w:rStyle w:val="Hyperlink"/>
@@ -13250,9 +14377,10 @@
         </w:tblBorders>
       </w:tblPr>
       <w:tblGrid>
-        <w:gridCol w:w="3360"/>
-        <w:gridCol w:w="3360"/>
-        <w:gridCol w:w="3360"/>
+        <w:gridCol w:w="2520"/>
+        <w:gridCol w:w="2520"/>
+        <w:gridCol w:w="2520"/>
+        <w:gridCol w:w="2520"/>
       </w:tblGrid>
       <w:tr>
         <w:trPr>
@@ -13260,7 +14388,7 @@
         </w:trPr>
         <w:tc>
           <w:tcPr>
-            <w:tcW w:type="dxa" w:w="3360"/>
+            <w:tcW w:type="dxa" w:w="2520"/>
             <w:tcBorders>
               <w:top w:val="single" w:color="C9D3DF" w:sz="4"/>
               <w:left w:val="single" w:color="C9D3DF" w:sz="4"/>
@@ -13290,7 +14418,7 @@
         </w:tc>
         <w:tc>
           <w:tcPr>
-            <w:tcW w:type="dxa" w:w="3360"/>
+            <w:tcW w:type="dxa" w:w="2520"/>
             <w:tcBorders>
               <w:top w:val="single" w:color="C9D3DF" w:sz="4"/>
               <w:left w:val="single" w:color="C9D3DF" w:sz="4"/>
@@ -13320,7 +14448,37 @@
         </w:tc>
         <w:tc>
           <w:tcPr>
-            <w:tcW w:type="dxa" w:w="3360"/>
+            <w:tcW w:type="dxa" w:w="2520"/>
+            <w:tcBorders>
+              <w:top w:val="single" w:color="C9D3DF" w:sz="4"/>
+              <w:left w:val="single" w:color="C9D3DF" w:sz="4"/>
+              <w:bottom w:val="single" w:color="C9D3DF" w:sz="4"/>
+              <w:right w:val="single" w:color="C9D3DF" w:sz="4"/>
+            </w:tcBorders>
+            <w:shd w:fill="1F3A5F" w:color="auto" w:val="clear"/>
+            <w:tcMar>
+              <w:top w:type="dxa" w:w="60"/>
+              <w:left w:type="dxa" w:w="100"/>
+              <w:bottom w:type="dxa" w:w="60"/>
+              <w:right w:type="dxa" w:w="100"/>
+            </w:tcMar>
+          </w:tcPr>
+          <w:p>
+            <w:r>
+              <w:rPr>
+                <w:b/>
+                <w:bCs/>
+                <w:color w:val="FFFFFF"/>
+                <w:sz w:val="19"/>
+                <w:szCs w:val="19"/>
+              </w:rPr>
+              <w:t xml:space="preserve">Uses on page</w:t>
+            </w:r>
+          </w:p>
+        </w:tc>
+        <w:tc>
+          <w:tcPr>
+            <w:tcW w:type="dxa" w:w="2520"/>
             <w:tcBorders>
               <w:top w:val="single" w:color="C9D3DF" w:sz="4"/>
               <w:left w:val="single" w:color="C9D3DF" w:sz="4"/>
@@ -13355,7 +14513,7 @@
         </w:trPr>
         <w:tc>
           <w:tcPr>
-            <w:tcW w:type="dxa" w:w="3360"/>
+            <w:tcW w:type="dxa" w:w="2520"/>
             <w:tcBorders>
               <w:top w:val="single" w:color="C9D3DF" w:sz="4"/>
               <w:left w:val="single" w:color="C9D3DF" w:sz="4"/>
@@ -13381,7 +14539,7 @@
         </w:tc>
         <w:tc>
           <w:tcPr>
-            <w:tcW w:type="dxa" w:w="3360"/>
+            <w:tcW w:type="dxa" w:w="2520"/>
             <w:tcBorders>
               <w:top w:val="single" w:color="C9D3DF" w:sz="4"/>
               <w:left w:val="single" w:color="C9D3DF" w:sz="4"/>
@@ -13407,27 +14565,53 @@
         </w:tc>
         <w:tc>
           <w:tcPr>
-            <w:tcW w:type="dxa" w:w="3360"/>
-            <w:tcBorders>
-              <w:top w:val="single" w:color="C9D3DF" w:sz="4"/>
-              <w:left w:val="single" w:color="C9D3DF" w:sz="4"/>
-              <w:bottom w:val="single" w:color="C9D3DF" w:sz="4"/>
-              <w:right w:val="single" w:color="C9D3DF" w:sz="4"/>
-            </w:tcBorders>
-            <w:tcMar>
-              <w:top w:type="dxa" w:w="60"/>
-              <w:left w:type="dxa" w:w="100"/>
-              <w:bottom w:type="dxa" w:w="60"/>
-              <w:right w:type="dxa" w:w="100"/>
-            </w:tcMar>
-          </w:tcPr>
-          <w:p>
-            <w:r>
-              <w:rPr>
-                <w:sz w:val="19"/>
-                <w:szCs w:val="19"/>
-              </w:rPr>
-              <w:t xml:space="preserve">Title, H1, "So, what is Lynkk?"</w:t>
+            <w:tcW w:type="dxa" w:w="2520"/>
+            <w:tcBorders>
+              <w:top w:val="single" w:color="C9D3DF" w:sz="4"/>
+              <w:left w:val="single" w:color="C9D3DF" w:sz="4"/>
+              <w:bottom w:val="single" w:color="C9D3DF" w:sz="4"/>
+              <w:right w:val="single" w:color="C9D3DF" w:sz="4"/>
+            </w:tcBorders>
+            <w:tcMar>
+              <w:top w:type="dxa" w:w="60"/>
+              <w:left w:type="dxa" w:w="100"/>
+              <w:bottom w:type="dxa" w:w="60"/>
+              <w:right w:type="dxa" w:w="100"/>
+            </w:tcMar>
+          </w:tcPr>
+          <w:p>
+            <w:r>
+              <w:rPr>
+                <w:sz w:val="19"/>
+                <w:szCs w:val="19"/>
+              </w:rPr>
+              <w:t xml:space="preserve">2</w:t>
+            </w:r>
+          </w:p>
+        </w:tc>
+        <w:tc>
+          <w:tcPr>
+            <w:tcW w:type="dxa" w:w="2520"/>
+            <w:tcBorders>
+              <w:top w:val="single" w:color="C9D3DF" w:sz="4"/>
+              <w:left w:val="single" w:color="C9D3DF" w:sz="4"/>
+              <w:bottom w:val="single" w:color="C9D3DF" w:sz="4"/>
+              <w:right w:val="single" w:color="C9D3DF" w:sz="4"/>
+            </w:tcBorders>
+            <w:tcMar>
+              <w:top w:type="dxa" w:w="60"/>
+              <w:left w:type="dxa" w:w="100"/>
+              <w:bottom w:type="dxa" w:w="60"/>
+              <w:right w:type="dxa" w:w="100"/>
+            </w:tcMar>
+          </w:tcPr>
+          <w:p>
+            <w:r>
+              <w:rPr>
+                <w:sz w:val="19"/>
+                <w:szCs w:val="19"/>
+              </w:rPr>
+              <w:t xml:space="preserve">Title, H1, "So, what is Lynkk?" section</w:t>
             </w:r>
           </w:p>
         </w:tc>
@@ -13438,7 +14622,7 @@
         </w:trPr>
         <w:tc>
           <w:tcPr>
-            <w:tcW w:type="dxa" w:w="3360"/>
+            <w:tcW w:type="dxa" w:w="2520"/>
             <w:tcBorders>
               <w:top w:val="single" w:color="C9D3DF" w:sz="4"/>
               <w:left w:val="single" w:color="C9D3DF" w:sz="4"/>
@@ -13464,7 +14648,7 @@
         </w:tc>
         <w:tc>
           <w:tcPr>
-            <w:tcW w:type="dxa" w:w="3360"/>
+            <w:tcW w:type="dxa" w:w="2520"/>
             <w:tcBorders>
               <w:top w:val="single" w:color="C9D3DF" w:sz="4"/>
               <w:left w:val="single" w:color="C9D3DF" w:sz="4"/>
@@ -13490,27 +14674,53 @@
         </w:tc>
         <w:tc>
           <w:tcPr>
-            <w:tcW w:type="dxa" w:w="3360"/>
-            <w:tcBorders>
-              <w:top w:val="single" w:color="C9D3DF" w:sz="4"/>
-              <w:left w:val="single" w:color="C9D3DF" w:sz="4"/>
-              <w:bottom w:val="single" w:color="C9D3DF" w:sz="4"/>
-              <w:right w:val="single" w:color="C9D3DF" w:sz="4"/>
-            </w:tcBorders>
-            <w:tcMar>
-              <w:top w:type="dxa" w:w="60"/>
-              <w:left w:type="dxa" w:w="100"/>
-              <w:bottom w:type="dxa" w:w="60"/>
-              <w:right w:type="dxa" w:w="100"/>
-            </w:tcMar>
-          </w:tcPr>
-          <w:p>
-            <w:r>
-              <w:rPr>
-                <w:sz w:val="19"/>
-                <w:szCs w:val="19"/>
-              </w:rPr>
-              <w:t xml:space="preserve">Meta description, guide link</w:t>
+            <w:tcW w:type="dxa" w:w="2520"/>
+            <w:tcBorders>
+              <w:top w:val="single" w:color="C9D3DF" w:sz="4"/>
+              <w:left w:val="single" w:color="C9D3DF" w:sz="4"/>
+              <w:bottom w:val="single" w:color="C9D3DF" w:sz="4"/>
+              <w:right w:val="single" w:color="C9D3DF" w:sz="4"/>
+            </w:tcBorders>
+            <w:tcMar>
+              <w:top w:type="dxa" w:w="60"/>
+              <w:left w:type="dxa" w:w="100"/>
+              <w:bottom w:type="dxa" w:w="60"/>
+              <w:right w:type="dxa" w:w="100"/>
+            </w:tcMar>
+          </w:tcPr>
+          <w:p>
+            <w:r>
+              <w:rPr>
+                <w:sz w:val="19"/>
+                <w:szCs w:val="19"/>
+              </w:rPr>
+              <w:t xml:space="preserve">1</w:t>
+            </w:r>
+          </w:p>
+        </w:tc>
+        <w:tc>
+          <w:tcPr>
+            <w:tcW w:type="dxa" w:w="2520"/>
+            <w:tcBorders>
+              <w:top w:val="single" w:color="C9D3DF" w:sz="4"/>
+              <w:left w:val="single" w:color="C9D3DF" w:sz="4"/>
+              <w:bottom w:val="single" w:color="C9D3DF" w:sz="4"/>
+              <w:right w:val="single" w:color="C9D3DF" w:sz="4"/>
+            </w:tcBorders>
+            <w:tcMar>
+              <w:top w:type="dxa" w:w="60"/>
+              <w:left w:type="dxa" w:w="100"/>
+              <w:bottom w:type="dxa" w:w="60"/>
+              <w:right w:type="dxa" w:w="100"/>
+            </w:tcMar>
+          </w:tcPr>
+          <w:p>
+            <w:r>
+              <w:rPr>
+                <w:sz w:val="19"/>
+                <w:szCs w:val="19"/>
+              </w:rPr>
+              <w:t xml:space="preserve">Meta, "How Lynkk helps Sam with 1 on 1 meetings" section</w:t>
             </w:r>
           </w:p>
         </w:tc>
@@ -13521,7 +14731,7 @@
         </w:trPr>
         <w:tc>
           <w:tcPr>
-            <w:tcW w:type="dxa" w:w="3360"/>
+            <w:tcW w:type="dxa" w:w="2520"/>
             <w:tcBorders>
               <w:top w:val="single" w:color="C9D3DF" w:sz="4"/>
               <w:left w:val="single" w:color="C9D3DF" w:sz="4"/>
@@ -13547,7 +14757,7 @@
         </w:tc>
         <w:tc>
           <w:tcPr>
-            <w:tcW w:type="dxa" w:w="3360"/>
+            <w:tcW w:type="dxa" w:w="2520"/>
             <w:tcBorders>
               <w:top w:val="single" w:color="C9D3DF" w:sz="4"/>
               <w:left w:val="single" w:color="C9D3DF" w:sz="4"/>
@@ -13573,27 +14783,53 @@
         </w:tc>
         <w:tc>
           <w:tcPr>
-            <w:tcW w:type="dxa" w:w="3360"/>
-            <w:tcBorders>
-              <w:top w:val="single" w:color="C9D3DF" w:sz="4"/>
-              <w:left w:val="single" w:color="C9D3DF" w:sz="4"/>
-              <w:bottom w:val="single" w:color="C9D3DF" w:sz="4"/>
-              <w:right w:val="single" w:color="C9D3DF" w:sz="4"/>
-            </w:tcBorders>
-            <w:tcMar>
-              <w:top w:type="dxa" w:w="60"/>
-              <w:left w:type="dxa" w:w="100"/>
-              <w:bottom w:type="dxa" w:w="60"/>
-              <w:right w:type="dxa" w:w="100"/>
-            </w:tcMar>
-          </w:tcPr>
-          <w:p>
-            <w:r>
-              <w:rPr>
-                <w:sz w:val="19"/>
-                <w:szCs w:val="19"/>
-              </w:rPr>
-              <w:t xml:space="preserve">H1, story</w:t>
+            <w:tcW w:type="dxa" w:w="2520"/>
+            <w:tcBorders>
+              <w:top w:val="single" w:color="C9D3DF" w:sz="4"/>
+              <w:left w:val="single" w:color="C9D3DF" w:sz="4"/>
+              <w:bottom w:val="single" w:color="C9D3DF" w:sz="4"/>
+              <w:right w:val="single" w:color="C9D3DF" w:sz="4"/>
+            </w:tcBorders>
+            <w:tcMar>
+              <w:top w:type="dxa" w:w="60"/>
+              <w:left w:type="dxa" w:w="100"/>
+              <w:bottom w:type="dxa" w:w="60"/>
+              <w:right w:type="dxa" w:w="100"/>
+            </w:tcMar>
+          </w:tcPr>
+          <w:p>
+            <w:r>
+              <w:rPr>
+                <w:sz w:val="19"/>
+                <w:szCs w:val="19"/>
+              </w:rPr>
+              <w:t xml:space="preserve">4</w:t>
+            </w:r>
+          </w:p>
+        </w:tc>
+        <w:tc>
+          <w:tcPr>
+            <w:tcW w:type="dxa" w:w="2520"/>
+            <w:tcBorders>
+              <w:top w:val="single" w:color="C9D3DF" w:sz="4"/>
+              <w:left w:val="single" w:color="C9D3DF" w:sz="4"/>
+              <w:bottom w:val="single" w:color="C9D3DF" w:sz="4"/>
+              <w:right w:val="single" w:color="C9D3DF" w:sz="4"/>
+            </w:tcBorders>
+            <w:tcMar>
+              <w:top w:type="dxa" w:w="60"/>
+              <w:left w:type="dxa" w:w="100"/>
+              <w:bottom w:type="dxa" w:w="60"/>
+              <w:right w:type="dxa" w:w="100"/>
+            </w:tcMar>
+          </w:tcPr>
+          <w:p>
+            <w:r>
+              <w:rPr>
+                <w:sz w:val="19"/>
+                <w:szCs w:val="19"/>
+              </w:rPr>
+              <w:t xml:space="preserve">Title, H1, Intro, "Meet Sam" section, "How Lynkk helps Sam with 1 on 1 meetings" heading</w:t>
             </w:r>
           </w:p>
         </w:tc>
@@ -14033,7 +15269,7 @@
       <w:r>
         <w:t xml:space="preserve">New to 1:1s? Read our guide to the </w:t>
       </w:r>
-      <w:hyperlink w:history="1" r:id="rIdx4bg5ditgrb4g_pnirfkl">
+      <w:hyperlink w:history="1" r:id="rIdflu7czov2nxd0znaa1wkw">
         <w:r>
           <w:rPr>
             <w:rStyle w:val="Hyperlink"/>
@@ -14543,7 +15779,7 @@
       <w:r>
         <w:t xml:space="preserve">1:1 notes are private unless you share them. Your data is encrypted and stays in the region you choose. Lynkk never uses your meetings to train AI. </w:t>
       </w:r>
-      <w:hyperlink w:history="1" r:id="rId7vrmvrqg947ppqwrxacpp">
+      <w:hyperlink w:history="1" r:id="rId0ecdflrhhi3dez0vxxwge">
         <w:r>
           <w:rPr>
             <w:rStyle w:val="Hyperlink"/>
@@ -14765,7 +16001,7 @@
       <w:pPr>
         <w:spacing w:after="140"/>
       </w:pPr>
-      <w:hyperlink w:history="1" r:id="rIdpm48weisv_nifxx-y9oqr">
+      <w:hyperlink w:history="1" r:id="rIdh6xfp7v4nfecha9zqkyth">
         <w:r>
           <w:rPr>
             <w:rStyle w:val="Hyperlink"/>
@@ -14895,7 +16131,7 @@
         <w:spacing w:after="140"/>
       </w:pPr>
       <w:r>
-        <w:t xml:space="preserve">Try Lynkk in your next 1 on 1 meeting. It's free to start.</w:t>
+        <w:t xml:space="preserve">Try Lynkk in your next one on one. It's free to start.</w:t>
       </w:r>
     </w:p>
     <w:p>
@@ -14952,9 +16188,10 @@
         </w:tblBorders>
       </w:tblPr>
       <w:tblGrid>
-        <w:gridCol w:w="3360"/>
-        <w:gridCol w:w="3360"/>
-        <w:gridCol w:w="3360"/>
+        <w:gridCol w:w="2520"/>
+        <w:gridCol w:w="2520"/>
+        <w:gridCol w:w="2520"/>
+        <w:gridCol w:w="2520"/>
       </w:tblGrid>
       <w:tr>
         <w:trPr>
@@ -14962,7 +16199,7 @@
         </w:trPr>
         <w:tc>
           <w:tcPr>
-            <w:tcW w:type="dxa" w:w="3360"/>
+            <w:tcW w:type="dxa" w:w="2520"/>
             <w:tcBorders>
               <w:top w:val="single" w:color="C9D3DF" w:sz="4"/>
               <w:left w:val="single" w:color="C9D3DF" w:sz="4"/>
@@ -14992,7 +16229,7 @@
         </w:tc>
         <w:tc>
           <w:tcPr>
-            <w:tcW w:type="dxa" w:w="3360"/>
+            <w:tcW w:type="dxa" w:w="2520"/>
             <w:tcBorders>
               <w:top w:val="single" w:color="C9D3DF" w:sz="4"/>
               <w:left w:val="single" w:color="C9D3DF" w:sz="4"/>
@@ -15022,7 +16259,37 @@
         </w:tc>
         <w:tc>
           <w:tcPr>
-            <w:tcW w:type="dxa" w:w="3360"/>
+            <w:tcW w:type="dxa" w:w="2520"/>
+            <w:tcBorders>
+              <w:top w:val="single" w:color="C9D3DF" w:sz="4"/>
+              <w:left w:val="single" w:color="C9D3DF" w:sz="4"/>
+              <w:bottom w:val="single" w:color="C9D3DF" w:sz="4"/>
+              <w:right w:val="single" w:color="C9D3DF" w:sz="4"/>
+            </w:tcBorders>
+            <w:shd w:fill="1F3A5F" w:color="auto" w:val="clear"/>
+            <w:tcMar>
+              <w:top w:type="dxa" w:w="60"/>
+              <w:left w:type="dxa" w:w="100"/>
+              <w:bottom w:type="dxa" w:w="60"/>
+              <w:right w:type="dxa" w:w="100"/>
+            </w:tcMar>
+          </w:tcPr>
+          <w:p>
+            <w:r>
+              <w:rPr>
+                <w:b/>
+                <w:bCs/>
+                <w:color w:val="FFFFFF"/>
+                <w:sz w:val="19"/>
+                <w:szCs w:val="19"/>
+              </w:rPr>
+              <w:t xml:space="preserve">Uses on page</w:t>
+            </w:r>
+          </w:p>
+        </w:tc>
+        <w:tc>
+          <w:tcPr>
+            <w:tcW w:type="dxa" w:w="2520"/>
             <w:tcBorders>
               <w:top w:val="single" w:color="C9D3DF" w:sz="4"/>
               <w:left w:val="single" w:color="C9D3DF" w:sz="4"/>
@@ -15057,7 +16324,7 @@
         </w:trPr>
         <w:tc>
           <w:tcPr>
-            <w:tcW w:type="dxa" w:w="3360"/>
+            <w:tcW w:type="dxa" w:w="2520"/>
             <w:tcBorders>
               <w:top w:val="single" w:color="C9D3DF" w:sz="4"/>
               <w:left w:val="single" w:color="C9D3DF" w:sz="4"/>
@@ -15083,7 +16350,7 @@
         </w:tc>
         <w:tc>
           <w:tcPr>
-            <w:tcW w:type="dxa" w:w="3360"/>
+            <w:tcW w:type="dxa" w:w="2520"/>
             <w:tcBorders>
               <w:top w:val="single" w:color="C9D3DF" w:sz="4"/>
               <w:left w:val="single" w:color="C9D3DF" w:sz="4"/>
@@ -15109,27 +16376,53 @@
         </w:tc>
         <w:tc>
           <w:tcPr>
-            <w:tcW w:type="dxa" w:w="3360"/>
-            <w:tcBorders>
-              <w:top w:val="single" w:color="C9D3DF" w:sz="4"/>
-              <w:left w:val="single" w:color="C9D3DF" w:sz="4"/>
-              <w:bottom w:val="single" w:color="C9D3DF" w:sz="4"/>
-              <w:right w:val="single" w:color="C9D3DF" w:sz="4"/>
-            </w:tcBorders>
-            <w:tcMar>
-              <w:top w:type="dxa" w:w="60"/>
-              <w:left w:type="dxa" w:w="100"/>
-              <w:bottom w:type="dxa" w:w="60"/>
-              <w:right w:type="dxa" w:w="100"/>
-            </w:tcMar>
-          </w:tcPr>
-          <w:p>
-            <w:r>
-              <w:rPr>
-                <w:sz w:val="19"/>
-                <w:szCs w:val="19"/>
-              </w:rPr>
-              <w:t xml:space="preserve">Title, H1, "So, what is Lynkk?"</w:t>
+            <w:tcW w:type="dxa" w:w="2520"/>
+            <w:tcBorders>
+              <w:top w:val="single" w:color="C9D3DF" w:sz="4"/>
+              <w:left w:val="single" w:color="C9D3DF" w:sz="4"/>
+              <w:bottom w:val="single" w:color="C9D3DF" w:sz="4"/>
+              <w:right w:val="single" w:color="C9D3DF" w:sz="4"/>
+            </w:tcBorders>
+            <w:tcMar>
+              <w:top w:type="dxa" w:w="60"/>
+              <w:left w:type="dxa" w:w="100"/>
+              <w:bottom w:type="dxa" w:w="60"/>
+              <w:right w:type="dxa" w:w="100"/>
+            </w:tcMar>
+          </w:tcPr>
+          <w:p>
+            <w:r>
+              <w:rPr>
+                <w:sz w:val="19"/>
+                <w:szCs w:val="19"/>
+              </w:rPr>
+              <w:t xml:space="preserve">2</w:t>
+            </w:r>
+          </w:p>
+        </w:tc>
+        <w:tc>
+          <w:tcPr>
+            <w:tcW w:type="dxa" w:w="2520"/>
+            <w:tcBorders>
+              <w:top w:val="single" w:color="C9D3DF" w:sz="4"/>
+              <w:left w:val="single" w:color="C9D3DF" w:sz="4"/>
+              <w:bottom w:val="single" w:color="C9D3DF" w:sz="4"/>
+              <w:right w:val="single" w:color="C9D3DF" w:sz="4"/>
+            </w:tcBorders>
+            <w:tcMar>
+              <w:top w:type="dxa" w:w="60"/>
+              <w:left w:type="dxa" w:w="100"/>
+              <w:bottom w:type="dxa" w:w="60"/>
+              <w:right w:type="dxa" w:w="100"/>
+            </w:tcMar>
+          </w:tcPr>
+          <w:p>
+            <w:r>
+              <w:rPr>
+                <w:sz w:val="19"/>
+                <w:szCs w:val="19"/>
+              </w:rPr>
+              <w:t xml:space="preserve">Title, H1, "So, what is Lynkk?" section</w:t>
             </w:r>
           </w:p>
         </w:tc>
@@ -15140,7 +16433,7 @@
         </w:trPr>
         <w:tc>
           <w:tcPr>
-            <w:tcW w:type="dxa" w:w="3360"/>
+            <w:tcW w:type="dxa" w:w="2520"/>
             <w:tcBorders>
               <w:top w:val="single" w:color="C9D3DF" w:sz="4"/>
               <w:left w:val="single" w:color="C9D3DF" w:sz="4"/>
@@ -15166,7 +16459,7 @@
         </w:tc>
         <w:tc>
           <w:tcPr>
-            <w:tcW w:type="dxa" w:w="3360"/>
+            <w:tcW w:type="dxa" w:w="2520"/>
             <w:tcBorders>
               <w:top w:val="single" w:color="C9D3DF" w:sz="4"/>
               <w:left w:val="single" w:color="C9D3DF" w:sz="4"/>
@@ -15192,27 +16485,53 @@
         </w:tc>
         <w:tc>
           <w:tcPr>
-            <w:tcW w:type="dxa" w:w="3360"/>
-            <w:tcBorders>
-              <w:top w:val="single" w:color="C9D3DF" w:sz="4"/>
-              <w:left w:val="single" w:color="C9D3DF" w:sz="4"/>
-              <w:bottom w:val="single" w:color="C9D3DF" w:sz="4"/>
-              <w:right w:val="single" w:color="C9D3DF" w:sz="4"/>
-            </w:tcBorders>
-            <w:tcMar>
-              <w:top w:type="dxa" w:w="60"/>
-              <w:left w:type="dxa" w:w="100"/>
-              <w:bottom w:type="dxa" w:w="60"/>
-              <w:right w:type="dxa" w:w="100"/>
-            </w:tcMar>
-          </w:tcPr>
-          <w:p>
-            <w:r>
-              <w:rPr>
-                <w:sz w:val="19"/>
-                <w:szCs w:val="19"/>
-              </w:rPr>
-              <w:t xml:space="preserve">"What else can Lynkk do?" heading area, FAQ</w:t>
+            <w:tcW w:type="dxa" w:w="2520"/>
+            <w:tcBorders>
+              <w:top w:val="single" w:color="C9D3DF" w:sz="4"/>
+              <w:left w:val="single" w:color="C9D3DF" w:sz="4"/>
+              <w:bottom w:val="single" w:color="C9D3DF" w:sz="4"/>
+              <w:right w:val="single" w:color="C9D3DF" w:sz="4"/>
+            </w:tcBorders>
+            <w:tcMar>
+              <w:top w:type="dxa" w:w="60"/>
+              <w:left w:type="dxa" w:w="100"/>
+              <w:bottom w:type="dxa" w:w="60"/>
+              <w:right w:type="dxa" w:w="100"/>
+            </w:tcMar>
+          </w:tcPr>
+          <w:p>
+            <w:r>
+              <w:rPr>
+                <w:sz w:val="19"/>
+                <w:szCs w:val="19"/>
+              </w:rPr>
+              <w:t xml:space="preserve">1</w:t>
+            </w:r>
+          </w:p>
+        </w:tc>
+        <w:tc>
+          <w:tcPr>
+            <w:tcW w:type="dxa" w:w="2520"/>
+            <w:tcBorders>
+              <w:top w:val="single" w:color="C9D3DF" w:sz="4"/>
+              <w:left w:val="single" w:color="C9D3DF" w:sz="4"/>
+              <w:bottom w:val="single" w:color="C9D3DF" w:sz="4"/>
+              <w:right w:val="single" w:color="C9D3DF" w:sz="4"/>
+            </w:tcBorders>
+            <w:tcMar>
+              <w:top w:type="dxa" w:w="60"/>
+              <w:left w:type="dxa" w:w="100"/>
+              <w:bottom w:type="dxa" w:w="60"/>
+              <w:right w:type="dxa" w:w="100"/>
+            </w:tcMar>
+          </w:tcPr>
+          <w:p>
+            <w:r>
+              <w:rPr>
+                <w:sz w:val="19"/>
+                <w:szCs w:val="19"/>
+              </w:rPr>
+              <w:t xml:space="preserve">"What else can Lynkk do?" section</w:t>
             </w:r>
           </w:p>
         </w:tc>
@@ -15223,7 +16542,7 @@
         </w:trPr>
         <w:tc>
           <w:tcPr>
-            <w:tcW w:type="dxa" w:w="3360"/>
+            <w:tcW w:type="dxa" w:w="2520"/>
             <w:tcBorders>
               <w:top w:val="single" w:color="C9D3DF" w:sz="4"/>
               <w:left w:val="single" w:color="C9D3DF" w:sz="4"/>
@@ -15249,7 +16568,7 @@
         </w:tc>
         <w:tc>
           <w:tcPr>
-            <w:tcW w:type="dxa" w:w="3360"/>
+            <w:tcW w:type="dxa" w:w="2520"/>
             <w:tcBorders>
               <w:top w:val="single" w:color="C9D3DF" w:sz="4"/>
               <w:left w:val="single" w:color="C9D3DF" w:sz="4"/>
@@ -15275,27 +16594,53 @@
         </w:tc>
         <w:tc>
           <w:tcPr>
-            <w:tcW w:type="dxa" w:w="3360"/>
-            <w:tcBorders>
-              <w:top w:val="single" w:color="C9D3DF" w:sz="4"/>
-              <w:left w:val="single" w:color="C9D3DF" w:sz="4"/>
-              <w:bottom w:val="single" w:color="C9D3DF" w:sz="4"/>
-              <w:right w:val="single" w:color="C9D3DF" w:sz="4"/>
-            </w:tcBorders>
-            <w:tcMar>
-              <w:top w:type="dxa" w:w="60"/>
-              <w:left w:type="dxa" w:w="100"/>
-              <w:bottom w:type="dxa" w:w="60"/>
-              <w:right w:type="dxa" w:w="100"/>
-            </w:tcMar>
-          </w:tcPr>
-          <w:p>
-            <w:r>
-              <w:rPr>
-                <w:sz w:val="19"/>
-                <w:szCs w:val="19"/>
-              </w:rPr>
-              <w:t xml:space="preserve">Meta description, FAQ</w:t>
+            <w:tcW w:type="dxa" w:w="2520"/>
+            <w:tcBorders>
+              <w:top w:val="single" w:color="C9D3DF" w:sz="4"/>
+              <w:left w:val="single" w:color="C9D3DF" w:sz="4"/>
+              <w:bottom w:val="single" w:color="C9D3DF" w:sz="4"/>
+              <w:right w:val="single" w:color="C9D3DF" w:sz="4"/>
+            </w:tcBorders>
+            <w:tcMar>
+              <w:top w:type="dxa" w:w="60"/>
+              <w:left w:type="dxa" w:w="100"/>
+              <w:bottom w:type="dxa" w:w="60"/>
+              <w:right w:type="dxa" w:w="100"/>
+            </w:tcMar>
+          </w:tcPr>
+          <w:p>
+            <w:r>
+              <w:rPr>
+                <w:sz w:val="19"/>
+                <w:szCs w:val="19"/>
+              </w:rPr>
+              <w:t xml:space="preserve">1</w:t>
+            </w:r>
+          </w:p>
+        </w:tc>
+        <w:tc>
+          <w:tcPr>
+            <w:tcW w:type="dxa" w:w="2520"/>
+            <w:tcBorders>
+              <w:top w:val="single" w:color="C9D3DF" w:sz="4"/>
+              <w:left w:val="single" w:color="C9D3DF" w:sz="4"/>
+              <w:bottom w:val="single" w:color="C9D3DF" w:sz="4"/>
+              <w:right w:val="single" w:color="C9D3DF" w:sz="4"/>
+            </w:tcBorders>
+            <w:tcMar>
+              <w:top w:type="dxa" w:w="60"/>
+              <w:left w:type="dxa" w:w="100"/>
+              <w:bottom w:type="dxa" w:w="60"/>
+              <w:right w:type="dxa" w:w="100"/>
+            </w:tcMar>
+          </w:tcPr>
+          <w:p>
+            <w:r>
+              <w:rPr>
+                <w:sz w:val="19"/>
+                <w:szCs w:val="19"/>
+              </w:rPr>
+              <w:t xml:space="preserve">Meta, "Questions people ask" section</w:t>
             </w:r>
           </w:p>
         </w:tc>
@@ -16133,7 +17478,7 @@
         <w:spacing w:after="140"/>
       </w:pPr>
       <w:r>
-        <w:t xml:space="preserve">Lynkk is a simple AI tool for real estate agents. It also helps you:</w:t>
+        <w:t xml:space="preserve">Looking for simple AI tools for real estate agents? Lynkk also helps you:</w:t>
       </w:r>
     </w:p>
     <w:p>
@@ -16227,7 +17572,7 @@
       <w:r>
         <w:t xml:space="preserve">Notes are private unless you share them. Your data is encrypted and stays in the region you choose. Lynkk never uses your calls to train AI. </w:t>
       </w:r>
-      <w:hyperlink w:history="1" r:id="rIdhnfa_cctldmvily4ox3z5">
+      <w:hyperlink w:history="1" r:id="rIdlimnsrms2lxboao9jj63c">
         <w:r>
           <w:rPr>
             <w:rStyle w:val="Hyperlink"/>
@@ -16449,7 +17794,7 @@
       <w:pPr>
         <w:spacing w:after="140"/>
       </w:pPr>
-      <w:hyperlink w:history="1" r:id="rIdnbqfl28e7dikdwpgynp2j">
+      <w:hyperlink w:history="1" r:id="rIdw9dyriysfecorskkidinm">
         <w:r>
           <w:rPr>
             <w:rStyle w:val="Hyperlink"/>
@@ -16636,9 +17981,10 @@
         </w:tblBorders>
       </w:tblPr>
       <w:tblGrid>
-        <w:gridCol w:w="3360"/>
-        <w:gridCol w:w="3360"/>
-        <w:gridCol w:w="3360"/>
+        <w:gridCol w:w="2520"/>
+        <w:gridCol w:w="2520"/>
+        <w:gridCol w:w="2520"/>
+        <w:gridCol w:w="2520"/>
       </w:tblGrid>
       <w:tr>
         <w:trPr>
@@ -16646,7 +17992,7 @@
         </w:trPr>
         <w:tc>
           <w:tcPr>
-            <w:tcW w:type="dxa" w:w="3360"/>
+            <w:tcW w:type="dxa" w:w="2520"/>
             <w:tcBorders>
               <w:top w:val="single" w:color="C9D3DF" w:sz="4"/>
               <w:left w:val="single" w:color="C9D3DF" w:sz="4"/>
@@ -16676,7 +18022,7 @@
         </w:tc>
         <w:tc>
           <w:tcPr>
-            <w:tcW w:type="dxa" w:w="3360"/>
+            <w:tcW w:type="dxa" w:w="2520"/>
             <w:tcBorders>
               <w:top w:val="single" w:color="C9D3DF" w:sz="4"/>
               <w:left w:val="single" w:color="C9D3DF" w:sz="4"/>
@@ -16706,7 +18052,37 @@
         </w:tc>
         <w:tc>
           <w:tcPr>
-            <w:tcW w:type="dxa" w:w="3360"/>
+            <w:tcW w:type="dxa" w:w="2520"/>
+            <w:tcBorders>
+              <w:top w:val="single" w:color="C9D3DF" w:sz="4"/>
+              <w:left w:val="single" w:color="C9D3DF" w:sz="4"/>
+              <w:bottom w:val="single" w:color="C9D3DF" w:sz="4"/>
+              <w:right w:val="single" w:color="C9D3DF" w:sz="4"/>
+            </w:tcBorders>
+            <w:shd w:fill="1F3A5F" w:color="auto" w:val="clear"/>
+            <w:tcMar>
+              <w:top w:type="dxa" w:w="60"/>
+              <w:left w:type="dxa" w:w="100"/>
+              <w:bottom w:type="dxa" w:w="60"/>
+              <w:right w:type="dxa" w:w="100"/>
+            </w:tcMar>
+          </w:tcPr>
+          <w:p>
+            <w:r>
+              <w:rPr>
+                <w:b/>
+                <w:bCs/>
+                <w:color w:val="FFFFFF"/>
+                <w:sz w:val="19"/>
+                <w:szCs w:val="19"/>
+              </w:rPr>
+              <w:t xml:space="preserve">Uses on page</w:t>
+            </w:r>
+          </w:p>
+        </w:tc>
+        <w:tc>
+          <w:tcPr>
+            <w:tcW w:type="dxa" w:w="2520"/>
             <w:tcBorders>
               <w:top w:val="single" w:color="C9D3DF" w:sz="4"/>
               <w:left w:val="single" w:color="C9D3DF" w:sz="4"/>
@@ -16741,7 +18117,7 @@
         </w:trPr>
         <w:tc>
           <w:tcPr>
-            <w:tcW w:type="dxa" w:w="3360"/>
+            <w:tcW w:type="dxa" w:w="2520"/>
             <w:tcBorders>
               <w:top w:val="single" w:color="C9D3DF" w:sz="4"/>
               <w:left w:val="single" w:color="C9D3DF" w:sz="4"/>
@@ -16767,7 +18143,7 @@
         </w:tc>
         <w:tc>
           <w:tcPr>
-            <w:tcW w:type="dxa" w:w="3360"/>
+            <w:tcW w:type="dxa" w:w="2520"/>
             <w:tcBorders>
               <w:top w:val="single" w:color="C9D3DF" w:sz="4"/>
               <w:left w:val="single" w:color="C9D3DF" w:sz="4"/>
@@ -16793,27 +18169,53 @@
         </w:tc>
         <w:tc>
           <w:tcPr>
-            <w:tcW w:type="dxa" w:w="3360"/>
-            <w:tcBorders>
-              <w:top w:val="single" w:color="C9D3DF" w:sz="4"/>
-              <w:left w:val="single" w:color="C9D3DF" w:sz="4"/>
-              <w:bottom w:val="single" w:color="C9D3DF" w:sz="4"/>
-              <w:right w:val="single" w:color="C9D3DF" w:sz="4"/>
-            </w:tcBorders>
-            <w:tcMar>
-              <w:top w:type="dxa" w:w="60"/>
-              <w:left w:type="dxa" w:w="100"/>
-              <w:bottom w:type="dxa" w:w="60"/>
-              <w:right w:type="dxa" w:w="100"/>
-            </w:tcMar>
-          </w:tcPr>
-          <w:p>
-            <w:r>
-              <w:rPr>
-                <w:sz w:val="19"/>
-                <w:szCs w:val="19"/>
-              </w:rPr>
-              <w:t xml:space="preserve">Title, H1, "So, what is Lynkk?"</w:t>
+            <w:tcW w:type="dxa" w:w="2520"/>
+            <w:tcBorders>
+              <w:top w:val="single" w:color="C9D3DF" w:sz="4"/>
+              <w:left w:val="single" w:color="C9D3DF" w:sz="4"/>
+              <w:bottom w:val="single" w:color="C9D3DF" w:sz="4"/>
+              <w:right w:val="single" w:color="C9D3DF" w:sz="4"/>
+            </w:tcBorders>
+            <w:tcMar>
+              <w:top w:type="dxa" w:w="60"/>
+              <w:left w:type="dxa" w:w="100"/>
+              <w:bottom w:type="dxa" w:w="60"/>
+              <w:right w:type="dxa" w:w="100"/>
+            </w:tcMar>
+          </w:tcPr>
+          <w:p>
+            <w:r>
+              <w:rPr>
+                <w:sz w:val="19"/>
+                <w:szCs w:val="19"/>
+              </w:rPr>
+              <w:t xml:space="preserve">2</w:t>
+            </w:r>
+          </w:p>
+        </w:tc>
+        <w:tc>
+          <w:tcPr>
+            <w:tcW w:type="dxa" w:w="2520"/>
+            <w:tcBorders>
+              <w:top w:val="single" w:color="C9D3DF" w:sz="4"/>
+              <w:left w:val="single" w:color="C9D3DF" w:sz="4"/>
+              <w:bottom w:val="single" w:color="C9D3DF" w:sz="4"/>
+              <w:right w:val="single" w:color="C9D3DF" w:sz="4"/>
+            </w:tcBorders>
+            <w:tcMar>
+              <w:top w:type="dxa" w:w="60"/>
+              <w:left w:type="dxa" w:w="100"/>
+              <w:bottom w:type="dxa" w:w="60"/>
+              <w:right w:type="dxa" w:w="100"/>
+            </w:tcMar>
+          </w:tcPr>
+          <w:p>
+            <w:r>
+              <w:rPr>
+                <w:sz w:val="19"/>
+                <w:szCs w:val="19"/>
+              </w:rPr>
+              <w:t xml:space="preserve">Title, H1, "Questions people ask" section</w:t>
             </w:r>
           </w:p>
         </w:tc>
@@ -16824,7 +18226,7 @@
         </w:trPr>
         <w:tc>
           <w:tcPr>
-            <w:tcW w:type="dxa" w:w="3360"/>
+            <w:tcW w:type="dxa" w:w="2520"/>
             <w:tcBorders>
               <w:top w:val="single" w:color="C9D3DF" w:sz="4"/>
               <w:left w:val="single" w:color="C9D3DF" w:sz="4"/>
@@ -16850,7 +18252,7 @@
         </w:tc>
         <w:tc>
           <w:tcPr>
-            <w:tcW w:type="dxa" w:w="3360"/>
+            <w:tcW w:type="dxa" w:w="2520"/>
             <w:tcBorders>
               <w:top w:val="single" w:color="C9D3DF" w:sz="4"/>
               <w:left w:val="single" w:color="C9D3DF" w:sz="4"/>
@@ -16876,27 +18278,53 @@
         </w:tc>
         <w:tc>
           <w:tcPr>
-            <w:tcW w:type="dxa" w:w="3360"/>
-            <w:tcBorders>
-              <w:top w:val="single" w:color="C9D3DF" w:sz="4"/>
-              <w:left w:val="single" w:color="C9D3DF" w:sz="4"/>
-              <w:bottom w:val="single" w:color="C9D3DF" w:sz="4"/>
-              <w:right w:val="single" w:color="C9D3DF" w:sz="4"/>
-            </w:tcBorders>
-            <w:tcMar>
-              <w:top w:type="dxa" w:w="60"/>
-              <w:left w:type="dxa" w:w="100"/>
-              <w:bottom w:type="dxa" w:w="60"/>
-              <w:right w:type="dxa" w:w="100"/>
-            </w:tcMar>
-          </w:tcPr>
-          <w:p>
-            <w:r>
-              <w:rPr>
-                <w:sz w:val="19"/>
-                <w:szCs w:val="19"/>
-              </w:rPr>
-              <w:t xml:space="preserve">"What else can Lynkk do?"</w:t>
+            <w:tcW w:type="dxa" w:w="2520"/>
+            <w:tcBorders>
+              <w:top w:val="single" w:color="C9D3DF" w:sz="4"/>
+              <w:left w:val="single" w:color="C9D3DF" w:sz="4"/>
+              <w:bottom w:val="single" w:color="C9D3DF" w:sz="4"/>
+              <w:right w:val="single" w:color="C9D3DF" w:sz="4"/>
+            </w:tcBorders>
+            <w:tcMar>
+              <w:top w:type="dxa" w:w="60"/>
+              <w:left w:type="dxa" w:w="100"/>
+              <w:bottom w:type="dxa" w:w="60"/>
+              <w:right w:type="dxa" w:w="100"/>
+            </w:tcMar>
+          </w:tcPr>
+          <w:p>
+            <w:r>
+              <w:rPr>
+                <w:sz w:val="19"/>
+                <w:szCs w:val="19"/>
+              </w:rPr>
+              <w:t xml:space="preserve">1</w:t>
+            </w:r>
+          </w:p>
+        </w:tc>
+        <w:tc>
+          <w:tcPr>
+            <w:tcW w:type="dxa" w:w="2520"/>
+            <w:tcBorders>
+              <w:top w:val="single" w:color="C9D3DF" w:sz="4"/>
+              <w:left w:val="single" w:color="C9D3DF" w:sz="4"/>
+              <w:bottom w:val="single" w:color="C9D3DF" w:sz="4"/>
+              <w:right w:val="single" w:color="C9D3DF" w:sz="4"/>
+            </w:tcBorders>
+            <w:tcMar>
+              <w:top w:type="dxa" w:w="60"/>
+              <w:left w:type="dxa" w:w="100"/>
+              <w:bottom w:type="dxa" w:w="60"/>
+              <w:right w:type="dxa" w:w="100"/>
+            </w:tcMar>
+          </w:tcPr>
+          <w:p>
+            <w:r>
+              <w:rPr>
+                <w:sz w:val="19"/>
+                <w:szCs w:val="19"/>
+              </w:rPr>
+              <w:t xml:space="preserve">"What else can Lynkk do?" section</w:t>
             </w:r>
           </w:p>
         </w:tc>
@@ -16907,7 +18335,7 @@
         </w:trPr>
         <w:tc>
           <w:tcPr>
-            <w:tcW w:type="dxa" w:w="3360"/>
+            <w:tcW w:type="dxa" w:w="2520"/>
             <w:tcBorders>
               <w:top w:val="single" w:color="C9D3DF" w:sz="4"/>
               <w:left w:val="single" w:color="C9D3DF" w:sz="4"/>
@@ -16933,7 +18361,7 @@
         </w:tc>
         <w:tc>
           <w:tcPr>
-            <w:tcW w:type="dxa" w:w="3360"/>
+            <w:tcW w:type="dxa" w:w="2520"/>
             <w:tcBorders>
               <w:top w:val="single" w:color="C9D3DF" w:sz="4"/>
               <w:left w:val="single" w:color="C9D3DF" w:sz="4"/>
@@ -16959,27 +18387,53 @@
         </w:tc>
         <w:tc>
           <w:tcPr>
-            <w:tcW w:type="dxa" w:w="3360"/>
-            <w:tcBorders>
-              <w:top w:val="single" w:color="C9D3DF" w:sz="4"/>
-              <w:left w:val="single" w:color="C9D3DF" w:sz="4"/>
-              <w:bottom w:val="single" w:color="C9D3DF" w:sz="4"/>
-              <w:right w:val="single" w:color="C9D3DF" w:sz="4"/>
-            </w:tcBorders>
-            <w:tcMar>
-              <w:top w:type="dxa" w:w="60"/>
-              <w:left w:type="dxa" w:w="100"/>
-              <w:bottom w:type="dxa" w:w="60"/>
-              <w:right w:type="dxa" w:w="100"/>
-            </w:tcMar>
-          </w:tcPr>
-          <w:p>
-            <w:r>
-              <w:rPr>
-                <w:sz w:val="19"/>
-                <w:szCs w:val="19"/>
-              </w:rPr>
-              <w:t xml:space="preserve">FAQ</w:t>
+            <w:tcW w:type="dxa" w:w="2520"/>
+            <w:tcBorders>
+              <w:top w:val="single" w:color="C9D3DF" w:sz="4"/>
+              <w:left w:val="single" w:color="C9D3DF" w:sz="4"/>
+              <w:bottom w:val="single" w:color="C9D3DF" w:sz="4"/>
+              <w:right w:val="single" w:color="C9D3DF" w:sz="4"/>
+            </w:tcBorders>
+            <w:tcMar>
+              <w:top w:type="dxa" w:w="60"/>
+              <w:left w:type="dxa" w:w="100"/>
+              <w:bottom w:type="dxa" w:w="60"/>
+              <w:right w:type="dxa" w:w="100"/>
+            </w:tcMar>
+          </w:tcPr>
+          <w:p>
+            <w:r>
+              <w:rPr>
+                <w:sz w:val="19"/>
+                <w:szCs w:val="19"/>
+              </w:rPr>
+              <w:t xml:space="preserve">1</w:t>
+            </w:r>
+          </w:p>
+        </w:tc>
+        <w:tc>
+          <w:tcPr>
+            <w:tcW w:type="dxa" w:w="2520"/>
+            <w:tcBorders>
+              <w:top w:val="single" w:color="C9D3DF" w:sz="4"/>
+              <w:left w:val="single" w:color="C9D3DF" w:sz="4"/>
+              <w:bottom w:val="single" w:color="C9D3DF" w:sz="4"/>
+              <w:right w:val="single" w:color="C9D3DF" w:sz="4"/>
+            </w:tcBorders>
+            <w:tcMar>
+              <w:top w:type="dxa" w:w="60"/>
+              <w:left w:type="dxa" w:w="100"/>
+              <w:bottom w:type="dxa" w:w="60"/>
+              <w:right w:type="dxa" w:w="100"/>
+            </w:tcMar>
+          </w:tcPr>
+          <w:p>
+            <w:r>
+              <w:rPr>
+                <w:sz w:val="19"/>
+                <w:szCs w:val="19"/>
+              </w:rPr>
+              <w:t xml:space="preserve">"Questions people ask" section</w:t>
             </w:r>
           </w:p>
         </w:tc>
@@ -16990,7 +18444,7 @@
         </w:trPr>
         <w:tc>
           <w:tcPr>
-            <w:tcW w:type="dxa" w:w="3360"/>
+            <w:tcW w:type="dxa" w:w="2520"/>
             <w:tcBorders>
               <w:top w:val="single" w:color="C9D3DF" w:sz="4"/>
               <w:left w:val="single" w:color="C9D3DF" w:sz="4"/>
@@ -17016,7 +18470,7 @@
         </w:tc>
         <w:tc>
           <w:tcPr>
-            <w:tcW w:type="dxa" w:w="3360"/>
+            <w:tcW w:type="dxa" w:w="2520"/>
             <w:tcBorders>
               <w:top w:val="single" w:color="C9D3DF" w:sz="4"/>
               <w:left w:val="single" w:color="C9D3DF" w:sz="4"/>
@@ -17042,27 +18496,53 @@
         </w:tc>
         <w:tc>
           <w:tcPr>
-            <w:tcW w:type="dxa" w:w="3360"/>
-            <w:tcBorders>
-              <w:top w:val="single" w:color="C9D3DF" w:sz="4"/>
-              <w:left w:val="single" w:color="C9D3DF" w:sz="4"/>
-              <w:bottom w:val="single" w:color="C9D3DF" w:sz="4"/>
-              <w:right w:val="single" w:color="C9D3DF" w:sz="4"/>
-            </w:tcBorders>
-            <w:tcMar>
-              <w:top w:type="dxa" w:w="60"/>
-              <w:left w:type="dxa" w:w="100"/>
-              <w:bottom w:type="dxa" w:w="60"/>
-              <w:right w:type="dxa" w:w="100"/>
-            </w:tcMar>
-          </w:tcPr>
-          <w:p>
-            <w:r>
-              <w:rPr>
-                <w:sz w:val="19"/>
-                <w:szCs w:val="19"/>
-              </w:rPr>
-              <w:t xml:space="preserve">Meta description</w:t>
+            <w:tcW w:type="dxa" w:w="2520"/>
+            <w:tcBorders>
+              <w:top w:val="single" w:color="C9D3DF" w:sz="4"/>
+              <w:left w:val="single" w:color="C9D3DF" w:sz="4"/>
+              <w:bottom w:val="single" w:color="C9D3DF" w:sz="4"/>
+              <w:right w:val="single" w:color="C9D3DF" w:sz="4"/>
+            </w:tcBorders>
+            <w:tcMar>
+              <w:top w:type="dxa" w:w="60"/>
+              <w:left w:type="dxa" w:w="100"/>
+              <w:bottom w:type="dxa" w:w="60"/>
+              <w:right w:type="dxa" w:w="100"/>
+            </w:tcMar>
+          </w:tcPr>
+          <w:p>
+            <w:r>
+              <w:rPr>
+                <w:sz w:val="19"/>
+                <w:szCs w:val="19"/>
+              </w:rPr>
+              <w:t xml:space="preserve">1</w:t>
+            </w:r>
+          </w:p>
+        </w:tc>
+        <w:tc>
+          <w:tcPr>
+            <w:tcW w:type="dxa" w:w="2520"/>
+            <w:tcBorders>
+              <w:top w:val="single" w:color="C9D3DF" w:sz="4"/>
+              <w:left w:val="single" w:color="C9D3DF" w:sz="4"/>
+              <w:bottom w:val="single" w:color="C9D3DF" w:sz="4"/>
+              <w:right w:val="single" w:color="C9D3DF" w:sz="4"/>
+            </w:tcBorders>
+            <w:tcMar>
+              <w:top w:type="dxa" w:w="60"/>
+              <w:left w:type="dxa" w:w="100"/>
+              <w:bottom w:type="dxa" w:w="60"/>
+              <w:right w:type="dxa" w:w="100"/>
+            </w:tcMar>
+          </w:tcPr>
+          <w:p>
+            <w:r>
+              <w:rPr>
+                <w:sz w:val="19"/>
+                <w:szCs w:val="19"/>
+              </w:rPr>
+              <w:t xml:space="preserve">Meta, "So, what is Lynkk?" section</w:t>
             </w:r>
           </w:p>
         </w:tc>
@@ -17501,7 +18981,7 @@
         <w:spacing w:after="140"/>
       </w:pPr>
       <w:r>
-        <w:t xml:space="preserve">Lynkk is AI for financial advisors that writes your client meeting notes. It records the meeting, writes down what matters, and keeps it private.</w:t>
+        <w:t xml:space="preserve">Lynkk is an AI note taker for financial advisors. It records your client meetings, writes down what matters, and keeps it private.</w:t>
       </w:r>
     </w:p>
     <w:p>
@@ -17900,7 +19380,7 @@
         <w:spacing w:after="140"/>
       </w:pPr>
       <w:r>
-        <w:t xml:space="preserve">Lynkk is a simple AI tool for financial advisors. It also lets you:</w:t>
+        <w:t xml:space="preserve">Looking for simple AI tools for financial advisors? Lynkk also lets you:</w:t>
       </w:r>
     </w:p>
     <w:p>
@@ -17994,7 +19474,7 @@
       <w:r>
         <w:t xml:space="preserve">Notes are private unless you share them. Your data is encrypted. Lynkk never uses your meetings to train AI. </w:t>
       </w:r>
-      <w:hyperlink w:history="1" r:id="rId6s1agxa5u3fvdrqx9hhem">
+      <w:hyperlink w:history="1" r:id="rId55eookxspqnkmvsdt3bel">
         <w:r>
           <w:rPr>
             <w:rStyle w:val="Hyperlink"/>
@@ -18216,7 +19696,7 @@
       <w:pPr>
         <w:spacing w:after="140"/>
       </w:pPr>
-      <w:hyperlink w:history="1" r:id="rIdikjhlmucpvuzv9qogvef4">
+      <w:hyperlink w:history="1" r:id="rIdlbavpagedkgohqd6wlbrp">
         <w:r>
           <w:rPr>
             <w:rStyle w:val="Hyperlink"/>

</xml_diff>

<commit_message>
Weave keywords into the storylines and add storyline section to keyword report
Co-Authored-By: Claude Opus 5.5 <noreply@anthropic.com>
Claude-Session: https://claude.ai/code/session_01Xs6uEGTRa4UggVmKjUH61X
</commit_message>
<xml_diff>
--- a/content/use-cases/story-drafts/Lynkk-Use-Case-Stories.docx
+++ b/content/use-cases/story-drafts/Lynkk-Use-Case-Stories.docx
@@ -2033,7 +2033,7 @@
       <w:r>
         <w:t xml:space="preserve">Your notes are private unless you share them. Your data is encrypted and stays in the region you choose. Lynkk never uses your calls to train AI. </w:t>
       </w:r>
-      <w:hyperlink w:history="1" r:id="rIddfmgmsdyzlamcaufh__rw">
+      <w:hyperlink w:history="1" r:id="rIdqba9wwrxsby5qbn-ae6fa">
         <w:r>
           <w:rPr>
             <w:rStyle w:val="Hyperlink"/>
@@ -2255,7 +2255,7 @@
       <w:pPr>
         <w:spacing w:after="140"/>
       </w:pPr>
-      <w:hyperlink w:history="1" r:id="rIdnkhyj4a0ytxk0cxcspwol">
+      <w:hyperlink w:history="1" r:id="rId0_g7-_mzqn5nfhwbdzjik">
         <w:r>
           <w:rPr>
             <w:rStyle w:val="Hyperlink"/>
@@ -4196,7 +4196,7 @@
       <w:r>
         <w:t xml:space="preserve">Your notes are private unless you share them. Your data is encrypted and stays in the region you choose. Lynkk never uses your recordings to train AI. </w:t>
       </w:r>
-      <w:hyperlink w:history="1" r:id="rIdcmepe78jat1ccy_lvfalv">
+      <w:hyperlink w:history="1" r:id="rIdq4nwwqlqwf9ewiu7bbvs8">
         <w:r>
           <w:rPr>
             <w:rStyle w:val="Hyperlink"/>
@@ -4418,7 +4418,7 @@
       <w:pPr>
         <w:spacing w:after="140"/>
       </w:pPr>
-      <w:hyperlink w:history="1" r:id="rIdf8lu1ioorozq0g3gmntm4">
+      <w:hyperlink w:history="1" r:id="rIdjctnzig9jcqlouhqby-mo">
         <w:r>
           <w:rPr>
             <w:rStyle w:val="Hyperlink"/>
@@ -5723,7 +5723,7 @@
       <w:r>
         <w:t xml:space="preserve">New to standups? Read our guide to the </w:t>
       </w:r>
-      <w:hyperlink w:history="1" r:id="rIdacg_-ehtzpn-t3mgopbcu">
+      <w:hyperlink w:history="1" r:id="rIdi2o0dvet43nv_stzo-vat">
         <w:r>
           <w:rPr>
             <w:rStyle w:val="Hyperlink"/>
@@ -6233,7 +6233,7 @@
       <w:r>
         <w:t xml:space="preserve">Notes are private unless you share them. Your data is encrypted and stays in the region you choose. Lynkk never uses your meetings to train AI. </w:t>
       </w:r>
-      <w:hyperlink w:history="1" r:id="rIdrjdf7egp9klyetmlo5pyo">
+      <w:hyperlink w:history="1" r:id="rIdfw6i3vukzsv5ex-b_yyjh">
         <w:r>
           <w:rPr>
             <w:rStyle w:val="Hyperlink"/>
@@ -6455,7 +6455,7 @@
       <w:pPr>
         <w:spacing w:after="140"/>
       </w:pPr>
-      <w:hyperlink w:history="1" r:id="rId333tgasfbnrn7mosphlz-">
+      <w:hyperlink w:history="1" r:id="rIdcbxt4hc2n2zsvzgsquavl">
         <w:r>
           <w:rPr>
             <w:rStyle w:val="Hyperlink"/>
@@ -8374,7 +8374,7 @@
       <w:r>
         <w:t xml:space="preserve">Your notes are private unless you share them. Your data is encrypted and stays in the region you choose. Lynkk never uses your recordings to train AI. </w:t>
       </w:r>
-      <w:hyperlink w:history="1" r:id="rId9ed5evfbvo4nzfkdxkhsb">
+      <w:hyperlink w:history="1" r:id="rIdxle-63maex6cg0ydra4cd">
         <w:r>
           <w:rPr>
             <w:rStyle w:val="Hyperlink"/>
@@ -8596,7 +8596,7 @@
       <w:pPr>
         <w:spacing w:after="140"/>
       </w:pPr>
-      <w:hyperlink w:history="1" r:id="rIdlpavzfhzin-bue2xmf_g6">
+      <w:hyperlink w:history="1" r:id="rIdagyqddrdqxaqvnimr0_kb">
         <w:r>
           <w:rPr>
             <w:rStyle w:val="Hyperlink"/>
@@ -8991,33 +8991,33 @@
                 <w:sz w:val="19"/>
                 <w:szCs w:val="19"/>
               </w:rPr>
-              <w:t xml:space="preserve">1</w:t>
-            </w:r>
-          </w:p>
-        </w:tc>
-        <w:tc>
-          <w:tcPr>
-            <w:tcW w:type="dxa" w:w="2520"/>
-            <w:tcBorders>
-              <w:top w:val="single" w:color="C9D3DF" w:sz="4"/>
-              <w:left w:val="single" w:color="C9D3DF" w:sz="4"/>
-              <w:bottom w:val="single" w:color="C9D3DF" w:sz="4"/>
-              <w:right w:val="single" w:color="C9D3DF" w:sz="4"/>
-            </w:tcBorders>
-            <w:tcMar>
-              <w:top w:type="dxa" w:w="60"/>
-              <w:left w:type="dxa" w:w="100"/>
-              <w:bottom w:type="dxa" w:w="60"/>
-              <w:right w:type="dxa" w:w="100"/>
-            </w:tcMar>
-          </w:tcPr>
-          <w:p>
-            <w:r>
-              <w:rPr>
-                <w:sz w:val="19"/>
-                <w:szCs w:val="19"/>
-              </w:rPr>
-              <w:t xml:space="preserve">Title, H1</w:t>
+              <w:t xml:space="preserve">2</w:t>
+            </w:r>
+          </w:p>
+        </w:tc>
+        <w:tc>
+          <w:tcPr>
+            <w:tcW w:type="dxa" w:w="2520"/>
+            <w:tcBorders>
+              <w:top w:val="single" w:color="C9D3DF" w:sz="4"/>
+              <w:left w:val="single" w:color="C9D3DF" w:sz="4"/>
+              <w:bottom w:val="single" w:color="C9D3DF" w:sz="4"/>
+              <w:right w:val="single" w:color="C9D3DF" w:sz="4"/>
+            </w:tcBorders>
+            <w:tcMar>
+              <w:top w:type="dxa" w:w="60"/>
+              <w:left w:type="dxa" w:w="100"/>
+              <w:bottom w:type="dxa" w:w="60"/>
+              <w:right w:type="dxa" w:w="100"/>
+            </w:tcMar>
+          </w:tcPr>
+          <w:p>
+            <w:r>
+              <w:rPr>
+                <w:sz w:val="19"/>
+                <w:szCs w:val="19"/>
+              </w:rPr>
+              <w:t xml:space="preserve">Title, H1, "How Lynkk helps Ethan record lectures" section</w:t>
             </w:r>
           </w:p>
         </w:tc>
@@ -9754,7 +9754,7 @@
         <w:spacing w:after="140"/>
       </w:pPr>
       <w:r>
-        <w:t xml:space="preserve">Ethan asks his teacher if he can record, and the teacher says yes. Then he starts using Lynkk.</w:t>
+        <w:t xml:space="preserve">Ethan asks his teacher if he can record, and the teacher says yes. Then he starts using Lynkk as his lecture recorder.</w:t>
       </w:r>
     </w:p>
     <w:p>
@@ -10624,7 +10624,7 @@
       <w:pPr>
         <w:spacing w:after="140"/>
       </w:pPr>
-      <w:hyperlink w:history="1" r:id="rId8j_anfswxissjpmooz6en">
+      <w:hyperlink w:history="1" r:id="rIdqqzwohl26qcqtp8jhwrah">
         <w:r>
           <w:rPr>
             <w:rStyle w:val="Hyperlink"/>
@@ -11019,33 +11019,33 @@
                 <w:sz w:val="19"/>
                 <w:szCs w:val="19"/>
               </w:rPr>
-              <w:t xml:space="preserve">2</w:t>
-            </w:r>
-          </w:p>
-        </w:tc>
-        <w:tc>
-          <w:tcPr>
-            <w:tcW w:type="dxa" w:w="2520"/>
-            <w:tcBorders>
-              <w:top w:val="single" w:color="C9D3DF" w:sz="4"/>
-              <w:left w:val="single" w:color="C9D3DF" w:sz="4"/>
-              <w:bottom w:val="single" w:color="C9D3DF" w:sz="4"/>
-              <w:right w:val="single" w:color="C9D3DF" w:sz="4"/>
-            </w:tcBorders>
-            <w:tcMar>
-              <w:top w:type="dxa" w:w="60"/>
-              <w:left w:type="dxa" w:w="100"/>
-              <w:bottom w:type="dxa" w:w="60"/>
-              <w:right w:type="dxa" w:w="100"/>
-            </w:tcMar>
-          </w:tcPr>
-          <w:p>
-            <w:r>
-              <w:rPr>
-                <w:sz w:val="19"/>
-                <w:szCs w:val="19"/>
-              </w:rPr>
-              <w:t xml:space="preserve">Title, Meta, H1, "So, what is Lynkk?" section</w:t>
+              <w:t xml:space="preserve">3</w:t>
+            </w:r>
+          </w:p>
+        </w:tc>
+        <w:tc>
+          <w:tcPr>
+            <w:tcW w:type="dxa" w:w="2520"/>
+            <w:tcBorders>
+              <w:top w:val="single" w:color="C9D3DF" w:sz="4"/>
+              <w:left w:val="single" w:color="C9D3DF" w:sz="4"/>
+              <w:bottom w:val="single" w:color="C9D3DF" w:sz="4"/>
+              <w:right w:val="single" w:color="C9D3DF" w:sz="4"/>
+            </w:tcBorders>
+            <w:tcMar>
+              <w:top w:type="dxa" w:w="60"/>
+              <w:left w:type="dxa" w:w="100"/>
+              <w:bottom w:type="dxa" w:w="60"/>
+              <w:right w:type="dxa" w:w="100"/>
+            </w:tcMar>
+          </w:tcPr>
+          <w:p>
+            <w:r>
+              <w:rPr>
+                <w:sz w:val="19"/>
+                <w:szCs w:val="19"/>
+              </w:rPr>
+              <w:t xml:space="preserve">Title, Meta, H1, "Meet Sarah" section, "So, what is Lynkk?" section</w:t>
             </w:r>
           </w:p>
         </w:tc>
@@ -11524,7 +11524,7 @@
         <w:spacing w:after="140"/>
       </w:pPr>
       <w:r>
-        <w:t xml:space="preserve">Sarah is the marketing manager at Brightpath Software LLC. She is rewriting the company website. She wants it to sound like the customers, not like the company.</w:t>
+        <w:t xml:space="preserve">Sarah is the marketing manager at Brightpath Software LLC. She is rewriting the company website. She wants it to sound like the customers, not like the company. She wants to use AI for marketing, but only if it helps her hear real customers.</w:t>
       </w:r>
     </w:p>
     <w:p>
@@ -12172,7 +12172,7 @@
       <w:r>
         <w:t xml:space="preserve">Notes are private unless you share them. Your data is encrypted and stays in the region you choose. Lynkk never uses your calls to train AI. </w:t>
       </w:r>
-      <w:hyperlink w:history="1" r:id="rIdqxok0oadhsuxdtcruyihv">
+      <w:hyperlink w:history="1" r:id="rIdvy4hj19o4zwotab3dfule">
         <w:r>
           <w:rPr>
             <w:rStyle w:val="Hyperlink"/>
@@ -12394,7 +12394,7 @@
       <w:pPr>
         <w:spacing w:after="140"/>
       </w:pPr>
-      <w:hyperlink w:history="1" r:id="rIdbs1_e9u2n9h2c29arge-a">
+      <w:hyperlink w:history="1" r:id="rIdyzwh4g5ht9junx_yhgznd">
         <w:r>
           <w:rPr>
             <w:rStyle w:val="Hyperlink"/>
@@ -12789,33 +12789,33 @@
                 <w:sz w:val="19"/>
                 <w:szCs w:val="19"/>
               </w:rPr>
-              <w:t xml:space="preserve">1</w:t>
-            </w:r>
-          </w:p>
-        </w:tc>
-        <w:tc>
-          <w:tcPr>
-            <w:tcW w:type="dxa" w:w="2520"/>
-            <w:tcBorders>
-              <w:top w:val="single" w:color="C9D3DF" w:sz="4"/>
-              <w:left w:val="single" w:color="C9D3DF" w:sz="4"/>
-              <w:bottom w:val="single" w:color="C9D3DF" w:sz="4"/>
-              <w:right w:val="single" w:color="C9D3DF" w:sz="4"/>
-            </w:tcBorders>
-            <w:tcMar>
-              <w:top w:type="dxa" w:w="60"/>
-              <w:left w:type="dxa" w:w="100"/>
-              <w:bottom w:type="dxa" w:w="60"/>
-              <w:right w:type="dxa" w:w="100"/>
-            </w:tcMar>
-          </w:tcPr>
-          <w:p>
-            <w:r>
-              <w:rPr>
-                <w:sz w:val="19"/>
-                <w:szCs w:val="19"/>
-              </w:rPr>
-              <w:t xml:space="preserve">Title, H1</w:t>
+              <w:t xml:space="preserve">2</w:t>
+            </w:r>
+          </w:p>
+        </w:tc>
+        <w:tc>
+          <w:tcPr>
+            <w:tcW w:type="dxa" w:w="2520"/>
+            <w:tcBorders>
+              <w:top w:val="single" w:color="C9D3DF" w:sz="4"/>
+              <w:left w:val="single" w:color="C9D3DF" w:sz="4"/>
+              <w:bottom w:val="single" w:color="C9D3DF" w:sz="4"/>
+              <w:right w:val="single" w:color="C9D3DF" w:sz="4"/>
+            </w:tcBorders>
+            <w:tcMar>
+              <w:top w:type="dxa" w:w="60"/>
+              <w:left w:type="dxa" w:w="100"/>
+              <w:bottom w:type="dxa" w:w="60"/>
+              <w:right w:type="dxa" w:w="100"/>
+            </w:tcMar>
+          </w:tcPr>
+          <w:p>
+            <w:r>
+              <w:rPr>
+                <w:sz w:val="19"/>
+                <w:szCs w:val="19"/>
+              </w:rPr>
+              <w:t xml:space="preserve">Title, H1, "How Lynkk helps Laura in client meetings" section</w:t>
             </w:r>
           </w:p>
         </w:tc>
@@ -13334,7 +13334,7 @@
         <w:spacing w:after="140"/>
       </w:pPr>
       <w:r>
-        <w:t xml:space="preserve">Laura starts using Lynkk. Here is what changes.</w:t>
+        <w:t xml:space="preserve">Laura starts using Lynkk, a simple AI for lawyers. Here is what changes.</w:t>
       </w:r>
     </w:p>
     <w:p>
@@ -13957,7 +13957,7 @@
       <w:r>
         <w:t xml:space="preserve">Notes are private unless you share them. Your data is encrypted. Lynkk never uses your meetings to train AI. </w:t>
       </w:r>
-      <w:hyperlink w:history="1" r:id="rIdhzww-auiki4p8lpaj9drb">
+      <w:hyperlink w:history="1" r:id="rIdnvntxya6jbdpsx4gnifuu">
         <w:r>
           <w:rPr>
             <w:rStyle w:val="Hyperlink"/>
@@ -14179,7 +14179,7 @@
       <w:pPr>
         <w:spacing w:after="140"/>
       </w:pPr>
-      <w:hyperlink w:history="1" r:id="rIdvycu7sjufuqc9f73rvnot">
+      <w:hyperlink w:history="1" r:id="rIdbpuifxj6el6r439yllr-f">
         <w:r>
           <w:rPr>
             <w:rStyle w:val="Hyperlink"/>
@@ -14215,7 +14215,7 @@
       <w:r>
         <w:t xml:space="preserve">No. Lynkk writes notes and text for your own work. It isn't a certified court transcript. See our guide to </w:t>
       </w:r>
-      <w:hyperlink w:history="1" r:id="rIdklanvg5uh4kd6egerc_qv">
+      <w:hyperlink w:history="1" r:id="rIdbh8xrvbtwaef_2ak0ddhp">
         <w:r>
           <w:rPr>
             <w:rStyle w:val="Hyperlink"/>
@@ -15269,7 +15269,7 @@
       <w:r>
         <w:t xml:space="preserve">New to 1:1s? Read our guide to the </w:t>
       </w:r>
-      <w:hyperlink w:history="1" r:id="rIdflu7czov2nxd0znaa1wkw">
+      <w:hyperlink w:history="1" r:id="rIdxk_a1cphcbxm70gcy_kfr">
         <w:r>
           <w:rPr>
             <w:rStyle w:val="Hyperlink"/>
@@ -15779,7 +15779,7 @@
       <w:r>
         <w:t xml:space="preserve">1:1 notes are private unless you share them. Your data is encrypted and stays in the region you choose. Lynkk never uses your meetings to train AI. </w:t>
       </w:r>
-      <w:hyperlink w:history="1" r:id="rId0ecdflrhhi3dez0vxxwge">
+      <w:hyperlink w:history="1" r:id="rIdkkzamn78svnbojtmlhmn5">
         <w:r>
           <w:rPr>
             <w:rStyle w:val="Hyperlink"/>
@@ -16001,7 +16001,7 @@
       <w:pPr>
         <w:spacing w:after="140"/>
       </w:pPr>
-      <w:hyperlink w:history="1" r:id="rIdh6xfp7v4nfecha9zqkyth">
+      <w:hyperlink w:history="1" r:id="rIdmfmk4czanfbiqy0shxn6d">
         <w:r>
           <w:rPr>
             <w:rStyle w:val="Hyperlink"/>
@@ -16505,33 +16505,33 @@
                 <w:sz w:val="19"/>
                 <w:szCs w:val="19"/>
               </w:rPr>
-              <w:t xml:space="preserve">1</w:t>
-            </w:r>
-          </w:p>
-        </w:tc>
-        <w:tc>
-          <w:tcPr>
-            <w:tcW w:type="dxa" w:w="2520"/>
-            <w:tcBorders>
-              <w:top w:val="single" w:color="C9D3DF" w:sz="4"/>
-              <w:left w:val="single" w:color="C9D3DF" w:sz="4"/>
-              <w:bottom w:val="single" w:color="C9D3DF" w:sz="4"/>
-              <w:right w:val="single" w:color="C9D3DF" w:sz="4"/>
-            </w:tcBorders>
-            <w:tcMar>
-              <w:top w:type="dxa" w:w="60"/>
-              <w:left w:type="dxa" w:w="100"/>
-              <w:bottom w:type="dxa" w:w="60"/>
-              <w:right w:type="dxa" w:w="100"/>
-            </w:tcMar>
-          </w:tcPr>
-          <w:p>
-            <w:r>
-              <w:rPr>
-                <w:sz w:val="19"/>
-                <w:szCs w:val="19"/>
-              </w:rPr>
-              <w:t xml:space="preserve">"What else can Lynkk do?" section</w:t>
+              <w:t xml:space="preserve">2</w:t>
+            </w:r>
+          </w:p>
+        </w:tc>
+        <w:tc>
+          <w:tcPr>
+            <w:tcW w:type="dxa" w:w="2520"/>
+            <w:tcBorders>
+              <w:top w:val="single" w:color="C9D3DF" w:sz="4"/>
+              <w:left w:val="single" w:color="C9D3DF" w:sz="4"/>
+              <w:bottom w:val="single" w:color="C9D3DF" w:sz="4"/>
+              <w:right w:val="single" w:color="C9D3DF" w:sz="4"/>
+            </w:tcBorders>
+            <w:tcMar>
+              <w:top w:type="dxa" w:w="60"/>
+              <w:left w:type="dxa" w:w="100"/>
+              <w:bottom w:type="dxa" w:w="60"/>
+              <w:right w:type="dxa" w:w="100"/>
+            </w:tcMar>
+          </w:tcPr>
+          <w:p>
+            <w:r>
+              <w:rPr>
+                <w:sz w:val="19"/>
+                <w:szCs w:val="19"/>
+              </w:rPr>
+              <w:t xml:space="preserve">"How Lynkk helps Chris remember every client" section, "What else can Lynkk do?" section</w:t>
             </w:r>
           </w:p>
         </w:tc>
@@ -16941,7 +16941,7 @@
         <w:spacing w:after="140"/>
       </w:pPr>
       <w:r>
-        <w:t xml:space="preserve">Chris starts using Lynkk. Here is what changes.</w:t>
+        <w:t xml:space="preserve">A friend tells Chris about AI tools for real estate agents. He starts using Lynkk. Here is what changes.</w:t>
       </w:r>
     </w:p>
     <w:p>
@@ -17572,7 +17572,7 @@
       <w:r>
         <w:t xml:space="preserve">Notes are private unless you share them. Your data is encrypted and stays in the region you choose. Lynkk never uses your calls to train AI. </w:t>
       </w:r>
-      <w:hyperlink w:history="1" r:id="rIdlimnsrms2lxboao9jj63c">
+      <w:hyperlink w:history="1" r:id="rIdh-4dddwlpq2hzk7zeo5s5">
         <w:r>
           <w:rPr>
             <w:rStyle w:val="Hyperlink"/>
@@ -17794,7 +17794,7 @@
       <w:pPr>
         <w:spacing w:after="140"/>
       </w:pPr>
-      <w:hyperlink w:history="1" r:id="rIdw9dyriysfecorskkidinm">
+      <w:hyperlink w:history="1" r:id="rIdgt0ybygx1dno6dvvgjhjr">
         <w:r>
           <w:rPr>
             <w:rStyle w:val="Hyperlink"/>
@@ -18189,33 +18189,33 @@
                 <w:sz w:val="19"/>
                 <w:szCs w:val="19"/>
               </w:rPr>
-              <w:t xml:space="preserve">2</w:t>
-            </w:r>
-          </w:p>
-        </w:tc>
-        <w:tc>
-          <w:tcPr>
-            <w:tcW w:type="dxa" w:w="2520"/>
-            <w:tcBorders>
-              <w:top w:val="single" w:color="C9D3DF" w:sz="4"/>
-              <w:left w:val="single" w:color="C9D3DF" w:sz="4"/>
-              <w:bottom w:val="single" w:color="C9D3DF" w:sz="4"/>
-              <w:right w:val="single" w:color="C9D3DF" w:sz="4"/>
-            </w:tcBorders>
-            <w:tcMar>
-              <w:top w:type="dxa" w:w="60"/>
-              <w:left w:type="dxa" w:w="100"/>
-              <w:bottom w:type="dxa" w:w="60"/>
-              <w:right w:type="dxa" w:w="100"/>
-            </w:tcMar>
-          </w:tcPr>
-          <w:p>
-            <w:r>
-              <w:rPr>
-                <w:sz w:val="19"/>
-                <w:szCs w:val="19"/>
-              </w:rPr>
-              <w:t xml:space="preserve">Title, H1, "Questions people ask" section</w:t>
+              <w:t xml:space="preserve">3</w:t>
+            </w:r>
+          </w:p>
+        </w:tc>
+        <w:tc>
+          <w:tcPr>
+            <w:tcW w:type="dxa" w:w="2520"/>
+            <w:tcBorders>
+              <w:top w:val="single" w:color="C9D3DF" w:sz="4"/>
+              <w:left w:val="single" w:color="C9D3DF" w:sz="4"/>
+              <w:bottom w:val="single" w:color="C9D3DF" w:sz="4"/>
+              <w:right w:val="single" w:color="C9D3DF" w:sz="4"/>
+            </w:tcBorders>
+            <w:tcMar>
+              <w:top w:type="dxa" w:w="60"/>
+              <w:left w:type="dxa" w:w="100"/>
+              <w:bottom w:type="dxa" w:w="60"/>
+              <w:right w:type="dxa" w:w="100"/>
+            </w:tcMar>
+          </w:tcPr>
+          <w:p>
+            <w:r>
+              <w:rPr>
+                <w:sz w:val="19"/>
+                <w:szCs w:val="19"/>
+              </w:rPr>
+              <w:t xml:space="preserve">Title, H1, "How Lynkk helps David with client reviews" section, "Questions people ask" section</w:t>
             </w:r>
           </w:p>
         </w:tc>
@@ -18843,7 +18843,7 @@
         <w:spacing w:after="140"/>
       </w:pPr>
       <w:r>
-        <w:t xml:space="preserve">David starts using Lynkk. Here is what changes.</w:t>
+        <w:t xml:space="preserve">David starts using Lynkk, AI for financial advisors that writes the notes for him. Here is what changes.</w:t>
       </w:r>
     </w:p>
     <w:p>
@@ -19474,7 +19474,7 @@
       <w:r>
         <w:t xml:space="preserve">Notes are private unless you share them. Your data is encrypted. Lynkk never uses your meetings to train AI. </w:t>
       </w:r>
-      <w:hyperlink w:history="1" r:id="rId55eookxspqnkmvsdt3bel">
+      <w:hyperlink w:history="1" r:id="rIdp2hlkwg-ophj6u_xqx0rt">
         <w:r>
           <w:rPr>
             <w:rStyle w:val="Hyperlink"/>
@@ -19696,7 +19696,7 @@
       <w:pPr>
         <w:spacing w:after="140"/>
       </w:pPr>
-      <w:hyperlink w:history="1" r:id="rIdlbavpagedkgohqd6wlbrp">
+      <w:hyperlink w:history="1" r:id="rIdqbxortpfuishyz9rlv-sj">
         <w:r>
           <w:rPr>
             <w:rStyle w:val="Hyperlink"/>

</xml_diff>

<commit_message>
Weave feature keywords into each use-case story and document them in the keyword report
Co-Authored-By: Claude Opus 5.5 <noreply@anthropic.com>
Claude-Session: https://claude.ai/code/session_01Xs6uEGTRa4UggVmKjUH61X
</commit_message>
<xml_diff>
--- a/content/use-cases/story-drafts/Lynkk-Use-Case-Stories.docx
+++ b/content/use-cases/story-drafts/Lynkk-Use-Case-Stories.docx
@@ -1077,6 +1077,224 @@
           </w:p>
         </w:tc>
       </w:tr>
+      <w:tr>
+        <w:trPr>
+          <w:tblHeader w:val="false"/>
+        </w:trPr>
+        <w:tc>
+          <w:tcPr>
+            <w:tcW w:type="dxa" w:w="2520"/>
+            <w:tcBorders>
+              <w:top w:val="single" w:color="C9D3DF" w:sz="4"/>
+              <w:left w:val="single" w:color="C9D3DF" w:sz="4"/>
+              <w:bottom w:val="single" w:color="C9D3DF" w:sz="4"/>
+              <w:right w:val="single" w:color="C9D3DF" w:sz="4"/>
+            </w:tcBorders>
+            <w:tcMar>
+              <w:top w:type="dxa" w:w="60"/>
+              <w:left w:type="dxa" w:w="100"/>
+              <w:bottom w:type="dxa" w:w="60"/>
+              <w:right w:type="dxa" w:w="100"/>
+            </w:tcMar>
+          </w:tcPr>
+          <w:p>
+            <w:r>
+              <w:rPr>
+                <w:sz w:val="19"/>
+                <w:szCs w:val="19"/>
+              </w:rPr>
+              <w:t xml:space="preserve">ai meeting assistant</w:t>
+            </w:r>
+          </w:p>
+        </w:tc>
+        <w:tc>
+          <w:tcPr>
+            <w:tcW w:type="dxa" w:w="2520"/>
+            <w:tcBorders>
+              <w:top w:val="single" w:color="C9D3DF" w:sz="4"/>
+              <w:left w:val="single" w:color="C9D3DF" w:sz="4"/>
+              <w:bottom w:val="single" w:color="C9D3DF" w:sz="4"/>
+              <w:right w:val="single" w:color="C9D3DF" w:sz="4"/>
+            </w:tcBorders>
+            <w:tcMar>
+              <w:top w:type="dxa" w:w="60"/>
+              <w:left w:type="dxa" w:w="100"/>
+              <w:bottom w:type="dxa" w:w="60"/>
+              <w:right w:type="dxa" w:w="100"/>
+            </w:tcMar>
+          </w:tcPr>
+          <w:p>
+            <w:r>
+              <w:rPr>
+                <w:sz w:val="19"/>
+                <w:szCs w:val="19"/>
+              </w:rPr>
+              <w:t xml:space="preserve">4,400 (feature)</w:t>
+            </w:r>
+          </w:p>
+        </w:tc>
+        <w:tc>
+          <w:tcPr>
+            <w:tcW w:type="dxa" w:w="2520"/>
+            <w:tcBorders>
+              <w:top w:val="single" w:color="C9D3DF" w:sz="4"/>
+              <w:left w:val="single" w:color="C9D3DF" w:sz="4"/>
+              <w:bottom w:val="single" w:color="C9D3DF" w:sz="4"/>
+              <w:right w:val="single" w:color="C9D3DF" w:sz="4"/>
+            </w:tcBorders>
+            <w:tcMar>
+              <w:top w:type="dxa" w:w="60"/>
+              <w:left w:type="dxa" w:w="100"/>
+              <w:bottom w:type="dxa" w:w="60"/>
+              <w:right w:type="dxa" w:w="100"/>
+            </w:tcMar>
+          </w:tcPr>
+          <w:p>
+            <w:r>
+              <w:rPr>
+                <w:sz w:val="19"/>
+                <w:szCs w:val="19"/>
+              </w:rPr>
+              <w:t xml:space="preserve">1</w:t>
+            </w:r>
+          </w:p>
+        </w:tc>
+        <w:tc>
+          <w:tcPr>
+            <w:tcW w:type="dxa" w:w="2520"/>
+            <w:tcBorders>
+              <w:top w:val="single" w:color="C9D3DF" w:sz="4"/>
+              <w:left w:val="single" w:color="C9D3DF" w:sz="4"/>
+              <w:bottom w:val="single" w:color="C9D3DF" w:sz="4"/>
+              <w:right w:val="single" w:color="C9D3DF" w:sz="4"/>
+            </w:tcBorders>
+            <w:tcMar>
+              <w:top w:type="dxa" w:w="60"/>
+              <w:left w:type="dxa" w:w="100"/>
+              <w:bottom w:type="dxa" w:w="60"/>
+              <w:right w:type="dxa" w:w="100"/>
+            </w:tcMar>
+          </w:tcPr>
+          <w:p>
+            <w:r>
+              <w:rPr>
+                <w:sz w:val="19"/>
+                <w:szCs w:val="19"/>
+              </w:rPr>
+              <w:t xml:space="preserve">"How Lynkk helps Jessica on her next sales call" section</w:t>
+            </w:r>
+          </w:p>
+        </w:tc>
+      </w:tr>
+      <w:tr>
+        <w:trPr>
+          <w:tblHeader w:val="false"/>
+        </w:trPr>
+        <w:tc>
+          <w:tcPr>
+            <w:tcW w:type="dxa" w:w="2520"/>
+            <w:tcBorders>
+              <w:top w:val="single" w:color="C9D3DF" w:sz="4"/>
+              <w:left w:val="single" w:color="C9D3DF" w:sz="4"/>
+              <w:bottom w:val="single" w:color="C9D3DF" w:sz="4"/>
+              <w:right w:val="single" w:color="C9D3DF" w:sz="4"/>
+            </w:tcBorders>
+            <w:tcMar>
+              <w:top w:type="dxa" w:w="60"/>
+              <w:left w:type="dxa" w:w="100"/>
+              <w:bottom w:type="dxa" w:w="60"/>
+              <w:right w:type="dxa" w:w="100"/>
+            </w:tcMar>
+          </w:tcPr>
+          <w:p>
+            <w:r>
+              <w:rPr>
+                <w:sz w:val="19"/>
+                <w:szCs w:val="19"/>
+              </w:rPr>
+              <w:t xml:space="preserve">action items</w:t>
+            </w:r>
+          </w:p>
+        </w:tc>
+        <w:tc>
+          <w:tcPr>
+            <w:tcW w:type="dxa" w:w="2520"/>
+            <w:tcBorders>
+              <w:top w:val="single" w:color="C9D3DF" w:sz="4"/>
+              <w:left w:val="single" w:color="C9D3DF" w:sz="4"/>
+              <w:bottom w:val="single" w:color="C9D3DF" w:sz="4"/>
+              <w:right w:val="single" w:color="C9D3DF" w:sz="4"/>
+            </w:tcBorders>
+            <w:tcMar>
+              <w:top w:type="dxa" w:w="60"/>
+              <w:left w:type="dxa" w:w="100"/>
+              <w:bottom w:type="dxa" w:w="60"/>
+              <w:right w:type="dxa" w:w="100"/>
+            </w:tcMar>
+          </w:tcPr>
+          <w:p>
+            <w:r>
+              <w:rPr>
+                <w:sz w:val="19"/>
+                <w:szCs w:val="19"/>
+              </w:rPr>
+              <w:t xml:space="preserve">2,900 (feature)</w:t>
+            </w:r>
+          </w:p>
+        </w:tc>
+        <w:tc>
+          <w:tcPr>
+            <w:tcW w:type="dxa" w:w="2520"/>
+            <w:tcBorders>
+              <w:top w:val="single" w:color="C9D3DF" w:sz="4"/>
+              <w:left w:val="single" w:color="C9D3DF" w:sz="4"/>
+              <w:bottom w:val="single" w:color="C9D3DF" w:sz="4"/>
+              <w:right w:val="single" w:color="C9D3DF" w:sz="4"/>
+            </w:tcBorders>
+            <w:tcMar>
+              <w:top w:type="dxa" w:w="60"/>
+              <w:left w:type="dxa" w:w="100"/>
+              <w:bottom w:type="dxa" w:w="60"/>
+              <w:right w:type="dxa" w:w="100"/>
+            </w:tcMar>
+          </w:tcPr>
+          <w:p>
+            <w:r>
+              <w:rPr>
+                <w:sz w:val="19"/>
+                <w:szCs w:val="19"/>
+              </w:rPr>
+              <w:t xml:space="preserve">1</w:t>
+            </w:r>
+          </w:p>
+        </w:tc>
+        <w:tc>
+          <w:tcPr>
+            <w:tcW w:type="dxa" w:w="2520"/>
+            <w:tcBorders>
+              <w:top w:val="single" w:color="C9D3DF" w:sz="4"/>
+              <w:left w:val="single" w:color="C9D3DF" w:sz="4"/>
+              <w:bottom w:val="single" w:color="C9D3DF" w:sz="4"/>
+              <w:right w:val="single" w:color="C9D3DF" w:sz="4"/>
+            </w:tcBorders>
+            <w:tcMar>
+              <w:top w:type="dxa" w:w="60"/>
+              <w:left w:type="dxa" w:w="100"/>
+              <w:bottom w:type="dxa" w:w="60"/>
+              <w:right w:type="dxa" w:w="100"/>
+            </w:tcMar>
+          </w:tcPr>
+          <w:p>
+            <w:r>
+              <w:rPr>
+                <w:sz w:val="19"/>
+                <w:szCs w:val="19"/>
+              </w:rPr>
+              <w:t xml:space="preserve">"How Lynkk helps Jessica on her next sales call" section</w:t>
+            </w:r>
+          </w:p>
+        </w:tc>
+      </w:tr>
     </w:tbl>
     <w:p>
       <w:pPr>
@@ -1419,7 +1637,7 @@
         <w:t xml:space="preserve">During the call, Jessica just talks.</w:t>
       </w:r>
       <w:r>
-        <w:t xml:space="preserve"> Lynkk records the call from her computer. No extra bot joins the call. When Dana asks, "What did we agree last time?", Lynkk shows Jessica the answer right away.</w:t>
+        <w:t xml:space="preserve"> Lynkk works like a quiet AI meeting assistant. It records the call from her computer, and no extra bot joins the call. When Dana asks, "What did we agree last time?", Lynkk shows Jessica the answer right away.</w:t>
       </w:r>
     </w:p>
     <w:p>
@@ -1434,7 +1652,7 @@
         <w:t xml:space="preserve">After the call, the notes are already done.</w:t>
       </w:r>
       <w:r>
-        <w:t xml:space="preserve"> Jessica does not type anything. Lynkk writes the next steps, who will do them, and by when.</w:t>
+        <w:t xml:space="preserve"> Jessica does not type anything. Lynkk writes the action items: the next steps, who will do them, and by when.</w:t>
       </w:r>
     </w:p>
     <w:p>
@@ -2033,7 +2251,7 @@
       <w:r>
         <w:t xml:space="preserve">Your notes are private unless you share them. Your data is encrypted and stays in the region you choose. Lynkk never uses your calls to train AI. </w:t>
       </w:r>
-      <w:hyperlink w:history="1" r:id="rIdqba9wwrxsby5qbn-ae6fa">
+      <w:hyperlink w:history="1" r:id="rId4hffs-ynjg7gytrdoxked">
         <w:r>
           <w:rPr>
             <w:rStyle w:val="Hyperlink"/>
@@ -2255,7 +2473,7 @@
       <w:pPr>
         <w:spacing w:after="140"/>
       </w:pPr>
-      <w:hyperlink w:history="1" r:id="rId0_g7-_mzqn5nfhwbdzjik">
+      <w:hyperlink w:history="1" r:id="rIdn39qd0cevcj-beg0ffr32">
         <w:r>
           <w:rPr>
             <w:rStyle w:val="Hyperlink"/>
@@ -3226,6 +3444,224 @@
           </w:p>
         </w:tc>
       </w:tr>
+      <w:tr>
+        <w:trPr>
+          <w:tblHeader w:val="false"/>
+        </w:trPr>
+        <w:tc>
+          <w:tcPr>
+            <w:tcW w:type="dxa" w:w="2520"/>
+            <w:tcBorders>
+              <w:top w:val="single" w:color="C9D3DF" w:sz="4"/>
+              <w:left w:val="single" w:color="C9D3DF" w:sz="4"/>
+              <w:bottom w:val="single" w:color="C9D3DF" w:sz="4"/>
+              <w:right w:val="single" w:color="C9D3DF" w:sz="4"/>
+            </w:tcBorders>
+            <w:tcMar>
+              <w:top w:type="dxa" w:w="60"/>
+              <w:left w:type="dxa" w:w="100"/>
+              <w:bottom w:type="dxa" w:w="60"/>
+              <w:right w:type="dxa" w:w="100"/>
+            </w:tcMar>
+          </w:tcPr>
+          <w:p>
+            <w:r>
+              <w:rPr>
+                <w:sz w:val="19"/>
+                <w:szCs w:val="19"/>
+              </w:rPr>
+              <w:t xml:space="preserve">transcription software</w:t>
+            </w:r>
+          </w:p>
+        </w:tc>
+        <w:tc>
+          <w:tcPr>
+            <w:tcW w:type="dxa" w:w="2520"/>
+            <w:tcBorders>
+              <w:top w:val="single" w:color="C9D3DF" w:sz="4"/>
+              <w:left w:val="single" w:color="C9D3DF" w:sz="4"/>
+              <w:bottom w:val="single" w:color="C9D3DF" w:sz="4"/>
+              <w:right w:val="single" w:color="C9D3DF" w:sz="4"/>
+            </w:tcBorders>
+            <w:tcMar>
+              <w:top w:type="dxa" w:w="60"/>
+              <w:left w:type="dxa" w:w="100"/>
+              <w:bottom w:type="dxa" w:w="60"/>
+              <w:right w:type="dxa" w:w="100"/>
+            </w:tcMar>
+          </w:tcPr>
+          <w:p>
+            <w:r>
+              <w:rPr>
+                <w:sz w:val="19"/>
+                <w:szCs w:val="19"/>
+              </w:rPr>
+              <w:t xml:space="preserve">3,600 (feature)</w:t>
+            </w:r>
+          </w:p>
+        </w:tc>
+        <w:tc>
+          <w:tcPr>
+            <w:tcW w:type="dxa" w:w="2520"/>
+            <w:tcBorders>
+              <w:top w:val="single" w:color="C9D3DF" w:sz="4"/>
+              <w:left w:val="single" w:color="C9D3DF" w:sz="4"/>
+              <w:bottom w:val="single" w:color="C9D3DF" w:sz="4"/>
+              <w:right w:val="single" w:color="C9D3DF" w:sz="4"/>
+            </w:tcBorders>
+            <w:tcMar>
+              <w:top w:type="dxa" w:w="60"/>
+              <w:left w:type="dxa" w:w="100"/>
+              <w:bottom w:type="dxa" w:w="60"/>
+              <w:right w:type="dxa" w:w="100"/>
+            </w:tcMar>
+          </w:tcPr>
+          <w:p>
+            <w:r>
+              <w:rPr>
+                <w:sz w:val="19"/>
+                <w:szCs w:val="19"/>
+              </w:rPr>
+              <w:t xml:space="preserve">1</w:t>
+            </w:r>
+          </w:p>
+        </w:tc>
+        <w:tc>
+          <w:tcPr>
+            <w:tcW w:type="dxa" w:w="2520"/>
+            <w:tcBorders>
+              <w:top w:val="single" w:color="C9D3DF" w:sz="4"/>
+              <w:left w:val="single" w:color="C9D3DF" w:sz="4"/>
+              <w:bottom w:val="single" w:color="C9D3DF" w:sz="4"/>
+              <w:right w:val="single" w:color="C9D3DF" w:sz="4"/>
+            </w:tcBorders>
+            <w:tcMar>
+              <w:top w:type="dxa" w:w="60"/>
+              <w:left w:type="dxa" w:w="100"/>
+              <w:bottom w:type="dxa" w:w="60"/>
+              <w:right w:type="dxa" w:w="100"/>
+            </w:tcMar>
+          </w:tcPr>
+          <w:p>
+            <w:r>
+              <w:rPr>
+                <w:sz w:val="19"/>
+                <w:szCs w:val="19"/>
+              </w:rPr>
+              <w:t xml:space="preserve">"Rachel's problem" section</w:t>
+            </w:r>
+          </w:p>
+        </w:tc>
+      </w:tr>
+      <w:tr>
+        <w:trPr>
+          <w:tblHeader w:val="false"/>
+        </w:trPr>
+        <w:tc>
+          <w:tcPr>
+            <w:tcW w:type="dxa" w:w="2520"/>
+            <w:tcBorders>
+              <w:top w:val="single" w:color="C9D3DF" w:sz="4"/>
+              <w:left w:val="single" w:color="C9D3DF" w:sz="4"/>
+              <w:bottom w:val="single" w:color="C9D3DF" w:sz="4"/>
+              <w:right w:val="single" w:color="C9D3DF" w:sz="4"/>
+            </w:tcBorders>
+            <w:tcMar>
+              <w:top w:type="dxa" w:w="60"/>
+              <w:left w:type="dxa" w:w="100"/>
+              <w:bottom w:type="dxa" w:w="60"/>
+              <w:right w:type="dxa" w:w="100"/>
+            </w:tcMar>
+          </w:tcPr>
+          <w:p>
+            <w:r>
+              <w:rPr>
+                <w:sz w:val="19"/>
+                <w:szCs w:val="19"/>
+              </w:rPr>
+              <w:t xml:space="preserve">audio to text</w:t>
+            </w:r>
+          </w:p>
+        </w:tc>
+        <w:tc>
+          <w:tcPr>
+            <w:tcW w:type="dxa" w:w="2520"/>
+            <w:tcBorders>
+              <w:top w:val="single" w:color="C9D3DF" w:sz="4"/>
+              <w:left w:val="single" w:color="C9D3DF" w:sz="4"/>
+              <w:bottom w:val="single" w:color="C9D3DF" w:sz="4"/>
+              <w:right w:val="single" w:color="C9D3DF" w:sz="4"/>
+            </w:tcBorders>
+            <w:tcMar>
+              <w:top w:type="dxa" w:w="60"/>
+              <w:left w:type="dxa" w:w="100"/>
+              <w:bottom w:type="dxa" w:w="60"/>
+              <w:right w:type="dxa" w:w="100"/>
+            </w:tcMar>
+          </w:tcPr>
+          <w:p>
+            <w:r>
+              <w:rPr>
+                <w:sz w:val="19"/>
+                <w:szCs w:val="19"/>
+              </w:rPr>
+              <w:t xml:space="preserve">12,100 (feature)</w:t>
+            </w:r>
+          </w:p>
+        </w:tc>
+        <w:tc>
+          <w:tcPr>
+            <w:tcW w:type="dxa" w:w="2520"/>
+            <w:tcBorders>
+              <w:top w:val="single" w:color="C9D3DF" w:sz="4"/>
+              <w:left w:val="single" w:color="C9D3DF" w:sz="4"/>
+              <w:bottom w:val="single" w:color="C9D3DF" w:sz="4"/>
+              <w:right w:val="single" w:color="C9D3DF" w:sz="4"/>
+            </w:tcBorders>
+            <w:tcMar>
+              <w:top w:type="dxa" w:w="60"/>
+              <w:left w:type="dxa" w:w="100"/>
+              <w:bottom w:type="dxa" w:w="60"/>
+              <w:right w:type="dxa" w:w="100"/>
+            </w:tcMar>
+          </w:tcPr>
+          <w:p>
+            <w:r>
+              <w:rPr>
+                <w:sz w:val="19"/>
+                <w:szCs w:val="19"/>
+              </w:rPr>
+              <w:t xml:space="preserve">1</w:t>
+            </w:r>
+          </w:p>
+        </w:tc>
+        <w:tc>
+          <w:tcPr>
+            <w:tcW w:type="dxa" w:w="2520"/>
+            <w:tcBorders>
+              <w:top w:val="single" w:color="C9D3DF" w:sz="4"/>
+              <w:left w:val="single" w:color="C9D3DF" w:sz="4"/>
+              <w:bottom w:val="single" w:color="C9D3DF" w:sz="4"/>
+              <w:right w:val="single" w:color="C9D3DF" w:sz="4"/>
+            </w:tcBorders>
+            <w:tcMar>
+              <w:top w:type="dxa" w:w="60"/>
+              <w:left w:type="dxa" w:w="100"/>
+              <w:bottom w:type="dxa" w:w="60"/>
+              <w:right w:type="dxa" w:w="100"/>
+            </w:tcMar>
+          </w:tcPr>
+          <w:p>
+            <w:r>
+              <w:rPr>
+                <w:sz w:val="19"/>
+                <w:szCs w:val="19"/>
+              </w:rPr>
+              <w:t xml:space="preserve">"How Lynkk helps Rachel transcribe interviews" section</w:t>
+            </w:r>
+          </w:p>
+        </w:tc>
+      </w:tr>
     </w:tbl>
     <w:p>
       <w:pPr>
@@ -3506,7 +3942,7 @@
         <w:spacing w:after="140"/>
       </w:pPr>
       <w:r>
-        <w:t xml:space="preserve">Her notes only have short phrases, not the customer's real words. After eight interviews, she can't remember who said what. Finding one good quote means listening to hours of recordings again.</w:t>
+        <w:t xml:space="preserve">Her notes only have short phrases, not the customer's real words. After eight interviews, she can't remember who said what. Finding one good quote means listening to hours of recordings again. She tried transcription software once, but it gave her a wall of text with no names.</w:t>
       </w:r>
     </w:p>
     <w:p>
@@ -3567,7 +4003,7 @@
         <w:t xml:space="preserve">After the interview, the text is ready.</w:t>
       </w:r>
       <w:r>
-        <w:t xml:space="preserve"> Lynkk writes every word and labels who said it. It also lists the main points and the questions still open.</w:t>
+        <w:t xml:space="preserve"> Lynkk turns the audio to text and labels who said each line. It also lists the main points and the questions still open.</w:t>
       </w:r>
     </w:p>
     <w:p>
@@ -4196,7 +4632,7 @@
       <w:r>
         <w:t xml:space="preserve">Your notes are private unless you share them. Your data is encrypted and stays in the region you choose. Lynkk never uses your recordings to train AI. </w:t>
       </w:r>
-      <w:hyperlink w:history="1" r:id="rIdq4nwwqlqwf9ewiu7bbvs8">
+      <w:hyperlink w:history="1" r:id="rIdgapwqbfncha3lxrvgqdya">
         <w:r>
           <w:rPr>
             <w:rStyle w:val="Hyperlink"/>
@@ -4418,7 +4854,7 @@
       <w:pPr>
         <w:spacing w:after="140"/>
       </w:pPr>
-      <w:hyperlink w:history="1" r:id="rIdjctnzig9jcqlouhqby-mo">
+      <w:hyperlink w:history="1" r:id="rIdftvgw_dkynybgwt2gwpm5">
         <w:r>
           <w:rPr>
             <w:rStyle w:val="Hyperlink"/>
@@ -5280,6 +5716,224 @@
           </w:p>
         </w:tc>
       </w:tr>
+      <w:tr>
+        <w:trPr>
+          <w:tblHeader w:val="false"/>
+        </w:trPr>
+        <w:tc>
+          <w:tcPr>
+            <w:tcW w:type="dxa" w:w="2520"/>
+            <w:tcBorders>
+              <w:top w:val="single" w:color="C9D3DF" w:sz="4"/>
+              <w:left w:val="single" w:color="C9D3DF" w:sz="4"/>
+              <w:bottom w:val="single" w:color="C9D3DF" w:sz="4"/>
+              <w:right w:val="single" w:color="C9D3DF" w:sz="4"/>
+            </w:tcBorders>
+            <w:tcMar>
+              <w:top w:type="dxa" w:w="60"/>
+              <w:left w:type="dxa" w:w="100"/>
+              <w:bottom w:type="dxa" w:w="60"/>
+              <w:right w:type="dxa" w:w="100"/>
+            </w:tcMar>
+          </w:tcPr>
+          <w:p>
+            <w:r>
+              <w:rPr>
+                <w:sz w:val="19"/>
+                <w:szCs w:val="19"/>
+              </w:rPr>
+              <w:t xml:space="preserve">ai meeting notes</w:t>
+            </w:r>
+          </w:p>
+        </w:tc>
+        <w:tc>
+          <w:tcPr>
+            <w:tcW w:type="dxa" w:w="2520"/>
+            <w:tcBorders>
+              <w:top w:val="single" w:color="C9D3DF" w:sz="4"/>
+              <w:left w:val="single" w:color="C9D3DF" w:sz="4"/>
+              <w:bottom w:val="single" w:color="C9D3DF" w:sz="4"/>
+              <w:right w:val="single" w:color="C9D3DF" w:sz="4"/>
+            </w:tcBorders>
+            <w:tcMar>
+              <w:top w:type="dxa" w:w="60"/>
+              <w:left w:type="dxa" w:w="100"/>
+              <w:bottom w:type="dxa" w:w="60"/>
+              <w:right w:type="dxa" w:w="100"/>
+            </w:tcMar>
+          </w:tcPr>
+          <w:p>
+            <w:r>
+              <w:rPr>
+                <w:sz w:val="19"/>
+                <w:szCs w:val="19"/>
+              </w:rPr>
+              <w:t xml:space="preserve">1,000 (feature)</w:t>
+            </w:r>
+          </w:p>
+        </w:tc>
+        <w:tc>
+          <w:tcPr>
+            <w:tcW w:type="dxa" w:w="2520"/>
+            <w:tcBorders>
+              <w:top w:val="single" w:color="C9D3DF" w:sz="4"/>
+              <w:left w:val="single" w:color="C9D3DF" w:sz="4"/>
+              <w:bottom w:val="single" w:color="C9D3DF" w:sz="4"/>
+              <w:right w:val="single" w:color="C9D3DF" w:sz="4"/>
+            </w:tcBorders>
+            <w:tcMar>
+              <w:top w:type="dxa" w:w="60"/>
+              <w:left w:type="dxa" w:w="100"/>
+              <w:bottom w:type="dxa" w:w="60"/>
+              <w:right w:type="dxa" w:w="100"/>
+            </w:tcMar>
+          </w:tcPr>
+          <w:p>
+            <w:r>
+              <w:rPr>
+                <w:sz w:val="19"/>
+                <w:szCs w:val="19"/>
+              </w:rPr>
+              <w:t xml:space="preserve">1</w:t>
+            </w:r>
+          </w:p>
+        </w:tc>
+        <w:tc>
+          <w:tcPr>
+            <w:tcW w:type="dxa" w:w="2520"/>
+            <w:tcBorders>
+              <w:top w:val="single" w:color="C9D3DF" w:sz="4"/>
+              <w:left w:val="single" w:color="C9D3DF" w:sz="4"/>
+              <w:bottom w:val="single" w:color="C9D3DF" w:sz="4"/>
+              <w:right w:val="single" w:color="C9D3DF" w:sz="4"/>
+            </w:tcBorders>
+            <w:tcMar>
+              <w:top w:type="dxa" w:w="60"/>
+              <w:left w:type="dxa" w:w="100"/>
+              <w:bottom w:type="dxa" w:w="60"/>
+              <w:right w:type="dxa" w:w="100"/>
+            </w:tcMar>
+          </w:tcPr>
+          <w:p>
+            <w:r>
+              <w:rPr>
+                <w:sz w:val="19"/>
+                <w:szCs w:val="19"/>
+              </w:rPr>
+              <w:t xml:space="preserve">"How Lynkk helps Jake with the daily standup meeting" section</w:t>
+            </w:r>
+          </w:p>
+        </w:tc>
+      </w:tr>
+      <w:tr>
+        <w:trPr>
+          <w:tblHeader w:val="false"/>
+        </w:trPr>
+        <w:tc>
+          <w:tcPr>
+            <w:tcW w:type="dxa" w:w="2520"/>
+            <w:tcBorders>
+              <w:top w:val="single" w:color="C9D3DF" w:sz="4"/>
+              <w:left w:val="single" w:color="C9D3DF" w:sz="4"/>
+              <w:bottom w:val="single" w:color="C9D3DF" w:sz="4"/>
+              <w:right w:val="single" w:color="C9D3DF" w:sz="4"/>
+            </w:tcBorders>
+            <w:tcMar>
+              <w:top w:type="dxa" w:w="60"/>
+              <w:left w:type="dxa" w:w="100"/>
+              <w:bottom w:type="dxa" w:w="60"/>
+              <w:right w:type="dxa" w:w="100"/>
+            </w:tcMar>
+          </w:tcPr>
+          <w:p>
+            <w:r>
+              <w:rPr>
+                <w:sz w:val="19"/>
+                <w:szCs w:val="19"/>
+              </w:rPr>
+              <w:t xml:space="preserve">action items</w:t>
+            </w:r>
+          </w:p>
+        </w:tc>
+        <w:tc>
+          <w:tcPr>
+            <w:tcW w:type="dxa" w:w="2520"/>
+            <w:tcBorders>
+              <w:top w:val="single" w:color="C9D3DF" w:sz="4"/>
+              <w:left w:val="single" w:color="C9D3DF" w:sz="4"/>
+              <w:bottom w:val="single" w:color="C9D3DF" w:sz="4"/>
+              <w:right w:val="single" w:color="C9D3DF" w:sz="4"/>
+            </w:tcBorders>
+            <w:tcMar>
+              <w:top w:type="dxa" w:w="60"/>
+              <w:left w:type="dxa" w:w="100"/>
+              <w:bottom w:type="dxa" w:w="60"/>
+              <w:right w:type="dxa" w:w="100"/>
+            </w:tcMar>
+          </w:tcPr>
+          <w:p>
+            <w:r>
+              <w:rPr>
+                <w:sz w:val="19"/>
+                <w:szCs w:val="19"/>
+              </w:rPr>
+              <w:t xml:space="preserve">2,900 (feature)</w:t>
+            </w:r>
+          </w:p>
+        </w:tc>
+        <w:tc>
+          <w:tcPr>
+            <w:tcW w:type="dxa" w:w="2520"/>
+            <w:tcBorders>
+              <w:top w:val="single" w:color="C9D3DF" w:sz="4"/>
+              <w:left w:val="single" w:color="C9D3DF" w:sz="4"/>
+              <w:bottom w:val="single" w:color="C9D3DF" w:sz="4"/>
+              <w:right w:val="single" w:color="C9D3DF" w:sz="4"/>
+            </w:tcBorders>
+            <w:tcMar>
+              <w:top w:type="dxa" w:w="60"/>
+              <w:left w:type="dxa" w:w="100"/>
+              <w:bottom w:type="dxa" w:w="60"/>
+              <w:right w:type="dxa" w:w="100"/>
+            </w:tcMar>
+          </w:tcPr>
+          <w:p>
+            <w:r>
+              <w:rPr>
+                <w:sz w:val="19"/>
+                <w:szCs w:val="19"/>
+              </w:rPr>
+              <w:t xml:space="preserve">1</w:t>
+            </w:r>
+          </w:p>
+        </w:tc>
+        <w:tc>
+          <w:tcPr>
+            <w:tcW w:type="dxa" w:w="2520"/>
+            <w:tcBorders>
+              <w:top w:val="single" w:color="C9D3DF" w:sz="4"/>
+              <w:left w:val="single" w:color="C9D3DF" w:sz="4"/>
+              <w:bottom w:val="single" w:color="C9D3DF" w:sz="4"/>
+              <w:right w:val="single" w:color="C9D3DF" w:sz="4"/>
+            </w:tcBorders>
+            <w:tcMar>
+              <w:top w:type="dxa" w:w="60"/>
+              <w:left w:type="dxa" w:w="100"/>
+              <w:bottom w:type="dxa" w:w="60"/>
+              <w:right w:type="dxa" w:w="100"/>
+            </w:tcMar>
+          </w:tcPr>
+          <w:p>
+            <w:r>
+              <w:rPr>
+                <w:sz w:val="19"/>
+                <w:szCs w:val="19"/>
+              </w:rPr>
+              <w:t xml:space="preserve">"How Lynkk helps Jake with the daily standup meeting" section</w:t>
+            </w:r>
+          </w:p>
+        </w:tc>
+      </w:tr>
     </w:tbl>
     <w:p>
       <w:pPr>
@@ -5606,7 +6260,7 @@
         <w:t xml:space="preserve">During the standup, the team just talks.</w:t>
       </w:r>
       <w:r>
-        <w:t xml:space="preserve"> Nobody types. Nobody is the "note taker" anymore.</w:t>
+        <w:t xml:space="preserve"> Nobody types. Nobody is the "note taker" anymore. Lynkk takes the AI meeting notes for the whole team.</w:t>
       </w:r>
     </w:p>
     <w:p>
@@ -5621,7 +6275,7 @@
         <w:t xml:space="preserve">After the standup, the note is ready.</w:t>
       </w:r>
       <w:r>
-        <w:t xml:space="preserve"> Lynkk sorts it into yesterday, today and blockers. Every task goes to the Tasks board with a name and a date.</w:t>
+        <w:t xml:space="preserve"> Lynkk sorts it into yesterday, today and blockers. Blockers and action items go to the Tasks board, each with a name and a date.</w:t>
       </w:r>
     </w:p>
     <w:p>
@@ -5723,7 +6377,7 @@
       <w:r>
         <w:t xml:space="preserve">New to standups? Read our guide to the </w:t>
       </w:r>
-      <w:hyperlink w:history="1" r:id="rIdi2o0dvet43nv_stzo-vat">
+      <w:hyperlink w:history="1" r:id="rIdgfpgog75t2d5av2kcnq4d">
         <w:r>
           <w:rPr>
             <w:rStyle w:val="Hyperlink"/>
@@ -6233,7 +6887,7 @@
       <w:r>
         <w:t xml:space="preserve">Notes are private unless you share them. Your data is encrypted and stays in the region you choose. Lynkk never uses your meetings to train AI. </w:t>
       </w:r>
-      <w:hyperlink w:history="1" r:id="rIdfw6i3vukzsv5ex-b_yyjh">
+      <w:hyperlink w:history="1" r:id="rId1mnh2evurxsutsvvkhvia">
         <w:r>
           <w:rPr>
             <w:rStyle w:val="Hyperlink"/>
@@ -6455,7 +7109,7 @@
       <w:pPr>
         <w:spacing w:after="140"/>
       </w:pPr>
-      <w:hyperlink w:history="1" r:id="rIdcbxt4hc2n2zsvzgsquavl">
+      <w:hyperlink w:history="1" r:id="rIdvjkl98tydtjqcfl78jgrh">
         <w:r>
           <w:rPr>
             <w:rStyle w:val="Hyperlink"/>
@@ -7426,6 +8080,224 @@
           </w:p>
         </w:tc>
       </w:tr>
+      <w:tr>
+        <w:trPr>
+          <w:tblHeader w:val="false"/>
+        </w:trPr>
+        <w:tc>
+          <w:tcPr>
+            <w:tcW w:type="dxa" w:w="2520"/>
+            <w:tcBorders>
+              <w:top w:val="single" w:color="C9D3DF" w:sz="4"/>
+              <w:left w:val="single" w:color="C9D3DF" w:sz="4"/>
+              <w:bottom w:val="single" w:color="C9D3DF" w:sz="4"/>
+              <w:right w:val="single" w:color="C9D3DF" w:sz="4"/>
+            </w:tcBorders>
+            <w:tcMar>
+              <w:top w:type="dxa" w:w="60"/>
+              <w:left w:type="dxa" w:w="100"/>
+              <w:bottom w:type="dxa" w:w="60"/>
+              <w:right w:type="dxa" w:w="100"/>
+            </w:tcMar>
+          </w:tcPr>
+          <w:p>
+            <w:r>
+              <w:rPr>
+                <w:sz w:val="19"/>
+                <w:szCs w:val="19"/>
+              </w:rPr>
+              <w:t xml:space="preserve">transcribe audio</w:t>
+            </w:r>
+          </w:p>
+        </w:tc>
+        <w:tc>
+          <w:tcPr>
+            <w:tcW w:type="dxa" w:w="2520"/>
+            <w:tcBorders>
+              <w:top w:val="single" w:color="C9D3DF" w:sz="4"/>
+              <w:left w:val="single" w:color="C9D3DF" w:sz="4"/>
+              <w:bottom w:val="single" w:color="C9D3DF" w:sz="4"/>
+              <w:right w:val="single" w:color="C9D3DF" w:sz="4"/>
+            </w:tcBorders>
+            <w:tcMar>
+              <w:top w:type="dxa" w:w="60"/>
+              <w:left w:type="dxa" w:w="100"/>
+              <w:bottom w:type="dxa" w:w="60"/>
+              <w:right w:type="dxa" w:w="100"/>
+            </w:tcMar>
+          </w:tcPr>
+          <w:p>
+            <w:r>
+              <w:rPr>
+                <w:sz w:val="19"/>
+                <w:szCs w:val="19"/>
+              </w:rPr>
+              <w:t xml:space="preserve">33,100 (feature)</w:t>
+            </w:r>
+          </w:p>
+        </w:tc>
+        <w:tc>
+          <w:tcPr>
+            <w:tcW w:type="dxa" w:w="2520"/>
+            <w:tcBorders>
+              <w:top w:val="single" w:color="C9D3DF" w:sz="4"/>
+              <w:left w:val="single" w:color="C9D3DF" w:sz="4"/>
+              <w:bottom w:val="single" w:color="C9D3DF" w:sz="4"/>
+              <w:right w:val="single" w:color="C9D3DF" w:sz="4"/>
+            </w:tcBorders>
+            <w:tcMar>
+              <w:top w:type="dxa" w:w="60"/>
+              <w:left w:type="dxa" w:w="100"/>
+              <w:bottom w:type="dxa" w:w="60"/>
+              <w:right w:type="dxa" w:w="100"/>
+            </w:tcMar>
+          </w:tcPr>
+          <w:p>
+            <w:r>
+              <w:rPr>
+                <w:sz w:val="19"/>
+                <w:szCs w:val="19"/>
+              </w:rPr>
+              <w:t xml:space="preserve">1</w:t>
+            </w:r>
+          </w:p>
+        </w:tc>
+        <w:tc>
+          <w:tcPr>
+            <w:tcW w:type="dxa" w:w="2520"/>
+            <w:tcBorders>
+              <w:top w:val="single" w:color="C9D3DF" w:sz="4"/>
+              <w:left w:val="single" w:color="C9D3DF" w:sz="4"/>
+              <w:bottom w:val="single" w:color="C9D3DF" w:sz="4"/>
+              <w:right w:val="single" w:color="C9D3DF" w:sz="4"/>
+            </w:tcBorders>
+            <w:tcMar>
+              <w:top w:type="dxa" w:w="60"/>
+              <w:left w:type="dxa" w:w="100"/>
+              <w:bottom w:type="dxa" w:w="60"/>
+              <w:right w:type="dxa" w:w="100"/>
+            </w:tcMar>
+          </w:tcPr>
+          <w:p>
+            <w:r>
+              <w:rPr>
+                <w:sz w:val="19"/>
+                <w:szCs w:val="19"/>
+              </w:rPr>
+              <w:t xml:space="preserve">"Emily's problem" section</w:t>
+            </w:r>
+          </w:p>
+        </w:tc>
+      </w:tr>
+      <w:tr>
+        <w:trPr>
+          <w:tblHeader w:val="false"/>
+        </w:trPr>
+        <w:tc>
+          <w:tcPr>
+            <w:tcW w:type="dxa" w:w="2520"/>
+            <w:tcBorders>
+              <w:top w:val="single" w:color="C9D3DF" w:sz="4"/>
+              <w:left w:val="single" w:color="C9D3DF" w:sz="4"/>
+              <w:bottom w:val="single" w:color="C9D3DF" w:sz="4"/>
+              <w:right w:val="single" w:color="C9D3DF" w:sz="4"/>
+            </w:tcBorders>
+            <w:tcMar>
+              <w:top w:type="dxa" w:w="60"/>
+              <w:left w:type="dxa" w:w="100"/>
+              <w:bottom w:type="dxa" w:w="60"/>
+              <w:right w:type="dxa" w:w="100"/>
+            </w:tcMar>
+          </w:tcPr>
+          <w:p>
+            <w:r>
+              <w:rPr>
+                <w:sz w:val="19"/>
+                <w:szCs w:val="19"/>
+              </w:rPr>
+              <w:t xml:space="preserve">ai transcription</w:t>
+            </w:r>
+          </w:p>
+        </w:tc>
+        <w:tc>
+          <w:tcPr>
+            <w:tcW w:type="dxa" w:w="2520"/>
+            <w:tcBorders>
+              <w:top w:val="single" w:color="C9D3DF" w:sz="4"/>
+              <w:left w:val="single" w:color="C9D3DF" w:sz="4"/>
+              <w:bottom w:val="single" w:color="C9D3DF" w:sz="4"/>
+              <w:right w:val="single" w:color="C9D3DF" w:sz="4"/>
+            </w:tcBorders>
+            <w:tcMar>
+              <w:top w:type="dxa" w:w="60"/>
+              <w:left w:type="dxa" w:w="100"/>
+              <w:bottom w:type="dxa" w:w="60"/>
+              <w:right w:type="dxa" w:w="100"/>
+            </w:tcMar>
+          </w:tcPr>
+          <w:p>
+            <w:r>
+              <w:rPr>
+                <w:sz w:val="19"/>
+                <w:szCs w:val="19"/>
+              </w:rPr>
+              <w:t xml:space="preserve">5,400 (feature)</w:t>
+            </w:r>
+          </w:p>
+        </w:tc>
+        <w:tc>
+          <w:tcPr>
+            <w:tcW w:type="dxa" w:w="2520"/>
+            <w:tcBorders>
+              <w:top w:val="single" w:color="C9D3DF" w:sz="4"/>
+              <w:left w:val="single" w:color="C9D3DF" w:sz="4"/>
+              <w:bottom w:val="single" w:color="C9D3DF" w:sz="4"/>
+              <w:right w:val="single" w:color="C9D3DF" w:sz="4"/>
+            </w:tcBorders>
+            <w:tcMar>
+              <w:top w:type="dxa" w:w="60"/>
+              <w:left w:type="dxa" w:w="100"/>
+              <w:bottom w:type="dxa" w:w="60"/>
+              <w:right w:type="dxa" w:w="100"/>
+            </w:tcMar>
+          </w:tcPr>
+          <w:p>
+            <w:r>
+              <w:rPr>
+                <w:sz w:val="19"/>
+                <w:szCs w:val="19"/>
+              </w:rPr>
+              <w:t xml:space="preserve">1</w:t>
+            </w:r>
+          </w:p>
+        </w:tc>
+        <w:tc>
+          <w:tcPr>
+            <w:tcW w:type="dxa" w:w="2520"/>
+            <w:tcBorders>
+              <w:top w:val="single" w:color="C9D3DF" w:sz="4"/>
+              <w:left w:val="single" w:color="C9D3DF" w:sz="4"/>
+              <w:bottom w:val="single" w:color="C9D3DF" w:sz="4"/>
+              <w:right w:val="single" w:color="C9D3DF" w:sz="4"/>
+            </w:tcBorders>
+            <w:tcMar>
+              <w:top w:type="dxa" w:w="60"/>
+              <w:left w:type="dxa" w:w="100"/>
+              <w:bottom w:type="dxa" w:w="60"/>
+              <w:right w:type="dxa" w:w="100"/>
+            </w:tcMar>
+          </w:tcPr>
+          <w:p>
+            <w:r>
+              <w:rPr>
+                <w:sz w:val="19"/>
+                <w:szCs w:val="19"/>
+              </w:rPr>
+              <w:t xml:space="preserve">"How Lynkk helps Emily with field interviews" section</w:t>
+            </w:r>
+          </w:p>
+        </w:tc>
+      </w:tr>
     </w:tbl>
     <w:p>
       <w:pPr>
@@ -7706,7 +8578,7 @@
         <w:spacing w:after="140"/>
       </w:pPr>
       <w:r>
-        <w:t xml:space="preserve">Emily comes back with hours of audio. She has no time to listen to it again. And typing it out by hand would take days.</w:t>
+        <w:t xml:space="preserve">Emily comes back with hours of audio. She has no time to listen to it again. She needs a way to transcribe audio in two languages. Typing it out by hand would take days.</w:t>
       </w:r>
     </w:p>
     <w:p>
@@ -7767,7 +8639,7 @@
         <w:t xml:space="preserve">Then she reads, instead of listening again.</w:t>
       </w:r>
       <w:r>
-        <w:t xml:space="preserve"> She gets the text in Hindi and Hinglish, with each speaker labelled, plus the main points and open questions.</w:t>
+        <w:t xml:space="preserve"> Lynkk's AI transcription gives her the text in Hindi and Hinglish, with each speaker labelled, plus the main points and open questions.</w:t>
       </w:r>
     </w:p>
     <w:p>
@@ -8374,7 +9246,7 @@
       <w:r>
         <w:t xml:space="preserve">Your notes are private unless you share them. Your data is encrypted and stays in the region you choose. Lynkk never uses your recordings to train AI. </w:t>
       </w:r>
-      <w:hyperlink w:history="1" r:id="rIdxle-63maex6cg0ydra4cd">
+      <w:hyperlink w:history="1" r:id="rIdlws8tlf6gmajzjy6u-egg">
         <w:r>
           <w:rPr>
             <w:rStyle w:val="Hyperlink"/>
@@ -8596,7 +9468,7 @@
       <w:pPr>
         <w:spacing w:after="140"/>
       </w:pPr>
-      <w:hyperlink w:history="1" r:id="rIdagyqddrdqxaqvnimr0_kb">
+      <w:hyperlink w:history="1" r:id="rIdao6bvquh3nfxr6glimow_">
         <w:r>
           <w:rPr>
             <w:rStyle w:val="Hyperlink"/>
@@ -9458,6 +10330,224 @@
           </w:p>
         </w:tc>
       </w:tr>
+      <w:tr>
+        <w:trPr>
+          <w:tblHeader w:val="false"/>
+        </w:trPr>
+        <w:tc>
+          <w:tcPr>
+            <w:tcW w:type="dxa" w:w="2520"/>
+            <w:tcBorders>
+              <w:top w:val="single" w:color="C9D3DF" w:sz="4"/>
+              <w:left w:val="single" w:color="C9D3DF" w:sz="4"/>
+              <w:bottom w:val="single" w:color="C9D3DF" w:sz="4"/>
+              <w:right w:val="single" w:color="C9D3DF" w:sz="4"/>
+            </w:tcBorders>
+            <w:tcMar>
+              <w:top w:type="dxa" w:w="60"/>
+              <w:left w:type="dxa" w:w="100"/>
+              <w:bottom w:type="dxa" w:w="60"/>
+              <w:right w:type="dxa" w:w="100"/>
+            </w:tcMar>
+          </w:tcPr>
+          <w:p>
+            <w:r>
+              <w:rPr>
+                <w:sz w:val="19"/>
+                <w:szCs w:val="19"/>
+              </w:rPr>
+              <w:t xml:space="preserve">transcribe audio</w:t>
+            </w:r>
+          </w:p>
+        </w:tc>
+        <w:tc>
+          <w:tcPr>
+            <w:tcW w:type="dxa" w:w="2520"/>
+            <w:tcBorders>
+              <w:top w:val="single" w:color="C9D3DF" w:sz="4"/>
+              <w:left w:val="single" w:color="C9D3DF" w:sz="4"/>
+              <w:bottom w:val="single" w:color="C9D3DF" w:sz="4"/>
+              <w:right w:val="single" w:color="C9D3DF" w:sz="4"/>
+            </w:tcBorders>
+            <w:tcMar>
+              <w:top w:type="dxa" w:w="60"/>
+              <w:left w:type="dxa" w:w="100"/>
+              <w:bottom w:type="dxa" w:w="60"/>
+              <w:right w:type="dxa" w:w="100"/>
+            </w:tcMar>
+          </w:tcPr>
+          <w:p>
+            <w:r>
+              <w:rPr>
+                <w:sz w:val="19"/>
+                <w:szCs w:val="19"/>
+              </w:rPr>
+              <w:t xml:space="preserve">33,100 (feature)</w:t>
+            </w:r>
+          </w:p>
+        </w:tc>
+        <w:tc>
+          <w:tcPr>
+            <w:tcW w:type="dxa" w:w="2520"/>
+            <w:tcBorders>
+              <w:top w:val="single" w:color="C9D3DF" w:sz="4"/>
+              <w:left w:val="single" w:color="C9D3DF" w:sz="4"/>
+              <w:bottom w:val="single" w:color="C9D3DF" w:sz="4"/>
+              <w:right w:val="single" w:color="C9D3DF" w:sz="4"/>
+            </w:tcBorders>
+            <w:tcMar>
+              <w:top w:type="dxa" w:w="60"/>
+              <w:left w:type="dxa" w:w="100"/>
+              <w:bottom w:type="dxa" w:w="60"/>
+              <w:right w:type="dxa" w:w="100"/>
+            </w:tcMar>
+          </w:tcPr>
+          <w:p>
+            <w:r>
+              <w:rPr>
+                <w:sz w:val="19"/>
+                <w:szCs w:val="19"/>
+              </w:rPr>
+              <w:t xml:space="preserve">1</w:t>
+            </w:r>
+          </w:p>
+        </w:tc>
+        <w:tc>
+          <w:tcPr>
+            <w:tcW w:type="dxa" w:w="2520"/>
+            <w:tcBorders>
+              <w:top w:val="single" w:color="C9D3DF" w:sz="4"/>
+              <w:left w:val="single" w:color="C9D3DF" w:sz="4"/>
+              <w:bottom w:val="single" w:color="C9D3DF" w:sz="4"/>
+              <w:right w:val="single" w:color="C9D3DF" w:sz="4"/>
+            </w:tcBorders>
+            <w:tcMar>
+              <w:top w:type="dxa" w:w="60"/>
+              <w:left w:type="dxa" w:w="100"/>
+              <w:bottom w:type="dxa" w:w="60"/>
+              <w:right w:type="dxa" w:w="100"/>
+            </w:tcMar>
+          </w:tcPr>
+          <w:p>
+            <w:r>
+              <w:rPr>
+                <w:sz w:val="19"/>
+                <w:szCs w:val="19"/>
+              </w:rPr>
+              <w:t xml:space="preserve">"Ethan's problem" section</w:t>
+            </w:r>
+          </w:p>
+        </w:tc>
+      </w:tr>
+      <w:tr>
+        <w:trPr>
+          <w:tblHeader w:val="false"/>
+        </w:trPr>
+        <w:tc>
+          <w:tcPr>
+            <w:tcW w:type="dxa" w:w="2520"/>
+            <w:tcBorders>
+              <w:top w:val="single" w:color="C9D3DF" w:sz="4"/>
+              <w:left w:val="single" w:color="C9D3DF" w:sz="4"/>
+              <w:bottom w:val="single" w:color="C9D3DF" w:sz="4"/>
+              <w:right w:val="single" w:color="C9D3DF" w:sz="4"/>
+            </w:tcBorders>
+            <w:tcMar>
+              <w:top w:type="dxa" w:w="60"/>
+              <w:left w:type="dxa" w:w="100"/>
+              <w:bottom w:type="dxa" w:w="60"/>
+              <w:right w:type="dxa" w:w="100"/>
+            </w:tcMar>
+          </w:tcPr>
+          <w:p>
+            <w:r>
+              <w:rPr>
+                <w:sz w:val="19"/>
+                <w:szCs w:val="19"/>
+              </w:rPr>
+              <w:t xml:space="preserve">ai note taker</w:t>
+            </w:r>
+          </w:p>
+        </w:tc>
+        <w:tc>
+          <w:tcPr>
+            <w:tcW w:type="dxa" w:w="2520"/>
+            <w:tcBorders>
+              <w:top w:val="single" w:color="C9D3DF" w:sz="4"/>
+              <w:left w:val="single" w:color="C9D3DF" w:sz="4"/>
+              <w:bottom w:val="single" w:color="C9D3DF" w:sz="4"/>
+              <w:right w:val="single" w:color="C9D3DF" w:sz="4"/>
+            </w:tcBorders>
+            <w:tcMar>
+              <w:top w:type="dxa" w:w="60"/>
+              <w:left w:type="dxa" w:w="100"/>
+              <w:bottom w:type="dxa" w:w="60"/>
+              <w:right w:type="dxa" w:w="100"/>
+            </w:tcMar>
+          </w:tcPr>
+          <w:p>
+            <w:r>
+              <w:rPr>
+                <w:sz w:val="19"/>
+                <w:szCs w:val="19"/>
+              </w:rPr>
+              <w:t xml:space="preserve">27,100 (feature)</w:t>
+            </w:r>
+          </w:p>
+        </w:tc>
+        <w:tc>
+          <w:tcPr>
+            <w:tcW w:type="dxa" w:w="2520"/>
+            <w:tcBorders>
+              <w:top w:val="single" w:color="C9D3DF" w:sz="4"/>
+              <w:left w:val="single" w:color="C9D3DF" w:sz="4"/>
+              <w:bottom w:val="single" w:color="C9D3DF" w:sz="4"/>
+              <w:right w:val="single" w:color="C9D3DF" w:sz="4"/>
+            </w:tcBorders>
+            <w:tcMar>
+              <w:top w:type="dxa" w:w="60"/>
+              <w:left w:type="dxa" w:w="100"/>
+              <w:bottom w:type="dxa" w:w="60"/>
+              <w:right w:type="dxa" w:w="100"/>
+            </w:tcMar>
+          </w:tcPr>
+          <w:p>
+            <w:r>
+              <w:rPr>
+                <w:sz w:val="19"/>
+                <w:szCs w:val="19"/>
+              </w:rPr>
+              <w:t xml:space="preserve">2</w:t>
+            </w:r>
+          </w:p>
+        </w:tc>
+        <w:tc>
+          <w:tcPr>
+            <w:tcW w:type="dxa" w:w="2520"/>
+            <w:tcBorders>
+              <w:top w:val="single" w:color="C9D3DF" w:sz="4"/>
+              <w:left w:val="single" w:color="C9D3DF" w:sz="4"/>
+              <w:bottom w:val="single" w:color="C9D3DF" w:sz="4"/>
+              <w:right w:val="single" w:color="C9D3DF" w:sz="4"/>
+            </w:tcBorders>
+            <w:tcMar>
+              <w:top w:type="dxa" w:w="60"/>
+              <w:left w:type="dxa" w:w="100"/>
+              <w:bottom w:type="dxa" w:w="60"/>
+              <w:right w:type="dxa" w:w="100"/>
+            </w:tcMar>
+          </w:tcPr>
+          <w:p>
+            <w:r>
+              <w:rPr>
+                <w:sz w:val="19"/>
+                <w:szCs w:val="19"/>
+              </w:rPr>
+              <w:t xml:space="preserve">"How Lynkk helps Ethan record lectures" section, "Questions people ask" section</w:t>
+            </w:r>
+          </w:p>
+        </w:tc>
+      </w:tr>
     </w:tbl>
     <w:p>
       <w:pPr>
@@ -9738,7 +10828,7 @@
         <w:spacing w:after="140"/>
       </w:pPr>
       <w:r>
-        <w:t xml:space="preserve">When he writes, he misses the explanation. When he listens, he forgets it a week later. Before the exam, he opens his notes and they don't make sense. The one example he needs is somewhere in a 90-minute recording.</w:t>
+        <w:t xml:space="preserve">When he writes, he misses the explanation. When he listens, he forgets it a week later. Before the exam, he opens his notes and they don't make sense. The one example he needs is somewhere in a 90-minute recording. He once tried to transcribe audio from a class by hand. It took all weekend.</w:t>
       </w:r>
     </w:p>
     <w:p>
@@ -9784,7 +10874,7 @@
         <w:t xml:space="preserve">During class, Ethan just listens.</w:t>
       </w:r>
       <w:r>
-        <w:t xml:space="preserve"> He follows the explanation and asks questions. He doesn't try to write everything down.</w:t>
+        <w:t xml:space="preserve"> He follows the explanation and asks questions. Lynkk is his AI note taker, so he doesn't try to write everything down.</w:t>
       </w:r>
     </w:p>
     <w:p>
@@ -10624,7 +11714,7 @@
       <w:pPr>
         <w:spacing w:after="140"/>
       </w:pPr>
-      <w:hyperlink w:history="1" r:id="rIdqqzwohl26qcqtp8jhwrah">
+      <w:hyperlink w:history="1" r:id="rId-4pqez78rcesv5is-aiy-">
         <w:r>
           <w:rPr>
             <w:rStyle w:val="Hyperlink"/>
@@ -11268,6 +12358,224 @@
           </w:p>
         </w:tc>
       </w:tr>
+      <w:tr>
+        <w:trPr>
+          <w:tblHeader w:val="false"/>
+        </w:trPr>
+        <w:tc>
+          <w:tcPr>
+            <w:tcW w:type="dxa" w:w="2520"/>
+            <w:tcBorders>
+              <w:top w:val="single" w:color="C9D3DF" w:sz="4"/>
+              <w:left w:val="single" w:color="C9D3DF" w:sz="4"/>
+              <w:bottom w:val="single" w:color="C9D3DF" w:sz="4"/>
+              <w:right w:val="single" w:color="C9D3DF" w:sz="4"/>
+            </w:tcBorders>
+            <w:tcMar>
+              <w:top w:type="dxa" w:w="60"/>
+              <w:left w:type="dxa" w:w="100"/>
+              <w:bottom w:type="dxa" w:w="60"/>
+              <w:right w:type="dxa" w:w="100"/>
+            </w:tcMar>
+          </w:tcPr>
+          <w:p>
+            <w:r>
+              <w:rPr>
+                <w:sz w:val="19"/>
+                <w:szCs w:val="19"/>
+              </w:rPr>
+              <w:t xml:space="preserve">meeting recorder</w:t>
+            </w:r>
+          </w:p>
+        </w:tc>
+        <w:tc>
+          <w:tcPr>
+            <w:tcW w:type="dxa" w:w="2520"/>
+            <w:tcBorders>
+              <w:top w:val="single" w:color="C9D3DF" w:sz="4"/>
+              <w:left w:val="single" w:color="C9D3DF" w:sz="4"/>
+              <w:bottom w:val="single" w:color="C9D3DF" w:sz="4"/>
+              <w:right w:val="single" w:color="C9D3DF" w:sz="4"/>
+            </w:tcBorders>
+            <w:tcMar>
+              <w:top w:type="dxa" w:w="60"/>
+              <w:left w:type="dxa" w:w="100"/>
+              <w:bottom w:type="dxa" w:w="60"/>
+              <w:right w:type="dxa" w:w="100"/>
+            </w:tcMar>
+          </w:tcPr>
+          <w:p>
+            <w:r>
+              <w:rPr>
+                <w:sz w:val="19"/>
+                <w:szCs w:val="19"/>
+              </w:rPr>
+              <w:t xml:space="preserve">1,900 (feature)</w:t>
+            </w:r>
+          </w:p>
+        </w:tc>
+        <w:tc>
+          <w:tcPr>
+            <w:tcW w:type="dxa" w:w="2520"/>
+            <w:tcBorders>
+              <w:top w:val="single" w:color="C9D3DF" w:sz="4"/>
+              <w:left w:val="single" w:color="C9D3DF" w:sz="4"/>
+              <w:bottom w:val="single" w:color="C9D3DF" w:sz="4"/>
+              <w:right w:val="single" w:color="C9D3DF" w:sz="4"/>
+            </w:tcBorders>
+            <w:tcMar>
+              <w:top w:type="dxa" w:w="60"/>
+              <w:left w:type="dxa" w:w="100"/>
+              <w:bottom w:type="dxa" w:w="60"/>
+              <w:right w:type="dxa" w:w="100"/>
+            </w:tcMar>
+          </w:tcPr>
+          <w:p>
+            <w:r>
+              <w:rPr>
+                <w:sz w:val="19"/>
+                <w:szCs w:val="19"/>
+              </w:rPr>
+              <w:t xml:space="preserve">1</w:t>
+            </w:r>
+          </w:p>
+        </w:tc>
+        <w:tc>
+          <w:tcPr>
+            <w:tcW w:type="dxa" w:w="2520"/>
+            <w:tcBorders>
+              <w:top w:val="single" w:color="C9D3DF" w:sz="4"/>
+              <w:left w:val="single" w:color="C9D3DF" w:sz="4"/>
+              <w:bottom w:val="single" w:color="C9D3DF" w:sz="4"/>
+              <w:right w:val="single" w:color="C9D3DF" w:sz="4"/>
+            </w:tcBorders>
+            <w:tcMar>
+              <w:top w:type="dxa" w:w="60"/>
+              <w:left w:type="dxa" w:w="100"/>
+              <w:bottom w:type="dxa" w:w="60"/>
+              <w:right w:type="dxa" w:w="100"/>
+            </w:tcMar>
+          </w:tcPr>
+          <w:p>
+            <w:r>
+              <w:rPr>
+                <w:sz w:val="19"/>
+                <w:szCs w:val="19"/>
+              </w:rPr>
+              <w:t xml:space="preserve">"How Lynkk helps Sarah find the voice of customer" section</w:t>
+            </w:r>
+          </w:p>
+        </w:tc>
+      </w:tr>
+      <w:tr>
+        <w:trPr>
+          <w:tblHeader w:val="false"/>
+        </w:trPr>
+        <w:tc>
+          <w:tcPr>
+            <w:tcW w:type="dxa" w:w="2520"/>
+            <w:tcBorders>
+              <w:top w:val="single" w:color="C9D3DF" w:sz="4"/>
+              <w:left w:val="single" w:color="C9D3DF" w:sz="4"/>
+              <w:bottom w:val="single" w:color="C9D3DF" w:sz="4"/>
+              <w:right w:val="single" w:color="C9D3DF" w:sz="4"/>
+            </w:tcBorders>
+            <w:tcMar>
+              <w:top w:type="dxa" w:w="60"/>
+              <w:left w:type="dxa" w:w="100"/>
+              <w:bottom w:type="dxa" w:w="60"/>
+              <w:right w:type="dxa" w:w="100"/>
+            </w:tcMar>
+          </w:tcPr>
+          <w:p>
+            <w:r>
+              <w:rPr>
+                <w:sz w:val="19"/>
+                <w:szCs w:val="19"/>
+              </w:rPr>
+              <w:t xml:space="preserve">meeting summary</w:t>
+            </w:r>
+          </w:p>
+        </w:tc>
+        <w:tc>
+          <w:tcPr>
+            <w:tcW w:type="dxa" w:w="2520"/>
+            <w:tcBorders>
+              <w:top w:val="single" w:color="C9D3DF" w:sz="4"/>
+              <w:left w:val="single" w:color="C9D3DF" w:sz="4"/>
+              <w:bottom w:val="single" w:color="C9D3DF" w:sz="4"/>
+              <w:right w:val="single" w:color="C9D3DF" w:sz="4"/>
+            </w:tcBorders>
+            <w:tcMar>
+              <w:top w:type="dxa" w:w="60"/>
+              <w:left w:type="dxa" w:w="100"/>
+              <w:bottom w:type="dxa" w:w="60"/>
+              <w:right w:type="dxa" w:w="100"/>
+            </w:tcMar>
+          </w:tcPr>
+          <w:p>
+            <w:r>
+              <w:rPr>
+                <w:sz w:val="19"/>
+                <w:szCs w:val="19"/>
+              </w:rPr>
+              <w:t xml:space="preserve">390 (feature)</w:t>
+            </w:r>
+          </w:p>
+        </w:tc>
+        <w:tc>
+          <w:tcPr>
+            <w:tcW w:type="dxa" w:w="2520"/>
+            <w:tcBorders>
+              <w:top w:val="single" w:color="C9D3DF" w:sz="4"/>
+              <w:left w:val="single" w:color="C9D3DF" w:sz="4"/>
+              <w:bottom w:val="single" w:color="C9D3DF" w:sz="4"/>
+              <w:right w:val="single" w:color="C9D3DF" w:sz="4"/>
+            </w:tcBorders>
+            <w:tcMar>
+              <w:top w:type="dxa" w:w="60"/>
+              <w:left w:type="dxa" w:w="100"/>
+              <w:bottom w:type="dxa" w:w="60"/>
+              <w:right w:type="dxa" w:w="100"/>
+            </w:tcMar>
+          </w:tcPr>
+          <w:p>
+            <w:r>
+              <w:rPr>
+                <w:sz w:val="19"/>
+                <w:szCs w:val="19"/>
+              </w:rPr>
+              <w:t xml:space="preserve">1</w:t>
+            </w:r>
+          </w:p>
+        </w:tc>
+        <w:tc>
+          <w:tcPr>
+            <w:tcW w:type="dxa" w:w="2520"/>
+            <w:tcBorders>
+              <w:top w:val="single" w:color="C9D3DF" w:sz="4"/>
+              <w:left w:val="single" w:color="C9D3DF" w:sz="4"/>
+              <w:bottom w:val="single" w:color="C9D3DF" w:sz="4"/>
+              <w:right w:val="single" w:color="C9D3DF" w:sz="4"/>
+            </w:tcBorders>
+            <w:tcMar>
+              <w:top w:type="dxa" w:w="60"/>
+              <w:left w:type="dxa" w:w="100"/>
+              <w:bottom w:type="dxa" w:w="60"/>
+              <w:right w:type="dxa" w:w="100"/>
+            </w:tcMar>
+          </w:tcPr>
+          <w:p>
+            <w:r>
+              <w:rPr>
+                <w:sz w:val="19"/>
+                <w:szCs w:val="19"/>
+              </w:rPr>
+              <w:t xml:space="preserve">"How Lynkk helps Sarah find the voice of customer" section</w:t>
+            </w:r>
+          </w:p>
+        </w:tc>
+      </w:tr>
     </w:tbl>
     <w:p>
       <w:pPr>
@@ -11564,7 +12872,7 @@
         <w:spacing w:after="140"/>
       </w:pPr>
       <w:r>
-        <w:t xml:space="preserve">Sarah's team starts recording customer calls with Lynkk. Here is what changes.</w:t>
+        <w:t xml:space="preserve">Sarah's team starts using Lynkk as the meeting recorder for customer calls. Here is what changes.</w:t>
       </w:r>
     </w:p>
     <w:p>
@@ -11579,7 +12887,7 @@
         <w:t xml:space="preserve">First, every customer call is recorded.</w:t>
       </w:r>
       <w:r>
-        <w:t xml:space="preserve"> Sales calls, interviews and a focus group in the office. Lynkk writes the notes for each one.</w:t>
+        <w:t xml:space="preserve"> Sales calls, interviews and a focus group in the office. Lynkk writes a meeting summary for each one.</w:t>
       </w:r>
     </w:p>
     <w:p>
@@ -12172,7 +13480,7 @@
       <w:r>
         <w:t xml:space="preserve">Notes are private unless you share them. Your data is encrypted and stays in the region you choose. Lynkk never uses your calls to train AI. </w:t>
       </w:r>
-      <w:hyperlink w:history="1" r:id="rIdvy4hj19o4zwotab3dfule">
+      <w:hyperlink w:history="1" r:id="rIdnxacmpltajzwnt3qbkgbl">
         <w:r>
           <w:rPr>
             <w:rStyle w:val="Hyperlink"/>
@@ -12394,7 +13702,7 @@
       <w:pPr>
         <w:spacing w:after="140"/>
       </w:pPr>
-      <w:hyperlink w:history="1" r:id="rIdyzwh4g5ht9junx_yhgznd">
+      <w:hyperlink w:history="1" r:id="rIdkfqptd-nyd2yu1dgbncg2">
         <w:r>
           <w:rPr>
             <w:rStyle w:val="Hyperlink"/>
@@ -13038,6 +14346,115 @@
           </w:p>
         </w:tc>
       </w:tr>
+      <w:tr>
+        <w:trPr>
+          <w:tblHeader w:val="false"/>
+        </w:trPr>
+        <w:tc>
+          <w:tcPr>
+            <w:tcW w:type="dxa" w:w="2520"/>
+            <w:tcBorders>
+              <w:top w:val="single" w:color="C9D3DF" w:sz="4"/>
+              <w:left w:val="single" w:color="C9D3DF" w:sz="4"/>
+              <w:bottom w:val="single" w:color="C9D3DF" w:sz="4"/>
+              <w:right w:val="single" w:color="C9D3DF" w:sz="4"/>
+            </w:tcBorders>
+            <w:tcMar>
+              <w:top w:type="dxa" w:w="60"/>
+              <w:left w:type="dxa" w:w="100"/>
+              <w:bottom w:type="dxa" w:w="60"/>
+              <w:right w:type="dxa" w:w="100"/>
+            </w:tcMar>
+          </w:tcPr>
+          <w:p>
+            <w:r>
+              <w:rPr>
+                <w:sz w:val="19"/>
+                <w:szCs w:val="19"/>
+              </w:rPr>
+              <w:t xml:space="preserve">meeting transcription</w:t>
+            </w:r>
+          </w:p>
+        </w:tc>
+        <w:tc>
+          <w:tcPr>
+            <w:tcW w:type="dxa" w:w="2520"/>
+            <w:tcBorders>
+              <w:top w:val="single" w:color="C9D3DF" w:sz="4"/>
+              <w:left w:val="single" w:color="C9D3DF" w:sz="4"/>
+              <w:bottom w:val="single" w:color="C9D3DF" w:sz="4"/>
+              <w:right w:val="single" w:color="C9D3DF" w:sz="4"/>
+            </w:tcBorders>
+            <w:tcMar>
+              <w:top w:type="dxa" w:w="60"/>
+              <w:left w:type="dxa" w:w="100"/>
+              <w:bottom w:type="dxa" w:w="60"/>
+              <w:right w:type="dxa" w:w="100"/>
+            </w:tcMar>
+          </w:tcPr>
+          <w:p>
+            <w:r>
+              <w:rPr>
+                <w:sz w:val="19"/>
+                <w:szCs w:val="19"/>
+              </w:rPr>
+              <w:t xml:space="preserve">480 (feature)</w:t>
+            </w:r>
+          </w:p>
+        </w:tc>
+        <w:tc>
+          <w:tcPr>
+            <w:tcW w:type="dxa" w:w="2520"/>
+            <w:tcBorders>
+              <w:top w:val="single" w:color="C9D3DF" w:sz="4"/>
+              <w:left w:val="single" w:color="C9D3DF" w:sz="4"/>
+              <w:bottom w:val="single" w:color="C9D3DF" w:sz="4"/>
+              <w:right w:val="single" w:color="C9D3DF" w:sz="4"/>
+            </w:tcBorders>
+            <w:tcMar>
+              <w:top w:type="dxa" w:w="60"/>
+              <w:left w:type="dxa" w:w="100"/>
+              <w:bottom w:type="dxa" w:w="60"/>
+              <w:right w:type="dxa" w:w="100"/>
+            </w:tcMar>
+          </w:tcPr>
+          <w:p>
+            <w:r>
+              <w:rPr>
+                <w:sz w:val="19"/>
+                <w:szCs w:val="19"/>
+              </w:rPr>
+              <w:t xml:space="preserve">1</w:t>
+            </w:r>
+          </w:p>
+        </w:tc>
+        <w:tc>
+          <w:tcPr>
+            <w:tcW w:type="dxa" w:w="2520"/>
+            <w:tcBorders>
+              <w:top w:val="single" w:color="C9D3DF" w:sz="4"/>
+              <w:left w:val="single" w:color="C9D3DF" w:sz="4"/>
+              <w:bottom w:val="single" w:color="C9D3DF" w:sz="4"/>
+              <w:right w:val="single" w:color="C9D3DF" w:sz="4"/>
+            </w:tcBorders>
+            <w:tcMar>
+              <w:top w:type="dxa" w:w="60"/>
+              <w:left w:type="dxa" w:w="100"/>
+              <w:bottom w:type="dxa" w:w="60"/>
+              <w:right w:type="dxa" w:w="100"/>
+            </w:tcMar>
+          </w:tcPr>
+          <w:p>
+            <w:r>
+              <w:rPr>
+                <w:sz w:val="19"/>
+                <w:szCs w:val="19"/>
+              </w:rPr>
+              <w:t xml:space="preserve">"Laura's problem" section</w:t>
+            </w:r>
+          </w:p>
+        </w:tc>
+      </w:tr>
     </w:tbl>
     <w:p>
       <w:pPr>
@@ -13318,7 +14735,7 @@
         <w:spacing w:after="140"/>
       </w:pPr>
       <w:r>
-        <w:t xml:space="preserve">So she writes while the client talks. She looks at her notepad more than at the client. Later, she can't read half of what she wrote. Was the notice sent on the 2nd or the 12th?</w:t>
+        <w:t xml:space="preserve">So she writes while the client talks. She looks at her notepad more than at the client. Later, she can't read half of what she wrote. She tried meeting transcription once, but she got pages of text and still had to dig out the facts. Was the notice sent on the 2nd or the 12th?</w:t>
       </w:r>
     </w:p>
     <w:p>
@@ -13957,7 +15374,7 @@
       <w:r>
         <w:t xml:space="preserve">Notes are private unless you share them. Your data is encrypted. Lynkk never uses your meetings to train AI. </w:t>
       </w:r>
-      <w:hyperlink w:history="1" r:id="rIdnvntxya6jbdpsx4gnifuu">
+      <w:hyperlink w:history="1" r:id="rIddx7g0hclwfouiabiwgmka">
         <w:r>
           <w:rPr>
             <w:rStyle w:val="Hyperlink"/>
@@ -14179,7 +15596,7 @@
       <w:pPr>
         <w:spacing w:after="140"/>
       </w:pPr>
-      <w:hyperlink w:history="1" r:id="rIdbpuifxj6el6r439yllr-f">
+      <w:hyperlink w:history="1" r:id="rId797tgirkilvwcvvwvra21">
         <w:r>
           <w:rPr>
             <w:rStyle w:val="Hyperlink"/>
@@ -14215,7 +15632,7 @@
       <w:r>
         <w:t xml:space="preserve">No. Lynkk writes notes and text for your own work. It isn't a certified court transcript. See our guide to </w:t>
       </w:r>
-      <w:hyperlink w:history="1" r:id="rIdbh8xrvbtwaef_2ak0ddhp">
+      <w:hyperlink w:history="1" r:id="rIdh77ctbatuaf4zh3t3wgzm">
         <w:r>
           <w:rPr>
             <w:rStyle w:val="Hyperlink"/>
@@ -14834,6 +16251,224 @@
           </w:p>
         </w:tc>
       </w:tr>
+      <w:tr>
+        <w:trPr>
+          <w:tblHeader w:val="false"/>
+        </w:trPr>
+        <w:tc>
+          <w:tcPr>
+            <w:tcW w:type="dxa" w:w="2520"/>
+            <w:tcBorders>
+              <w:top w:val="single" w:color="C9D3DF" w:sz="4"/>
+              <w:left w:val="single" w:color="C9D3DF" w:sz="4"/>
+              <w:bottom w:val="single" w:color="C9D3DF" w:sz="4"/>
+              <w:right w:val="single" w:color="C9D3DF" w:sz="4"/>
+            </w:tcBorders>
+            <w:tcMar>
+              <w:top w:type="dxa" w:w="60"/>
+              <w:left w:type="dxa" w:w="100"/>
+              <w:bottom w:type="dxa" w:w="60"/>
+              <w:right w:type="dxa" w:w="100"/>
+            </w:tcMar>
+          </w:tcPr>
+          <w:p>
+            <w:r>
+              <w:rPr>
+                <w:sz w:val="19"/>
+                <w:szCs w:val="19"/>
+              </w:rPr>
+              <w:t xml:space="preserve">ai meeting assistant</w:t>
+            </w:r>
+          </w:p>
+        </w:tc>
+        <w:tc>
+          <w:tcPr>
+            <w:tcW w:type="dxa" w:w="2520"/>
+            <w:tcBorders>
+              <w:top w:val="single" w:color="C9D3DF" w:sz="4"/>
+              <w:left w:val="single" w:color="C9D3DF" w:sz="4"/>
+              <w:bottom w:val="single" w:color="C9D3DF" w:sz="4"/>
+              <w:right w:val="single" w:color="C9D3DF" w:sz="4"/>
+            </w:tcBorders>
+            <w:tcMar>
+              <w:top w:type="dxa" w:w="60"/>
+              <w:left w:type="dxa" w:w="100"/>
+              <w:bottom w:type="dxa" w:w="60"/>
+              <w:right w:type="dxa" w:w="100"/>
+            </w:tcMar>
+          </w:tcPr>
+          <w:p>
+            <w:r>
+              <w:rPr>
+                <w:sz w:val="19"/>
+                <w:szCs w:val="19"/>
+              </w:rPr>
+              <w:t xml:space="preserve">4,400 (feature)</w:t>
+            </w:r>
+          </w:p>
+        </w:tc>
+        <w:tc>
+          <w:tcPr>
+            <w:tcW w:type="dxa" w:w="2520"/>
+            <w:tcBorders>
+              <w:top w:val="single" w:color="C9D3DF" w:sz="4"/>
+              <w:left w:val="single" w:color="C9D3DF" w:sz="4"/>
+              <w:bottom w:val="single" w:color="C9D3DF" w:sz="4"/>
+              <w:right w:val="single" w:color="C9D3DF" w:sz="4"/>
+            </w:tcBorders>
+            <w:tcMar>
+              <w:top w:type="dxa" w:w="60"/>
+              <w:left w:type="dxa" w:w="100"/>
+              <w:bottom w:type="dxa" w:w="60"/>
+              <w:right w:type="dxa" w:w="100"/>
+            </w:tcMar>
+          </w:tcPr>
+          <w:p>
+            <w:r>
+              <w:rPr>
+                <w:sz w:val="19"/>
+                <w:szCs w:val="19"/>
+              </w:rPr>
+              <w:t xml:space="preserve">1</w:t>
+            </w:r>
+          </w:p>
+        </w:tc>
+        <w:tc>
+          <w:tcPr>
+            <w:tcW w:type="dxa" w:w="2520"/>
+            <w:tcBorders>
+              <w:top w:val="single" w:color="C9D3DF" w:sz="4"/>
+              <w:left w:val="single" w:color="C9D3DF" w:sz="4"/>
+              <w:bottom w:val="single" w:color="C9D3DF" w:sz="4"/>
+              <w:right w:val="single" w:color="C9D3DF" w:sz="4"/>
+            </w:tcBorders>
+            <w:tcMar>
+              <w:top w:type="dxa" w:w="60"/>
+              <w:left w:type="dxa" w:w="100"/>
+              <w:bottom w:type="dxa" w:w="60"/>
+              <w:right w:type="dxa" w:w="100"/>
+            </w:tcMar>
+          </w:tcPr>
+          <w:p>
+            <w:r>
+              <w:rPr>
+                <w:sz w:val="19"/>
+                <w:szCs w:val="19"/>
+              </w:rPr>
+              <w:t xml:space="preserve">"How Lynkk helps Sam with 1 on 1 meetings" section</w:t>
+            </w:r>
+          </w:p>
+        </w:tc>
+      </w:tr>
+      <w:tr>
+        <w:trPr>
+          <w:tblHeader w:val="false"/>
+        </w:trPr>
+        <w:tc>
+          <w:tcPr>
+            <w:tcW w:type="dxa" w:w="2520"/>
+            <w:tcBorders>
+              <w:top w:val="single" w:color="C9D3DF" w:sz="4"/>
+              <w:left w:val="single" w:color="C9D3DF" w:sz="4"/>
+              <w:bottom w:val="single" w:color="C9D3DF" w:sz="4"/>
+              <w:right w:val="single" w:color="C9D3DF" w:sz="4"/>
+            </w:tcBorders>
+            <w:tcMar>
+              <w:top w:type="dxa" w:w="60"/>
+              <w:left w:type="dxa" w:w="100"/>
+              <w:bottom w:type="dxa" w:w="60"/>
+              <w:right w:type="dxa" w:w="100"/>
+            </w:tcMar>
+          </w:tcPr>
+          <w:p>
+            <w:r>
+              <w:rPr>
+                <w:sz w:val="19"/>
+                <w:szCs w:val="19"/>
+              </w:rPr>
+              <w:t xml:space="preserve">action items</w:t>
+            </w:r>
+          </w:p>
+        </w:tc>
+        <w:tc>
+          <w:tcPr>
+            <w:tcW w:type="dxa" w:w="2520"/>
+            <w:tcBorders>
+              <w:top w:val="single" w:color="C9D3DF" w:sz="4"/>
+              <w:left w:val="single" w:color="C9D3DF" w:sz="4"/>
+              <w:bottom w:val="single" w:color="C9D3DF" w:sz="4"/>
+              <w:right w:val="single" w:color="C9D3DF" w:sz="4"/>
+            </w:tcBorders>
+            <w:tcMar>
+              <w:top w:type="dxa" w:w="60"/>
+              <w:left w:type="dxa" w:w="100"/>
+              <w:bottom w:type="dxa" w:w="60"/>
+              <w:right w:type="dxa" w:w="100"/>
+            </w:tcMar>
+          </w:tcPr>
+          <w:p>
+            <w:r>
+              <w:rPr>
+                <w:sz w:val="19"/>
+                <w:szCs w:val="19"/>
+              </w:rPr>
+              <w:t xml:space="preserve">2,900 (feature)</w:t>
+            </w:r>
+          </w:p>
+        </w:tc>
+        <w:tc>
+          <w:tcPr>
+            <w:tcW w:type="dxa" w:w="2520"/>
+            <w:tcBorders>
+              <w:top w:val="single" w:color="C9D3DF" w:sz="4"/>
+              <w:left w:val="single" w:color="C9D3DF" w:sz="4"/>
+              <w:bottom w:val="single" w:color="C9D3DF" w:sz="4"/>
+              <w:right w:val="single" w:color="C9D3DF" w:sz="4"/>
+            </w:tcBorders>
+            <w:tcMar>
+              <w:top w:type="dxa" w:w="60"/>
+              <w:left w:type="dxa" w:w="100"/>
+              <w:bottom w:type="dxa" w:w="60"/>
+              <w:right w:type="dxa" w:w="100"/>
+            </w:tcMar>
+          </w:tcPr>
+          <w:p>
+            <w:r>
+              <w:rPr>
+                <w:sz w:val="19"/>
+                <w:szCs w:val="19"/>
+              </w:rPr>
+              <w:t xml:space="preserve">1</w:t>
+            </w:r>
+          </w:p>
+        </w:tc>
+        <w:tc>
+          <w:tcPr>
+            <w:tcW w:type="dxa" w:w="2520"/>
+            <w:tcBorders>
+              <w:top w:val="single" w:color="C9D3DF" w:sz="4"/>
+              <w:left w:val="single" w:color="C9D3DF" w:sz="4"/>
+              <w:bottom w:val="single" w:color="C9D3DF" w:sz="4"/>
+              <w:right w:val="single" w:color="C9D3DF" w:sz="4"/>
+            </w:tcBorders>
+            <w:tcMar>
+              <w:top w:type="dxa" w:w="60"/>
+              <w:left w:type="dxa" w:w="100"/>
+              <w:bottom w:type="dxa" w:w="60"/>
+              <w:right w:type="dxa" w:w="100"/>
+            </w:tcMar>
+          </w:tcPr>
+          <w:p>
+            <w:r>
+              <w:rPr>
+                <w:sz w:val="19"/>
+                <w:szCs w:val="19"/>
+              </w:rPr>
+              <w:t xml:space="preserve">"How Lynkk helps Sam with 1 on 1 meetings" section</w:t>
+            </w:r>
+          </w:p>
+        </w:tc>
+      </w:tr>
     </w:tbl>
     <w:p>
       <w:pPr>
@@ -15142,7 +16777,7 @@
           <w:b/>
           <w:bCs/>
         </w:rPr>
-        <w:t xml:space="preserve">Before the 1:1, Sam asks Lynkk.</w:t>
+        <w:t xml:space="preserve">Before the 1:1, Sam asks Lynkk, his AI meeting assistant.</w:t>
       </w:r>
       <w:r>
         <w:t xml:space="preserve"> "What did Olivia and I agree last month?" Lynkk shows the answer, with a link to the moment it was said.</w:t>
@@ -15175,7 +16810,7 @@
         <w:t xml:space="preserve">After the 1:1, the note is ready.</w:t>
       </w:r>
       <w:r>
-        <w:t xml:space="preserve"> Lynkk writes the wins, the problems, and the tasks with names and dates.</w:t>
+        <w:t xml:space="preserve"> Lynkk writes the wins, the problems, and the action items with names and dates.</w:t>
       </w:r>
     </w:p>
     <w:p>
@@ -15269,7 +16904,7 @@
       <w:r>
         <w:t xml:space="preserve">New to 1:1s? Read our guide to the </w:t>
       </w:r>
-      <w:hyperlink w:history="1" r:id="rIdxk_a1cphcbxm70gcy_kfr">
+      <w:hyperlink w:history="1" r:id="rIddtuu0rmgxwixiusn_uo67">
         <w:r>
           <w:rPr>
             <w:rStyle w:val="Hyperlink"/>
@@ -15779,7 +17414,7 @@
       <w:r>
         <w:t xml:space="preserve">1:1 notes are private unless you share them. Your data is encrypted and stays in the region you choose. Lynkk never uses your meetings to train AI. </w:t>
       </w:r>
-      <w:hyperlink w:history="1" r:id="rIdkkzamn78svnbojtmlhmn5">
+      <w:hyperlink w:history="1" r:id="rIdioxkm83zftnsbedpt7ty5">
         <w:r>
           <w:rPr>
             <w:rStyle w:val="Hyperlink"/>
@@ -16001,7 +17636,7 @@
       <w:pPr>
         <w:spacing w:after="140"/>
       </w:pPr>
-      <w:hyperlink w:history="1" r:id="rIdmfmk4czanfbiqy0shxn6d">
+      <w:hyperlink w:history="1" r:id="rIdzjhjrsj3_3pe2bvqq0nmy">
         <w:r>
           <w:rPr>
             <w:rStyle w:val="Hyperlink"/>
@@ -16645,6 +18280,224 @@
           </w:p>
         </w:tc>
       </w:tr>
+      <w:tr>
+        <w:trPr>
+          <w:tblHeader w:val="false"/>
+        </w:trPr>
+        <w:tc>
+          <w:tcPr>
+            <w:tcW w:type="dxa" w:w="2520"/>
+            <w:tcBorders>
+              <w:top w:val="single" w:color="C9D3DF" w:sz="4"/>
+              <w:left w:val="single" w:color="C9D3DF" w:sz="4"/>
+              <w:bottom w:val="single" w:color="C9D3DF" w:sz="4"/>
+              <w:right w:val="single" w:color="C9D3DF" w:sz="4"/>
+            </w:tcBorders>
+            <w:tcMar>
+              <w:top w:type="dxa" w:w="60"/>
+              <w:left w:type="dxa" w:w="100"/>
+              <w:bottom w:type="dxa" w:w="60"/>
+              <w:right w:type="dxa" w:w="100"/>
+            </w:tcMar>
+          </w:tcPr>
+          <w:p>
+            <w:r>
+              <w:rPr>
+                <w:sz w:val="19"/>
+                <w:szCs w:val="19"/>
+              </w:rPr>
+              <w:t xml:space="preserve">meeting notes</w:t>
+            </w:r>
+          </w:p>
+        </w:tc>
+        <w:tc>
+          <w:tcPr>
+            <w:tcW w:type="dxa" w:w="2520"/>
+            <w:tcBorders>
+              <w:top w:val="single" w:color="C9D3DF" w:sz="4"/>
+              <w:left w:val="single" w:color="C9D3DF" w:sz="4"/>
+              <w:bottom w:val="single" w:color="C9D3DF" w:sz="4"/>
+              <w:right w:val="single" w:color="C9D3DF" w:sz="4"/>
+            </w:tcBorders>
+            <w:tcMar>
+              <w:top w:type="dxa" w:w="60"/>
+              <w:left w:type="dxa" w:w="100"/>
+              <w:bottom w:type="dxa" w:w="60"/>
+              <w:right w:type="dxa" w:w="100"/>
+            </w:tcMar>
+          </w:tcPr>
+          <w:p>
+            <w:r>
+              <w:rPr>
+                <w:sz w:val="19"/>
+                <w:szCs w:val="19"/>
+              </w:rPr>
+              <w:t xml:space="preserve">3,600 (feature)</w:t>
+            </w:r>
+          </w:p>
+        </w:tc>
+        <w:tc>
+          <w:tcPr>
+            <w:tcW w:type="dxa" w:w="2520"/>
+            <w:tcBorders>
+              <w:top w:val="single" w:color="C9D3DF" w:sz="4"/>
+              <w:left w:val="single" w:color="C9D3DF" w:sz="4"/>
+              <w:bottom w:val="single" w:color="C9D3DF" w:sz="4"/>
+              <w:right w:val="single" w:color="C9D3DF" w:sz="4"/>
+            </w:tcBorders>
+            <w:tcMar>
+              <w:top w:type="dxa" w:w="60"/>
+              <w:left w:type="dxa" w:w="100"/>
+              <w:bottom w:type="dxa" w:w="60"/>
+              <w:right w:type="dxa" w:w="100"/>
+            </w:tcMar>
+          </w:tcPr>
+          <w:p>
+            <w:r>
+              <w:rPr>
+                <w:sz w:val="19"/>
+                <w:szCs w:val="19"/>
+              </w:rPr>
+              <w:t xml:space="preserve">1</w:t>
+            </w:r>
+          </w:p>
+        </w:tc>
+        <w:tc>
+          <w:tcPr>
+            <w:tcW w:type="dxa" w:w="2520"/>
+            <w:tcBorders>
+              <w:top w:val="single" w:color="C9D3DF" w:sz="4"/>
+              <w:left w:val="single" w:color="C9D3DF" w:sz="4"/>
+              <w:bottom w:val="single" w:color="C9D3DF" w:sz="4"/>
+              <w:right w:val="single" w:color="C9D3DF" w:sz="4"/>
+            </w:tcBorders>
+            <w:tcMar>
+              <w:top w:type="dxa" w:w="60"/>
+              <w:left w:type="dxa" w:w="100"/>
+              <w:bottom w:type="dxa" w:w="60"/>
+              <w:right w:type="dxa" w:w="100"/>
+            </w:tcMar>
+          </w:tcPr>
+          <w:p>
+            <w:r>
+              <w:rPr>
+                <w:sz w:val="19"/>
+                <w:szCs w:val="19"/>
+              </w:rPr>
+              <w:t xml:space="preserve">"Chris's problem" section</w:t>
+            </w:r>
+          </w:p>
+        </w:tc>
+      </w:tr>
+      <w:tr>
+        <w:trPr>
+          <w:tblHeader w:val="false"/>
+        </w:trPr>
+        <w:tc>
+          <w:tcPr>
+            <w:tcW w:type="dxa" w:w="2520"/>
+            <w:tcBorders>
+              <w:top w:val="single" w:color="C9D3DF" w:sz="4"/>
+              <w:left w:val="single" w:color="C9D3DF" w:sz="4"/>
+              <w:bottom w:val="single" w:color="C9D3DF" w:sz="4"/>
+              <w:right w:val="single" w:color="C9D3DF" w:sz="4"/>
+            </w:tcBorders>
+            <w:tcMar>
+              <w:top w:type="dxa" w:w="60"/>
+              <w:left w:type="dxa" w:w="100"/>
+              <w:bottom w:type="dxa" w:w="60"/>
+              <w:right w:type="dxa" w:w="100"/>
+            </w:tcMar>
+          </w:tcPr>
+          <w:p>
+            <w:r>
+              <w:rPr>
+                <w:sz w:val="19"/>
+                <w:szCs w:val="19"/>
+              </w:rPr>
+              <w:t xml:space="preserve">ai note taker</w:t>
+            </w:r>
+          </w:p>
+        </w:tc>
+        <w:tc>
+          <w:tcPr>
+            <w:tcW w:type="dxa" w:w="2520"/>
+            <w:tcBorders>
+              <w:top w:val="single" w:color="C9D3DF" w:sz="4"/>
+              <w:left w:val="single" w:color="C9D3DF" w:sz="4"/>
+              <w:bottom w:val="single" w:color="C9D3DF" w:sz="4"/>
+              <w:right w:val="single" w:color="C9D3DF" w:sz="4"/>
+            </w:tcBorders>
+            <w:tcMar>
+              <w:top w:type="dxa" w:w="60"/>
+              <w:left w:type="dxa" w:w="100"/>
+              <w:bottom w:type="dxa" w:w="60"/>
+              <w:right w:type="dxa" w:w="100"/>
+            </w:tcMar>
+          </w:tcPr>
+          <w:p>
+            <w:r>
+              <w:rPr>
+                <w:sz w:val="19"/>
+                <w:szCs w:val="19"/>
+              </w:rPr>
+              <w:t xml:space="preserve">27,100 (feature)</w:t>
+            </w:r>
+          </w:p>
+        </w:tc>
+        <w:tc>
+          <w:tcPr>
+            <w:tcW w:type="dxa" w:w="2520"/>
+            <w:tcBorders>
+              <w:top w:val="single" w:color="C9D3DF" w:sz="4"/>
+              <w:left w:val="single" w:color="C9D3DF" w:sz="4"/>
+              <w:bottom w:val="single" w:color="C9D3DF" w:sz="4"/>
+              <w:right w:val="single" w:color="C9D3DF" w:sz="4"/>
+            </w:tcBorders>
+            <w:tcMar>
+              <w:top w:type="dxa" w:w="60"/>
+              <w:left w:type="dxa" w:w="100"/>
+              <w:bottom w:type="dxa" w:w="60"/>
+              <w:right w:type="dxa" w:w="100"/>
+            </w:tcMar>
+          </w:tcPr>
+          <w:p>
+            <w:r>
+              <w:rPr>
+                <w:sz w:val="19"/>
+                <w:szCs w:val="19"/>
+              </w:rPr>
+              <w:t xml:space="preserve">1</w:t>
+            </w:r>
+          </w:p>
+        </w:tc>
+        <w:tc>
+          <w:tcPr>
+            <w:tcW w:type="dxa" w:w="2520"/>
+            <w:tcBorders>
+              <w:top w:val="single" w:color="C9D3DF" w:sz="4"/>
+              <w:left w:val="single" w:color="C9D3DF" w:sz="4"/>
+              <w:bottom w:val="single" w:color="C9D3DF" w:sz="4"/>
+              <w:right w:val="single" w:color="C9D3DF" w:sz="4"/>
+            </w:tcBorders>
+            <w:tcMar>
+              <w:top w:type="dxa" w:w="60"/>
+              <w:left w:type="dxa" w:w="100"/>
+              <w:bottom w:type="dxa" w:w="60"/>
+              <w:right w:type="dxa" w:w="100"/>
+            </w:tcMar>
+          </w:tcPr>
+          <w:p>
+            <w:r>
+              <w:rPr>
+                <w:sz w:val="19"/>
+                <w:szCs w:val="19"/>
+              </w:rPr>
+              <w:t xml:space="preserve">"How Lynkk helps Chris remember every client" section</w:t>
+            </w:r>
+          </w:p>
+        </w:tc>
+      </w:tr>
     </w:tbl>
     <w:p>
       <w:pPr>
@@ -16925,7 +18778,7 @@
         <w:spacing w:after="140"/>
       </w:pPr>
       <w:r>
-        <w:t xml:space="preserve">After many calls, Chris mixes them up. He sends the Johnsons a house with a garden but no school nearby. They are disappointed. Chris looks like he wasn't listening, but he just couldn't remember everything.</w:t>
+        <w:t xml:space="preserve">After many calls with no meeting notes, Chris mixes them up. He sends the Johnsons a house with a garden but no school nearby. They are disappointed. Chris looks like he wasn't listening, but he just couldn't remember everything.</w:t>
       </w:r>
     </w:p>
     <w:p>
@@ -16971,7 +18824,7 @@
         <w:t xml:space="preserve">During the meeting, Chris just listens.</w:t>
       </w:r>
       <w:r>
-        <w:t xml:space="preserve"> He records with the Lynkk Mac app in his office, or on a video call. He doesn't write anything down.</w:t>
+        <w:t xml:space="preserve"> He records with the Lynkk Mac app in his office, or on a video call. Lynkk is his AI note taker, so he doesn't write anything down.</w:t>
       </w:r>
     </w:p>
     <w:p>
@@ -17572,7 +19425,7 @@
       <w:r>
         <w:t xml:space="preserve">Notes are private unless you share them. Your data is encrypted and stays in the region you choose. Lynkk never uses your calls to train AI. </w:t>
       </w:r>
-      <w:hyperlink w:history="1" r:id="rIdh-4dddwlpq2hzk7zeo5s5">
+      <w:hyperlink w:history="1" r:id="rIduec_ar8kppbzt5arc0dcb">
         <w:r>
           <w:rPr>
             <w:rStyle w:val="Hyperlink"/>
@@ -17794,7 +19647,7 @@
       <w:pPr>
         <w:spacing w:after="140"/>
       </w:pPr>
-      <w:hyperlink w:history="1" r:id="rIdgt0ybygx1dno6dvvgjhjr">
+      <w:hyperlink w:history="1" r:id="rIdeiyj2wecyyzsmzlqq2l4d">
         <w:r>
           <w:rPr>
             <w:rStyle w:val="Hyperlink"/>
@@ -18547,6 +20400,115 @@
           </w:p>
         </w:tc>
       </w:tr>
+      <w:tr>
+        <w:trPr>
+          <w:tblHeader w:val="false"/>
+        </w:trPr>
+        <w:tc>
+          <w:tcPr>
+            <w:tcW w:type="dxa" w:w="2520"/>
+            <w:tcBorders>
+              <w:top w:val="single" w:color="C9D3DF" w:sz="4"/>
+              <w:left w:val="single" w:color="C9D3DF" w:sz="4"/>
+              <w:bottom w:val="single" w:color="C9D3DF" w:sz="4"/>
+              <w:right w:val="single" w:color="C9D3DF" w:sz="4"/>
+            </w:tcBorders>
+            <w:tcMar>
+              <w:top w:type="dxa" w:w="60"/>
+              <w:left w:type="dxa" w:w="100"/>
+              <w:bottom w:type="dxa" w:w="60"/>
+              <w:right w:type="dxa" w:w="100"/>
+            </w:tcMar>
+          </w:tcPr>
+          <w:p>
+            <w:r>
+              <w:rPr>
+                <w:sz w:val="19"/>
+                <w:szCs w:val="19"/>
+              </w:rPr>
+              <w:t xml:space="preserve">ai meeting summary</w:t>
+            </w:r>
+          </w:p>
+        </w:tc>
+        <w:tc>
+          <w:tcPr>
+            <w:tcW w:type="dxa" w:w="2520"/>
+            <w:tcBorders>
+              <w:top w:val="single" w:color="C9D3DF" w:sz="4"/>
+              <w:left w:val="single" w:color="C9D3DF" w:sz="4"/>
+              <w:bottom w:val="single" w:color="C9D3DF" w:sz="4"/>
+              <w:right w:val="single" w:color="C9D3DF" w:sz="4"/>
+            </w:tcBorders>
+            <w:tcMar>
+              <w:top w:type="dxa" w:w="60"/>
+              <w:left w:type="dxa" w:w="100"/>
+              <w:bottom w:type="dxa" w:w="60"/>
+              <w:right w:type="dxa" w:w="100"/>
+            </w:tcMar>
+          </w:tcPr>
+          <w:p>
+            <w:r>
+              <w:rPr>
+                <w:sz w:val="19"/>
+                <w:szCs w:val="19"/>
+              </w:rPr>
+              <w:t xml:space="preserve">170 (feature)</w:t>
+            </w:r>
+          </w:p>
+        </w:tc>
+        <w:tc>
+          <w:tcPr>
+            <w:tcW w:type="dxa" w:w="2520"/>
+            <w:tcBorders>
+              <w:top w:val="single" w:color="C9D3DF" w:sz="4"/>
+              <w:left w:val="single" w:color="C9D3DF" w:sz="4"/>
+              <w:bottom w:val="single" w:color="C9D3DF" w:sz="4"/>
+              <w:right w:val="single" w:color="C9D3DF" w:sz="4"/>
+            </w:tcBorders>
+            <w:tcMar>
+              <w:top w:type="dxa" w:w="60"/>
+              <w:left w:type="dxa" w:w="100"/>
+              <w:bottom w:type="dxa" w:w="60"/>
+              <w:right w:type="dxa" w:w="100"/>
+            </w:tcMar>
+          </w:tcPr>
+          <w:p>
+            <w:r>
+              <w:rPr>
+                <w:sz w:val="19"/>
+                <w:szCs w:val="19"/>
+              </w:rPr>
+              <w:t xml:space="preserve">1</w:t>
+            </w:r>
+          </w:p>
+        </w:tc>
+        <w:tc>
+          <w:tcPr>
+            <w:tcW w:type="dxa" w:w="2520"/>
+            <w:tcBorders>
+              <w:top w:val="single" w:color="C9D3DF" w:sz="4"/>
+              <w:left w:val="single" w:color="C9D3DF" w:sz="4"/>
+              <w:bottom w:val="single" w:color="C9D3DF" w:sz="4"/>
+              <w:right w:val="single" w:color="C9D3DF" w:sz="4"/>
+            </w:tcBorders>
+            <w:tcMar>
+              <w:top w:type="dxa" w:w="60"/>
+              <w:left w:type="dxa" w:w="100"/>
+              <w:bottom w:type="dxa" w:w="60"/>
+              <w:right w:type="dxa" w:w="100"/>
+            </w:tcMar>
+          </w:tcPr>
+          <w:p>
+            <w:r>
+              <w:rPr>
+                <w:sz w:val="19"/>
+                <w:szCs w:val="19"/>
+              </w:rPr>
+              <w:t xml:space="preserve">"How Lynkk helps David with client reviews" section</w:t>
+            </w:r>
+          </w:p>
+        </w:tc>
+      </w:tr>
     </w:tbl>
     <w:p>
       <w:pPr>
@@ -18888,7 +20850,7 @@
         <w:t xml:space="preserve">After the meeting, the note is ready.</w:t>
       </w:r>
       <w:r>
-        <w:t xml:space="preserve"> Lynkk writes their goals, what changed since last year, and the tasks with names and dates.</w:t>
+        <w:t xml:space="preserve"> Lynkk writes an AI meeting summary: their goals, what changed since last year, and the tasks with names and dates.</w:t>
       </w:r>
     </w:p>
     <w:p>
@@ -19474,7 +21436,7 @@
       <w:r>
         <w:t xml:space="preserve">Notes are private unless you share them. Your data is encrypted. Lynkk never uses your meetings to train AI. </w:t>
       </w:r>
-      <w:hyperlink w:history="1" r:id="rIdp2hlkwg-ophj6u_xqx0rt">
+      <w:hyperlink w:history="1" r:id="rIddnehufw1wp3_mqf_olq-r">
         <w:r>
           <w:rPr>
             <w:rStyle w:val="Hyperlink"/>
@@ -19696,7 +21658,7 @@
       <w:pPr>
         <w:spacing w:after="140"/>
       </w:pPr>
-      <w:hyperlink w:history="1" r:id="rIdqbxortpfuishyz9rlv-sj">
+      <w:hyperlink w:history="1" r:id="rIdu9ruv935sktixinkjct8m">
         <w:r>
           <w:rPr>
             <w:rStyle w:val="Hyperlink"/>

</xml_diff>